<commit_message>
refactor: dormitory allocation scenario
</commit_message>
<xml_diff>
--- a/JobMatchingSystem/Program_Assignment_3_Report.docx
+++ b/JobMatchingSystem/Program_Assignment_3_Report.docx
@@ -75,7 +75,7 @@
           <w:rFonts w:ascii="新細明體" w:hAnsi="新細明體" w:eastAsia="新細明體"/>
           <w:sz w:val="24"/>
         </w:rPr>
-        <w:t>組員：人工智慧三A  411203712  ＿＿＿</w:t>
+        <w:t>組員：人工智慧三A  411203712  陳郁潔</w:t>
       </w:r>
     </w:p>
     <w:p>
@@ -88,7 +88,7 @@
           <w:rFonts w:ascii="新細明體" w:hAnsi="新細明體" w:eastAsia="新細明體"/>
           <w:sz w:val="24"/>
         </w:rPr>
-        <w:t xml:space="preserve">　　　人工智慧三A  411221003  ＿＿＿</w:t>
+        <w:t xml:space="preserve">　　　人工智慧三A  411221003  楊雅羽</w:t>
       </w:r>
     </w:p>
     <w:p>
@@ -101,7 +101,7 @@
           <w:rFonts w:ascii="新細明體" w:hAnsi="新細明體" w:eastAsia="新細明體"/>
           <w:sz w:val="24"/>
         </w:rPr>
-        <w:t xml:space="preserve">　　　人工智慧三A  411211943  ＿＿＿</w:t>
+        <w:t xml:space="preserve">　　　人工智慧三A  411211943  吳佳彥</w:t>
       </w:r>
     </w:p>
     <w:p>
@@ -114,7 +114,7 @@
           <w:rFonts w:ascii="新細明體" w:hAnsi="新細明體" w:eastAsia="新細明體"/>
           <w:sz w:val="24"/>
         </w:rPr>
-        <w:t xml:space="preserve">　　　人工智慧三A  411211969  ＿＿＿</w:t>
+        <w:t xml:space="preserve">　　　人工智慧三A  411211969  黃粲凱</w:t>
       </w:r>
     </w:p>
     <w:p>
@@ -144,7 +144,7 @@
           <w:rFonts w:ascii="新細明體" w:hAnsi="新細明體" w:eastAsia="新細明體"/>
           <w:sz w:val="24"/>
         </w:rPr>
-        <w:t>根據作業 PDF 規範，設計一套求職媒合最佳配對資訊系統，系統以人員指派問題（Personnel Assignment Problem）為核心，將 n 位求職者與 m 個公司職缺進行最佳配對。系統透過適配分數矩陣量化每位求職者對每個職缺的適合程度，並使用三種課堂教授的演算法——分支定界法（Branch-and-Bound）、貪婪演算法（Greedy Algorithm）與動態規劃法（Dynamic Programming）——計算最佳配對方案，使總適配分數最大化。</w:t>
+        <w:t>本報告設計並實作一套學生宿舍最佳配對資訊系統，以人員指派問題（Personnel Assignment Problem）為核心，將 n 位學生與 m 間宿舍房間進行最佳配對。系統透過偏好分數矩陣量化每位學生對每間房間的偏好程度，並使用三種演算法——分支定界法（Branch-and-Bound）、貪婪演算法（Greedy Algorithm）與動態規劃法（Dynamic Programming）——計算最佳配對方案，使總偏好分數最大化。</w:t>
       </w:r>
     </w:p>
     <w:p>
@@ -156,7 +156,7 @@
           <w:rFonts w:ascii="新細明體" w:hAnsi="新細明體" w:eastAsia="新細明體"/>
           <w:sz w:val="24"/>
         </w:rPr>
-        <w:t>系統提供直覺的圖形化操作介面，包含可編輯的適配分數矩陣、二部圖配對視覺化、三種演算法的一鍵比較功能，以及穩定性檢測（Blocking Pair 偵測）。系統為純前端應用，使用 HTML5 Canvas 搭配 JavaScript 實作，無需安裝任何軟體即可在瀏覽器中運行。</w:t>
+        <w:t>系統提供直覺的圖形化操作介面，包含可編輯的偏好分數矩陣、二部圖配對視覺化、三種演算法的一鍵比較功能，以及穩定性檢測（Blocking Pair 偵測）。系統為純前端應用，使用 HTML5 Canvas 搭配 JavaScript 實作，無需安裝任何軟體即可在瀏覽器中運行。</w:t>
       </w:r>
     </w:p>
     <w:p>
@@ -199,7 +199,7 @@
           <w:rFonts w:ascii="新細明體" w:hAnsi="新細明體" w:eastAsia="新細明體"/>
           <w:sz w:val="24"/>
         </w:rPr>
-        <w:t>系統背景是一間人力資源媒合平台，協助求職者與公司職缺進行最佳配對。平台的運營環境如下：</w:t>
+        <w:t>每學期開學前，大學宿舍管理單位需要將申請住宿的學生分配到有限的宿舍房間中。每位學生對不同房間有不同的偏好（例如樓層高低、朝向、距離教室遠近、室友組合等），而每間房間的容納人數有限。目前多數學校採用隨機抽籤的方式分配宿舍，無法考量學生的個人偏好，經常導致學生對分配結果不滿意。</w:t>
       </w:r>
     </w:p>
     <w:p>
@@ -211,7 +211,7 @@
           <w:rFonts w:ascii="新細明體" w:hAnsi="新細明體" w:eastAsia="新細明體"/>
           <w:sz w:val="24"/>
         </w:rPr>
-        <w:t>• 求職者：平台上有 n 位求職者，每位求職者具備不同的技能、學歷和工作經驗。</w:t>
+        <w:t>本系統的目標是將宿舍分配從「隨機抽籤」升級為「最佳化配對」，透過演算法找到一個使所有學生整體滿意度最高的分配方案。系統的運營環境如下：</w:t>
       </w:r>
     </w:p>
     <w:p>
@@ -223,7 +223,7 @@
           <w:rFonts w:ascii="新細明體" w:hAnsi="新細明體" w:eastAsia="新細明體"/>
           <w:sz w:val="24"/>
         </w:rPr>
-        <w:t>• 公司職缺：平台上有 m 個公司職缺，每個職缺對求職者的條件有不同的要求和偏好。</w:t>
+        <w:t>• 學生：共有 n 位學生申請住宿，每位學生對每間房間有一個 0-100 的偏好分數。</w:t>
       </w:r>
     </w:p>
     <w:p>
@@ -235,7 +235,7 @@
           <w:rFonts w:ascii="新細明體" w:hAnsi="新細明體" w:eastAsia="新細明體"/>
           <w:sz w:val="24"/>
         </w:rPr>
-        <w:t>• 適配分數：系統根據求職者的條件與職缺的要求，計算出一個 0-100 的適配分數 c(i,j)，代表求職者 i 對職缺 j 的適合程度。</w:t>
+        <w:t>• 宿舍房間：共有 m 間房間可供分配，每間房間最多容納 1 位學生（一對一配對）。</w:t>
       </w:r>
     </w:p>
     <w:p>
@@ -247,7 +247,19 @@
           <w:rFonts w:ascii="新細明體" w:hAnsi="新細明體" w:eastAsia="新細明體"/>
           <w:sz w:val="24"/>
         </w:rPr>
-        <w:t>• 配對目標：平台期望產生一個最佳的一對一配對方案，使所有配對的總適配分數最大化，讓求職者和公司都能獲得最滿意的結果。</w:t>
+        <w:t>• 偏好分數：分數由學生根據房間條件（樓層、朝向、設備等）自行評估，分數越高代表越偏好。</w:t>
+      </w:r>
+    </w:p>
+    <w:p>
+      <w:pPr>
+        <w:spacing w:after="120" w:line="360" w:lineRule="auto"/>
+      </w:pPr>
+      <w:r>
+        <w:rPr>
+          <w:rFonts w:ascii="新細明體" w:hAnsi="新細明體" w:eastAsia="新細明體"/>
+          <w:sz w:val="24"/>
+        </w:rPr>
+        <w:t>• 配對目標：產生一個最佳的一對一分配方案，使所有配對的總偏好分數最大化。</w:t>
       </w:r>
     </w:p>
     <w:p>
@@ -272,7 +284,7 @@
           <w:rFonts w:ascii="新細明體" w:hAnsi="新細明體" w:eastAsia="新細明體"/>
           <w:sz w:val="24"/>
         </w:rPr>
-        <w:t>以下為系統預設的範例資料（4 位求職者 × 4 個職缺），表格中的數值代表適配分數：</w:t>
+        <w:t>以下為系統預設的範例資料（4 位學生 × 4 間房間），表格中的數值代表偏好分數（0-100）：</w:t>
       </w:r>
     </w:p>
     <w:tbl>
@@ -321,7 +333,7 @@
                 <w:b/>
                 <w:sz w:val="20"/>
               </w:rPr>
-              <w:t>職缺 1</w:t>
+              <w:t>房間 101</w:t>
             </w:r>
           </w:p>
         </w:tc>
@@ -339,7 +351,7 @@
                 <w:b/>
                 <w:sz w:val="20"/>
               </w:rPr>
-              <w:t>職缺 2</w:t>
+              <w:t>房間 102</w:t>
             </w:r>
           </w:p>
         </w:tc>
@@ -357,7 +369,7 @@
                 <w:b/>
                 <w:sz w:val="20"/>
               </w:rPr>
-              <w:t>職缺 3</w:t>
+              <w:t>房間 103</w:t>
             </w:r>
           </w:p>
         </w:tc>
@@ -375,7 +387,7 @@
                 <w:b/>
                 <w:sz w:val="20"/>
               </w:rPr>
-              <w:t>職缺 4</w:t>
+              <w:t>房間 104</w:t>
             </w:r>
           </w:p>
         </w:tc>
@@ -393,7 +405,7 @@
               <w:rPr>
                 <w:sz w:val="20"/>
               </w:rPr>
-              <w:t>求職者 A</w:t>
+              <w:t>學生 A</w:t>
             </w:r>
           </w:p>
         </w:tc>
@@ -475,7 +487,7 @@
               <w:rPr>
                 <w:sz w:val="20"/>
               </w:rPr>
-              <w:t>求職者 B</w:t>
+              <w:t>學生 B</w:t>
             </w:r>
           </w:p>
         </w:tc>
@@ -557,7 +569,7 @@
               <w:rPr>
                 <w:sz w:val="20"/>
               </w:rPr>
-              <w:t>求職者 C</w:t>
+              <w:t>學生 C</w:t>
             </w:r>
           </w:p>
         </w:tc>
@@ -639,7 +651,7 @@
               <w:rPr>
                 <w:sz w:val="20"/>
               </w:rPr>
-              <w:t>求職者 D</w:t>
+              <w:t>學生 D</w:t>
             </w:r>
           </w:p>
         </w:tc>
@@ -709,7 +721,19 @@
         </w:tc>
       </w:tr>
     </w:tbl>
-    <w:p/>
+    <w:p>
+      <w:pPr>
+        <w:spacing w:after="160" w:line="360" w:lineRule="auto"/>
+        <w:jc w:val="center"/>
+      </w:pPr>
+      <w:r>
+        <w:rPr>
+          <w:rFonts w:ascii="新細明體" w:hAnsi="新細明體" w:eastAsia="新細明體"/>
+          <w:sz w:val="20"/>
+        </w:rPr>
+        <w:t>表 1  範例 1 偏好分數矩陣（4×4）</w:t>
+      </w:r>
+    </w:p>
     <w:p>
       <w:pPr>
         <w:spacing w:after="120" w:line="360" w:lineRule="auto"/>
@@ -719,7 +743,635 @@
           <w:rFonts w:ascii="新細明體" w:hAnsi="新細明體" w:eastAsia="新細明體"/>
           <w:sz w:val="24"/>
         </w:rPr>
-        <w:t>表 1 範例適配分數矩陣</w:t>
+        <w:t>第二組範例為 5 位學生 × 5 間房間的較大規模資料：</w:t>
+      </w:r>
+    </w:p>
+    <w:tbl>
+      <w:tblPr>
+        <w:tblStyle w:val="TableGrid"/>
+        <w:tblW w:type="auto" w:w="0"/>
+        <w:jc w:val="center"/>
+        <w:tblLook w:firstColumn="1" w:firstRow="1" w:lastColumn="0" w:lastRow="0" w:noHBand="0" w:noVBand="1" w:val="04A0"/>
+      </w:tblPr>
+      <w:tblGrid>
+        <w:gridCol w:w="1441"/>
+        <w:gridCol w:w="1441"/>
+        <w:gridCol w:w="1441"/>
+        <w:gridCol w:w="1441"/>
+        <w:gridCol w:w="1441"/>
+        <w:gridCol w:w="1441"/>
+      </w:tblGrid>
+      <w:tr>
+        <w:tc>
+          <w:tcPr>
+            <w:tcW w:type="dxa" w:w="1441"/>
+            <w:shd w:val="clear" w:fill="E8E0F0"/>
+          </w:tcPr>
+          <w:p>
+            <w:pPr>
+              <w:jc w:val="center"/>
+            </w:pPr>
+            <w:r>
+              <w:rPr>
+                <w:b/>
+                <w:sz w:val="20"/>
+              </w:rPr>
+            </w:r>
+          </w:p>
+        </w:tc>
+        <w:tc>
+          <w:tcPr>
+            <w:tcW w:type="dxa" w:w="1441"/>
+            <w:shd w:val="clear" w:fill="E8E0F0"/>
+          </w:tcPr>
+          <w:p>
+            <w:pPr>
+              <w:jc w:val="center"/>
+            </w:pPr>
+            <w:r>
+              <w:rPr>
+                <w:b/>
+                <w:sz w:val="20"/>
+              </w:rPr>
+              <w:t>房間 101</w:t>
+            </w:r>
+          </w:p>
+        </w:tc>
+        <w:tc>
+          <w:tcPr>
+            <w:tcW w:type="dxa" w:w="1441"/>
+            <w:shd w:val="clear" w:fill="E8E0F0"/>
+          </w:tcPr>
+          <w:p>
+            <w:pPr>
+              <w:jc w:val="center"/>
+            </w:pPr>
+            <w:r>
+              <w:rPr>
+                <w:b/>
+                <w:sz w:val="20"/>
+              </w:rPr>
+              <w:t>房間 102</w:t>
+            </w:r>
+          </w:p>
+        </w:tc>
+        <w:tc>
+          <w:tcPr>
+            <w:tcW w:type="dxa" w:w="1441"/>
+            <w:shd w:val="clear" w:fill="E8E0F0"/>
+          </w:tcPr>
+          <w:p>
+            <w:pPr>
+              <w:jc w:val="center"/>
+            </w:pPr>
+            <w:r>
+              <w:rPr>
+                <w:b/>
+                <w:sz w:val="20"/>
+              </w:rPr>
+              <w:t>房間 103</w:t>
+            </w:r>
+          </w:p>
+        </w:tc>
+        <w:tc>
+          <w:tcPr>
+            <w:tcW w:type="dxa" w:w="1441"/>
+            <w:shd w:val="clear" w:fill="E8E0F0"/>
+          </w:tcPr>
+          <w:p>
+            <w:pPr>
+              <w:jc w:val="center"/>
+            </w:pPr>
+            <w:r>
+              <w:rPr>
+                <w:b/>
+                <w:sz w:val="20"/>
+              </w:rPr>
+              <w:t>房間 104</w:t>
+            </w:r>
+          </w:p>
+        </w:tc>
+        <w:tc>
+          <w:tcPr>
+            <w:tcW w:type="dxa" w:w="1441"/>
+            <w:shd w:val="clear" w:fill="E8E0F0"/>
+          </w:tcPr>
+          <w:p>
+            <w:pPr>
+              <w:jc w:val="center"/>
+            </w:pPr>
+            <w:r>
+              <w:rPr>
+                <w:b/>
+                <w:sz w:val="20"/>
+              </w:rPr>
+              <w:t>房間 105</w:t>
+            </w:r>
+          </w:p>
+        </w:tc>
+      </w:tr>
+      <w:tr>
+        <w:tc>
+          <w:tcPr>
+            <w:tcW w:type="dxa" w:w="1441"/>
+          </w:tcPr>
+          <w:p>
+            <w:pPr>
+              <w:jc w:val="center"/>
+            </w:pPr>
+            <w:r>
+              <w:rPr>
+                <w:sz w:val="20"/>
+              </w:rPr>
+              <w:t>學生 A</w:t>
+            </w:r>
+          </w:p>
+        </w:tc>
+        <w:tc>
+          <w:tcPr>
+            <w:tcW w:type="dxa" w:w="1441"/>
+          </w:tcPr>
+          <w:p>
+            <w:pPr>
+              <w:jc w:val="center"/>
+            </w:pPr>
+            <w:r>
+              <w:rPr>
+                <w:sz w:val="20"/>
+              </w:rPr>
+              <w:t>92</w:t>
+            </w:r>
+          </w:p>
+        </w:tc>
+        <w:tc>
+          <w:tcPr>
+            <w:tcW w:type="dxa" w:w="1441"/>
+          </w:tcPr>
+          <w:p>
+            <w:pPr>
+              <w:jc w:val="center"/>
+            </w:pPr>
+            <w:r>
+              <w:rPr>
+                <w:sz w:val="20"/>
+              </w:rPr>
+              <w:t>75</w:t>
+            </w:r>
+          </w:p>
+        </w:tc>
+        <w:tc>
+          <w:tcPr>
+            <w:tcW w:type="dxa" w:w="1441"/>
+          </w:tcPr>
+          <w:p>
+            <w:pPr>
+              <w:jc w:val="center"/>
+            </w:pPr>
+            <w:r>
+              <w:rPr>
+                <w:sz w:val="20"/>
+              </w:rPr>
+              <w:t>60</w:t>
+            </w:r>
+          </w:p>
+        </w:tc>
+        <w:tc>
+          <w:tcPr>
+            <w:tcW w:type="dxa" w:w="1441"/>
+          </w:tcPr>
+          <w:p>
+            <w:pPr>
+              <w:jc w:val="center"/>
+            </w:pPr>
+            <w:r>
+              <w:rPr>
+                <w:sz w:val="20"/>
+              </w:rPr>
+              <w:t>85</w:t>
+            </w:r>
+          </w:p>
+        </w:tc>
+        <w:tc>
+          <w:tcPr>
+            <w:tcW w:type="dxa" w:w="1441"/>
+          </w:tcPr>
+          <w:p>
+            <w:pPr>
+              <w:jc w:val="center"/>
+            </w:pPr>
+            <w:r>
+              <w:rPr>
+                <w:sz w:val="20"/>
+              </w:rPr>
+              <w:t>50</w:t>
+            </w:r>
+          </w:p>
+        </w:tc>
+      </w:tr>
+      <w:tr>
+        <w:tc>
+          <w:tcPr>
+            <w:tcW w:type="dxa" w:w="1441"/>
+          </w:tcPr>
+          <w:p>
+            <w:pPr>
+              <w:jc w:val="center"/>
+            </w:pPr>
+            <w:r>
+              <w:rPr>
+                <w:sz w:val="20"/>
+              </w:rPr>
+              <w:t>學生 B</w:t>
+            </w:r>
+          </w:p>
+        </w:tc>
+        <w:tc>
+          <w:tcPr>
+            <w:tcW w:type="dxa" w:w="1441"/>
+          </w:tcPr>
+          <w:p>
+            <w:pPr>
+              <w:jc w:val="center"/>
+            </w:pPr>
+            <w:r>
+              <w:rPr>
+                <w:sz w:val="20"/>
+              </w:rPr>
+              <w:t>55</w:t>
+            </w:r>
+          </w:p>
+        </w:tc>
+        <w:tc>
+          <w:tcPr>
+            <w:tcW w:type="dxa" w:w="1441"/>
+          </w:tcPr>
+          <w:p>
+            <w:pPr>
+              <w:jc w:val="center"/>
+            </w:pPr>
+            <w:r>
+              <w:rPr>
+                <w:sz w:val="20"/>
+              </w:rPr>
+              <w:t>88</w:t>
+            </w:r>
+          </w:p>
+        </w:tc>
+        <w:tc>
+          <w:tcPr>
+            <w:tcW w:type="dxa" w:w="1441"/>
+          </w:tcPr>
+          <w:p>
+            <w:pPr>
+              <w:jc w:val="center"/>
+            </w:pPr>
+            <w:r>
+              <w:rPr>
+                <w:sz w:val="20"/>
+              </w:rPr>
+              <w:t>70</w:t>
+            </w:r>
+          </w:p>
+        </w:tc>
+        <w:tc>
+          <w:tcPr>
+            <w:tcW w:type="dxa" w:w="1441"/>
+          </w:tcPr>
+          <w:p>
+            <w:pPr>
+              <w:jc w:val="center"/>
+            </w:pPr>
+            <w:r>
+              <w:rPr>
+                <w:sz w:val="20"/>
+              </w:rPr>
+              <w:t>45</w:t>
+            </w:r>
+          </w:p>
+        </w:tc>
+        <w:tc>
+          <w:tcPr>
+            <w:tcW w:type="dxa" w:w="1441"/>
+          </w:tcPr>
+          <w:p>
+            <w:pPr>
+              <w:jc w:val="center"/>
+            </w:pPr>
+            <w:r>
+              <w:rPr>
+                <w:sz w:val="20"/>
+              </w:rPr>
+              <w:t>90</w:t>
+            </w:r>
+          </w:p>
+        </w:tc>
+      </w:tr>
+      <w:tr>
+        <w:tc>
+          <w:tcPr>
+            <w:tcW w:type="dxa" w:w="1441"/>
+          </w:tcPr>
+          <w:p>
+            <w:pPr>
+              <w:jc w:val="center"/>
+            </w:pPr>
+            <w:r>
+              <w:rPr>
+                <w:sz w:val="20"/>
+              </w:rPr>
+              <w:t>學生 C</w:t>
+            </w:r>
+          </w:p>
+        </w:tc>
+        <w:tc>
+          <w:tcPr>
+            <w:tcW w:type="dxa" w:w="1441"/>
+          </w:tcPr>
+          <w:p>
+            <w:pPr>
+              <w:jc w:val="center"/>
+            </w:pPr>
+            <w:r>
+              <w:rPr>
+                <w:sz w:val="20"/>
+              </w:rPr>
+              <w:t>80</w:t>
+            </w:r>
+          </w:p>
+        </w:tc>
+        <w:tc>
+          <w:tcPr>
+            <w:tcW w:type="dxa" w:w="1441"/>
+          </w:tcPr>
+          <w:p>
+            <w:pPr>
+              <w:jc w:val="center"/>
+            </w:pPr>
+            <w:r>
+              <w:rPr>
+                <w:sz w:val="20"/>
+              </w:rPr>
+              <w:t>42</w:t>
+            </w:r>
+          </w:p>
+        </w:tc>
+        <w:tc>
+          <w:tcPr>
+            <w:tcW w:type="dxa" w:w="1441"/>
+          </w:tcPr>
+          <w:p>
+            <w:pPr>
+              <w:jc w:val="center"/>
+            </w:pPr>
+            <w:r>
+              <w:rPr>
+                <w:sz w:val="20"/>
+              </w:rPr>
+              <w:t>95</w:t>
+            </w:r>
+          </w:p>
+        </w:tc>
+        <w:tc>
+          <w:tcPr>
+            <w:tcW w:type="dxa" w:w="1441"/>
+          </w:tcPr>
+          <w:p>
+            <w:pPr>
+              <w:jc w:val="center"/>
+            </w:pPr>
+            <w:r>
+              <w:rPr>
+                <w:sz w:val="20"/>
+              </w:rPr>
+              <w:t>60</w:t>
+            </w:r>
+          </w:p>
+        </w:tc>
+        <w:tc>
+          <w:tcPr>
+            <w:tcW w:type="dxa" w:w="1441"/>
+          </w:tcPr>
+          <w:p>
+            <w:pPr>
+              <w:jc w:val="center"/>
+            </w:pPr>
+            <w:r>
+              <w:rPr>
+                <w:sz w:val="20"/>
+              </w:rPr>
+              <w:t>65</w:t>
+            </w:r>
+          </w:p>
+        </w:tc>
+      </w:tr>
+      <w:tr>
+        <w:tc>
+          <w:tcPr>
+            <w:tcW w:type="dxa" w:w="1441"/>
+          </w:tcPr>
+          <w:p>
+            <w:pPr>
+              <w:jc w:val="center"/>
+            </w:pPr>
+            <w:r>
+              <w:rPr>
+                <w:sz w:val="20"/>
+              </w:rPr>
+              <w:t>學生 D</w:t>
+            </w:r>
+          </w:p>
+        </w:tc>
+        <w:tc>
+          <w:tcPr>
+            <w:tcW w:type="dxa" w:w="1441"/>
+          </w:tcPr>
+          <w:p>
+            <w:pPr>
+              <w:jc w:val="center"/>
+            </w:pPr>
+            <w:r>
+              <w:rPr>
+                <w:sz w:val="20"/>
+              </w:rPr>
+              <w:t>65</w:t>
+            </w:r>
+          </w:p>
+        </w:tc>
+        <w:tc>
+          <w:tcPr>
+            <w:tcW w:type="dxa" w:w="1441"/>
+          </w:tcPr>
+          <w:p>
+            <w:pPr>
+              <w:jc w:val="center"/>
+            </w:pPr>
+            <w:r>
+              <w:rPr>
+                <w:sz w:val="20"/>
+              </w:rPr>
+              <w:t>90</w:t>
+            </w:r>
+          </w:p>
+        </w:tc>
+        <w:tc>
+          <w:tcPr>
+            <w:tcW w:type="dxa" w:w="1441"/>
+          </w:tcPr>
+          <w:p>
+            <w:pPr>
+              <w:jc w:val="center"/>
+            </w:pPr>
+            <w:r>
+              <w:rPr>
+                <w:sz w:val="20"/>
+              </w:rPr>
+              <w:t>50</w:t>
+            </w:r>
+          </w:p>
+        </w:tc>
+        <w:tc>
+          <w:tcPr>
+            <w:tcW w:type="dxa" w:w="1441"/>
+          </w:tcPr>
+          <w:p>
+            <w:pPr>
+              <w:jc w:val="center"/>
+            </w:pPr>
+            <w:r>
+              <w:rPr>
+                <w:sz w:val="20"/>
+              </w:rPr>
+              <w:t>78</w:t>
+            </w:r>
+          </w:p>
+        </w:tc>
+        <w:tc>
+          <w:tcPr>
+            <w:tcW w:type="dxa" w:w="1441"/>
+          </w:tcPr>
+          <w:p>
+            <w:pPr>
+              <w:jc w:val="center"/>
+            </w:pPr>
+            <w:r>
+              <w:rPr>
+                <w:sz w:val="20"/>
+              </w:rPr>
+              <w:t>55</w:t>
+            </w:r>
+          </w:p>
+        </w:tc>
+      </w:tr>
+      <w:tr>
+        <w:tc>
+          <w:tcPr>
+            <w:tcW w:type="dxa" w:w="1441"/>
+          </w:tcPr>
+          <w:p>
+            <w:pPr>
+              <w:jc w:val="center"/>
+            </w:pPr>
+            <w:r>
+              <w:rPr>
+                <w:sz w:val="20"/>
+              </w:rPr>
+              <w:t>學生 E</w:t>
+            </w:r>
+          </w:p>
+        </w:tc>
+        <w:tc>
+          <w:tcPr>
+            <w:tcW w:type="dxa" w:w="1441"/>
+          </w:tcPr>
+          <w:p>
+            <w:pPr>
+              <w:jc w:val="center"/>
+            </w:pPr>
+            <w:r>
+              <w:rPr>
+                <w:sz w:val="20"/>
+              </w:rPr>
+              <w:t>70</w:t>
+            </w:r>
+          </w:p>
+        </w:tc>
+        <w:tc>
+          <w:tcPr>
+            <w:tcW w:type="dxa" w:w="1441"/>
+          </w:tcPr>
+          <w:p>
+            <w:pPr>
+              <w:jc w:val="center"/>
+            </w:pPr>
+            <w:r>
+              <w:rPr>
+                <w:sz w:val="20"/>
+              </w:rPr>
+              <w:t>55</w:t>
+            </w:r>
+          </w:p>
+        </w:tc>
+        <w:tc>
+          <w:tcPr>
+            <w:tcW w:type="dxa" w:w="1441"/>
+          </w:tcPr>
+          <w:p>
+            <w:pPr>
+              <w:jc w:val="center"/>
+            </w:pPr>
+            <w:r>
+              <w:rPr>
+                <w:sz w:val="20"/>
+              </w:rPr>
+              <w:t>85</w:t>
+            </w:r>
+          </w:p>
+        </w:tc>
+        <w:tc>
+          <w:tcPr>
+            <w:tcW w:type="dxa" w:w="1441"/>
+          </w:tcPr>
+          <w:p>
+            <w:pPr>
+              <w:jc w:val="center"/>
+            </w:pPr>
+            <w:r>
+              <w:rPr>
+                <w:sz w:val="20"/>
+              </w:rPr>
+              <w:t>40</w:t>
+            </w:r>
+          </w:p>
+        </w:tc>
+        <w:tc>
+          <w:tcPr>
+            <w:tcW w:type="dxa" w:w="1441"/>
+          </w:tcPr>
+          <w:p>
+            <w:pPr>
+              <w:jc w:val="center"/>
+            </w:pPr>
+            <w:r>
+              <w:rPr>
+                <w:sz w:val="20"/>
+              </w:rPr>
+              <w:t>92</w:t>
+            </w:r>
+          </w:p>
+        </w:tc>
+      </w:tr>
+    </w:tbl>
+    <w:p>
+      <w:pPr>
+        <w:spacing w:after="160" w:line="360" w:lineRule="auto"/>
+        <w:jc w:val="center"/>
+      </w:pPr>
+      <w:r>
+        <w:rPr>
+          <w:rFonts w:ascii="新細明體" w:hAnsi="新細明體" w:eastAsia="新細明體"/>
+          <w:sz w:val="20"/>
+        </w:rPr>
+        <w:t>表 2  範例 2 偏好分數矩陣（5×5）</w:t>
       </w:r>
     </w:p>
     <w:p>
@@ -744,7 +1396,7 @@
           <w:rFonts w:ascii="新細明體" w:hAnsi="新細明體" w:eastAsia="新細明體"/>
           <w:sz w:val="24"/>
         </w:rPr>
-        <w:t>系統的資料模型可以用二部圖 G = (S ∪ J, E) 表示：</w:t>
+        <w:t>系統的資料模型可以用二部圖 G = (S ∪ R, E) 表示：</w:t>
       </w:r>
     </w:p>
     <w:p>
@@ -756,7 +1408,7 @@
           <w:rFonts w:ascii="新細明體" w:hAnsi="新細明體" w:eastAsia="新細明體"/>
           <w:sz w:val="24"/>
         </w:rPr>
-        <w:t>• S（求職者集合）：S = {s₁, s₂, ..., sₙ}，每個 sᵢ 代表一位求職者。</w:t>
+        <w:t>• S（學生集合）：S = {s₁, s₂, ..., sₙ}，每個 sᵢ 代表一位學生。</w:t>
       </w:r>
     </w:p>
     <w:p>
@@ -768,7 +1420,7 @@
           <w:rFonts w:ascii="新細明體" w:hAnsi="新細明體" w:eastAsia="新細明體"/>
           <w:sz w:val="24"/>
         </w:rPr>
-        <w:t>• J（職缺集合）：J = {j₁, j₂, ..., jₘ}，每個 jₖ 代表一個職缺。</w:t>
+        <w:t>• R（房間集合）：R = {r₁, r₂, ..., rₘ}，每個 rₖ 代表一間宿舍房間。</w:t>
       </w:r>
     </w:p>
     <w:p>
@@ -780,7 +1432,7 @@
           <w:rFonts w:ascii="新細明體" w:hAnsi="新細明體" w:eastAsia="新細明體"/>
           <w:sz w:val="24"/>
         </w:rPr>
-        <w:t>• E（邊集合）：每條邊 (sᵢ, jₖ) 的權重為適配分數 c(i,k)。</w:t>
+        <w:t>• E（邊集合）：每條邊 (sᵢ, rₖ) 的權重為偏好分數 c(i,k) ∈ [0, 100]。</w:t>
       </w:r>
     </w:p>
     <w:p>
@@ -792,7 +1444,7 @@
           <w:rFonts w:ascii="新細明體" w:hAnsi="新細明體" w:eastAsia="新細明體"/>
           <w:sz w:val="24"/>
         </w:rPr>
-        <w:t>• 適配分數矩陣 C：n × m 矩陣，C[i][k] = c(i,k) ∈ [0, 100]。</w:t>
+        <w:t>• 偏好分數矩陣 C：n × m 矩陣，C[i][k] = c(i,k)，量化學生 i 對房間 k 的偏好程度。</w:t>
       </w:r>
     </w:p>
     <w:p>
@@ -817,7 +1469,7 @@
           <w:rFonts w:ascii="新細明體" w:hAnsi="新細明體" w:eastAsia="新細明體"/>
           <w:sz w:val="24"/>
         </w:rPr>
-        <w:t>系統是一套為人力資源媒合平台打造的最佳配對資訊系統，目標是提供一個直觀、高效的數位化平台，讓使用者輸入或生成適配分數矩陣，並自動計算最佳配對方案。</w:t>
+        <w:t>本系統是一套為大學宿舍管理單位打造的最佳配對資訊系統，提供一個直觀、高效的數位化平台，讓管理者輸入或生成學生的偏好分數矩陣，並自動計算最佳分配方案。</w:t>
       </w:r>
     </w:p>
     <w:p>
@@ -829,7 +1481,7 @@
           <w:rFonts w:ascii="新細明體" w:hAnsi="新細明體" w:eastAsia="新細明體"/>
           <w:sz w:val="24"/>
         </w:rPr>
-        <w:t>系統提供直覺的圖形化操作介面，左側為配對視覺化區域（二部圖），下方為可編輯的適配分數矩陣表格，右側為控制面板，包含資料設定、演算法選擇、結果展示和三算法比較等功能。</w:t>
+        <w:t>系統採用左右分欄的單頁應用佈局。左側主區域分為上半部的二部圖配對視覺化區域（使用 HTML5 Canvas 繪製）和下半部的可編輯偏好分數矩陣表格。右側側邊欄包含資料設定區（人數輸入、隨機生成、範例載入）、演算法選擇區（三種演算法的 Radio 選項）、執行按鈕（執行配對 / 三算法比較 / 清除結果）、以及結果展示區域。</w:t>
       </w:r>
     </w:p>
     <w:p>
@@ -843,6 +1495,44 @@
           <w:sz w:val="26"/>
         </w:rPr>
         <w:t>1-5 使用流程</w:t>
+      </w:r>
+    </w:p>
+    <w:p>
+      <w:pPr>
+        <w:spacing w:after="80" w:line="360" w:lineRule="auto"/>
+      </w:pPr>
+      <w:r>
+        <w:rPr>
+          <w:rFonts w:ascii="新細明體" w:hAnsi="新細明體" w:eastAsia="新細明體"/>
+          <w:b/>
+          <w:sz w:val="24"/>
+        </w:rPr>
+        <w:t>1-5.1 資料模型</w:t>
+      </w:r>
+    </w:p>
+    <w:p>
+      <w:pPr>
+        <w:spacing w:after="120" w:line="360" w:lineRule="auto"/>
+      </w:pPr>
+      <w:r>
+        <w:rPr>
+          <w:rFonts w:ascii="新細明體" w:hAnsi="新細明體" w:eastAsia="新細明體"/>
+          <w:sz w:val="24"/>
+        </w:rPr>
+        <w:t>核心資料結構為一個 n×m 的二維陣列 scoreMatrix，其中 scoreMatrix[i][j] 儲存學生 i 對房間 j 的偏好分數。配對結果以一維陣列 assignment 表示，其中 assignment[i] = j 代表學生 i 被分配到房間 j。</w:t>
+      </w:r>
+    </w:p>
+    <w:p>
+      <w:pPr>
+        <w:spacing w:after="80" w:line="360" w:lineRule="auto"/>
+      </w:pPr>
+      <w:r>
+        <w:rPr>
+          <w:rFonts w:ascii="新細明體" w:hAnsi="新細明體" w:eastAsia="新細明體"/>
+          <w:b/>
+          <w:sz w:val="24"/>
+        </w:rPr>
+        <w:t>1-5.2 使用流程</w:t>
       </w:r>
     </w:p>
     <w:tbl>
@@ -942,7 +1632,7 @@
               <w:rPr>
                 <w:sz w:val="20"/>
               </w:rPr>
-              <w:t>點擊「範例1」或「隨機生成」</w:t>
+              <w:t>設定學生人數 n 和房間數量 m</w:t>
             </w:r>
           </w:p>
         </w:tc>
@@ -958,7 +1648,7 @@
               <w:rPr>
                 <w:sz w:val="20"/>
               </w:rPr>
-              <w:t>系統生成適配分數矩陣並顯示於表格</w:t>
+              <w:t>更新介面參數</w:t>
             </w:r>
           </w:p>
         </w:tc>
@@ -992,7 +1682,7 @@
               <w:rPr>
                 <w:sz w:val="20"/>
               </w:rPr>
-              <w:t>（可選）點擊矩陣儲存格修改分數</w:t>
+              <w:t>點擊「隨機生成」或「範例1」</w:t>
             </w:r>
           </w:p>
         </w:tc>
@@ -1008,7 +1698,7 @@
               <w:rPr>
                 <w:sz w:val="20"/>
               </w:rPr>
-              <w:t>系統即時更新對應的分數值</w:t>
+              <w:t>生成偏好分數矩陣並顯示於表格</w:t>
             </w:r>
           </w:p>
         </w:tc>
@@ -1042,7 +1732,7 @@
               <w:rPr>
                 <w:sz w:val="20"/>
               </w:rPr>
-              <w:t>選擇演算法（B&amp;B/貪婪/DP）</w:t>
+              <w:t>（可選）點擊矩陣儲存格修改分數</w:t>
             </w:r>
           </w:p>
         </w:tc>
@@ -1058,7 +1748,7 @@
               <w:rPr>
                 <w:sz w:val="20"/>
               </w:rPr>
-              <w:t>系統準備對應的配對引擎</w:t>
+              <w:t>即時更新對應的分數值</w:t>
             </w:r>
           </w:p>
         </w:tc>
@@ -1092,7 +1782,7 @@
               <w:rPr>
                 <w:sz w:val="20"/>
               </w:rPr>
-              <w:t>點擊「執行配對」</w:t>
+              <w:t>選擇演算法（B&amp;B / 貪婪 / DP）</w:t>
             </w:r>
           </w:p>
         </w:tc>
@@ -1108,7 +1798,7 @@
               <w:rPr>
                 <w:sz w:val="20"/>
               </w:rPr>
-              <w:t>系統計算最佳配對並在二部圖上顯示連線</w:t>
+              <w:t>準備對應的配對引擎</w:t>
             </w:r>
           </w:p>
         </w:tc>
@@ -1142,7 +1832,7 @@
               <w:rPr>
                 <w:sz w:val="20"/>
               </w:rPr>
-              <w:t>查看結果面板</w:t>
+              <w:t>點擊「執行配對」</w:t>
             </w:r>
           </w:p>
         </w:tc>
@@ -1158,7 +1848,7 @@
               <w:rPr>
                 <w:sz w:val="20"/>
               </w:rPr>
-              <w:t>顯示總分、配對明細、穩定性檢測結果</w:t>
+              <w:t>計算最佳配對，在二部圖上顯示綠色連線</w:t>
             </w:r>
           </w:p>
         </w:tc>
@@ -1192,6 +1882,56 @@
               <w:rPr>
                 <w:sz w:val="20"/>
               </w:rPr>
+              <w:t>查看結果面板</w:t>
+            </w:r>
+          </w:p>
+        </w:tc>
+        <w:tc>
+          <w:tcPr>
+            <w:tcW w:type="dxa" w:w="2882"/>
+          </w:tcPr>
+          <w:p>
+            <w:pPr>
+              <w:jc w:val="center"/>
+            </w:pPr>
+            <w:r>
+              <w:rPr>
+                <w:sz w:val="20"/>
+              </w:rPr>
+              <w:t>顯示總分、配對明細、搜尋統計、穩定性檢測</w:t>
+            </w:r>
+          </w:p>
+        </w:tc>
+      </w:tr>
+      <w:tr>
+        <w:tc>
+          <w:tcPr>
+            <w:tcW w:type="dxa" w:w="2882"/>
+          </w:tcPr>
+          <w:p>
+            <w:pPr>
+              <w:jc w:val="center"/>
+            </w:pPr>
+            <w:r>
+              <w:rPr>
+                <w:sz w:val="20"/>
+              </w:rPr>
+              <w:t>7</w:t>
+            </w:r>
+          </w:p>
+        </w:tc>
+        <w:tc>
+          <w:tcPr>
+            <w:tcW w:type="dxa" w:w="2882"/>
+          </w:tcPr>
+          <w:p>
+            <w:pPr>
+              <w:jc w:val="center"/>
+            </w:pPr>
+            <w:r>
+              <w:rPr>
+                <w:sz w:val="20"/>
+              </w:rPr>
               <w:t>點擊「三算法比較」</w:t>
             </w:r>
           </w:p>
@@ -1208,23 +1948,23 @@
               <w:rPr>
                 <w:sz w:val="20"/>
               </w:rPr>
-              <w:t>同時運行三種演算法，以表格比較結果</w:t>
+              <w:t>同時運行三種演算法，以表格比較各項指標</w:t>
             </w:r>
           </w:p>
         </w:tc>
       </w:tr>
     </w:tbl>
-    <w:p/>
     <w:p>
       <w:pPr>
-        <w:spacing w:after="120" w:line="360" w:lineRule="auto"/>
+        <w:spacing w:after="160" w:line="360" w:lineRule="auto"/>
+        <w:jc w:val="center"/>
       </w:pPr>
       <w:r>
         <w:rPr>
           <w:rFonts w:ascii="新細明體" w:hAnsi="新細明體" w:eastAsia="新細明體"/>
-          <w:sz w:val="24"/>
+          <w:sz w:val="20"/>
         </w:rPr>
-        <w:t>表 2 系統使用流程</w:t>
+        <w:t>表 3  系統使用流程</w:t>
       </w:r>
     </w:p>
     <w:p>
@@ -1337,7 +2077,7 @@
               <w:rPr>
                 <w:sz w:val="20"/>
               </w:rPr>
-              <w:t>適配分數矩陣視覺化</w:t>
+              <w:t>偏好分數矩陣視覺化</w:t>
             </w:r>
           </w:p>
         </w:tc>
@@ -1353,7 +2093,7 @@
               <w:rPr>
                 <w:sz w:val="20"/>
               </w:rPr>
-              <w:t>以表格形式呈現 n×m 適配分數矩陣</w:t>
+              <w:t>以表格形式呈現 n×m 偏好分數矩陣</w:t>
             </w:r>
           </w:p>
         </w:tc>
@@ -1403,7 +2143,7 @@
               <w:rPr>
                 <w:sz w:val="20"/>
               </w:rPr>
-              <w:t>使用者可點擊任一儲存格直接修改分數 (0-100)</w:t>
+              <w:t>使用者可點擊任一儲存格直接修改分數（0-100）</w:t>
             </w:r>
           </w:p>
         </w:tc>
@@ -1453,7 +2193,7 @@
               <w:rPr>
                 <w:sz w:val="20"/>
               </w:rPr>
-              <w:t>一鍵隨機生成指定規模的適配分數矩陣</w:t>
+              <w:t>一鍵隨機生成指定規模的偏好分數矩陣（範圍 20-100）</w:t>
             </w:r>
           </w:p>
         </w:tc>
@@ -1603,7 +2343,7 @@
               <w:rPr>
                 <w:sz w:val="20"/>
               </w:rPr>
-              <w:t>根據選擇的演算法計算最佳配對</w:t>
+              <w:t>根據選擇的演算法計算最佳宿舍分配方案</w:t>
             </w:r>
           </w:p>
         </w:tc>
@@ -1653,7 +2393,7 @@
               <w:rPr>
                 <w:sz w:val="20"/>
               </w:rPr>
-              <w:t>以 Canvas 繪製二部圖，用綠色連線顯示配對結果</w:t>
+              <w:t>以 Canvas 繪製二部圖，左側圓形為學生，右側方形為房間，配對以綠色連線表示</w:t>
             </w:r>
           </w:p>
         </w:tc>
@@ -1703,7 +2443,7 @@
               <w:rPr>
                 <w:sz w:val="20"/>
               </w:rPr>
-              <w:t>顯示總分、每對配對的分數、搜尋節點數、修剪次數</w:t>
+              <w:t>顯示總分、每對配對的分數、搜尋節點數、修剪次數、計算時間</w:t>
             </w:r>
           </w:p>
         </w:tc>
@@ -1753,7 +2493,7 @@
               <w:rPr>
                 <w:sz w:val="20"/>
               </w:rPr>
-              <w:t>配對完成後檢測是否存在 blocking pair</w:t>
+              <w:t>配對完成後自動檢測是否存在 blocking pair</w:t>
             </w:r>
           </w:p>
         </w:tc>
@@ -1803,23 +2543,23 @@
               <w:rPr>
                 <w:sz w:val="20"/>
               </w:rPr>
-              <w:t>同時運行三種演算法，以表格比較各項指標</w:t>
+              <w:t>同時運行三種演算法，以比較表格呈現各項指標差異</w:t>
             </w:r>
           </w:p>
         </w:tc>
       </w:tr>
     </w:tbl>
-    <w:p/>
     <w:p>
       <w:pPr>
-        <w:spacing w:after="120" w:line="360" w:lineRule="auto"/>
+        <w:spacing w:after="160" w:line="360" w:lineRule="auto"/>
+        <w:jc w:val="center"/>
       </w:pPr>
       <w:r>
         <w:rPr>
           <w:rFonts w:ascii="新細明體" w:hAnsi="新細明體" w:eastAsia="新細明體"/>
-          <w:sz w:val="24"/>
+          <w:sz w:val="20"/>
         </w:rPr>
-        <w:t>表 3 功能需求表</w:t>
+        <w:t>表 4  功能需求表</w:t>
       </w:r>
     </w:p>
     <w:p>
@@ -1844,7 +2584,19 @@
           <w:rFonts w:ascii="新細明體" w:hAnsi="新細明體" w:eastAsia="新細明體"/>
           <w:sz w:val="24"/>
         </w:rPr>
-        <w:t>系統採用左右分欄的單頁應用佈局。左側主區域分為上半部的二部圖配對視覺化（Canvas）和下半部的適配分數矩陣表格。右側側邊欄包含資料設定（人數、生成、範例）、演算法選擇（三個 Radio 選項）、執行按鈕、以及結果展示區域。介面採用白色主題，配色以靛藍色（求職者）和橙色（職缺）區分兩組節點。</w:t>
+        <w:t>介面採用白色主題，配色以靛藍色（#4f46e5）代表學生節點、橙色（#ea580c）代表房間節點、綠色（#059669）代表配對連線。字型使用 Noto Sans TC 搭配 Inter，兼顧中英文排版的美觀性。</w:t>
+      </w:r>
+    </w:p>
+    <w:p>
+      <w:pPr>
+        <w:spacing w:after="120" w:line="360" w:lineRule="auto"/>
+      </w:pPr>
+      <w:r>
+        <w:rPr>
+          <w:rFonts w:ascii="新細明體" w:hAnsi="新細明體" w:eastAsia="新細明體"/>
+          <w:sz w:val="24"/>
+        </w:rPr>
+        <w:t>左側 Canvas 畫布以二部圖形式呈現配對關係，學生以圓形節點排列於左側，房間以圓角矩形節點排列於右側。配對成功的連線上方會顯示該對的偏好分數。下方的矩陣表格支援即時點擊編輯，已配對的儲存格會以綠色背景高亮標示。</w:t>
       </w:r>
     </w:p>
     <w:p>
@@ -1882,7 +2634,7 @@
           <w:rFonts w:ascii="新細明體" w:hAnsi="新細明體" w:eastAsia="新細明體"/>
           <w:sz w:val="24"/>
         </w:rPr>
-        <w:t>給定 n 位求職者和 m 個職缺（取 min(n,m) 進行一對一配對），以及適配分數矩陣 C，找到一個指派方案使總適配分數最大化。</w:t>
+        <w:t>給定 n 位學生和 m 間房間（取 k = min(n,m) 進行一對一配對），以及偏好分數矩陣 C，找到一個分配方案使總偏好分數最大化。</w:t>
       </w:r>
     </w:p>
     <w:p>
@@ -1906,7 +2658,7 @@
           <w:rFonts w:ascii="新細明體" w:hAnsi="新細明體" w:eastAsia="新細明體"/>
           <w:sz w:val="24"/>
         </w:rPr>
-        <w:t>輸入：n×m 適配分數矩陣 C，其中 c(i,j) ∈ [0, 100]。</w:t>
+        <w:t>輸入：n×m 偏好分數矩陣 C，其中 c(i,j) ∈ [0, 100]。</w:t>
       </w:r>
     </w:p>
     <w:p>
@@ -1930,7 +2682,7 @@
           <w:rFonts w:ascii="新細明體" w:hAnsi="新細明體" w:eastAsia="新細明體"/>
           <w:sz w:val="24"/>
         </w:rPr>
-        <w:t>約束：每位求職者最多分配到一個職缺，每個職缺最多分配一位求職者。</w:t>
+        <w:t>約束：每位學生最多分配到一間房間，每間房間最多分配一位學生。</w:t>
       </w:r>
     </w:p>
     <w:p>
@@ -1955,7 +2707,7 @@
           <w:rFonts w:ascii="新細明體" w:hAnsi="新細明體" w:eastAsia="新細明體"/>
           <w:sz w:val="24"/>
         </w:rPr>
-        <w:t>配對完成後，檢測是否存在「不穩定配對」（Blocking Pair）：即求職者 sᵢ 對職缺 jₖ 的適配分數高於其目前配對的職缺，且 sᵢ 對 jₖ 的分數也高於 jₖ 目前配對的求職者。</w:t>
+        <w:t>配對完成後，檢測是否存在「不穩定配對」（Blocking Pair）：即存在某位學生 sᵢ 對某間房間 rₖ 的偏好分數高於其目前配到的房間，同時 sᵢ 對 rₖ 的分數也高於 rₖ 目前住戶對 rₖ 的分數。</w:t>
       </w:r>
     </w:p>
     <w:p>
@@ -1967,19 +2719,7 @@
           <w:rFonts w:ascii="新細明體" w:hAnsi="新細明體" w:eastAsia="新細明體"/>
           <w:sz w:val="24"/>
         </w:rPr>
-        <w:t>形式化定義：</w:t>
-      </w:r>
-    </w:p>
-    <w:p>
-      <w:pPr>
-        <w:spacing w:after="120" w:line="360" w:lineRule="auto"/>
-      </w:pPr>
-      <w:r>
-        <w:rPr>
-          <w:rFonts w:ascii="新細明體" w:hAnsi="新細明體" w:eastAsia="新細明體"/>
-          <w:sz w:val="24"/>
-        </w:rPr>
-        <w:t>若存在 (sᵢ, jₖ) 使得 c(i,k) &gt; c(i, π(i)) 且 c(i,k) &gt; c(π⁻¹(k), k)，則稱 (sᵢ, jₖ) 為 blocking pair，該配對不穩定。</w:t>
+        <w:t>形式化定義：若存在 (sᵢ, rₖ) 使得 c(i,k) &gt; c(i, π(i)) 且 c(i,k) &gt; c(π⁻¹(k), k)，則稱 (sᵢ, rₖ) 為 blocking pair，該配對結果不穩定。</w:t>
       </w:r>
     </w:p>
     <w:p>
@@ -2004,7 +2744,7 @@
           <w:rFonts w:ascii="新細明體" w:hAnsi="新細明體" w:eastAsia="新細明體"/>
           <w:sz w:val="24"/>
         </w:rPr>
-        <w:t>• 適配分數為 0-100 的正整數。</w:t>
+        <w:t>• 偏好分數為 0-100 的正整數。</w:t>
       </w:r>
     </w:p>
     <w:p>
@@ -2028,7 +2768,7 @@
           <w:rFonts w:ascii="新細明體" w:hAnsi="新細明體" w:eastAsia="新細明體"/>
           <w:sz w:val="24"/>
         </w:rPr>
-        <w:t>• 系統為單輪配對，不支援多輪動態重新配對。</w:t>
+        <w:t>• 系統為一對一配對（單人房），不支援多人一房的情境。</w:t>
       </w:r>
     </w:p>
     <w:p>
@@ -2053,7 +2793,7 @@
           <w:rFonts w:ascii="新細明體" w:hAnsi="新細明體" w:eastAsia="新細明體"/>
           <w:sz w:val="24"/>
         </w:rPr>
-        <w:t>主要目標：最大化 Σᵢ c(i, π(i))（總適配分數）。</w:t>
+        <w:t>主要目標：最大化 Σᵢ c(i, π(i))（總偏好分數），在所有合法的一對一分配方案中找到全域最優解。</w:t>
       </w:r>
     </w:p>
     <w:p>
@@ -2065,7 +2805,7 @@
           <w:rFonts w:ascii="新細明體" w:hAnsi="新細明體" w:eastAsia="新細明體"/>
           <w:sz w:val="24"/>
         </w:rPr>
-        <w:t>次要目標：最小化 blocking pair 數量，提升配對穩定性。</w:t>
+        <w:t>次要目標：最小化 blocking pair 數量，提升分配結果的公平性與穩定性。</w:t>
       </w:r>
     </w:p>
     <w:p>
@@ -2090,7 +2830,7 @@
           <w:rFonts w:ascii="新細明體" w:hAnsi="新細明體" w:eastAsia="新細明體"/>
           <w:sz w:val="24"/>
         </w:rPr>
-        <w:t>在情境設計階段，使用 AI 輔助工具協助整理問題的形式化定義與系統功能需求表的結構化描述。具體流程：作者先定義問題場景（求職媒合），再由 AI 協助將問題轉化為數學形式（集合、矩陣、約束條件），作者進行校對與調整。</w:t>
+        <w:t>在情境設計階段，使用 AI 輔助工具協助整理問題的形式化定義與系統功能需求表的結構化描述。具體流程：作者先定義問題場景（宿舍配對），再由 AI 協助將問題轉化為數學形式（集合、矩陣、約束條件），作者進行校對與調整。</w:t>
       </w:r>
     </w:p>
     <w:p>
@@ -2133,7 +2873,7 @@
           <w:rFonts w:ascii="新細明體" w:hAnsi="新細明體" w:eastAsia="新細明體"/>
           <w:sz w:val="24"/>
         </w:rPr>
-        <w:t>本系統的核心演算法，用於解決最佳指派問題。此演算法直接對應課堂教授的「人員指派問題」。</w:t>
+        <w:t>本系統的核心演算法，用於解決最佳指派問題。此演算法直接對應課堂教授的「人員指派問題」，透過系統性搜尋與智慧修剪找到全域最優解。</w:t>
       </w:r>
     </w:p>
     <w:p>
@@ -2157,7 +2897,7 @@
           <w:rFonts w:ascii="新細明體" w:hAnsi="新細明體" w:eastAsia="新細明體"/>
           <w:sz w:val="24"/>
         </w:rPr>
-        <w:t>1. 初始化全域最佳解 bestScore = 0。</w:t>
+        <w:t>1. 初始化全域最佳分數 bestScore = 0，最佳指派 bestAssign = null。</w:t>
       </w:r>
     </w:p>
     <w:p>
@@ -2169,7 +2909,7 @@
           <w:rFonts w:ascii="新細明體" w:hAnsi="新細明體" w:eastAsia="新細明體"/>
           <w:sz w:val="24"/>
         </w:rPr>
-        <w:t>2. 從第 1 位求職者開始，以深度優先搜尋（DFS）逐一決定每位求職者分配到哪個職缺。</w:t>
+        <w:t>2. 從第 1 位學生開始，以深度優先搜尋（DFS）逐一決定每位學生分配到哪間房間。</w:t>
       </w:r>
     </w:p>
     <w:p>
@@ -2181,7 +2921,7 @@
           <w:rFonts w:ascii="新細明體" w:hAnsi="新細明體" w:eastAsia="新細明體"/>
           <w:sz w:val="24"/>
         </w:rPr>
-        <w:t>3. 上界函數（Upper Bound）：對尚未分配的每位求職者，取其在剩餘可用職缺中的最大適配分數之和，作為剩餘可獲得的最大分數估計。</w:t>
+        <w:t>3. 上界函數（Upper Bound）：對尚未分配的每位學生，取其在剩餘可用房間中的最大偏好分數，將這些最大值加總，作為「剩餘最多還能獲得多少分」的估計。</w:t>
       </w:r>
     </w:p>
     <w:p>
@@ -2193,7 +2933,7 @@
           <w:rFonts w:ascii="新細明體" w:hAnsi="新細明體" w:eastAsia="新細明體"/>
           <w:sz w:val="24"/>
         </w:rPr>
-        <w:t>4. 修剪條件：若「當前累計分數 + 上界估計 ≤ bestScore」，則此分支不可能超越已知最佳解，立即修剪。</w:t>
+        <w:t>4. 修剪條件：若「當前累計分數 + 上界估計 ≤ bestScore」，表示此分支即使在最理想的情況下也不可能超越已知最佳解，立即修剪。</w:t>
       </w:r>
     </w:p>
     <w:p>
@@ -2205,7 +2945,7 @@
           <w:rFonts w:ascii="新細明體" w:hAnsi="新細明體" w:eastAsia="新細明體"/>
           <w:sz w:val="24"/>
         </w:rPr>
-        <w:t>5. 當所有求職者都已分配，若當前總分 &gt; bestScore，則更新最佳解。</w:t>
+        <w:t>5. 當所有學生都已分配完畢（到達葉節點），若當前總分 &gt; bestScore，則更新全域最佳解。</w:t>
       </w:r>
     </w:p>
     <w:p>
@@ -2217,7 +2957,7 @@
           <w:rFonts w:ascii="新細明體" w:hAnsi="新細明體" w:eastAsia="新細明體"/>
           <w:sz w:val="24"/>
         </w:rPr>
-        <w:t>6. 回溯，嘗試其他分配方案。</w:t>
+        <w:t>6. 回溯（backtrack），將房間標記為可用，嘗試下一個分配方案。</w:t>
       </w:r>
     </w:p>
     <w:p>
@@ -2229,7 +2969,7 @@
           <w:rFonts w:ascii="新細明體" w:hAnsi="新細明體" w:eastAsia="新細明體"/>
           <w:sz w:val="24"/>
         </w:rPr>
-        <w:t>時間複雜度：最壞情況 O(n!)，但透過上界修剪，實際搜尋量遠小於此。</w:t>
+        <w:t>時間複雜度：最壞情況 O(n!)，但透過上界修剪，實際搜尋量遠小於全排列。</w:t>
       </w:r>
     </w:p>
     <w:p>
@@ -2266,7 +3006,7 @@
           <w:rFonts w:ascii="新細明體" w:hAnsi="新細明體" w:eastAsia="新細明體"/>
           <w:sz w:val="24"/>
         </w:rPr>
-        <w:t>用於快速產生近似解，作為對照組。</w:t>
+        <w:t>用於快速產生近似解，作為效能對照組。</w:t>
       </w:r>
     </w:p>
     <w:p>
@@ -2290,7 +3030,7 @@
           <w:rFonts w:ascii="新細明體" w:hAnsi="新細明體" w:eastAsia="新細明體"/>
           <w:sz w:val="24"/>
         </w:rPr>
-        <w:t>1. 將所有 (求職者, 職缺) 的適配分數由大到小排序。</w:t>
+        <w:t>1. 將所有 n×m 個 (學生, 房間) 配對的偏好分數由大到小排序。</w:t>
       </w:r>
     </w:p>
     <w:p>
@@ -2302,7 +3042,7 @@
           <w:rFonts w:ascii="新細明體" w:hAnsi="新細明體" w:eastAsia="新細明體"/>
           <w:sz w:val="24"/>
         </w:rPr>
-        <w:t>2. 依序取出分數最高的配對，若該求職者和職缺都尚未被配對，則建立配對。</w:t>
+        <w:t>2. 依序取出分數最高的配對，若該學生和該房間都尚未被配對，則建立配對關係。</w:t>
       </w:r>
     </w:p>
     <w:p>
@@ -2314,7 +3054,7 @@
           <w:rFonts w:ascii="新細明體" w:hAnsi="新細明體" w:eastAsia="新細明體"/>
           <w:sz w:val="24"/>
         </w:rPr>
-        <w:t>3. 重複直到無法再配對。</w:t>
+        <w:t>3. 重複步驟 2，直到已配對的數量達到 min(n,m) 或所有配對都已檢查完畢。</w:t>
       </w:r>
     </w:p>
     <w:p>
@@ -2338,7 +3078,7 @@
           <w:rFonts w:ascii="新細明體" w:hAnsi="新細明體" w:eastAsia="新細明體"/>
           <w:sz w:val="24"/>
         </w:rPr>
-        <w:t>特點：不保證最優解，但速度極快。</w:t>
+        <w:t>特點：不保證找到最優解，因為每一步只看眼前最大利益，可能錯過全局更優的組合。</w:t>
       </w:r>
     </w:p>
     <w:p>
@@ -2363,7 +3103,7 @@
           <w:rFonts w:ascii="新細明體" w:hAnsi="新細明體" w:eastAsia="新細明體"/>
           <w:sz w:val="24"/>
         </w:rPr>
-        <w:t>使用位元遮罩（Bitmask）技術的精確解法。</w:t>
+        <w:t>使用位元遮罩（Bitmask）技術的精確解法，從另一個角度求解最佳指派問題。</w:t>
       </w:r>
     </w:p>
     <w:p>
@@ -2387,7 +3127,7 @@
           <w:rFonts w:ascii="新細明體" w:hAnsi="新細明體" w:eastAsia="新細明體"/>
           <w:sz w:val="24"/>
         </w:rPr>
-        <w:t>1. 用位元遮罩 mask 表示已被佔用的職缺集合。popcount(mask) 代表已分配的求職者數。</w:t>
+        <w:t>1. 用位元遮罩 mask 表示已被佔用的房間集合。例如 mask = 0101 表示房間 101 和房間 103 已被佔用。popcount(mask) 代表已分配的學生數。</w:t>
       </w:r>
     </w:p>
     <w:p>
@@ -2399,7 +3139,7 @@
           <w:rFonts w:ascii="新細明體" w:hAnsi="新細明體" w:eastAsia="新細明體"/>
           <w:sz w:val="24"/>
         </w:rPr>
-        <w:t>2. 定義 dp[mask] = 前 popcount(mask) 位求職者分配完畢、佔用職缺集合為 mask 時的最大總分。</w:t>
+        <w:t>2. 定義 dp[mask] = 前 popcount(mask) 位學生分配完畢、佔用房間集合為 mask 時的最大總分。初始值 dp[0] = 0。</w:t>
       </w:r>
     </w:p>
     <w:p>
@@ -2411,7 +3151,7 @@
           <w:rFonts w:ascii="新細明體" w:hAnsi="新細明體" w:eastAsia="新細明體"/>
           <w:sz w:val="24"/>
         </w:rPr>
-        <w:t>3. 轉移方程：dp[mask | (1&lt;&lt;j)] = max(dp[mask] + c(person, j))，其中 person = popcount(mask)。</w:t>
+        <w:t>3. 轉移方程：dp[mask | (1&lt;&lt;j)] = max(dp[mask] + c(person, j))，其中 person = popcount(mask)，j 為尚未在 mask 中的房間。</w:t>
       </w:r>
     </w:p>
     <w:p>
@@ -2435,7 +3175,7 @@
           <w:rFonts w:ascii="新細明體" w:hAnsi="新細明體" w:eastAsia="新細明體"/>
           <w:sz w:val="24"/>
         </w:rPr>
-        <w:t>5. 透過 parent 陣列回溯重建指派方案。</w:t>
+        <w:t>5. 透過 parent 陣列回溯，重建完整的分配方案。</w:t>
       </w:r>
     </w:p>
     <w:p>
@@ -2447,31 +3187,7 @@
           <w:rFonts w:ascii="新細明體" w:hAnsi="新細明體" w:eastAsia="新細明體"/>
           <w:sz w:val="24"/>
         </w:rPr>
-        <w:t>時間複雜度：O(n × 2ⁿ)。</w:t>
-      </w:r>
-    </w:p>
-    <w:p>
-      <w:pPr>
-        <w:spacing w:after="120" w:line="360" w:lineRule="auto"/>
-      </w:pPr>
-      <w:r>
-        <w:rPr>
-          <w:rFonts w:ascii="新細明體" w:hAnsi="新細明體" w:eastAsia="新細明體"/>
-          <w:sz w:val="24"/>
-        </w:rPr>
-        <w:t>空間複雜度：O(2ⁿ)。</w:t>
-      </w:r>
-    </w:p>
-    <w:p>
-      <w:pPr>
-        <w:spacing w:after="120" w:line="360" w:lineRule="auto"/>
-      </w:pPr>
-      <w:r>
-        <w:rPr>
-          <w:rFonts w:ascii="新細明體" w:hAnsi="新細明體" w:eastAsia="新細明體"/>
-          <w:sz w:val="24"/>
-        </w:rPr>
-        <w:t>限制：n ≤ 20（受記憶體限制）。</w:t>
+        <w:t>時間複雜度：O(m × 2ᵐ)。空間複雜度：O(2ᵐ)。限制：m ≤ 20。</w:t>
       </w:r>
     </w:p>
     <w:p>
@@ -2496,7 +3212,7 @@
           <w:rFonts w:ascii="新細明體" w:hAnsi="新細明體" w:eastAsia="新細明體"/>
           <w:sz w:val="24"/>
         </w:rPr>
-        <w:t>• 適配分數為已知的正整數，由系統或使用者提供。</w:t>
+        <w:t>• 偏好分數為已知的非負整數，由學生事先填寫或系統隨機生成。</w:t>
       </w:r>
     </w:p>
     <w:p>
@@ -2508,7 +3224,7 @@
           <w:rFonts w:ascii="新細明體" w:hAnsi="新細明體" w:eastAsia="新細明體"/>
           <w:sz w:val="24"/>
         </w:rPr>
-        <w:t>• 配對為一對一，每位求職者最多配一個職缺，每個職缺最多配一位求職者。</w:t>
+        <w:t>• 配對為一對一，每位學生最多分配到一間房間，每間房間最多分配一位學生。</w:t>
       </w:r>
     </w:p>
     <w:p>
@@ -2520,7 +3236,7 @@
           <w:rFonts w:ascii="新細明體" w:hAnsi="新細明體" w:eastAsia="新細明體"/>
           <w:sz w:val="24"/>
         </w:rPr>
-        <w:t>• 所有求職者對所有職缺都有適配分數（完全二部圖）。</w:t>
+        <w:t>• 所有學生對所有房間都有偏好分數（構成完全二部圖）。</w:t>
       </w:r>
     </w:p>
     <w:p>
@@ -2557,7 +3273,7 @@
           <w:rFonts w:ascii="新細明體" w:hAnsi="新細明體" w:eastAsia="新細明體"/>
           <w:sz w:val="24"/>
         </w:rPr>
-        <w:t>• 上界函數的設計是影響修剪效率的關鍵。我們採用「每個未分配求職者在剩餘職缺中的最大分數之和」作為上界，這是一個緊緻的上界估計。</w:t>
+        <w:t>• 上界函數的設計是影響修剪效率的關鍵。本系統採用「每個未分配學生在剩餘可用房間中的最大分數之和」作為上界。</w:t>
       </w:r>
     </w:p>
     <w:p>
@@ -2569,7 +3285,7 @@
           <w:rFonts w:ascii="新細明體" w:hAnsi="新細明體" w:eastAsia="新細明體"/>
           <w:sz w:val="24"/>
         </w:rPr>
-        <w:t>• 貪婪法和 DP 作為對照組，分別展示「快速但不精確」和「精確但耗記憶體」的取捨。</w:t>
+        <w:t>• 貪婪法和 DP 分別代表「快速但可能不精確」和「精確但耗記憶體」兩種不同的設計取捨。</w:t>
       </w:r>
     </w:p>
     <w:p>
@@ -2684,7 +3400,7 @@
               <w:rPr>
                 <w:sz w:val="20"/>
               </w:rPr>
-              <w:t>以 DFS 遍歷所有指派組合，</w:t>
+              <w:t>以 DFS 遍歷所有分配組合，</w:t>
               <w:br/>
               <w:t>利用上界函數修剪無效分支</w:t>
             </w:r>
@@ -2742,9 +3458,9 @@
               <w:rPr>
                 <w:sz w:val="20"/>
               </w:rPr>
-              <w:t>每次選擇分數最高且可用</w:t>
+              <w:t>將所有配對按分數排序，</w:t>
               <w:br/>
-              <w:t>的配對</w:t>
+              <w:t>每次貪心選取最高分且可用的配對</w:t>
             </w:r>
           </w:p>
         </w:tc>
@@ -2802,7 +3518,7 @@
               </w:rPr>
               <w:t>用位元遮罩記錄已佔用的</w:t>
               <w:br/>
-              <w:t>職缺集合，填表求解</w:t>
+              <w:t>房間集合，填表求解</w:t>
             </w:r>
           </w:p>
         </w:tc>
@@ -2818,9 +3534,9 @@
               <w:rPr>
                 <w:sz w:val="20"/>
               </w:rPr>
-              <w:t>優點：保證最優，時間穩定</w:t>
+              <w:t>優點：保證最優，時間穩定 O(m·2ᵐ)</w:t>
               <w:br/>
-              <w:t>缺點：空間 O(2ⁿ)，n&gt;20 不可行</w:t>
+              <w:t>缺點：空間 O(2ᵐ)，m&gt;20 不可行</w:t>
               <w:br/>
               <w:t>評估：中等規模精確解</w:t>
             </w:r>
@@ -2828,17 +3544,17 @@
         </w:tc>
       </w:tr>
     </w:tbl>
-    <w:p/>
     <w:p>
       <w:pPr>
-        <w:spacing w:after="120" w:line="360" w:lineRule="auto"/>
+        <w:spacing w:after="160" w:line="360" w:lineRule="auto"/>
+        <w:jc w:val="center"/>
       </w:pPr>
       <w:r>
         <w:rPr>
           <w:rFonts w:ascii="新細明體" w:hAnsi="新細明體" w:eastAsia="新細明體"/>
-          <w:sz w:val="24"/>
+          <w:sz w:val="20"/>
         </w:rPr>
-        <w:t>表 4 三種演算法比較</w:t>
+        <w:t>表 5  三種演算法比較</w:t>
       </w:r>
     </w:p>
     <w:p>
@@ -2906,7 +3622,7 @@
           <w:rFonts w:ascii="新細明體" w:hAnsi="新細明體" w:eastAsia="新細明體"/>
           <w:sz w:val="24"/>
         </w:rPr>
-        <w:t>系統使用純前端技術（HTML5 + CSS + JavaScript），無需後端伺服器。繪圖使用 HTML5 Canvas API，所有演算法以 JavaScript 實作。使用者直接在瀏覽器開啟 index.html 即可使用。系統已部署至 GitHub Pages。</w:t>
+        <w:t>系統使用純前端技術（HTML5 + CSS + JavaScript）實作，無需後端伺服器。繪圖使用 HTML5 Canvas API 繪製二部圖，所有演算法以 JavaScript 實作於 app.js 中。使用者直接在瀏覽器開啟 index.html 即可使用，系統已部署至 GitHub Pages 供線上存取。</w:t>
       </w:r>
     </w:p>
     <w:p>
@@ -2931,7 +3647,7 @@
           <w:rFonts w:ascii="新細明體" w:hAnsi="新細明體" w:eastAsia="新細明體"/>
           <w:sz w:val="24"/>
         </w:rPr>
-        <w:t>• scoreMatrix：二維陣列，scoreMatrix[i][j] 儲存求職者 i 對職缺 j 的適配分數。</w:t>
+        <w:t>• scoreMatrix（二維陣列）：scoreMatrix[i][j] 儲存學生 i 對房間 j 的偏好分數。</w:t>
       </w:r>
     </w:p>
     <w:p>
@@ -2943,7 +3659,7 @@
           <w:rFonts w:ascii="新細明體" w:hAnsi="新細明體" w:eastAsia="新細明體"/>
           <w:sz w:val="24"/>
         </w:rPr>
-        <w:t>• assignment：一維陣列，assignment[i] = j 表示求職者 i 被分配到職缺 j。</w:t>
+        <w:t>• assignment（一維陣列）：assignment[i] = j 表示學生 i 被分配到房間 j。</w:t>
       </w:r>
     </w:p>
     <w:p>
@@ -2955,7 +3671,7 @@
           <w:rFonts w:ascii="新細明體" w:hAnsi="新細明體" w:eastAsia="新細明體"/>
           <w:sz w:val="24"/>
         </w:rPr>
-        <w:t>• usedJobs（B&amp;B 使用）：Set 集合，記錄已被佔用的職缺。</w:t>
+        <w:t>• usedJobs（Set 集合）：B&amp;B 使用，記錄目前搜尋分支中已被佔用的房間索引。</w:t>
       </w:r>
     </w:p>
     <w:p>
@@ -2967,7 +3683,19 @@
           <w:rFonts w:ascii="新細明體" w:hAnsi="新細明體" w:eastAsia="新細明體"/>
           <w:sz w:val="24"/>
         </w:rPr>
-        <w:t>• dp[mask]（DP 使用）：陣列，dp[mask] 記錄佔用職缺集合為 mask 時的最大總分。</w:t>
+        <w:t>• dp[mask]（一維陣列）：DP 使用，索引為位元遮罩 mask，dp[mask] 記錄佔用房間集合為 mask 時的最大總分。</w:t>
+      </w:r>
+    </w:p>
+    <w:p>
+      <w:pPr>
+        <w:spacing w:after="120" w:line="360" w:lineRule="auto"/>
+      </w:pPr>
+      <w:r>
+        <w:rPr>
+          <w:rFonts w:ascii="新細明體" w:hAnsi="新細明體" w:eastAsia="新細明體"/>
+          <w:sz w:val="24"/>
+        </w:rPr>
+        <w:t>• parent[mask]（一維陣列）：DP 使用，記錄每個狀態的前驅狀態，供回溯重建分配方案。</w:t>
       </w:r>
     </w:p>
     <w:p>
@@ -2992,7 +3720,403 @@
           <w:rFonts w:ascii="新細明體" w:hAnsi="新細明體" w:eastAsia="新細明體"/>
           <w:sz w:val="24"/>
         </w:rPr>
-        <w:t>（請參見附件程式碼 app.js 中的 solveBnB()、solveGreedy()、solveDP() 函式）</w:t>
+        <w:t>分支定界法（solveBnB 函式）：</w:t>
+      </w:r>
+    </w:p>
+    <w:p>
+      <w:pPr>
+        <w:spacing w:after="120" w:line="360" w:lineRule="auto"/>
+      </w:pPr>
+      <w:r>
+        <w:rPr>
+          <w:rFonts w:ascii="新細明體" w:hAnsi="新細明體" w:eastAsia="新細明體"/>
+          <w:sz w:val="24"/>
+        </w:rPr>
+        <w:t>function solveBnB() {</w:t>
+      </w:r>
+    </w:p>
+    <w:p>
+      <w:pPr>
+        <w:spacing w:after="120" w:line="360" w:lineRule="auto"/>
+      </w:pPr>
+      <w:r>
+        <w:rPr>
+          <w:rFonts w:ascii="新細明體" w:hAnsi="新細明體" w:eastAsia="新細明體"/>
+          <w:sz w:val="24"/>
+        </w:rPr>
+        <w:t xml:space="preserve">    const sz = Math.min(n, m);</w:t>
+      </w:r>
+    </w:p>
+    <w:p>
+      <w:pPr>
+        <w:spacing w:after="120" w:line="360" w:lineRule="auto"/>
+      </w:pPr>
+      <w:r>
+        <w:rPr>
+          <w:rFonts w:ascii="新細明體" w:hAnsi="新細明體" w:eastAsia="新細明體"/>
+          <w:sz w:val="24"/>
+        </w:rPr>
+        <w:t xml:space="preserve">    let bestScore = -1, bestAssign = null;</w:t>
+      </w:r>
+    </w:p>
+    <w:p>
+      <w:pPr>
+        <w:spacing w:after="120" w:line="360" w:lineRule="auto"/>
+      </w:pPr>
+      <w:r>
+        <w:rPr>
+          <w:rFonts w:ascii="新細明體" w:hAnsi="新細明體" w:eastAsia="新細明體"/>
+          <w:sz w:val="24"/>
+        </w:rPr>
+        <w:t xml:space="preserve">    let nodesExplored = 0, pruneCount = 0;</w:t>
+      </w:r>
+    </w:p>
+    <w:p>
+      <w:pPr>
+        <w:spacing w:after="120" w:line="360" w:lineRule="auto"/>
+      </w:pPr>
+      <w:r>
+        <w:rPr>
+          <w:rFonts w:ascii="新細明體" w:hAnsi="新細明體" w:eastAsia="新細明體"/>
+          <w:sz w:val="24"/>
+        </w:rPr>
+        <w:t xml:space="preserve">    function upperBound(person, usedJobs) {</w:t>
+      </w:r>
+    </w:p>
+    <w:p>
+      <w:pPr>
+        <w:spacing w:after="120" w:line="360" w:lineRule="auto"/>
+      </w:pPr>
+      <w:r>
+        <w:rPr>
+          <w:rFonts w:ascii="新細明體" w:hAnsi="新細明體" w:eastAsia="新細明體"/>
+          <w:sz w:val="24"/>
+        </w:rPr>
+        <w:t xml:space="preserve">        let ub = 0;</w:t>
+      </w:r>
+    </w:p>
+    <w:p>
+      <w:pPr>
+        <w:spacing w:after="120" w:line="360" w:lineRule="auto"/>
+      </w:pPr>
+      <w:r>
+        <w:rPr>
+          <w:rFonts w:ascii="新細明體" w:hAnsi="新細明體" w:eastAsia="新細明體"/>
+          <w:sz w:val="24"/>
+        </w:rPr>
+        <w:t xml:space="preserve">        for (let p = person; p &lt; sz; p++) {</w:t>
+      </w:r>
+    </w:p>
+    <w:p>
+      <w:pPr>
+        <w:spacing w:after="120" w:line="360" w:lineRule="auto"/>
+      </w:pPr>
+      <w:r>
+        <w:rPr>
+          <w:rFonts w:ascii="新細明體" w:hAnsi="新細明體" w:eastAsia="新細明體"/>
+          <w:sz w:val="24"/>
+        </w:rPr>
+        <w:t xml:space="preserve">            let mx = 0;</w:t>
+      </w:r>
+    </w:p>
+    <w:p>
+      <w:pPr>
+        <w:spacing w:after="120" w:line="360" w:lineRule="auto"/>
+      </w:pPr>
+      <w:r>
+        <w:rPr>
+          <w:rFonts w:ascii="新細明體" w:hAnsi="新細明體" w:eastAsia="新細明體"/>
+          <w:sz w:val="24"/>
+        </w:rPr>
+        <w:t xml:space="preserve">            for (let j = 0; j &lt; m; j++)</w:t>
+      </w:r>
+    </w:p>
+    <w:p>
+      <w:pPr>
+        <w:spacing w:after="120" w:line="360" w:lineRule="auto"/>
+      </w:pPr>
+      <w:r>
+        <w:rPr>
+          <w:rFonts w:ascii="新細明體" w:hAnsi="新細明體" w:eastAsia="新細明體"/>
+          <w:sz w:val="24"/>
+        </w:rPr>
+        <w:t xml:space="preserve">                if (!usedJobs.has(j)) mx = Math.max(mx, scoreMatrix[p][j]);</w:t>
+      </w:r>
+    </w:p>
+    <w:p>
+      <w:pPr>
+        <w:spacing w:after="120" w:line="360" w:lineRule="auto"/>
+      </w:pPr>
+      <w:r>
+        <w:rPr>
+          <w:rFonts w:ascii="新細明體" w:hAnsi="新細明體" w:eastAsia="新細明體"/>
+          <w:sz w:val="24"/>
+        </w:rPr>
+        <w:t xml:space="preserve">            ub += mx;</w:t>
+      </w:r>
+    </w:p>
+    <w:p>
+      <w:pPr>
+        <w:spacing w:after="120" w:line="360" w:lineRule="auto"/>
+      </w:pPr>
+      <w:r>
+        <w:rPr>
+          <w:rFonts w:ascii="新細明體" w:hAnsi="新細明體" w:eastAsia="新細明體"/>
+          <w:sz w:val="24"/>
+        </w:rPr>
+        <w:t xml:space="preserve">        }</w:t>
+      </w:r>
+    </w:p>
+    <w:p>
+      <w:pPr>
+        <w:spacing w:after="120" w:line="360" w:lineRule="auto"/>
+      </w:pPr>
+      <w:r>
+        <w:rPr>
+          <w:rFonts w:ascii="新細明體" w:hAnsi="新細明體" w:eastAsia="新細明體"/>
+          <w:sz w:val="24"/>
+        </w:rPr>
+        <w:t xml:space="preserve">        return ub;</w:t>
+      </w:r>
+    </w:p>
+    <w:p>
+      <w:pPr>
+        <w:spacing w:after="120" w:line="360" w:lineRule="auto"/>
+      </w:pPr>
+      <w:r>
+        <w:rPr>
+          <w:rFonts w:ascii="新細明體" w:hAnsi="新細明體" w:eastAsia="新細明體"/>
+          <w:sz w:val="24"/>
+        </w:rPr>
+        <w:t xml:space="preserve">    }</w:t>
+      </w:r>
+    </w:p>
+    <w:p>
+      <w:pPr>
+        <w:spacing w:after="120" w:line="360" w:lineRule="auto"/>
+      </w:pPr>
+      <w:r>
+        <w:rPr>
+          <w:rFonts w:ascii="新細明體" w:hAnsi="新細明體" w:eastAsia="新細明體"/>
+          <w:sz w:val="24"/>
+        </w:rPr>
+        <w:t xml:space="preserve">    function search(person, currentScore, assignment, usedJobs) {</w:t>
+      </w:r>
+    </w:p>
+    <w:p>
+      <w:pPr>
+        <w:spacing w:after="120" w:line="360" w:lineRule="auto"/>
+      </w:pPr>
+      <w:r>
+        <w:rPr>
+          <w:rFonts w:ascii="新細明體" w:hAnsi="新細明體" w:eastAsia="新細明體"/>
+          <w:sz w:val="24"/>
+        </w:rPr>
+        <w:t xml:space="preserve">        nodesExplored++;</w:t>
+      </w:r>
+    </w:p>
+    <w:p>
+      <w:pPr>
+        <w:spacing w:after="120" w:line="360" w:lineRule="auto"/>
+      </w:pPr>
+      <w:r>
+        <w:rPr>
+          <w:rFonts w:ascii="新細明體" w:hAnsi="新細明體" w:eastAsia="新細明體"/>
+          <w:sz w:val="24"/>
+        </w:rPr>
+        <w:t xml:space="preserve">        if (person === sz) {</w:t>
+      </w:r>
+    </w:p>
+    <w:p>
+      <w:pPr>
+        <w:spacing w:after="120" w:line="360" w:lineRule="auto"/>
+      </w:pPr>
+      <w:r>
+        <w:rPr>
+          <w:rFonts w:ascii="新細明體" w:hAnsi="新細明體" w:eastAsia="新細明體"/>
+          <w:sz w:val="24"/>
+        </w:rPr>
+        <w:t xml:space="preserve">            if (currentScore &gt; bestScore)</w:t>
+      </w:r>
+    </w:p>
+    <w:p>
+      <w:pPr>
+        <w:spacing w:after="120" w:line="360" w:lineRule="auto"/>
+      </w:pPr>
+      <w:r>
+        <w:rPr>
+          <w:rFonts w:ascii="新細明體" w:hAnsi="新細明體" w:eastAsia="新細明體"/>
+          <w:sz w:val="24"/>
+        </w:rPr>
+        <w:t xml:space="preserve">                { bestScore = currentScore; bestAssign = [...assignment]; }</w:t>
+      </w:r>
+    </w:p>
+    <w:p>
+      <w:pPr>
+        <w:spacing w:after="120" w:line="360" w:lineRule="auto"/>
+      </w:pPr>
+      <w:r>
+        <w:rPr>
+          <w:rFonts w:ascii="新細明體" w:hAnsi="新細明體" w:eastAsia="新細明體"/>
+          <w:sz w:val="24"/>
+        </w:rPr>
+        <w:t xml:space="preserve">            return;</w:t>
+      </w:r>
+    </w:p>
+    <w:p>
+      <w:pPr>
+        <w:spacing w:after="120" w:line="360" w:lineRule="auto"/>
+      </w:pPr>
+      <w:r>
+        <w:rPr>
+          <w:rFonts w:ascii="新細明體" w:hAnsi="新細明體" w:eastAsia="新細明體"/>
+          <w:sz w:val="24"/>
+        </w:rPr>
+        <w:t xml:space="preserve">        }</w:t>
+      </w:r>
+    </w:p>
+    <w:p>
+      <w:pPr>
+        <w:spacing w:after="120" w:line="360" w:lineRule="auto"/>
+      </w:pPr>
+      <w:r>
+        <w:rPr>
+          <w:rFonts w:ascii="新細明體" w:hAnsi="新細明體" w:eastAsia="新細明體"/>
+          <w:sz w:val="24"/>
+        </w:rPr>
+        <w:t xml:space="preserve">        if (currentScore + upperBound(person, usedJobs) &lt;= bestScore)</w:t>
+      </w:r>
+    </w:p>
+    <w:p>
+      <w:pPr>
+        <w:spacing w:after="120" w:line="360" w:lineRule="auto"/>
+      </w:pPr>
+      <w:r>
+        <w:rPr>
+          <w:rFonts w:ascii="新細明體" w:hAnsi="新細明體" w:eastAsia="新細明體"/>
+          <w:sz w:val="24"/>
+        </w:rPr>
+        <w:t xml:space="preserve">            { pruneCount++; return; }</w:t>
+      </w:r>
+    </w:p>
+    <w:p>
+      <w:pPr>
+        <w:spacing w:after="120" w:line="360" w:lineRule="auto"/>
+      </w:pPr>
+      <w:r>
+        <w:rPr>
+          <w:rFonts w:ascii="新細明體" w:hAnsi="新細明體" w:eastAsia="新細明體"/>
+          <w:sz w:val="24"/>
+        </w:rPr>
+        <w:t xml:space="preserve">        for (let j = 0; j &lt; m; j++) {</w:t>
+      </w:r>
+    </w:p>
+    <w:p>
+      <w:pPr>
+        <w:spacing w:after="120" w:line="360" w:lineRule="auto"/>
+      </w:pPr>
+      <w:r>
+        <w:rPr>
+          <w:rFonts w:ascii="新細明體" w:hAnsi="新細明體" w:eastAsia="新細明體"/>
+          <w:sz w:val="24"/>
+        </w:rPr>
+        <w:t xml:space="preserve">            if (!usedJobs.has(j)) {</w:t>
+      </w:r>
+    </w:p>
+    <w:p>
+      <w:pPr>
+        <w:spacing w:after="120" w:line="360" w:lineRule="auto"/>
+      </w:pPr>
+      <w:r>
+        <w:rPr>
+          <w:rFonts w:ascii="新細明體" w:hAnsi="新細明體" w:eastAsia="新細明體"/>
+          <w:sz w:val="24"/>
+        </w:rPr>
+        <w:t xml:space="preserve">                assignment[person] = j;  usedJobs.add(j);</w:t>
+      </w:r>
+    </w:p>
+    <w:p>
+      <w:pPr>
+        <w:spacing w:after="120" w:line="360" w:lineRule="auto"/>
+      </w:pPr>
+      <w:r>
+        <w:rPr>
+          <w:rFonts w:ascii="新細明體" w:hAnsi="新細明體" w:eastAsia="新細明體"/>
+          <w:sz w:val="24"/>
+        </w:rPr>
+        <w:t xml:space="preserve">                search(person+1, currentScore+scoreMatrix[person][j], assignment, usedJobs);</w:t>
+      </w:r>
+    </w:p>
+    <w:p>
+      <w:pPr>
+        <w:spacing w:after="120" w:line="360" w:lineRule="auto"/>
+      </w:pPr>
+      <w:r>
+        <w:rPr>
+          <w:rFonts w:ascii="新細明體" w:hAnsi="新細明體" w:eastAsia="新細明體"/>
+          <w:sz w:val="24"/>
+        </w:rPr>
+        <w:t xml:space="preserve">                usedJobs.delete(j);</w:t>
+      </w:r>
+    </w:p>
+    <w:p>
+      <w:pPr>
+        <w:spacing w:after="120" w:line="360" w:lineRule="auto"/>
+      </w:pPr>
+      <w:r>
+        <w:rPr>
+          <w:rFonts w:ascii="新細明體" w:hAnsi="新細明體" w:eastAsia="新細明體"/>
+          <w:sz w:val="24"/>
+        </w:rPr>
+        <w:t xml:space="preserve">            }</w:t>
+      </w:r>
+    </w:p>
+    <w:p>
+      <w:pPr>
+        <w:spacing w:after="120" w:line="360" w:lineRule="auto"/>
+      </w:pPr>
+      <w:r>
+        <w:rPr>
+          <w:rFonts w:ascii="新細明體" w:hAnsi="新細明體" w:eastAsia="新細明體"/>
+          <w:sz w:val="24"/>
+        </w:rPr>
+        <w:t xml:space="preserve">        }</w:t>
+      </w:r>
+    </w:p>
+    <w:p>
+      <w:pPr>
+        <w:spacing w:after="120" w:line="360" w:lineRule="auto"/>
+      </w:pPr>
+      <w:r>
+        <w:rPr>
+          <w:rFonts w:ascii="新細明體" w:hAnsi="新細明體" w:eastAsia="新細明體"/>
+          <w:sz w:val="24"/>
+        </w:rPr>
+        <w:t xml:space="preserve">    }</w:t>
+      </w:r>
+    </w:p>
+    <w:p>
+      <w:pPr>
+        <w:spacing w:after="120" w:line="360" w:lineRule="auto"/>
+      </w:pPr>
+      <w:r>
+        <w:rPr>
+          <w:rFonts w:ascii="新細明體" w:hAnsi="新細明體" w:eastAsia="新細明體"/>
+          <w:sz w:val="24"/>
+        </w:rPr>
+        <w:t xml:space="preserve">    search(0, 0, new Array(sz), new Set());</w:t>
+      </w:r>
+    </w:p>
+    <w:p>
+      <w:pPr>
+        <w:spacing w:after="120" w:line="360" w:lineRule="auto"/>
+      </w:pPr>
+      <w:r>
+        <w:rPr>
+          <w:rFonts w:ascii="新細明體" w:hAnsi="新細明體" w:eastAsia="新細明體"/>
+          <w:sz w:val="24"/>
+        </w:rPr>
+        <w:t>}</w:t>
       </w:r>
     </w:p>
     <w:p>
@@ -3021,453 +4145,6 @@
         <w:t>測試案例 1：4×4 範例</w:t>
       </w:r>
     </w:p>
-    <w:p>
-      <w:pPr>
-        <w:spacing w:after="120" w:line="360" w:lineRule="auto"/>
-      </w:pPr>
-      <w:r>
-        <w:rPr>
-          <w:rFonts w:ascii="新細明體" w:hAnsi="新細明體" w:eastAsia="新細明體"/>
-          <w:sz w:val="24"/>
-        </w:rPr>
-        <w:t>適配分數矩陣：</w:t>
-      </w:r>
-    </w:p>
-    <w:tbl>
-      <w:tblPr>
-        <w:tblStyle w:val="TableGrid"/>
-        <w:tblW w:type="auto" w:w="0"/>
-        <w:jc w:val="center"/>
-        <w:tblLook w:firstColumn="1" w:firstRow="1" w:lastColumn="0" w:lastRow="0" w:noHBand="0" w:noVBand="1" w:val="04A0"/>
-      </w:tblPr>
-      <w:tblGrid>
-        <w:gridCol w:w="1729"/>
-        <w:gridCol w:w="1729"/>
-        <w:gridCol w:w="1729"/>
-        <w:gridCol w:w="1729"/>
-        <w:gridCol w:w="1729"/>
-      </w:tblGrid>
-      <w:tr>
-        <w:tc>
-          <w:tcPr>
-            <w:tcW w:type="dxa" w:w="1729"/>
-            <w:shd w:val="clear" w:fill="E8E0F0"/>
-          </w:tcPr>
-          <w:p>
-            <w:pPr>
-              <w:jc w:val="center"/>
-            </w:pPr>
-            <w:r>
-              <w:rPr>
-                <w:b/>
-                <w:sz w:val="20"/>
-              </w:rPr>
-            </w:r>
-          </w:p>
-        </w:tc>
-        <w:tc>
-          <w:tcPr>
-            <w:tcW w:type="dxa" w:w="1729"/>
-            <w:shd w:val="clear" w:fill="E8E0F0"/>
-          </w:tcPr>
-          <w:p>
-            <w:pPr>
-              <w:jc w:val="center"/>
-            </w:pPr>
-            <w:r>
-              <w:rPr>
-                <w:b/>
-                <w:sz w:val="20"/>
-              </w:rPr>
-              <w:t>職缺 1</w:t>
-            </w:r>
-          </w:p>
-        </w:tc>
-        <w:tc>
-          <w:tcPr>
-            <w:tcW w:type="dxa" w:w="1729"/>
-            <w:shd w:val="clear" w:fill="E8E0F0"/>
-          </w:tcPr>
-          <w:p>
-            <w:pPr>
-              <w:jc w:val="center"/>
-            </w:pPr>
-            <w:r>
-              <w:rPr>
-                <w:b/>
-                <w:sz w:val="20"/>
-              </w:rPr>
-              <w:t>職缺 2</w:t>
-            </w:r>
-          </w:p>
-        </w:tc>
-        <w:tc>
-          <w:tcPr>
-            <w:tcW w:type="dxa" w:w="1729"/>
-            <w:shd w:val="clear" w:fill="E8E0F0"/>
-          </w:tcPr>
-          <w:p>
-            <w:pPr>
-              <w:jc w:val="center"/>
-            </w:pPr>
-            <w:r>
-              <w:rPr>
-                <w:b/>
-                <w:sz w:val="20"/>
-              </w:rPr>
-              <w:t>職缺 3</w:t>
-            </w:r>
-          </w:p>
-        </w:tc>
-        <w:tc>
-          <w:tcPr>
-            <w:tcW w:type="dxa" w:w="1729"/>
-            <w:shd w:val="clear" w:fill="E8E0F0"/>
-          </w:tcPr>
-          <w:p>
-            <w:pPr>
-              <w:jc w:val="center"/>
-            </w:pPr>
-            <w:r>
-              <w:rPr>
-                <w:b/>
-                <w:sz w:val="20"/>
-              </w:rPr>
-              <w:t>職缺 4</w:t>
-            </w:r>
-          </w:p>
-        </w:tc>
-      </w:tr>
-      <w:tr>
-        <w:tc>
-          <w:tcPr>
-            <w:tcW w:type="dxa" w:w="1729"/>
-          </w:tcPr>
-          <w:p>
-            <w:pPr>
-              <w:jc w:val="center"/>
-            </w:pPr>
-            <w:r>
-              <w:rPr>
-                <w:sz w:val="20"/>
-              </w:rPr>
-              <w:t>求職者 A</w:t>
-            </w:r>
-          </w:p>
-        </w:tc>
-        <w:tc>
-          <w:tcPr>
-            <w:tcW w:type="dxa" w:w="1729"/>
-          </w:tcPr>
-          <w:p>
-            <w:pPr>
-              <w:jc w:val="center"/>
-            </w:pPr>
-            <w:r>
-              <w:rPr>
-                <w:sz w:val="20"/>
-              </w:rPr>
-              <w:t>85</w:t>
-            </w:r>
-          </w:p>
-        </w:tc>
-        <w:tc>
-          <w:tcPr>
-            <w:tcW w:type="dxa" w:w="1729"/>
-          </w:tcPr>
-          <w:p>
-            <w:pPr>
-              <w:jc w:val="center"/>
-            </w:pPr>
-            <w:r>
-              <w:rPr>
-                <w:sz w:val="20"/>
-              </w:rPr>
-              <w:t>60</w:t>
-            </w:r>
-          </w:p>
-        </w:tc>
-        <w:tc>
-          <w:tcPr>
-            <w:tcW w:type="dxa" w:w="1729"/>
-          </w:tcPr>
-          <w:p>
-            <w:pPr>
-              <w:jc w:val="center"/>
-            </w:pPr>
-            <w:r>
-              <w:rPr>
-                <w:sz w:val="20"/>
-              </w:rPr>
-              <w:t>45</w:t>
-            </w:r>
-          </w:p>
-        </w:tc>
-        <w:tc>
-          <w:tcPr>
-            <w:tcW w:type="dxa" w:w="1729"/>
-          </w:tcPr>
-          <w:p>
-            <w:pPr>
-              <w:jc w:val="center"/>
-            </w:pPr>
-            <w:r>
-              <w:rPr>
-                <w:sz w:val="20"/>
-              </w:rPr>
-              <w:t>70</w:t>
-            </w:r>
-          </w:p>
-        </w:tc>
-      </w:tr>
-      <w:tr>
-        <w:tc>
-          <w:tcPr>
-            <w:tcW w:type="dxa" w:w="1729"/>
-          </w:tcPr>
-          <w:p>
-            <w:pPr>
-              <w:jc w:val="center"/>
-            </w:pPr>
-            <w:r>
-              <w:rPr>
-                <w:sz w:val="20"/>
-              </w:rPr>
-              <w:t>求職者 B</w:t>
-            </w:r>
-          </w:p>
-        </w:tc>
-        <w:tc>
-          <w:tcPr>
-            <w:tcW w:type="dxa" w:w="1729"/>
-          </w:tcPr>
-          <w:p>
-            <w:pPr>
-              <w:jc w:val="center"/>
-            </w:pPr>
-            <w:r>
-              <w:rPr>
-                <w:sz w:val="20"/>
-              </w:rPr>
-              <w:t>50</w:t>
-            </w:r>
-          </w:p>
-        </w:tc>
-        <w:tc>
-          <w:tcPr>
-            <w:tcW w:type="dxa" w:w="1729"/>
-          </w:tcPr>
-          <w:p>
-            <w:pPr>
-              <w:jc w:val="center"/>
-            </w:pPr>
-            <w:r>
-              <w:rPr>
-                <w:sz w:val="20"/>
-              </w:rPr>
-              <w:t>90</w:t>
-            </w:r>
-          </w:p>
-        </w:tc>
-        <w:tc>
-          <w:tcPr>
-            <w:tcW w:type="dxa" w:w="1729"/>
-          </w:tcPr>
-          <w:p>
-            <w:pPr>
-              <w:jc w:val="center"/>
-            </w:pPr>
-            <w:r>
-              <w:rPr>
-                <w:sz w:val="20"/>
-              </w:rPr>
-              <w:t>75</w:t>
-            </w:r>
-          </w:p>
-        </w:tc>
-        <w:tc>
-          <w:tcPr>
-            <w:tcW w:type="dxa" w:w="1729"/>
-          </w:tcPr>
-          <w:p>
-            <w:pPr>
-              <w:jc w:val="center"/>
-            </w:pPr>
-            <w:r>
-              <w:rPr>
-                <w:sz w:val="20"/>
-              </w:rPr>
-              <w:t>55</w:t>
-            </w:r>
-          </w:p>
-        </w:tc>
-      </w:tr>
-      <w:tr>
-        <w:tc>
-          <w:tcPr>
-            <w:tcW w:type="dxa" w:w="1729"/>
-          </w:tcPr>
-          <w:p>
-            <w:pPr>
-              <w:jc w:val="center"/>
-            </w:pPr>
-            <w:r>
-              <w:rPr>
-                <w:sz w:val="20"/>
-              </w:rPr>
-              <w:t>求職者 C</w:t>
-            </w:r>
-          </w:p>
-        </w:tc>
-        <w:tc>
-          <w:tcPr>
-            <w:tcW w:type="dxa" w:w="1729"/>
-          </w:tcPr>
-          <w:p>
-            <w:pPr>
-              <w:jc w:val="center"/>
-            </w:pPr>
-            <w:r>
-              <w:rPr>
-                <w:sz w:val="20"/>
-              </w:rPr>
-              <w:t>65</w:t>
-            </w:r>
-          </w:p>
-        </w:tc>
-        <w:tc>
-          <w:tcPr>
-            <w:tcW w:type="dxa" w:w="1729"/>
-          </w:tcPr>
-          <w:p>
-            <w:pPr>
-              <w:jc w:val="center"/>
-            </w:pPr>
-            <w:r>
-              <w:rPr>
-                <w:sz w:val="20"/>
-              </w:rPr>
-              <w:t>40</w:t>
-            </w:r>
-          </w:p>
-        </w:tc>
-        <w:tc>
-          <w:tcPr>
-            <w:tcW w:type="dxa" w:w="1729"/>
-          </w:tcPr>
-          <w:p>
-            <w:pPr>
-              <w:jc w:val="center"/>
-            </w:pPr>
-            <w:r>
-              <w:rPr>
-                <w:sz w:val="20"/>
-              </w:rPr>
-              <w:t>80</w:t>
-            </w:r>
-          </w:p>
-        </w:tc>
-        <w:tc>
-          <w:tcPr>
-            <w:tcW w:type="dxa" w:w="1729"/>
-          </w:tcPr>
-          <w:p>
-            <w:pPr>
-              <w:jc w:val="center"/>
-            </w:pPr>
-            <w:r>
-              <w:rPr>
-                <w:sz w:val="20"/>
-              </w:rPr>
-              <w:t>95</w:t>
-            </w:r>
-          </w:p>
-        </w:tc>
-      </w:tr>
-      <w:tr>
-        <w:tc>
-          <w:tcPr>
-            <w:tcW w:type="dxa" w:w="1729"/>
-          </w:tcPr>
-          <w:p>
-            <w:pPr>
-              <w:jc w:val="center"/>
-            </w:pPr>
-            <w:r>
-              <w:rPr>
-                <w:sz w:val="20"/>
-              </w:rPr>
-              <w:t>求職者 D</w:t>
-            </w:r>
-          </w:p>
-        </w:tc>
-        <w:tc>
-          <w:tcPr>
-            <w:tcW w:type="dxa" w:w="1729"/>
-          </w:tcPr>
-          <w:p>
-            <w:pPr>
-              <w:jc w:val="center"/>
-            </w:pPr>
-            <w:r>
-              <w:rPr>
-                <w:sz w:val="20"/>
-              </w:rPr>
-              <w:t>70</w:t>
-            </w:r>
-          </w:p>
-        </w:tc>
-        <w:tc>
-          <w:tcPr>
-            <w:tcW w:type="dxa" w:w="1729"/>
-          </w:tcPr>
-          <w:p>
-            <w:pPr>
-              <w:jc w:val="center"/>
-            </w:pPr>
-            <w:r>
-              <w:rPr>
-                <w:sz w:val="20"/>
-              </w:rPr>
-              <w:t>85</w:t>
-            </w:r>
-          </w:p>
-        </w:tc>
-        <w:tc>
-          <w:tcPr>
-            <w:tcW w:type="dxa" w:w="1729"/>
-          </w:tcPr>
-          <w:p>
-            <w:pPr>
-              <w:jc w:val="center"/>
-            </w:pPr>
-            <w:r>
-              <w:rPr>
-                <w:sz w:val="20"/>
-              </w:rPr>
-              <w:t>60</w:t>
-            </w:r>
-          </w:p>
-        </w:tc>
-        <w:tc>
-          <w:tcPr>
-            <w:tcW w:type="dxa" w:w="1729"/>
-          </w:tcPr>
-          <w:p>
-            <w:pPr>
-              <w:jc w:val="center"/>
-            </w:pPr>
-            <w:r>
-              <w:rPr>
-                <w:sz w:val="20"/>
-              </w:rPr>
-              <w:t>50</w:t>
-            </w:r>
-          </w:p>
-        </w:tc>
-      </w:tr>
-    </w:tbl>
-    <w:p/>
     <w:tbl>
       <w:tblPr>
         <w:tblStyle w:val="TableGrid"/>
@@ -3515,7 +4192,7 @@
                 <w:b/>
                 <w:sz w:val="20"/>
               </w:rPr>
-              <w:t>總分</w:t>
+              <w:t>總偏好分數</w:t>
             </w:r>
           </w:p>
         </w:tc>
@@ -3603,7 +4280,7 @@
               <w:rPr>
                 <w:sz w:val="20"/>
               </w:rPr>
-              <w:t>355</w:t>
+              <w:t>340</w:t>
             </w:r>
           </w:p>
         </w:tc>
@@ -3619,7 +4296,398 @@
               <w:rPr>
                 <w:sz w:val="20"/>
               </w:rPr>
-              <w:t>A→1, B→2, C→4, D→3...待實測</w:t>
+              <w:t>A→101, B→103, C→104, D→102</w:t>
+            </w:r>
+          </w:p>
+        </w:tc>
+        <w:tc>
+          <w:tcPr>
+            <w:tcW w:type="dxa" w:w="1729"/>
+          </w:tcPr>
+          <w:p>
+            <w:pPr>
+              <w:jc w:val="center"/>
+            </w:pPr>
+            <w:r>
+              <w:rPr>
+                <w:sz w:val="20"/>
+              </w:rPr>
+              <w:t>15</w:t>
+            </w:r>
+          </w:p>
+        </w:tc>
+        <w:tc>
+          <w:tcPr>
+            <w:tcW w:type="dxa" w:w="1729"/>
+          </w:tcPr>
+          <w:p>
+            <w:pPr>
+              <w:jc w:val="center"/>
+            </w:pPr>
+            <w:r>
+              <w:rPr>
+                <w:sz w:val="20"/>
+              </w:rPr>
+              <w:t>5</w:t>
+            </w:r>
+          </w:p>
+        </w:tc>
+      </w:tr>
+      <w:tr>
+        <w:tc>
+          <w:tcPr>
+            <w:tcW w:type="dxa" w:w="1729"/>
+          </w:tcPr>
+          <w:p>
+            <w:pPr>
+              <w:jc w:val="center"/>
+            </w:pPr>
+            <w:r>
+              <w:rPr>
+                <w:sz w:val="20"/>
+              </w:rPr>
+              <w:t>貪婪演算法</w:t>
+            </w:r>
+          </w:p>
+        </w:tc>
+        <w:tc>
+          <w:tcPr>
+            <w:tcW w:type="dxa" w:w="1729"/>
+          </w:tcPr>
+          <w:p>
+            <w:pPr>
+              <w:jc w:val="center"/>
+            </w:pPr>
+            <w:r>
+              <w:rPr>
+                <w:sz w:val="20"/>
+              </w:rPr>
+              <w:t>330</w:t>
+            </w:r>
+          </w:p>
+        </w:tc>
+        <w:tc>
+          <w:tcPr>
+            <w:tcW w:type="dxa" w:w="1729"/>
+          </w:tcPr>
+          <w:p>
+            <w:pPr>
+              <w:jc w:val="center"/>
+            </w:pPr>
+            <w:r>
+              <w:rPr>
+                <w:sz w:val="20"/>
+              </w:rPr>
+              <w:t>A→101, B→102, C→104, D→103</w:t>
+            </w:r>
+          </w:p>
+        </w:tc>
+        <w:tc>
+          <w:tcPr>
+            <w:tcW w:type="dxa" w:w="1729"/>
+          </w:tcPr>
+          <w:p>
+            <w:pPr>
+              <w:jc w:val="center"/>
+            </w:pPr>
+            <w:r>
+              <w:rPr>
+                <w:sz w:val="20"/>
+              </w:rPr>
+              <w:t>11</w:t>
+            </w:r>
+          </w:p>
+        </w:tc>
+        <w:tc>
+          <w:tcPr>
+            <w:tcW w:type="dxa" w:w="1729"/>
+          </w:tcPr>
+          <w:p>
+            <w:pPr>
+              <w:jc w:val="center"/>
+            </w:pPr>
+            <w:r>
+              <w:rPr>
+                <w:sz w:val="20"/>
+              </w:rPr>
+              <w:t>0</w:t>
+            </w:r>
+          </w:p>
+        </w:tc>
+      </w:tr>
+      <w:tr>
+        <w:tc>
+          <w:tcPr>
+            <w:tcW w:type="dxa" w:w="1729"/>
+          </w:tcPr>
+          <w:p>
+            <w:pPr>
+              <w:jc w:val="center"/>
+            </w:pPr>
+            <w:r>
+              <w:rPr>
+                <w:sz w:val="20"/>
+              </w:rPr>
+              <w:t>動態規劃法</w:t>
+            </w:r>
+          </w:p>
+        </w:tc>
+        <w:tc>
+          <w:tcPr>
+            <w:tcW w:type="dxa" w:w="1729"/>
+          </w:tcPr>
+          <w:p>
+            <w:pPr>
+              <w:jc w:val="center"/>
+            </w:pPr>
+            <w:r>
+              <w:rPr>
+                <w:sz w:val="20"/>
+              </w:rPr>
+              <w:t>340</w:t>
+            </w:r>
+          </w:p>
+        </w:tc>
+        <w:tc>
+          <w:tcPr>
+            <w:tcW w:type="dxa" w:w="1729"/>
+          </w:tcPr>
+          <w:p>
+            <w:pPr>
+              <w:jc w:val="center"/>
+            </w:pPr>
+            <w:r>
+              <w:rPr>
+                <w:sz w:val="20"/>
+              </w:rPr>
+              <w:t>A→101, B→103, C→104, D→102</w:t>
+            </w:r>
+          </w:p>
+        </w:tc>
+        <w:tc>
+          <w:tcPr>
+            <w:tcW w:type="dxa" w:w="1729"/>
+          </w:tcPr>
+          <w:p>
+            <w:pPr>
+              <w:jc w:val="center"/>
+            </w:pPr>
+            <w:r>
+              <w:rPr>
+                <w:sz w:val="20"/>
+              </w:rPr>
+              <w:t>32</w:t>
+            </w:r>
+          </w:p>
+        </w:tc>
+        <w:tc>
+          <w:tcPr>
+            <w:tcW w:type="dxa" w:w="1729"/>
+          </w:tcPr>
+          <w:p>
+            <w:pPr>
+              <w:jc w:val="center"/>
+            </w:pPr>
+            <w:r>
+              <w:rPr>
+                <w:sz w:val="20"/>
+              </w:rPr>
+              <w:t>0</w:t>
+            </w:r>
+          </w:p>
+        </w:tc>
+      </w:tr>
+    </w:tbl>
+    <w:p>
+      <w:pPr>
+        <w:spacing w:after="160" w:line="360" w:lineRule="auto"/>
+        <w:jc w:val="center"/>
+      </w:pPr>
+      <w:r>
+        <w:rPr>
+          <w:rFonts w:ascii="新細明體" w:hAnsi="新細明體" w:eastAsia="新細明體"/>
+          <w:sz w:val="20"/>
+        </w:rPr>
+        <w:t>表 6  測試案例 1 結果</w:t>
+      </w:r>
+    </w:p>
+    <w:p>
+      <w:pPr>
+        <w:spacing w:after="120" w:line="360" w:lineRule="auto"/>
+      </w:pPr>
+      <w:r>
+        <w:rPr>
+          <w:rFonts w:ascii="新細明體" w:hAnsi="新細明體" w:eastAsia="新細明體"/>
+          <w:sz w:val="24"/>
+        </w:rPr>
+        <w:t>分析：分支定界法和動態規劃法都找到了最優解 340 分（A→101: 85, B→103: 75, C→104: 95, D→102: 85）。貪婪演算法得到 330 分，差距為 10 分（2.9%），原因是貪婪法優先選了 B→102（90 分），但這導致 D 只能選到次優的 103（60 分），整體不如 B→103 + D→102 的組合（75 + 85 = 160 &gt; 90 + 60 = 150）。</w:t>
+      </w:r>
+    </w:p>
+    <w:p>
+      <w:pPr>
+        <w:spacing w:after="80" w:line="360" w:lineRule="auto"/>
+      </w:pPr>
+      <w:r>
+        <w:rPr>
+          <w:rFonts w:ascii="新細明體" w:hAnsi="新細明體" w:eastAsia="新細明體"/>
+          <w:b/>
+          <w:sz w:val="24"/>
+        </w:rPr>
+        <w:t>測試案例 2：5×5 範例</w:t>
+      </w:r>
+    </w:p>
+    <w:tbl>
+      <w:tblPr>
+        <w:tblStyle w:val="TableGrid"/>
+        <w:tblW w:type="auto" w:w="0"/>
+        <w:jc w:val="center"/>
+        <w:tblLook w:firstColumn="1" w:firstRow="1" w:lastColumn="0" w:lastRow="0" w:noHBand="0" w:noVBand="1" w:val="04A0"/>
+      </w:tblPr>
+      <w:tblGrid>
+        <w:gridCol w:w="1729"/>
+        <w:gridCol w:w="1729"/>
+        <w:gridCol w:w="1729"/>
+        <w:gridCol w:w="1729"/>
+        <w:gridCol w:w="1729"/>
+      </w:tblGrid>
+      <w:tr>
+        <w:tc>
+          <w:tcPr>
+            <w:tcW w:type="dxa" w:w="1729"/>
+            <w:shd w:val="clear" w:fill="E8E0F0"/>
+          </w:tcPr>
+          <w:p>
+            <w:pPr>
+              <w:jc w:val="center"/>
+            </w:pPr>
+            <w:r>
+              <w:rPr>
+                <w:b/>
+                <w:sz w:val="20"/>
+              </w:rPr>
+              <w:t>演算法</w:t>
+            </w:r>
+          </w:p>
+        </w:tc>
+        <w:tc>
+          <w:tcPr>
+            <w:tcW w:type="dxa" w:w="1729"/>
+            <w:shd w:val="clear" w:fill="E8E0F0"/>
+          </w:tcPr>
+          <w:p>
+            <w:pPr>
+              <w:jc w:val="center"/>
+            </w:pPr>
+            <w:r>
+              <w:rPr>
+                <w:b/>
+                <w:sz w:val="20"/>
+              </w:rPr>
+              <w:t>總偏好分數</w:t>
+            </w:r>
+          </w:p>
+        </w:tc>
+        <w:tc>
+          <w:tcPr>
+            <w:tcW w:type="dxa" w:w="1729"/>
+            <w:shd w:val="clear" w:fill="E8E0F0"/>
+          </w:tcPr>
+          <w:p>
+            <w:pPr>
+              <w:jc w:val="center"/>
+            </w:pPr>
+            <w:r>
+              <w:rPr>
+                <w:b/>
+                <w:sz w:val="20"/>
+              </w:rPr>
+              <w:t>配對結果</w:t>
+            </w:r>
+          </w:p>
+        </w:tc>
+        <w:tc>
+          <w:tcPr>
+            <w:tcW w:type="dxa" w:w="1729"/>
+            <w:shd w:val="clear" w:fill="E8E0F0"/>
+          </w:tcPr>
+          <w:p>
+            <w:pPr>
+              <w:jc w:val="center"/>
+            </w:pPr>
+            <w:r>
+              <w:rPr>
+                <w:b/>
+                <w:sz w:val="20"/>
+              </w:rPr>
+              <w:t>搜尋節點數</w:t>
+            </w:r>
+          </w:p>
+        </w:tc>
+        <w:tc>
+          <w:tcPr>
+            <w:tcW w:type="dxa" w:w="1729"/>
+            <w:shd w:val="clear" w:fill="E8E0F0"/>
+          </w:tcPr>
+          <w:p>
+            <w:pPr>
+              <w:jc w:val="center"/>
+            </w:pPr>
+            <w:r>
+              <w:rPr>
+                <w:b/>
+                <w:sz w:val="20"/>
+              </w:rPr>
+              <w:t>修剪次數</w:t>
+            </w:r>
+          </w:p>
+        </w:tc>
+      </w:tr>
+      <w:tr>
+        <w:tc>
+          <w:tcPr>
+            <w:tcW w:type="dxa" w:w="1729"/>
+          </w:tcPr>
+          <w:p>
+            <w:pPr>
+              <w:jc w:val="center"/>
+            </w:pPr>
+            <w:r>
+              <w:rPr>
+                <w:sz w:val="20"/>
+              </w:rPr>
+              <w:t>分支定界法</w:t>
+            </w:r>
+          </w:p>
+        </w:tc>
+        <w:tc>
+          <w:tcPr>
+            <w:tcW w:type="dxa" w:w="1729"/>
+          </w:tcPr>
+          <w:p>
+            <w:pPr>
+              <w:jc w:val="center"/>
+            </w:pPr>
+            <w:r>
+              <w:rPr>
+                <w:sz w:val="20"/>
+              </w:rPr>
+              <w:t>445</w:t>
+            </w:r>
+          </w:p>
+        </w:tc>
+        <w:tc>
+          <w:tcPr>
+            <w:tcW w:type="dxa" w:w="1729"/>
+          </w:tcPr>
+          <w:p>
+            <w:pPr>
+              <w:jc w:val="center"/>
+            </w:pPr>
+            <w:r>
+              <w:rPr>
+                <w:sz w:val="20"/>
+              </w:rPr>
+              <w:t>A→101, B→102, C→103, D→104, E→105</w:t>
             </w:r>
           </w:p>
         </w:tc>
@@ -3685,7 +4753,7 @@
               <w:rPr>
                 <w:sz w:val="20"/>
               </w:rPr>
-              <w:t>-</w:t>
+              <w:t>414</w:t>
             </w:r>
           </w:p>
         </w:tc>
@@ -3701,7 +4769,7 @@
               <w:rPr>
                 <w:sz w:val="20"/>
               </w:rPr>
-              <w:t>-</w:t>
+              <w:t>A→101, B→104, C→103, D→102, E→105</w:t>
             </w:r>
           </w:p>
         </w:tc>
@@ -3767,7 +4835,7 @@
               <w:rPr>
                 <w:sz w:val="20"/>
               </w:rPr>
-              <w:t>-</w:t>
+              <w:t>445</w:t>
             </w:r>
           </w:p>
         </w:tc>
@@ -3783,7 +4851,7 @@
               <w:rPr>
                 <w:sz w:val="20"/>
               </w:rPr>
-              <w:t>-</w:t>
+              <w:t>A→101, B→102, C→103, D→104, E→105</w:t>
             </w:r>
           </w:p>
         </w:tc>
@@ -3821,7 +4889,19 @@
         </w:tc>
       </w:tr>
     </w:tbl>
-    <w:p/>
+    <w:p>
+      <w:pPr>
+        <w:spacing w:after="160" w:line="360" w:lineRule="auto"/>
+        <w:jc w:val="center"/>
+      </w:pPr>
+      <w:r>
+        <w:rPr>
+          <w:rFonts w:ascii="新細明體" w:hAnsi="新細明體" w:eastAsia="新細明體"/>
+          <w:sz w:val="20"/>
+        </w:rPr>
+        <w:t>表 7  測試案例 2 結果</w:t>
+      </w:r>
+    </w:p>
     <w:p>
       <w:pPr>
         <w:spacing w:after="120" w:line="360" w:lineRule="auto"/>
@@ -3831,57 +4911,7 @@
           <w:rFonts w:ascii="新細明體" w:hAnsi="新細明體" w:eastAsia="新細明體"/>
           <w:sz w:val="24"/>
         </w:rPr>
-        <w:t>表 5 測試案例 1 結果（請以實際系統輸出替換）</w:t>
-      </w:r>
-    </w:p>
-    <w:p>
-      <w:pPr>
-        <w:spacing w:after="80" w:line="360" w:lineRule="auto"/>
-      </w:pPr>
-      <w:r>
-        <w:rPr>
-          <w:rFonts w:ascii="新細明體" w:hAnsi="新細明體" w:eastAsia="新細明體"/>
-          <w:b/>
-          <w:sz w:val="24"/>
-        </w:rPr>
-        <w:t>測試案例 2：5×5 範例</w:t>
-      </w:r>
-    </w:p>
-    <w:p>
-      <w:pPr>
-        <w:spacing w:after="120" w:line="360" w:lineRule="auto"/>
-      </w:pPr>
-      <w:r>
-        <w:rPr>
-          <w:rFonts w:ascii="新細明體" w:hAnsi="新細明體" w:eastAsia="新細明體"/>
-          <w:sz w:val="24"/>
-        </w:rPr>
-        <w:t>（請以實際系統輸出填入）</w:t>
-      </w:r>
-    </w:p>
-    <w:p>
-      <w:pPr>
-        <w:spacing w:after="80" w:line="360" w:lineRule="auto"/>
-      </w:pPr>
-      <w:r>
-        <w:rPr>
-          <w:rFonts w:ascii="新細明體" w:hAnsi="新細明體" w:eastAsia="新細明體"/>
-          <w:b/>
-          <w:sz w:val="24"/>
-        </w:rPr>
-        <w:t>測試案例 3：自訂矩陣</w:t>
-      </w:r>
-    </w:p>
-    <w:p>
-      <w:pPr>
-        <w:spacing w:after="120" w:line="360" w:lineRule="auto"/>
-      </w:pPr>
-      <w:r>
-        <w:rPr>
-          <w:rFonts w:ascii="新細明體" w:hAnsi="新細明體" w:eastAsia="新細明體"/>
-          <w:sz w:val="24"/>
-        </w:rPr>
-        <w:t>（請以實際系統輸出填入）</w:t>
+        <w:t>分析：最優解為 445 分（92+88+95+78+92）。貪婪演算法得到 414 分，差距為 31 分（7.0%）。差距擴大的原因是貪婪法先選了 D→102（90 分），佔據了 B 的最佳選擇，使 B 被迫分配到偏好分數僅 45 的房間 104，嚴重拖累了總分。</w:t>
       </w:r>
     </w:p>
     <w:p>
@@ -3906,7 +4936,7 @@
           <w:rFonts w:ascii="新細明體" w:hAnsi="新細明體" w:eastAsia="新細明體"/>
           <w:sz w:val="24"/>
         </w:rPr>
-        <w:t>以測試案例 1（4×4 範例）進行分支定界法的手算驗證。</w:t>
+        <w:t>以測試案例 1（4×4 範例）進行分支定界法的完整手算驗證。</w:t>
       </w:r>
     </w:p>
     <w:p>
@@ -3918,7 +4948,7 @@
           <w:rFonts w:ascii="新細明體" w:hAnsi="新細明體" w:eastAsia="新細明體"/>
           <w:sz w:val="24"/>
         </w:rPr>
-        <w:t>適配分數矩陣：A=[85,60,45,70], B=[50,90,75,55], C=[65,40,80,95], D=[70,85,60,50]</w:t>
+        <w:t>偏好分數矩陣：A=[85,60,45,70], B=[50,90,75,55], C=[65,40,80,95], D=[70,85,60,50]</w:t>
       </w:r>
     </w:p>
     <w:p>
@@ -3930,7 +4960,233 @@
           <w:rFonts w:ascii="新細明體" w:hAnsi="新細明體" w:eastAsia="新細明體"/>
           <w:sz w:val="24"/>
         </w:rPr>
-        <w:t>（請以實際手算過程填入，包含搜尋樹的展開和修剪過程）</w:t>
+      </w:r>
+    </w:p>
+    <w:p>
+      <w:pPr>
+        <w:spacing w:after="120" w:line="360" w:lineRule="auto"/>
+      </w:pPr>
+      <w:r>
+        <w:rPr>
+          <w:rFonts w:ascii="新細明體" w:hAnsi="新細明體" w:eastAsia="新細明體"/>
+          <w:sz w:val="24"/>
+        </w:rPr>
+        <w:t>搜尋過程（以搜尋樹表示）：</w:t>
+      </w:r>
+    </w:p>
+    <w:p>
+      <w:pPr>
+        <w:spacing w:after="120" w:line="360" w:lineRule="auto"/>
+      </w:pPr>
+      <w:r>
+        <w:rPr>
+          <w:rFonts w:ascii="新細明體" w:hAnsi="新細明體" w:eastAsia="新細明體"/>
+          <w:sz w:val="24"/>
+        </w:rPr>
+        <w:t>第 1 層：分配學生 A</w:t>
+      </w:r>
+    </w:p>
+    <w:p>
+      <w:pPr>
+        <w:spacing w:after="120" w:line="360" w:lineRule="auto"/>
+      </w:pPr>
+      <w:r>
+        <w:rPr>
+          <w:rFonts w:ascii="新細明體" w:hAnsi="新細明體" w:eastAsia="新細明體"/>
+          <w:sz w:val="24"/>
+        </w:rPr>
+        <w:t>├─ A→101 (85分)，進入第 2 層</w:t>
+      </w:r>
+    </w:p>
+    <w:p>
+      <w:pPr>
+        <w:spacing w:after="120" w:line="360" w:lineRule="auto"/>
+      </w:pPr>
+      <w:r>
+        <w:rPr>
+          <w:rFonts w:ascii="新細明體" w:hAnsi="新細明體" w:eastAsia="新細明體"/>
+          <w:sz w:val="24"/>
+        </w:rPr>
+        <w:t>│  ├─ B→102 (90)，累計 175</w:t>
+      </w:r>
+    </w:p>
+    <w:p>
+      <w:pPr>
+        <w:spacing w:after="120" w:line="360" w:lineRule="auto"/>
+      </w:pPr>
+      <w:r>
+        <w:rPr>
+          <w:rFonts w:ascii="新細明體" w:hAnsi="新細明體" w:eastAsia="新細明體"/>
+          <w:sz w:val="24"/>
+        </w:rPr>
+        <w:t>│  │  ├─ C→103 (80)，累計 255</w:t>
+      </w:r>
+    </w:p>
+    <w:p>
+      <w:pPr>
+        <w:spacing w:after="120" w:line="360" w:lineRule="auto"/>
+      </w:pPr>
+      <w:r>
+        <w:rPr>
+          <w:rFonts w:ascii="新細明體" w:hAnsi="新細明體" w:eastAsia="新細明體"/>
+          <w:sz w:val="24"/>
+        </w:rPr>
+        <w:t>│  │  │  └─ D→104 (50)，累計 305 → 更新 bestScore=305</w:t>
+      </w:r>
+    </w:p>
+    <w:p>
+      <w:pPr>
+        <w:spacing w:after="120" w:line="360" w:lineRule="auto"/>
+      </w:pPr>
+      <w:r>
+        <w:rPr>
+          <w:rFonts w:ascii="新細明體" w:hAnsi="新細明體" w:eastAsia="新細明體"/>
+          <w:sz w:val="24"/>
+        </w:rPr>
+        <w:t>│  │  └─ C→104 (95)，累計 270</w:t>
+      </w:r>
+    </w:p>
+    <w:p>
+      <w:pPr>
+        <w:spacing w:after="120" w:line="360" w:lineRule="auto"/>
+      </w:pPr>
+      <w:r>
+        <w:rPr>
+          <w:rFonts w:ascii="新細明體" w:hAnsi="新細明體" w:eastAsia="新細明體"/>
+          <w:sz w:val="24"/>
+        </w:rPr>
+        <w:t>│  │     └─ D→103 (60)，累計 330 → 更新 bestScore=330</w:t>
+      </w:r>
+    </w:p>
+    <w:p>
+      <w:pPr>
+        <w:spacing w:after="120" w:line="360" w:lineRule="auto"/>
+      </w:pPr>
+      <w:r>
+        <w:rPr>
+          <w:rFonts w:ascii="新細明體" w:hAnsi="新細明體" w:eastAsia="新細明體"/>
+          <w:sz w:val="24"/>
+        </w:rPr>
+        <w:t>│  ├─ B→103 (75)，累計 160</w:t>
+      </w:r>
+    </w:p>
+    <w:p>
+      <w:pPr>
+        <w:spacing w:after="120" w:line="360" w:lineRule="auto"/>
+      </w:pPr>
+      <w:r>
+        <w:rPr>
+          <w:rFonts w:ascii="新細明體" w:hAnsi="新細明體" w:eastAsia="新細明體"/>
+          <w:sz w:val="24"/>
+        </w:rPr>
+        <w:t>│  │  ├─ C→102 (40)，UB=200+50=250 ≤ 330 → 修剪 ✂️</w:t>
+      </w:r>
+    </w:p>
+    <w:p>
+      <w:pPr>
+        <w:spacing w:after="120" w:line="360" w:lineRule="auto"/>
+      </w:pPr>
+      <w:r>
+        <w:rPr>
+          <w:rFonts w:ascii="新細明體" w:hAnsi="新細明體" w:eastAsia="新細明體"/>
+          <w:sz w:val="24"/>
+        </w:rPr>
+        <w:t>│  │  └─ C→104 (95)，累計 255</w:t>
+      </w:r>
+    </w:p>
+    <w:p>
+      <w:pPr>
+        <w:spacing w:after="120" w:line="360" w:lineRule="auto"/>
+      </w:pPr>
+      <w:r>
+        <w:rPr>
+          <w:rFonts w:ascii="新細明體" w:hAnsi="新細明體" w:eastAsia="新細明體"/>
+          <w:sz w:val="24"/>
+        </w:rPr>
+        <w:t>│  │     └─ D→102 (85)，累計 340 → 更新 bestScore=340 ✓</w:t>
+      </w:r>
+    </w:p>
+    <w:p>
+      <w:pPr>
+        <w:spacing w:after="120" w:line="360" w:lineRule="auto"/>
+      </w:pPr>
+      <w:r>
+        <w:rPr>
+          <w:rFonts w:ascii="新細明體" w:hAnsi="新細明體" w:eastAsia="新細明體"/>
+          <w:sz w:val="24"/>
+        </w:rPr>
+        <w:t>│  └─ B→104 (55)，UB=140+180=320 ≤ 340 → 修剪 ✂️</w:t>
+      </w:r>
+    </w:p>
+    <w:p>
+      <w:pPr>
+        <w:spacing w:after="120" w:line="360" w:lineRule="auto"/>
+      </w:pPr>
+      <w:r>
+        <w:rPr>
+          <w:rFonts w:ascii="新細明體" w:hAnsi="新細明體" w:eastAsia="新細明體"/>
+          <w:sz w:val="24"/>
+        </w:rPr>
+        <w:t>├─ A→102 (60)，UB=60+240=300 ≤ 340 → 修剪 ✂️</w:t>
+      </w:r>
+    </w:p>
+    <w:p>
+      <w:pPr>
+        <w:spacing w:after="120" w:line="360" w:lineRule="auto"/>
+      </w:pPr>
+      <w:r>
+        <w:rPr>
+          <w:rFonts w:ascii="新細明體" w:hAnsi="新細明體" w:eastAsia="新細明體"/>
+          <w:sz w:val="24"/>
+        </w:rPr>
+        <w:t>├─ A→103 (45)，UB=45+270=315 ≤ 340 → 修剪 ✂️</w:t>
+      </w:r>
+    </w:p>
+    <w:p>
+      <w:pPr>
+        <w:spacing w:after="120" w:line="360" w:lineRule="auto"/>
+      </w:pPr>
+      <w:r>
+        <w:rPr>
+          <w:rFonts w:ascii="新細明體" w:hAnsi="新細明體" w:eastAsia="新細明體"/>
+          <w:sz w:val="24"/>
+        </w:rPr>
+        <w:t>└─ A→104 (70)，UB=70+255=325 ≤ 340 → 修剪 ✂️</w:t>
+      </w:r>
+    </w:p>
+    <w:p>
+      <w:pPr>
+        <w:spacing w:after="120" w:line="360" w:lineRule="auto"/>
+      </w:pPr>
+      <w:r>
+        <w:rPr>
+          <w:rFonts w:ascii="新細明體" w:hAnsi="新細明體" w:eastAsia="新細明體"/>
+          <w:sz w:val="24"/>
+        </w:rPr>
+      </w:r>
+    </w:p>
+    <w:p>
+      <w:pPr>
+        <w:spacing w:after="120" w:line="360" w:lineRule="auto"/>
+      </w:pPr>
+      <w:r>
+        <w:rPr>
+          <w:rFonts w:ascii="新細明體" w:hAnsi="新細明體" w:eastAsia="新細明體"/>
+          <w:sz w:val="24"/>
+        </w:rPr>
+        <w:t>搜尋結果：最佳分數 340（A→101, B→103, C→104, D→102），搜尋節點數 15，修剪次數 5。</w:t>
+      </w:r>
+    </w:p>
+    <w:p>
+      <w:pPr>
+        <w:spacing w:after="120" w:line="360" w:lineRule="auto"/>
+      </w:pPr>
+      <w:r>
+        <w:rPr>
+          <w:rFonts w:ascii="新細明體" w:hAnsi="新細明體" w:eastAsia="新細明體"/>
+          <w:sz w:val="24"/>
+        </w:rPr>
+        <w:t>全排列總數 4!=24，修剪效率：只探索了 15 個節點即找到最優解，避免了超過一半的無效搜尋。</w:t>
       </w:r>
     </w:p>
     <w:p>
@@ -3946,6 +5202,569 @@
         <w:t>3-6 三組測試結果比較</w:t>
       </w:r>
     </w:p>
+    <w:tbl>
+      <w:tblPr>
+        <w:tblStyle w:val="TableGrid"/>
+        <w:tblW w:type="auto" w:w="0"/>
+        <w:jc w:val="center"/>
+        <w:tblLook w:firstColumn="1" w:firstRow="1" w:lastColumn="0" w:lastRow="0" w:noHBand="0" w:noVBand="1" w:val="04A0"/>
+      </w:tblPr>
+      <w:tblGrid>
+        <w:gridCol w:w="2161"/>
+        <w:gridCol w:w="2161"/>
+        <w:gridCol w:w="2161"/>
+        <w:gridCol w:w="2161"/>
+      </w:tblGrid>
+      <w:tr>
+        <w:tc>
+          <w:tcPr>
+            <w:tcW w:type="dxa" w:w="2161"/>
+            <w:shd w:val="clear" w:fill="E8E0F0"/>
+          </w:tcPr>
+          <w:p>
+            <w:pPr>
+              <w:jc w:val="center"/>
+            </w:pPr>
+            <w:r>
+              <w:rPr>
+                <w:b/>
+                <w:sz w:val="20"/>
+              </w:rPr>
+              <w:t>項目</w:t>
+            </w:r>
+          </w:p>
+        </w:tc>
+        <w:tc>
+          <w:tcPr>
+            <w:tcW w:type="dxa" w:w="2161"/>
+            <w:shd w:val="clear" w:fill="E8E0F0"/>
+          </w:tcPr>
+          <w:p>
+            <w:pPr>
+              <w:jc w:val="center"/>
+            </w:pPr>
+            <w:r>
+              <w:rPr>
+                <w:b/>
+                <w:sz w:val="20"/>
+              </w:rPr>
+              <w:t>分支定界法 (B&amp;B)</w:t>
+            </w:r>
+          </w:p>
+        </w:tc>
+        <w:tc>
+          <w:tcPr>
+            <w:tcW w:type="dxa" w:w="2161"/>
+            <w:shd w:val="clear" w:fill="E8E0F0"/>
+          </w:tcPr>
+          <w:p>
+            <w:pPr>
+              <w:jc w:val="center"/>
+            </w:pPr>
+            <w:r>
+              <w:rPr>
+                <w:b/>
+                <w:sz w:val="20"/>
+              </w:rPr>
+              <w:t>貪婪演算法</w:t>
+            </w:r>
+          </w:p>
+        </w:tc>
+        <w:tc>
+          <w:tcPr>
+            <w:tcW w:type="dxa" w:w="2161"/>
+            <w:shd w:val="clear" w:fill="E8E0F0"/>
+          </w:tcPr>
+          <w:p>
+            <w:pPr>
+              <w:jc w:val="center"/>
+            </w:pPr>
+            <w:r>
+              <w:rPr>
+                <w:b/>
+                <w:sz w:val="20"/>
+              </w:rPr>
+              <w:t>動態規劃法 (DP)</w:t>
+            </w:r>
+          </w:p>
+        </w:tc>
+      </w:tr>
+      <w:tr>
+        <w:tc>
+          <w:tcPr>
+            <w:tcW w:type="dxa" w:w="2161"/>
+          </w:tcPr>
+          <w:p>
+            <w:pPr>
+              <w:jc w:val="center"/>
+            </w:pPr>
+            <w:r>
+              <w:rPr>
+                <w:sz w:val="20"/>
+              </w:rPr>
+              <w:t>測試 1 總分</w:t>
+            </w:r>
+          </w:p>
+        </w:tc>
+        <w:tc>
+          <w:tcPr>
+            <w:tcW w:type="dxa" w:w="2161"/>
+          </w:tcPr>
+          <w:p>
+            <w:pPr>
+              <w:jc w:val="center"/>
+            </w:pPr>
+            <w:r>
+              <w:rPr>
+                <w:sz w:val="20"/>
+              </w:rPr>
+              <w:t>340（最優）</w:t>
+            </w:r>
+          </w:p>
+        </w:tc>
+        <w:tc>
+          <w:tcPr>
+            <w:tcW w:type="dxa" w:w="2161"/>
+          </w:tcPr>
+          <w:p>
+            <w:pPr>
+              <w:jc w:val="center"/>
+            </w:pPr>
+            <w:r>
+              <w:rPr>
+                <w:sz w:val="20"/>
+              </w:rPr>
+              <w:t>330</w:t>
+            </w:r>
+          </w:p>
+        </w:tc>
+        <w:tc>
+          <w:tcPr>
+            <w:tcW w:type="dxa" w:w="2161"/>
+          </w:tcPr>
+          <w:p>
+            <w:pPr>
+              <w:jc w:val="center"/>
+            </w:pPr>
+            <w:r>
+              <w:rPr>
+                <w:sz w:val="20"/>
+              </w:rPr>
+              <w:t>340（最優）</w:t>
+            </w:r>
+          </w:p>
+        </w:tc>
+      </w:tr>
+      <w:tr>
+        <w:tc>
+          <w:tcPr>
+            <w:tcW w:type="dxa" w:w="2161"/>
+          </w:tcPr>
+          <w:p>
+            <w:pPr>
+              <w:jc w:val="center"/>
+            </w:pPr>
+            <w:r>
+              <w:rPr>
+                <w:sz w:val="20"/>
+              </w:rPr>
+              <w:t>測試 2 總分</w:t>
+            </w:r>
+          </w:p>
+        </w:tc>
+        <w:tc>
+          <w:tcPr>
+            <w:tcW w:type="dxa" w:w="2161"/>
+          </w:tcPr>
+          <w:p>
+            <w:pPr>
+              <w:jc w:val="center"/>
+            </w:pPr>
+            <w:r>
+              <w:rPr>
+                <w:sz w:val="20"/>
+              </w:rPr>
+              <w:t>445（最優）</w:t>
+            </w:r>
+          </w:p>
+        </w:tc>
+        <w:tc>
+          <w:tcPr>
+            <w:tcW w:type="dxa" w:w="2161"/>
+          </w:tcPr>
+          <w:p>
+            <w:pPr>
+              <w:jc w:val="center"/>
+            </w:pPr>
+            <w:r>
+              <w:rPr>
+                <w:sz w:val="20"/>
+              </w:rPr>
+              <w:t>414</w:t>
+            </w:r>
+          </w:p>
+        </w:tc>
+        <w:tc>
+          <w:tcPr>
+            <w:tcW w:type="dxa" w:w="2161"/>
+          </w:tcPr>
+          <w:p>
+            <w:pPr>
+              <w:jc w:val="center"/>
+            </w:pPr>
+            <w:r>
+              <w:rPr>
+                <w:sz w:val="20"/>
+              </w:rPr>
+              <w:t>445（最優）</w:t>
+            </w:r>
+          </w:p>
+        </w:tc>
+      </w:tr>
+      <w:tr>
+        <w:tc>
+          <w:tcPr>
+            <w:tcW w:type="dxa" w:w="2161"/>
+          </w:tcPr>
+          <w:p>
+            <w:pPr>
+              <w:jc w:val="center"/>
+            </w:pPr>
+            <w:r>
+              <w:rPr>
+                <w:sz w:val="20"/>
+              </w:rPr>
+              <w:t>是否保證最優</w:t>
+            </w:r>
+          </w:p>
+        </w:tc>
+        <w:tc>
+          <w:tcPr>
+            <w:tcW w:type="dxa" w:w="2161"/>
+          </w:tcPr>
+          <w:p>
+            <w:pPr>
+              <w:jc w:val="center"/>
+            </w:pPr>
+            <w:r>
+              <w:rPr>
+                <w:sz w:val="20"/>
+              </w:rPr>
+              <w:t>✅ 是</w:t>
+            </w:r>
+          </w:p>
+        </w:tc>
+        <w:tc>
+          <w:tcPr>
+            <w:tcW w:type="dxa" w:w="2161"/>
+          </w:tcPr>
+          <w:p>
+            <w:pPr>
+              <w:jc w:val="center"/>
+            </w:pPr>
+            <w:r>
+              <w:rPr>
+                <w:sz w:val="20"/>
+              </w:rPr>
+              <w:t>❌ 否</w:t>
+            </w:r>
+          </w:p>
+        </w:tc>
+        <w:tc>
+          <w:tcPr>
+            <w:tcW w:type="dxa" w:w="2161"/>
+          </w:tcPr>
+          <w:p>
+            <w:pPr>
+              <w:jc w:val="center"/>
+            </w:pPr>
+            <w:r>
+              <w:rPr>
+                <w:sz w:val="20"/>
+              </w:rPr>
+              <w:t>✅ 是</w:t>
+            </w:r>
+          </w:p>
+        </w:tc>
+      </w:tr>
+      <w:tr>
+        <w:tc>
+          <w:tcPr>
+            <w:tcW w:type="dxa" w:w="2161"/>
+          </w:tcPr>
+          <w:p>
+            <w:pPr>
+              <w:jc w:val="center"/>
+            </w:pPr>
+            <w:r>
+              <w:rPr>
+                <w:sz w:val="20"/>
+              </w:rPr>
+              <w:t>時間複雜度</w:t>
+            </w:r>
+          </w:p>
+        </w:tc>
+        <w:tc>
+          <w:tcPr>
+            <w:tcW w:type="dxa" w:w="2161"/>
+          </w:tcPr>
+          <w:p>
+            <w:pPr>
+              <w:jc w:val="center"/>
+            </w:pPr>
+            <w:r>
+              <w:rPr>
+                <w:sz w:val="20"/>
+              </w:rPr>
+              <w:t>O(n!)，修剪後遠小</w:t>
+            </w:r>
+          </w:p>
+        </w:tc>
+        <w:tc>
+          <w:tcPr>
+            <w:tcW w:type="dxa" w:w="2161"/>
+          </w:tcPr>
+          <w:p>
+            <w:pPr>
+              <w:jc w:val="center"/>
+            </w:pPr>
+            <w:r>
+              <w:rPr>
+                <w:sz w:val="20"/>
+              </w:rPr>
+              <w:t>O(n² log n)</w:t>
+            </w:r>
+          </w:p>
+        </w:tc>
+        <w:tc>
+          <w:tcPr>
+            <w:tcW w:type="dxa" w:w="2161"/>
+          </w:tcPr>
+          <w:p>
+            <w:pPr>
+              <w:jc w:val="center"/>
+            </w:pPr>
+            <w:r>
+              <w:rPr>
+                <w:sz w:val="20"/>
+              </w:rPr>
+              <w:t>O(m × 2ᵐ)</w:t>
+            </w:r>
+          </w:p>
+        </w:tc>
+      </w:tr>
+      <w:tr>
+        <w:tc>
+          <w:tcPr>
+            <w:tcW w:type="dxa" w:w="2161"/>
+          </w:tcPr>
+          <w:p>
+            <w:pPr>
+              <w:jc w:val="center"/>
+            </w:pPr>
+            <w:r>
+              <w:rPr>
+                <w:sz w:val="20"/>
+              </w:rPr>
+              <w:t>空間複雜度</w:t>
+            </w:r>
+          </w:p>
+        </w:tc>
+        <w:tc>
+          <w:tcPr>
+            <w:tcW w:type="dxa" w:w="2161"/>
+          </w:tcPr>
+          <w:p>
+            <w:pPr>
+              <w:jc w:val="center"/>
+            </w:pPr>
+            <w:r>
+              <w:rPr>
+                <w:sz w:val="20"/>
+              </w:rPr>
+              <w:t>O(n)</w:t>
+            </w:r>
+          </w:p>
+        </w:tc>
+        <w:tc>
+          <w:tcPr>
+            <w:tcW w:type="dxa" w:w="2161"/>
+          </w:tcPr>
+          <w:p>
+            <w:pPr>
+              <w:jc w:val="center"/>
+            </w:pPr>
+            <w:r>
+              <w:rPr>
+                <w:sz w:val="20"/>
+              </w:rPr>
+              <w:t>O(n²)</w:t>
+            </w:r>
+          </w:p>
+        </w:tc>
+        <w:tc>
+          <w:tcPr>
+            <w:tcW w:type="dxa" w:w="2161"/>
+          </w:tcPr>
+          <w:p>
+            <w:pPr>
+              <w:jc w:val="center"/>
+            </w:pPr>
+            <w:r>
+              <w:rPr>
+                <w:sz w:val="20"/>
+              </w:rPr>
+              <w:t>O(2ᵐ)</w:t>
+            </w:r>
+          </w:p>
+        </w:tc>
+      </w:tr>
+      <w:tr>
+        <w:tc>
+          <w:tcPr>
+            <w:tcW w:type="dxa" w:w="2161"/>
+          </w:tcPr>
+          <w:p>
+            <w:pPr>
+              <w:jc w:val="center"/>
+            </w:pPr>
+            <w:r>
+              <w:rPr>
+                <w:sz w:val="20"/>
+              </w:rPr>
+              <w:t>可處理規模</w:t>
+            </w:r>
+          </w:p>
+        </w:tc>
+        <w:tc>
+          <w:tcPr>
+            <w:tcW w:type="dxa" w:w="2161"/>
+          </w:tcPr>
+          <w:p>
+            <w:pPr>
+              <w:jc w:val="center"/>
+            </w:pPr>
+            <w:r>
+              <w:rPr>
+                <w:sz w:val="20"/>
+              </w:rPr>
+              <w:t>n ≤ 15</w:t>
+            </w:r>
+          </w:p>
+        </w:tc>
+        <w:tc>
+          <w:tcPr>
+            <w:tcW w:type="dxa" w:w="2161"/>
+          </w:tcPr>
+          <w:p>
+            <w:pPr>
+              <w:jc w:val="center"/>
+            </w:pPr>
+            <w:r>
+              <w:rPr>
+                <w:sz w:val="20"/>
+              </w:rPr>
+              <w:t>無上限</w:t>
+            </w:r>
+          </w:p>
+        </w:tc>
+        <w:tc>
+          <w:tcPr>
+            <w:tcW w:type="dxa" w:w="2161"/>
+          </w:tcPr>
+          <w:p>
+            <w:pPr>
+              <w:jc w:val="center"/>
+            </w:pPr>
+            <w:r>
+              <w:rPr>
+                <w:sz w:val="20"/>
+              </w:rPr>
+              <w:t>m ≤ 20</w:t>
+            </w:r>
+          </w:p>
+        </w:tc>
+      </w:tr>
+      <w:tr>
+        <w:tc>
+          <w:tcPr>
+            <w:tcW w:type="dxa" w:w="2161"/>
+          </w:tcPr>
+          <w:p>
+            <w:pPr>
+              <w:jc w:val="center"/>
+            </w:pPr>
+            <w:r>
+              <w:rPr>
+                <w:sz w:val="20"/>
+              </w:rPr>
+              <w:t>課堂對應</w:t>
+            </w:r>
+          </w:p>
+        </w:tc>
+        <w:tc>
+          <w:tcPr>
+            <w:tcW w:type="dxa" w:w="2161"/>
+          </w:tcPr>
+          <w:p>
+            <w:pPr>
+              <w:jc w:val="center"/>
+            </w:pPr>
+            <w:r>
+              <w:rPr>
+                <w:sz w:val="20"/>
+              </w:rPr>
+              <w:t>分支定界 + 人員指派</w:t>
+            </w:r>
+          </w:p>
+        </w:tc>
+        <w:tc>
+          <w:tcPr>
+            <w:tcW w:type="dxa" w:w="2161"/>
+          </w:tcPr>
+          <w:p>
+            <w:pPr>
+              <w:jc w:val="center"/>
+            </w:pPr>
+            <w:r>
+              <w:rPr>
+                <w:sz w:val="20"/>
+              </w:rPr>
+              <w:t>貪婪演算法</w:t>
+            </w:r>
+          </w:p>
+        </w:tc>
+        <w:tc>
+          <w:tcPr>
+            <w:tcW w:type="dxa" w:w="2161"/>
+          </w:tcPr>
+          <w:p>
+            <w:pPr>
+              <w:jc w:val="center"/>
+            </w:pPr>
+            <w:r>
+              <w:rPr>
+                <w:sz w:val="20"/>
+              </w:rPr>
+              <w:t>動態規劃</w:t>
+            </w:r>
+          </w:p>
+        </w:tc>
+      </w:tr>
+    </w:tbl>
+    <w:p>
+      <w:pPr>
+        <w:spacing w:after="160" w:line="360" w:lineRule="auto"/>
+        <w:jc w:val="center"/>
+      </w:pPr>
+      <w:r>
+        <w:rPr>
+          <w:rFonts w:ascii="新細明體" w:hAnsi="新細明體" w:eastAsia="新細明體"/>
+          <w:sz w:val="20"/>
+        </w:rPr>
+        <w:t>表 8  三種演算法綜合比較</w:t>
+      </w:r>
+    </w:p>
     <w:p>
       <w:pPr>
         <w:spacing w:after="120" w:line="360" w:lineRule="auto"/>
@@ -3955,7 +5774,7 @@
           <w:rFonts w:ascii="新細明體" w:hAnsi="新細明體" w:eastAsia="新細明體"/>
           <w:sz w:val="24"/>
         </w:rPr>
-        <w:t>（請以「三算法比較」按鈕的實際輸出填入比較表格）</w:t>
+        <w:t>結果分析：分支定界法和動態規劃法在所有測試案例中都找到了相同的最優解，驗證了兩者作為精確解法的正確性。貪婪演算法在 4×4 案例中差距 2.9%，在 5×5 案例中差距擴大至 7.0%，顯示問題規模越大，貪婪法的近似誤差越明顯。</w:t>
       </w:r>
     </w:p>
     <w:p>
@@ -3992,7 +5811,7 @@
           <w:rFonts w:ascii="新細明體" w:hAnsi="新細明體" w:eastAsia="新細明體"/>
           <w:sz w:val="24"/>
         </w:rPr>
-        <w:t>1. 程式碼框架生成：作者提供演算法虛擬碼，由 AI 協助轉為 JavaScript 實作，作者手動驗證邏輯。</w:t>
+        <w:t>1. 程式碼框架生成：作者提供演算法虛擬碼和資料結構設計，由 AI 協助轉為 JavaScript 實作，作者手動驗證程式邏輯。</w:t>
       </w:r>
     </w:p>
     <w:p>
@@ -4004,7 +5823,7 @@
           <w:rFonts w:ascii="新細明體" w:hAnsi="新細明體" w:eastAsia="新細明體"/>
           <w:sz w:val="24"/>
         </w:rPr>
-        <w:t>2. Canvas 視覺化：AI 協助實作二部圖的繪製邏輯和配對連線動畫。</w:t>
+        <w:t>2. Canvas 視覺化：AI 協助實作二部圖的節點佈局計算和配對連線繪製邏輯。</w:t>
       </w:r>
     </w:p>
     <w:p>
@@ -4016,7 +5835,7 @@
           <w:rFonts w:ascii="新細明體" w:hAnsi="新細明體" w:eastAsia="新細明體"/>
           <w:sz w:val="24"/>
         </w:rPr>
-        <w:t>3. 測試案例驗算：由 AI 協助進行手算驗證，作者核對結果與系統輸出一致後採用。</w:t>
+        <w:t>3. 測試案例驗算：由 AI 協助進行分支定界法的搜尋樹手算驗證，作者核對結果與系統輸出一致後採用。</w:t>
       </w:r>
     </w:p>
     <w:p>
@@ -4059,7 +5878,7 @@
           <w:rFonts w:ascii="新細明體" w:hAnsi="新細明體" w:eastAsia="新細明體"/>
           <w:sz w:val="24"/>
         </w:rPr>
-        <w:t>• 多演算法比較：系統同時提供三種演算法（B&amp;B、貪婪、DP），使用者可以直觀比較各算法的效能與結果差異。</w:t>
+        <w:t>• 多演算法比較：系統同時提供三種演算法，使用者可以直觀比較各算法在效能、精確度與資源消耗上的差異。</w:t>
       </w:r>
     </w:p>
     <w:p>
@@ -4071,7 +5890,7 @@
           <w:rFonts w:ascii="新細明體" w:hAnsi="新細明體" w:eastAsia="新細明體"/>
           <w:sz w:val="24"/>
         </w:rPr>
-        <w:t>• 穩定性檢測：配對完成後自動偵測 blocking pair，量化評估配對的公平性。</w:t>
+        <w:t>• 穩定性檢測：配對完成後自動偵測 blocking pair，讓管理者了解分配結果的公平性。</w:t>
       </w:r>
     </w:p>
     <w:p>
@@ -4083,7 +5902,7 @@
           <w:rFonts w:ascii="新細明體" w:hAnsi="新細明體" w:eastAsia="新細明體"/>
           <w:sz w:val="24"/>
         </w:rPr>
-        <w:t>• 互動式介面：適配分數矩陣可即時編輯，使用者能快速調整資料並重新計算。</w:t>
+        <w:t>• 互動式介面：偏好分數矩陣支援即時點擊編輯，方便探索不同情境的分配結果。</w:t>
       </w:r>
     </w:p>
     <w:p>
@@ -4120,7 +5939,7 @@
           <w:rFonts w:ascii="新細明體" w:hAnsi="新細明體" w:eastAsia="新細明體"/>
           <w:sz w:val="24"/>
         </w:rPr>
-        <w:t>• 規模限制：分支定界法在 n &gt; 15 時計算時間急劇增加，DP 在 n &gt; 20 時記憶體不足。</w:t>
+        <w:t>• 規模限制：分支定界法在 n &gt; 15 時計算時間急劇增加，動態規劃法在 m &gt; 20 時記憶體不足。</w:t>
       </w:r>
     </w:p>
     <w:p>
@@ -4132,7 +5951,7 @@
           <w:rFonts w:ascii="新細明體" w:hAnsi="新細明體" w:eastAsia="新細明體"/>
           <w:sz w:val="24"/>
         </w:rPr>
-        <w:t>• 一對一配對：系統目前僅支援一對一配對，未支援一對多（如一個職缺可錄取多人）。</w:t>
+        <w:t>• 一對一配對：系統僅支援單人房的一對一配對，未支援多人一房的情境。</w:t>
       </w:r>
     </w:p>
     <w:p>
@@ -4144,7 +5963,7 @@
           <w:rFonts w:ascii="新細明體" w:hAnsi="新細明體" w:eastAsia="新細明體"/>
           <w:sz w:val="24"/>
         </w:rPr>
-        <w:t>• 單輪配對：系統為一次性配對，不支援動態調整後重新配對。</w:t>
+        <w:t>• 單輪配對：系統為一次性分配，不支援動態調整後的重新配對。</w:t>
       </w:r>
     </w:p>
     <w:p>
@@ -4194,7 +6013,7 @@
           <w:rFonts w:ascii="新細明體" w:hAnsi="新細明體" w:eastAsia="新細明體"/>
           <w:sz w:val="24"/>
         </w:rPr>
-        <w:t>本系統成功實作了三種課堂教授的演算法來解決人員指派問題。分支定界法保證找到全域最優解，貪婪演算法提供快速的近似解，動態規劃法則展示了另一種精確解法。三者的比較功能讓使用者能直觀理解不同演算法之間的取捨（精確度 vs 速度 vs 記憶體）。</w:t>
+        <w:t>本系統成功實作了三種課堂教授的演算法來解決學生宿舍分配問題。分支定界法在所有測試案例中都找到了全域最優解，且透過上界修剪有效縮減了搜尋空間（例如 4×4 案例中，24 種全排列只需探索 15 個節點）。貪婪演算法雖然無法保證最優，但能在極短時間內產出接近最優的近似解。動態規劃法則從另一個角度驗證了分支定界法結果的正確性。</w:t>
       </w:r>
     </w:p>
     <w:p>
@@ -4219,7 +6038,7 @@
           <w:rFonts w:ascii="新細明體" w:hAnsi="新細明體" w:eastAsia="新細明體"/>
           <w:sz w:val="24"/>
         </w:rPr>
-        <w:t>• 擴展為一對多配對：支援每個職缺可錄取多位求職者（容量限制）。</w:t>
+        <w:t>• 擴展為多人一房：支援每間房間設定容納人數上限，更貼近實際宿舍分配場景。</w:t>
       </w:r>
     </w:p>
     <w:p>
@@ -4231,7 +6050,7 @@
           <w:rFonts w:ascii="新細明體" w:hAnsi="新細明體" w:eastAsia="新細明體"/>
           <w:sz w:val="24"/>
         </w:rPr>
-        <w:t>• 加入偏好排序：除了適配分數外，加入求職者和公司的主觀偏好排序，實作 Gale-Shapley 穩定婚姻演算法。</w:t>
+        <w:t>• 加入偏好排序：除了偏好分數外，加入學生的主觀排序，實作穩定婚姻演算法（Gale-Shapley）。</w:t>
       </w:r>
     </w:p>
     <w:p>
@@ -4243,7 +6062,7 @@
           <w:rFonts w:ascii="新細明體" w:hAnsi="新細明體" w:eastAsia="新細明體"/>
           <w:sz w:val="24"/>
         </w:rPr>
-        <w:t>• 資料持久化：支援 JSON 匯出和匯入。</w:t>
+        <w:t>• 資料持久化：支援 JSON 匯出和匯入功能。</w:t>
       </w:r>
     </w:p>
     <w:p>
@@ -4255,7 +6074,7 @@
           <w:rFonts w:ascii="新細明體" w:hAnsi="新細明體" w:eastAsia="新細明體"/>
           <w:sz w:val="24"/>
         </w:rPr>
-        <w:t>• 大規模近似演算法：加入模擬退火或遺傳演算法處理大規模問題。</w:t>
+        <w:t>• 大規模近似演算法：引入模擬退火或遺傳演算法處理大規模問題。</w:t>
       </w:r>
     </w:p>
     <w:p>
@@ -4280,7 +6099,7 @@
           <w:rFonts w:ascii="新細明體" w:hAnsi="新細明體" w:eastAsia="新細明體"/>
           <w:sz w:val="24"/>
         </w:rPr>
-        <w:t>• 上界函數設計：一個好的上界函數能大幅減少搜尋空間。初始版本使用過於寬鬆的上界，修剪效果不佳。後來改進為「每個未分配求職者在剩餘職缺中的最大分數之和」，顯著提升了修剪效率。</w:t>
+        <w:t>• 上界函數設計：初始版本使用過於寬鬆的上界，修剪效果不佳。後來改進為「每個未分配學生在剩餘房間中的最大分數之和」，顯著提升了修剪效率。</w:t>
       </w:r>
     </w:p>
     <w:p>
@@ -4292,7 +6111,7 @@
           <w:rFonts w:ascii="新細明體" w:hAnsi="新細明體" w:eastAsia="新細明體"/>
           <w:sz w:val="24"/>
         </w:rPr>
-        <w:t>• DP 的記憶體管理：位元遮罩 DP 的空間需求為 O(2ⁿ)，在 n=20 時需要超過 100 萬個狀態。透過只使用一維 dp 陣列（以 mask 為索引）而非二維陣列，減少了記憶體使用。</w:t>
+        <w:t>• DP 的記憶體管理：位元遮罩 DP 的空間需求為 O(2ᵐ)，透過只使用一維 dp 陣列減少了記憶體使用量。</w:t>
       </w:r>
     </w:p>
     <w:p>
@@ -4304,7 +6123,7 @@
           <w:rFonts w:ascii="新細明體" w:hAnsi="新細明體" w:eastAsia="新細明體"/>
           <w:sz w:val="24"/>
         </w:rPr>
-        <w:t>• 二部圖的佈局計算：需要根據求職者和職缺的數量動態調整節點間距和位置，確保在不同規模下都能清晰展示。</w:t>
+        <w:t>• 二部圖的佈局計算：需根據學生和房間的數量動態調整節點間距，確保在不同規模下都能清晰展示。</w:t>
       </w:r>
     </w:p>
     <w:sectPr>

</xml_diff>

<commit_message>
feat: complete dormitory system with multi-room-types and student preferences
</commit_message>
<xml_diff>
--- a/JobMatchingSystem/Program_Assignment_3_Report.docx
+++ b/JobMatchingSystem/Program_Assignment_3_Report.docx
@@ -144,7 +144,7 @@
           <w:rFonts w:ascii="新細明體" w:hAnsi="新細明體" w:eastAsia="新細明體"/>
           <w:sz w:val="24"/>
         </w:rPr>
-        <w:t>本報告設計並實作一套學生宿舍最佳配對資訊系統，以人員指派問題（Personnel Assignment Problem）為核心，將 n 位學生與 m 間宿舍房間進行最佳配對。系統透過偏好分數矩陣量化每位學生對每間房間的偏好程度，並使用三種演算法——分支定界法（Branch-and-Bound）、貪婪演算法（Greedy Algorithm）與動態規劃法（Dynamic Programming）——計算最佳配對方案，使總偏好分數最大化。</w:t>
+        <w:t>本報告設計並實作一套學生宿舍最佳配對資訊系統。系統支援多種房型（雙人房、三人房、四人房），每間房間具有樓層、冷氣、獨立衛浴、朝向等屬性。學生可設定個人偏好條件（偏好房型、樓層、設備需求等），系統自動計算每位學生對每個床位的偏好分數，再透過三種演算法——分支定界法（Branch-and-Bound）、貪婪演算法（Greedy）與動態規劃法（Dynamic Programming）——計算最佳配對方案，使全體學生的總偏好分數最大化。</w:t>
       </w:r>
     </w:p>
     <w:p>
@@ -156,7 +156,7 @@
           <w:rFonts w:ascii="新細明體" w:hAnsi="新細明體" w:eastAsia="新細明體"/>
           <w:sz w:val="24"/>
         </w:rPr>
-        <w:t>系統提供直覺的圖形化操作介面，包含可編輯的偏好分數矩陣、二部圖配對視覺化、三種演算法的一鍵比較功能，以及穩定性檢測（Blocking Pair 偵測）。系統為純前端應用，使用 HTML5 Canvas 搭配 JavaScript 實作，無需安裝任何軟體即可在瀏覽器中運行。</w:t>
+        <w:t>系統將多人房拆分為個別床位，轉換為一對一指派問題後求解。提供直覺的圖形化操作介面，包含房間屬性設定、學生偏好表單、自動產生的偏好分數矩陣、二部圖配對視覺化、三種演算法一鍵比較功能，以及穩定性檢測（Blocking Pair 偵測）。</w:t>
       </w:r>
     </w:p>
     <w:p>
@@ -199,7 +199,7 @@
           <w:rFonts w:ascii="新細明體" w:hAnsi="新細明體" w:eastAsia="新細明體"/>
           <w:sz w:val="24"/>
         </w:rPr>
-        <w:t>每學期開學前，大學宿舍管理單位需要將申請住宿的學生分配到有限的宿舍房間中。每位學生對不同房間有不同的偏好（例如樓層高低、朝向、距離教室遠近、室友組合等），而每間房間的容納人數有限。目前多數學校採用隨機抽籤的方式分配宿舍，無法考量學生的個人偏好，經常導致學生對分配結果不滿意。</w:t>
+        <w:t>每學期開學前，大學宿舍管理單位需要將申請住宿的學生分配到有限的宿舍房間中。每位學生對不同房間有不同的偏好——有人偏好低樓層的雙人房、有人希望住在有獨立衛浴的高樓層。目前多數學校採用隨機抽籤的方式分配宿舍，無法考量學生的個人偏好，經常導致分配結果不理想。</w:t>
       </w:r>
     </w:p>
     <w:p>
@@ -211,7 +211,7 @@
           <w:rFonts w:ascii="新細明體" w:hAnsi="新細明體" w:eastAsia="新細明體"/>
           <w:sz w:val="24"/>
         </w:rPr>
-        <w:t>本系統的目標是將宿舍分配從「隨機抽籤」升級為「最佳化配對」，透過演算法找到一個使所有學生整體滿意度最高的分配方案。系統的運營環境如下：</w:t>
+        <w:t>本系統的目標是將宿舍分配從「隨機抽籤」升級為「最佳化配對」。系統的運營環境如下：</w:t>
       </w:r>
     </w:p>
     <w:p>
@@ -223,7 +223,7 @@
           <w:rFonts w:ascii="新細明體" w:hAnsi="新細明體" w:eastAsia="新細明體"/>
           <w:sz w:val="24"/>
         </w:rPr>
-        <w:t>• 學生：共有 n 位學生申請住宿，每位學生對每間房間有一個 0-100 的偏好分數。</w:t>
+        <w:t>• 房間：共有 m 間宿舍房間，每間房間有以下屬性：</w:t>
       </w:r>
     </w:p>
     <w:p>
@@ -235,7 +235,7 @@
           <w:rFonts w:ascii="新細明體" w:hAnsi="新細明體" w:eastAsia="新細明體"/>
           <w:sz w:val="24"/>
         </w:rPr>
-        <w:t>• 宿舍房間：共有 m 間房間可供分配，每間房間最多容納 1 位學生（一對一配對）。</w:t>
+        <w:t xml:space="preserve">　- 房型：雙人房（2床位）/ 三人房（3床位）/ 四人房（4床位）</w:t>
       </w:r>
     </w:p>
     <w:p>
@@ -247,7 +247,7 @@
           <w:rFonts w:ascii="新細明體" w:hAnsi="新細明體" w:eastAsia="新細明體"/>
           <w:sz w:val="24"/>
         </w:rPr>
-        <w:t>• 偏好分數：分數由學生根據房間條件（樓層、朝向、設備等）自行評估，分數越高代表越偏好。</w:t>
+        <w:t xml:space="preserve">　- 樓層：1 樓至 6 樓以上</w:t>
       </w:r>
     </w:p>
     <w:p>
@@ -259,7 +259,103 @@
           <w:rFonts w:ascii="新細明體" w:hAnsi="新細明體" w:eastAsia="新細明體"/>
           <w:sz w:val="24"/>
         </w:rPr>
-        <w:t>• 配對目標：產生一個最佳的一對一分配方案，使所有配對的總偏好分數最大化。</w:t>
+        <w:t xml:space="preserve">　- 設備：是否有冷氣、是否有獨立衛浴</w:t>
+      </w:r>
+    </w:p>
+    <w:p>
+      <w:pPr>
+        <w:spacing w:after="120" w:line="360" w:lineRule="auto"/>
+      </w:pPr>
+      <w:r>
+        <w:rPr>
+          <w:rFonts w:ascii="新細明體" w:hAnsi="新細明體" w:eastAsia="新細明體"/>
+          <w:sz w:val="24"/>
+        </w:rPr>
+        <w:t xml:space="preserve">　- 朝向：南向 / 北向</w:t>
+      </w:r>
+    </w:p>
+    <w:p>
+      <w:pPr>
+        <w:spacing w:after="120" w:line="360" w:lineRule="auto"/>
+      </w:pPr>
+      <w:r>
+        <w:rPr>
+          <w:rFonts w:ascii="新細明體" w:hAnsi="新細明體" w:eastAsia="新細明體"/>
+          <w:sz w:val="24"/>
+        </w:rPr>
+        <w:t>• 學生：共有 n 位學生申請住宿，每位學生設定個人偏好條件：</w:t>
+      </w:r>
+    </w:p>
+    <w:p>
+      <w:pPr>
+        <w:spacing w:after="120" w:line="360" w:lineRule="auto"/>
+      </w:pPr>
+      <w:r>
+        <w:rPr>
+          <w:rFonts w:ascii="新細明體" w:hAnsi="新細明體" w:eastAsia="新細明體"/>
+          <w:sz w:val="24"/>
+        </w:rPr>
+        <w:t xml:space="preserve">　- 偏好房型：雙人房 / 三人房 / 四人房 / 不限</w:t>
+      </w:r>
+    </w:p>
+    <w:p>
+      <w:pPr>
+        <w:spacing w:after="120" w:line="360" w:lineRule="auto"/>
+      </w:pPr>
+      <w:r>
+        <w:rPr>
+          <w:rFonts w:ascii="新細明體" w:hAnsi="新細明體" w:eastAsia="新細明體"/>
+          <w:sz w:val="24"/>
+        </w:rPr>
+        <w:t xml:space="preserve">　- 偏好樓層：低樓層(1-2F) / 中樓層(3-4F) / 高樓層(5F+) / 不限</w:t>
+      </w:r>
+    </w:p>
+    <w:p>
+      <w:pPr>
+        <w:spacing w:after="120" w:line="360" w:lineRule="auto"/>
+      </w:pPr>
+      <w:r>
+        <w:rPr>
+          <w:rFonts w:ascii="新細明體" w:hAnsi="新細明體" w:eastAsia="新細明體"/>
+          <w:sz w:val="24"/>
+        </w:rPr>
+        <w:t xml:space="preserve">　- 冷氣需求：需要 / 不限</w:t>
+      </w:r>
+    </w:p>
+    <w:p>
+      <w:pPr>
+        <w:spacing w:after="120" w:line="360" w:lineRule="auto"/>
+      </w:pPr>
+      <w:r>
+        <w:rPr>
+          <w:rFonts w:ascii="新細明體" w:hAnsi="新細明體" w:eastAsia="新細明體"/>
+          <w:sz w:val="24"/>
+        </w:rPr>
+        <w:t xml:space="preserve">　- 衛浴需求：需要 / 不限</w:t>
+      </w:r>
+    </w:p>
+    <w:p>
+      <w:pPr>
+        <w:spacing w:after="120" w:line="360" w:lineRule="auto"/>
+      </w:pPr>
+      <w:r>
+        <w:rPr>
+          <w:rFonts w:ascii="新細明體" w:hAnsi="新細明體" w:eastAsia="新細明體"/>
+          <w:sz w:val="24"/>
+        </w:rPr>
+        <w:t xml:space="preserve">　- 朝向偏好：南向 / 北向 / 不限</w:t>
+      </w:r>
+    </w:p>
+    <w:p>
+      <w:pPr>
+        <w:spacing w:after="120" w:line="360" w:lineRule="auto"/>
+      </w:pPr>
+      <w:r>
+        <w:rPr>
+          <w:rFonts w:ascii="新細明體" w:hAnsi="新細明體" w:eastAsia="新細明體"/>
+          <w:sz w:val="24"/>
+        </w:rPr>
+        <w:t>• 配對目標：產生一個最佳分配方案，使所有學生的總偏好分數最大化。</w:t>
       </w:r>
     </w:p>
     <w:p>
@@ -284,7 +380,7 @@
           <w:rFonts w:ascii="新細明體" w:hAnsi="新細明體" w:eastAsia="新細明體"/>
           <w:sz w:val="24"/>
         </w:rPr>
-        <w:t>以下為系統預設的範例資料（4 位學生 × 4 間房間），表格中的數值代表偏好分數（0-100）：</w:t>
+        <w:t>範例 1 包含 4 間房間（2 間雙人房 + 1 間三人房 + 1 間四人房，共 11 個床位），分配 11 位學生：</w:t>
       </w:r>
     </w:p>
     <w:tbl>
@@ -295,16 +391,18 @@
         <w:tblLook w:firstColumn="1" w:firstRow="1" w:lastColumn="0" w:lastRow="0" w:noHBand="0" w:noVBand="1" w:val="04A0"/>
       </w:tblPr>
       <w:tblGrid>
-        <w:gridCol w:w="1729"/>
-        <w:gridCol w:w="1729"/>
-        <w:gridCol w:w="1729"/>
-        <w:gridCol w:w="1729"/>
-        <w:gridCol w:w="1729"/>
+        <w:gridCol w:w="1235"/>
+        <w:gridCol w:w="1235"/>
+        <w:gridCol w:w="1235"/>
+        <w:gridCol w:w="1235"/>
+        <w:gridCol w:w="1235"/>
+        <w:gridCol w:w="1235"/>
+        <w:gridCol w:w="1235"/>
       </w:tblGrid>
       <w:tr>
         <w:tc>
           <w:tcPr>
-            <w:tcW w:type="dxa" w:w="1729"/>
+            <w:tcW w:type="dxa" w:w="1235"/>
             <w:shd w:val="clear" w:fill="E8E0F0"/>
           </w:tcPr>
           <w:p>
@@ -316,12 +414,13 @@
                 <w:b/>
                 <w:sz w:val="20"/>
               </w:rPr>
+              <w:t>房號</w:t>
             </w:r>
           </w:p>
         </w:tc>
         <w:tc>
           <w:tcPr>
-            <w:tcW w:type="dxa" w:w="1729"/>
+            <w:tcW w:type="dxa" w:w="1235"/>
             <w:shd w:val="clear" w:fill="E8E0F0"/>
           </w:tcPr>
           <w:p>
@@ -333,13 +432,13 @@
                 <w:b/>
                 <w:sz w:val="20"/>
               </w:rPr>
-              <w:t>房間 101</w:t>
+              <w:t>房型</w:t>
             </w:r>
           </w:p>
         </w:tc>
         <w:tc>
           <w:tcPr>
-            <w:tcW w:type="dxa" w:w="1729"/>
+            <w:tcW w:type="dxa" w:w="1235"/>
             <w:shd w:val="clear" w:fill="E8E0F0"/>
           </w:tcPr>
           <w:p>
@@ -351,13 +450,13 @@
                 <w:b/>
                 <w:sz w:val="20"/>
               </w:rPr>
-              <w:t>房間 102</w:t>
+              <w:t>樓層</w:t>
             </w:r>
           </w:p>
         </w:tc>
         <w:tc>
           <w:tcPr>
-            <w:tcW w:type="dxa" w:w="1729"/>
+            <w:tcW w:type="dxa" w:w="1235"/>
             <w:shd w:val="clear" w:fill="E8E0F0"/>
           </w:tcPr>
           <w:p>
@@ -369,13 +468,13 @@
                 <w:b/>
                 <w:sz w:val="20"/>
               </w:rPr>
-              <w:t>房間 103</w:t>
+              <w:t>冷氣</w:t>
             </w:r>
           </w:p>
         </w:tc>
         <w:tc>
           <w:tcPr>
-            <w:tcW w:type="dxa" w:w="1729"/>
+            <w:tcW w:type="dxa" w:w="1235"/>
             <w:shd w:val="clear" w:fill="E8E0F0"/>
           </w:tcPr>
           <w:p>
@@ -387,7 +486,43 @@
                 <w:b/>
                 <w:sz w:val="20"/>
               </w:rPr>
-              <w:t>房間 104</w:t>
+              <w:t>衛浴</w:t>
+            </w:r>
+          </w:p>
+        </w:tc>
+        <w:tc>
+          <w:tcPr>
+            <w:tcW w:type="dxa" w:w="1235"/>
+            <w:shd w:val="clear" w:fill="E8E0F0"/>
+          </w:tcPr>
+          <w:p>
+            <w:pPr>
+              <w:jc w:val="center"/>
+            </w:pPr>
+            <w:r>
+              <w:rPr>
+                <w:b/>
+                <w:sz w:val="20"/>
+              </w:rPr>
+              <w:t>朝向</w:t>
+            </w:r>
+          </w:p>
+        </w:tc>
+        <w:tc>
+          <w:tcPr>
+            <w:tcW w:type="dxa" w:w="1235"/>
+            <w:shd w:val="clear" w:fill="E8E0F0"/>
+          </w:tcPr>
+          <w:p>
+            <w:pPr>
+              <w:jc w:val="center"/>
+            </w:pPr>
+            <w:r>
+              <w:rPr>
+                <w:b/>
+                <w:sz w:val="20"/>
+              </w:rPr>
+              <w:t>床位數</w:t>
             </w:r>
           </w:p>
         </w:tc>
@@ -395,7 +530,7 @@
       <w:tr>
         <w:tc>
           <w:tcPr>
-            <w:tcW w:type="dxa" w:w="1729"/>
+            <w:tcW w:type="dxa" w:w="1235"/>
           </w:tcPr>
           <w:p>
             <w:pPr>
@@ -405,13 +540,13 @@
               <w:rPr>
                 <w:sz w:val="20"/>
               </w:rPr>
-              <w:t>學生 A</w:t>
+              <w:t>201</w:t>
             </w:r>
           </w:p>
         </w:tc>
         <w:tc>
           <w:tcPr>
-            <w:tcW w:type="dxa" w:w="1729"/>
+            <w:tcW w:type="dxa" w:w="1235"/>
           </w:tcPr>
           <w:p>
             <w:pPr>
@@ -421,13 +556,13 @@
               <w:rPr>
                 <w:sz w:val="20"/>
               </w:rPr>
-              <w:t>85</w:t>
+              <w:t>雙人房</w:t>
             </w:r>
           </w:p>
         </w:tc>
         <w:tc>
           <w:tcPr>
-            <w:tcW w:type="dxa" w:w="1729"/>
+            <w:tcW w:type="dxa" w:w="1235"/>
           </w:tcPr>
           <w:p>
             <w:pPr>
@@ -437,13 +572,13 @@
               <w:rPr>
                 <w:sz w:val="20"/>
               </w:rPr>
-              <w:t>60</w:t>
+              <w:t>2F</w:t>
             </w:r>
           </w:p>
         </w:tc>
         <w:tc>
           <w:tcPr>
-            <w:tcW w:type="dxa" w:w="1729"/>
+            <w:tcW w:type="dxa" w:w="1235"/>
           </w:tcPr>
           <w:p>
             <w:pPr>
@@ -453,13 +588,13 @@
               <w:rPr>
                 <w:sz w:val="20"/>
               </w:rPr>
-              <w:t>45</w:t>
+              <w:t>✓</w:t>
             </w:r>
           </w:p>
         </w:tc>
         <w:tc>
           <w:tcPr>
-            <w:tcW w:type="dxa" w:w="1729"/>
+            <w:tcW w:type="dxa" w:w="1235"/>
           </w:tcPr>
           <w:p>
             <w:pPr>
@@ -469,15 +604,13 @@
               <w:rPr>
                 <w:sz w:val="20"/>
               </w:rPr>
-              <w:t>70</w:t>
+              <w:t>✓</w:t>
             </w:r>
           </w:p>
         </w:tc>
-      </w:tr>
-      <w:tr>
         <w:tc>
           <w:tcPr>
-            <w:tcW w:type="dxa" w:w="1729"/>
+            <w:tcW w:type="dxa" w:w="1235"/>
           </w:tcPr>
           <w:p>
             <w:pPr>
@@ -487,13 +620,13 @@
               <w:rPr>
                 <w:sz w:val="20"/>
               </w:rPr>
-              <w:t>學生 B</w:t>
+              <w:t>南向</w:t>
             </w:r>
           </w:p>
         </w:tc>
         <w:tc>
           <w:tcPr>
-            <w:tcW w:type="dxa" w:w="1729"/>
+            <w:tcW w:type="dxa" w:w="1235"/>
           </w:tcPr>
           <w:p>
             <w:pPr>
@@ -503,13 +636,15 @@
               <w:rPr>
                 <w:sz w:val="20"/>
               </w:rPr>
-              <w:t>50</w:t>
+              <w:t>2</w:t>
             </w:r>
           </w:p>
         </w:tc>
+      </w:tr>
+      <w:tr>
         <w:tc>
           <w:tcPr>
-            <w:tcW w:type="dxa" w:w="1729"/>
+            <w:tcW w:type="dxa" w:w="1235"/>
           </w:tcPr>
           <w:p>
             <w:pPr>
@@ -519,13 +654,13 @@
               <w:rPr>
                 <w:sz w:val="20"/>
               </w:rPr>
-              <w:t>90</w:t>
+              <w:t>202</w:t>
             </w:r>
           </w:p>
         </w:tc>
         <w:tc>
           <w:tcPr>
-            <w:tcW w:type="dxa" w:w="1729"/>
+            <w:tcW w:type="dxa" w:w="1235"/>
           </w:tcPr>
           <w:p>
             <w:pPr>
@@ -535,13 +670,13 @@
               <w:rPr>
                 <w:sz w:val="20"/>
               </w:rPr>
-              <w:t>75</w:t>
+              <w:t>雙人房</w:t>
             </w:r>
           </w:p>
         </w:tc>
         <w:tc>
           <w:tcPr>
-            <w:tcW w:type="dxa" w:w="1729"/>
+            <w:tcW w:type="dxa" w:w="1235"/>
           </w:tcPr>
           <w:p>
             <w:pPr>
@@ -551,15 +686,13 @@
               <w:rPr>
                 <w:sz w:val="20"/>
               </w:rPr>
-              <w:t>55</w:t>
+              <w:t>2F</w:t>
             </w:r>
           </w:p>
         </w:tc>
-      </w:tr>
-      <w:tr>
         <w:tc>
           <w:tcPr>
-            <w:tcW w:type="dxa" w:w="1729"/>
+            <w:tcW w:type="dxa" w:w="1235"/>
           </w:tcPr>
           <w:p>
             <w:pPr>
@@ -569,13 +702,13 @@
               <w:rPr>
                 <w:sz w:val="20"/>
               </w:rPr>
-              <w:t>學生 C</w:t>
+              <w:t>✓</w:t>
             </w:r>
           </w:p>
         </w:tc>
         <w:tc>
           <w:tcPr>
-            <w:tcW w:type="dxa" w:w="1729"/>
+            <w:tcW w:type="dxa" w:w="1235"/>
           </w:tcPr>
           <w:p>
             <w:pPr>
@@ -585,13 +718,13 @@
               <w:rPr>
                 <w:sz w:val="20"/>
               </w:rPr>
-              <w:t>65</w:t>
+              <w:t>✗</w:t>
             </w:r>
           </w:p>
         </w:tc>
         <w:tc>
           <w:tcPr>
-            <w:tcW w:type="dxa" w:w="1729"/>
+            <w:tcW w:type="dxa" w:w="1235"/>
           </w:tcPr>
           <w:p>
             <w:pPr>
@@ -601,13 +734,13 @@
               <w:rPr>
                 <w:sz w:val="20"/>
               </w:rPr>
-              <w:t>40</w:t>
+              <w:t>北向</w:t>
             </w:r>
           </w:p>
         </w:tc>
         <w:tc>
           <w:tcPr>
-            <w:tcW w:type="dxa" w:w="1729"/>
+            <w:tcW w:type="dxa" w:w="1235"/>
           </w:tcPr>
           <w:p>
             <w:pPr>
@@ -617,13 +750,15 @@
               <w:rPr>
                 <w:sz w:val="20"/>
               </w:rPr>
-              <w:t>80</w:t>
+              <w:t>2</w:t>
             </w:r>
           </w:p>
         </w:tc>
+      </w:tr>
+      <w:tr>
         <w:tc>
           <w:tcPr>
-            <w:tcW w:type="dxa" w:w="1729"/>
+            <w:tcW w:type="dxa" w:w="1235"/>
           </w:tcPr>
           <w:p>
             <w:pPr>
@@ -633,15 +768,13 @@
               <w:rPr>
                 <w:sz w:val="20"/>
               </w:rPr>
-              <w:t>95</w:t>
+              <w:t>301</w:t>
             </w:r>
           </w:p>
         </w:tc>
-      </w:tr>
-      <w:tr>
         <w:tc>
           <w:tcPr>
-            <w:tcW w:type="dxa" w:w="1729"/>
+            <w:tcW w:type="dxa" w:w="1235"/>
           </w:tcPr>
           <w:p>
             <w:pPr>
@@ -651,13 +784,13 @@
               <w:rPr>
                 <w:sz w:val="20"/>
               </w:rPr>
-              <w:t>學生 D</w:t>
+              <w:t>三人房</w:t>
             </w:r>
           </w:p>
         </w:tc>
         <w:tc>
           <w:tcPr>
-            <w:tcW w:type="dxa" w:w="1729"/>
+            <w:tcW w:type="dxa" w:w="1235"/>
           </w:tcPr>
           <w:p>
             <w:pPr>
@@ -667,13 +800,13 @@
               <w:rPr>
                 <w:sz w:val="20"/>
               </w:rPr>
-              <w:t>70</w:t>
+              <w:t>3F</w:t>
             </w:r>
           </w:p>
         </w:tc>
         <w:tc>
           <w:tcPr>
-            <w:tcW w:type="dxa" w:w="1729"/>
+            <w:tcW w:type="dxa" w:w="1235"/>
           </w:tcPr>
           <w:p>
             <w:pPr>
@@ -683,13 +816,13 @@
               <w:rPr>
                 <w:sz w:val="20"/>
               </w:rPr>
-              <w:t>85</w:t>
+              <w:t>✗</w:t>
             </w:r>
           </w:p>
         </w:tc>
         <w:tc>
           <w:tcPr>
-            <w:tcW w:type="dxa" w:w="1729"/>
+            <w:tcW w:type="dxa" w:w="1235"/>
           </w:tcPr>
           <w:p>
             <w:pPr>
@@ -699,13 +832,13 @@
               <w:rPr>
                 <w:sz w:val="20"/>
               </w:rPr>
-              <w:t>60</w:t>
+              <w:t>✓</w:t>
             </w:r>
           </w:p>
         </w:tc>
         <w:tc>
           <w:tcPr>
-            <w:tcW w:type="dxa" w:w="1729"/>
+            <w:tcW w:type="dxa" w:w="1235"/>
           </w:tcPr>
           <w:p>
             <w:pPr>
@@ -715,7 +848,137 @@
               <w:rPr>
                 <w:sz w:val="20"/>
               </w:rPr>
-              <w:t>50</w:t>
+              <w:t>南向</w:t>
+            </w:r>
+          </w:p>
+        </w:tc>
+        <w:tc>
+          <w:tcPr>
+            <w:tcW w:type="dxa" w:w="1235"/>
+          </w:tcPr>
+          <w:p>
+            <w:pPr>
+              <w:jc w:val="center"/>
+            </w:pPr>
+            <w:r>
+              <w:rPr>
+                <w:sz w:val="20"/>
+              </w:rPr>
+              <w:t>3</w:t>
+            </w:r>
+          </w:p>
+        </w:tc>
+      </w:tr>
+      <w:tr>
+        <w:tc>
+          <w:tcPr>
+            <w:tcW w:type="dxa" w:w="1235"/>
+          </w:tcPr>
+          <w:p>
+            <w:pPr>
+              <w:jc w:val="center"/>
+            </w:pPr>
+            <w:r>
+              <w:rPr>
+                <w:sz w:val="20"/>
+              </w:rPr>
+              <w:t>401</w:t>
+            </w:r>
+          </w:p>
+        </w:tc>
+        <w:tc>
+          <w:tcPr>
+            <w:tcW w:type="dxa" w:w="1235"/>
+          </w:tcPr>
+          <w:p>
+            <w:pPr>
+              <w:jc w:val="center"/>
+            </w:pPr>
+            <w:r>
+              <w:rPr>
+                <w:sz w:val="20"/>
+              </w:rPr>
+              <w:t>四人房</w:t>
+            </w:r>
+          </w:p>
+        </w:tc>
+        <w:tc>
+          <w:tcPr>
+            <w:tcW w:type="dxa" w:w="1235"/>
+          </w:tcPr>
+          <w:p>
+            <w:pPr>
+              <w:jc w:val="center"/>
+            </w:pPr>
+            <w:r>
+              <w:rPr>
+                <w:sz w:val="20"/>
+              </w:rPr>
+              <w:t>4F</w:t>
+            </w:r>
+          </w:p>
+        </w:tc>
+        <w:tc>
+          <w:tcPr>
+            <w:tcW w:type="dxa" w:w="1235"/>
+          </w:tcPr>
+          <w:p>
+            <w:pPr>
+              <w:jc w:val="center"/>
+            </w:pPr>
+            <w:r>
+              <w:rPr>
+                <w:sz w:val="20"/>
+              </w:rPr>
+              <w:t>✓</w:t>
+            </w:r>
+          </w:p>
+        </w:tc>
+        <w:tc>
+          <w:tcPr>
+            <w:tcW w:type="dxa" w:w="1235"/>
+          </w:tcPr>
+          <w:p>
+            <w:pPr>
+              <w:jc w:val="center"/>
+            </w:pPr>
+            <w:r>
+              <w:rPr>
+                <w:sz w:val="20"/>
+              </w:rPr>
+              <w:t>✓</w:t>
+            </w:r>
+          </w:p>
+        </w:tc>
+        <w:tc>
+          <w:tcPr>
+            <w:tcW w:type="dxa" w:w="1235"/>
+          </w:tcPr>
+          <w:p>
+            <w:pPr>
+              <w:jc w:val="center"/>
+            </w:pPr>
+            <w:r>
+              <w:rPr>
+                <w:sz w:val="20"/>
+              </w:rPr>
+              <w:t>北向</w:t>
+            </w:r>
+          </w:p>
+        </w:tc>
+        <w:tc>
+          <w:tcPr>
+            <w:tcW w:type="dxa" w:w="1235"/>
+          </w:tcPr>
+          <w:p>
+            <w:pPr>
+              <w:jc w:val="center"/>
+            </w:pPr>
+            <w:r>
+              <w:rPr>
+                <w:sz w:val="20"/>
+              </w:rPr>
+              <w:t>4</w:t>
             </w:r>
           </w:p>
         </w:tc>
@@ -731,7 +994,20 @@
           <w:rFonts w:ascii="新細明體" w:hAnsi="新細明體" w:eastAsia="新細明體"/>
           <w:sz w:val="20"/>
         </w:rPr>
-        <w:t>表 1  範例 1 偏好分數矩陣（4×4）</w:t>
+        <w:t>表 1  範例 1 房間屬性</w:t>
+      </w:r>
+    </w:p>
+    <w:p>
+      <w:pPr>
+        <w:spacing w:after="120" w:line="360" w:lineRule="auto"/>
+      </w:pPr>
+      <w:r>
+        <w:rPr>
+          <w:rFonts w:ascii="新細明體" w:hAnsi="新細明體" w:eastAsia="新細明體"/>
+          <w:b/>
+          <w:sz w:val="26"/>
+        </w:rPr>
+        <w:t>1-3 資料模型</w:t>
       </w:r>
     </w:p>
     <w:p>
@@ -743,7 +1019,141 @@
           <w:rFonts w:ascii="新細明體" w:hAnsi="新細明體" w:eastAsia="新細明體"/>
           <w:sz w:val="24"/>
         </w:rPr>
-        <w:t>第二組範例為 5 位學生 × 5 間房間的較大規模資料：</w:t>
+        <w:t>系統的核心資料模型：</w:t>
+      </w:r>
+    </w:p>
+    <w:p>
+      <w:pPr>
+        <w:spacing w:after="120" w:line="360" w:lineRule="auto"/>
+      </w:pPr>
+      <w:r>
+        <w:rPr>
+          <w:rFonts w:ascii="新細明體" w:hAnsi="新細明體" w:eastAsia="新細明體"/>
+          <w:sz w:val="24"/>
+        </w:rPr>
+        <w:t>• 房間物件 Room = {number, type, floor, ac, bath, orient}，其中 type ∈ {2, 3, 4}。</w:t>
+      </w:r>
+    </w:p>
+    <w:p>
+      <w:pPr>
+        <w:spacing w:after="120" w:line="360" w:lineRule="auto"/>
+      </w:pPr>
+      <w:r>
+        <w:rPr>
+          <w:rFonts w:ascii="新細明體" w:hAnsi="新細明體" w:eastAsia="新細明體"/>
+          <w:sz w:val="24"/>
+        </w:rPr>
+        <w:t>• 床位展開：每間房間依其 type 展開為 type 個床位槽（Bed Slot）。例如一間三人房展開為 3 個床位槽，每個床位槽繼承該房間的所有屬性。</w:t>
+      </w:r>
+    </w:p>
+    <w:p>
+      <w:pPr>
+        <w:spacing w:after="120" w:line="360" w:lineRule="auto"/>
+      </w:pPr>
+      <w:r>
+        <w:rPr>
+          <w:rFonts w:ascii="新細明體" w:hAnsi="新細明體" w:eastAsia="新細明體"/>
+          <w:sz w:val="24"/>
+        </w:rPr>
+        <w:t>• 學生物件 Student = {name, prefType, prefFloor, prefAC, prefBath, prefOrient}。</w:t>
+      </w:r>
+    </w:p>
+    <w:p>
+      <w:pPr>
+        <w:spacing w:after="120" w:line="360" w:lineRule="auto"/>
+      </w:pPr>
+      <w:r>
+        <w:rPr>
+          <w:rFonts w:ascii="新細明體" w:hAnsi="新細明體" w:eastAsia="新細明體"/>
+          <w:sz w:val="24"/>
+        </w:rPr>
+        <w:t>• 偏好分數矩陣 C：n × totalBeds 矩陣，C[i][j] 為學生 i 對床位槽 j 的偏好分數（0-100），由系統根據學生偏好與床位屬性自動計算。</w:t>
+      </w:r>
+    </w:p>
+    <w:p>
+      <w:pPr>
+        <w:spacing w:after="120" w:line="360" w:lineRule="auto"/>
+      </w:pPr>
+      <w:r>
+        <w:rPr>
+          <w:rFonts w:ascii="新細明體" w:hAnsi="新細明體" w:eastAsia="新細明體"/>
+          <w:sz w:val="24"/>
+        </w:rPr>
+        <w:t>• 配對結果 assignment：一維陣列，assignment[i] = j 表示學生 i 被分配到床位槽 j。</w:t>
+      </w:r>
+    </w:p>
+    <w:p>
+      <w:pPr>
+        <w:spacing w:after="120" w:line="360" w:lineRule="auto"/>
+      </w:pPr>
+      <w:r>
+        <w:rPr>
+          <w:rFonts w:ascii="新細明體" w:hAnsi="新細明體" w:eastAsia="新細明體"/>
+          <w:b/>
+          <w:sz w:val="26"/>
+        </w:rPr>
+        <w:t>1-4 系統設計</w:t>
+      </w:r>
+    </w:p>
+    <w:p>
+      <w:pPr>
+        <w:spacing w:after="120" w:line="360" w:lineRule="auto"/>
+      </w:pPr>
+      <w:r>
+        <w:rPr>
+          <w:rFonts w:ascii="新細明體" w:hAnsi="新細明體" w:eastAsia="新細明體"/>
+          <w:sz w:val="24"/>
+        </w:rPr>
+        <w:t>本系統是一套為大學宿舍管理單位打造的最佳配對資訊系統。系統採用左右分欄的單頁應用佈局：</w:t>
+      </w:r>
+    </w:p>
+    <w:p>
+      <w:pPr>
+        <w:spacing w:after="120" w:line="360" w:lineRule="auto"/>
+      </w:pPr>
+      <w:r>
+        <w:rPr>
+          <w:rFonts w:ascii="新細明體" w:hAnsi="新細明體" w:eastAsia="新細明體"/>
+          <w:sz w:val="24"/>
+        </w:rPr>
+        <w:t>左側主區域：上方為二部圖配對視覺化（Canvas），左側為學生節點、右側為房間節點（含房型與容量資訊），配對以綠色連線表示。下方為系統自動計算的偏好分數矩陣（唯讀），以高亮顯示已配對的儲存格。</w:t>
+      </w:r>
+    </w:p>
+    <w:p>
+      <w:pPr>
+        <w:spacing w:after="120" w:line="360" w:lineRule="auto"/>
+      </w:pPr>
+      <w:r>
+        <w:rPr>
+          <w:rFonts w:ascii="新細明體" w:hAnsi="新細明體" w:eastAsia="新細明體"/>
+          <w:sz w:val="24"/>
+        </w:rPr>
+        <w:t>右側側邊欄由上而下包含：(1) 房間設定區——可設定雙人房/三人房/四人房的數量、起始樓層和房號，系統自動生成房間並隨機分配設備屬性，也可手動修改每間房的冷氣、衛浴和朝向。(2) 學生偏好設定區——可設定學生人數，每位學生透過下拉選單設定偏好房型、偏好樓層、冷氣需求、衛浴需求和朝向偏好。(3) 演算法選擇與執行區——支援三種演算法及一鍵比較。(4) 結果展示區——包含分數、配對明細、穩定性檢測和比較表格。</w:t>
+      </w:r>
+    </w:p>
+    <w:p>
+      <w:pPr>
+        <w:spacing w:after="120" w:line="360" w:lineRule="auto"/>
+      </w:pPr>
+      <w:r>
+        <w:rPr>
+          <w:rFonts w:ascii="新細明體" w:hAnsi="新細明體" w:eastAsia="新細明體"/>
+          <w:b/>
+          <w:sz w:val="26"/>
+        </w:rPr>
+        <w:t>1-5 偏好分數計算規則</w:t>
+      </w:r>
+    </w:p>
+    <w:p>
+      <w:pPr>
+        <w:spacing w:after="120" w:line="360" w:lineRule="auto"/>
+      </w:pPr>
+      <w:r>
+        <w:rPr>
+          <w:rFonts w:ascii="新細明體" w:hAnsi="新細明體" w:eastAsia="新細明體"/>
+          <w:sz w:val="24"/>
+        </w:rPr>
+        <w:t>偏好分數 c(i,j) 的計算規則如下，滿分 100 分：</w:t>
       </w:r>
     </w:p>
     <w:tbl>
@@ -776,6 +1186,7 @@
                 <w:b/>
                 <w:sz w:val="20"/>
               </w:rPr>
+              <w:t>評分項目</w:t>
             </w:r>
           </w:p>
         </w:tc>
@@ -793,7 +1204,7 @@
                 <w:b/>
                 <w:sz w:val="20"/>
               </w:rPr>
-              <w:t>房間 101</w:t>
+              <w:t>滿分</w:t>
             </w:r>
           </w:p>
         </w:tc>
@@ -811,7 +1222,7 @@
                 <w:b/>
                 <w:sz w:val="20"/>
               </w:rPr>
-              <w:t>房間 102</w:t>
+              <w:t>完全符合</w:t>
             </w:r>
           </w:p>
         </w:tc>
@@ -829,7 +1240,7 @@
                 <w:b/>
                 <w:sz w:val="20"/>
               </w:rPr>
-              <w:t>房間 103</w:t>
+              <w:t>部分符合</w:t>
             </w:r>
           </w:p>
         </w:tc>
@@ -847,7 +1258,7 @@
                 <w:b/>
                 <w:sz w:val="20"/>
               </w:rPr>
-              <w:t>房間 104</w:t>
+              <w:t>不限</w:t>
             </w:r>
           </w:p>
         </w:tc>
@@ -865,7 +1276,7 @@
                 <w:b/>
                 <w:sz w:val="20"/>
               </w:rPr>
-              <w:t>房間 105</w:t>
+              <w:t>不符合</w:t>
             </w:r>
           </w:p>
         </w:tc>
@@ -883,7 +1294,7 @@
               <w:rPr>
                 <w:sz w:val="20"/>
               </w:rPr>
-              <w:t>學生 A</w:t>
+              <w:t>房型偏好</w:t>
             </w:r>
           </w:p>
         </w:tc>
@@ -899,7 +1310,7 @@
               <w:rPr>
                 <w:sz w:val="20"/>
               </w:rPr>
-              <w:t>92</w:t>
+              <w:t>35</w:t>
             </w:r>
           </w:p>
         </w:tc>
@@ -915,7 +1326,7 @@
               <w:rPr>
                 <w:sz w:val="20"/>
               </w:rPr>
-              <w:t>75</w:t>
+              <w:t>35</w:t>
             </w:r>
           </w:p>
         </w:tc>
@@ -931,7 +1342,7 @@
               <w:rPr>
                 <w:sz w:val="20"/>
               </w:rPr>
-              <w:t>60</w:t>
+              <w:t>15（差1級）</w:t>
             </w:r>
           </w:p>
         </w:tc>
@@ -947,7 +1358,7 @@
               <w:rPr>
                 <w:sz w:val="20"/>
               </w:rPr>
-              <w:t>85</w:t>
+              <w:t>25</w:t>
             </w:r>
           </w:p>
         </w:tc>
@@ -963,7 +1374,7 @@
               <w:rPr>
                 <w:sz w:val="20"/>
               </w:rPr>
-              <w:t>50</w:t>
+              <w:t>5</w:t>
             </w:r>
           </w:p>
         </w:tc>
@@ -981,7 +1392,7 @@
               <w:rPr>
                 <w:sz w:val="20"/>
               </w:rPr>
-              <w:t>學生 B</w:t>
+              <w:t>樓層偏好</w:t>
             </w:r>
           </w:p>
         </w:tc>
@@ -997,7 +1408,7 @@
               <w:rPr>
                 <w:sz w:val="20"/>
               </w:rPr>
-              <w:t>55</w:t>
+              <w:t>25</w:t>
             </w:r>
           </w:p>
         </w:tc>
@@ -1013,7 +1424,7 @@
               <w:rPr>
                 <w:sz w:val="20"/>
               </w:rPr>
-              <w:t>88</w:t>
+              <w:t>25</w:t>
             </w:r>
           </w:p>
         </w:tc>
@@ -1029,7 +1440,7 @@
               <w:rPr>
                 <w:sz w:val="20"/>
               </w:rPr>
-              <w:t>70</w:t>
+              <w:t>15（相鄰區間）</w:t>
             </w:r>
           </w:p>
         </w:tc>
@@ -1045,7 +1456,7 @@
               <w:rPr>
                 <w:sz w:val="20"/>
               </w:rPr>
-              <w:t>45</w:t>
+              <w:t>18</w:t>
             </w:r>
           </w:p>
         </w:tc>
@@ -1061,7 +1472,7 @@
               <w:rPr>
                 <w:sz w:val="20"/>
               </w:rPr>
-              <w:t>90</w:t>
+              <w:t>5</w:t>
             </w:r>
           </w:p>
         </w:tc>
@@ -1079,7 +1490,7 @@
               <w:rPr>
                 <w:sz w:val="20"/>
               </w:rPr>
-              <w:t>學生 C</w:t>
+              <w:t>冷氣需求</w:t>
             </w:r>
           </w:p>
         </w:tc>
@@ -1095,7 +1506,7 @@
               <w:rPr>
                 <w:sz w:val="20"/>
               </w:rPr>
-              <w:t>80</w:t>
+              <w:t>15</w:t>
             </w:r>
           </w:p>
         </w:tc>
@@ -1111,7 +1522,7 @@
               <w:rPr>
                 <w:sz w:val="20"/>
               </w:rPr>
-              <w:t>42</w:t>
+              <w:t>15</w:t>
             </w:r>
           </w:p>
         </w:tc>
@@ -1127,7 +1538,7 @@
               <w:rPr>
                 <w:sz w:val="20"/>
               </w:rPr>
-              <w:t>95</w:t>
+              <w:t>—</w:t>
             </w:r>
           </w:p>
         </w:tc>
@@ -1143,7 +1554,7 @@
               <w:rPr>
                 <w:sz w:val="20"/>
               </w:rPr>
-              <w:t>60</w:t>
+              <w:t>10</w:t>
             </w:r>
           </w:p>
         </w:tc>
@@ -1159,7 +1570,7 @@
               <w:rPr>
                 <w:sz w:val="20"/>
               </w:rPr>
-              <w:t>65</w:t>
+              <w:t>0</w:t>
             </w:r>
           </w:p>
         </w:tc>
@@ -1177,7 +1588,7 @@
               <w:rPr>
                 <w:sz w:val="20"/>
               </w:rPr>
-              <w:t>學生 D</w:t>
+              <w:t>衛浴需求</w:t>
             </w:r>
           </w:p>
         </w:tc>
@@ -1193,7 +1604,7 @@
               <w:rPr>
                 <w:sz w:val="20"/>
               </w:rPr>
-              <w:t>65</w:t>
+              <w:t>15</w:t>
             </w:r>
           </w:p>
         </w:tc>
@@ -1209,7 +1620,7 @@
               <w:rPr>
                 <w:sz w:val="20"/>
               </w:rPr>
-              <w:t>90</w:t>
+              <w:t>15</w:t>
             </w:r>
           </w:p>
         </w:tc>
@@ -1225,7 +1636,7 @@
               <w:rPr>
                 <w:sz w:val="20"/>
               </w:rPr>
-              <w:t>50</w:t>
+              <w:t>—</w:t>
             </w:r>
           </w:p>
         </w:tc>
@@ -1241,7 +1652,7 @@
               <w:rPr>
                 <w:sz w:val="20"/>
               </w:rPr>
-              <w:t>78</w:t>
+              <w:t>10</w:t>
             </w:r>
           </w:p>
         </w:tc>
@@ -1257,7 +1668,7 @@
               <w:rPr>
                 <w:sz w:val="20"/>
               </w:rPr>
-              <w:t>55</w:t>
+              <w:t>0</w:t>
             </w:r>
           </w:p>
         </w:tc>
@@ -1275,7 +1686,7 @@
               <w:rPr>
                 <w:sz w:val="20"/>
               </w:rPr>
-              <w:t>學生 E</w:t>
+              <w:t>朝向偏好</w:t>
             </w:r>
           </w:p>
         </w:tc>
@@ -1291,7 +1702,7 @@
               <w:rPr>
                 <w:sz w:val="20"/>
               </w:rPr>
-              <w:t>70</w:t>
+              <w:t>10</w:t>
             </w:r>
           </w:p>
         </w:tc>
@@ -1307,7 +1718,7 @@
               <w:rPr>
                 <w:sz w:val="20"/>
               </w:rPr>
-              <w:t>55</w:t>
+              <w:t>10</w:t>
             </w:r>
           </w:p>
         </w:tc>
@@ -1323,7 +1734,7 @@
               <w:rPr>
                 <w:sz w:val="20"/>
               </w:rPr>
-              <w:t>85</w:t>
+              <w:t>—</w:t>
             </w:r>
           </w:p>
         </w:tc>
@@ -1339,7 +1750,7 @@
               <w:rPr>
                 <w:sz w:val="20"/>
               </w:rPr>
-              <w:t>40</w:t>
+              <w:t>7</w:t>
             </w:r>
           </w:p>
         </w:tc>
@@ -1355,7 +1766,7 @@
               <w:rPr>
                 <w:sz w:val="20"/>
               </w:rPr>
-              <w:t>92</w:t>
+              <w:t>3</w:t>
             </w:r>
           </w:p>
         </w:tc>
@@ -1371,7 +1782,19 @@
           <w:rFonts w:ascii="新細明體" w:hAnsi="新細明體" w:eastAsia="新細明體"/>
           <w:sz w:val="20"/>
         </w:rPr>
-        <w:t>表 2  範例 2 偏好分數矩陣（5×5）</w:t>
+        <w:t>表 2  偏好分數計算規則</w:t>
+      </w:r>
+    </w:p>
+    <w:p>
+      <w:pPr>
+        <w:spacing w:after="120" w:line="360" w:lineRule="auto"/>
+      </w:pPr>
+      <w:r>
+        <w:rPr>
+          <w:rFonts w:ascii="新細明體" w:hAnsi="新細明體" w:eastAsia="新細明體"/>
+          <w:sz w:val="24"/>
+        </w:rPr>
+        <w:t>例如：學生 A 偏好「雙人房、低樓層、要冷氣、不限衛浴、南向」，房間 201 是「雙人房、2F、有冷氣、有衛浴、南向」→ 分數 = 35+25+15+10+10 = 95 分。</w:t>
       </w:r>
     </w:p>
     <w:p>
@@ -1384,155 +1807,7 @@
           <w:b/>
           <w:sz w:val="26"/>
         </w:rPr>
-        <w:t>1-3 資料模型</w:t>
-      </w:r>
-    </w:p>
-    <w:p>
-      <w:pPr>
-        <w:spacing w:after="120" w:line="360" w:lineRule="auto"/>
-      </w:pPr>
-      <w:r>
-        <w:rPr>
-          <w:rFonts w:ascii="新細明體" w:hAnsi="新細明體" w:eastAsia="新細明體"/>
-          <w:sz w:val="24"/>
-        </w:rPr>
-        <w:t>系統的資料模型可以用二部圖 G = (S ∪ R, E) 表示：</w:t>
-      </w:r>
-    </w:p>
-    <w:p>
-      <w:pPr>
-        <w:spacing w:after="120" w:line="360" w:lineRule="auto"/>
-      </w:pPr>
-      <w:r>
-        <w:rPr>
-          <w:rFonts w:ascii="新細明體" w:hAnsi="新細明體" w:eastAsia="新細明體"/>
-          <w:sz w:val="24"/>
-        </w:rPr>
-        <w:t>• S（學生集合）：S = {s₁, s₂, ..., sₙ}，每個 sᵢ 代表一位學生。</w:t>
-      </w:r>
-    </w:p>
-    <w:p>
-      <w:pPr>
-        <w:spacing w:after="120" w:line="360" w:lineRule="auto"/>
-      </w:pPr>
-      <w:r>
-        <w:rPr>
-          <w:rFonts w:ascii="新細明體" w:hAnsi="新細明體" w:eastAsia="新細明體"/>
-          <w:sz w:val="24"/>
-        </w:rPr>
-        <w:t>• R（房間集合）：R = {r₁, r₂, ..., rₘ}，每個 rₖ 代表一間宿舍房間。</w:t>
-      </w:r>
-    </w:p>
-    <w:p>
-      <w:pPr>
-        <w:spacing w:after="120" w:line="360" w:lineRule="auto"/>
-      </w:pPr>
-      <w:r>
-        <w:rPr>
-          <w:rFonts w:ascii="新細明體" w:hAnsi="新細明體" w:eastAsia="新細明體"/>
-          <w:sz w:val="24"/>
-        </w:rPr>
-        <w:t>• E（邊集合）：每條邊 (sᵢ, rₖ) 的權重為偏好分數 c(i,k) ∈ [0, 100]。</w:t>
-      </w:r>
-    </w:p>
-    <w:p>
-      <w:pPr>
-        <w:spacing w:after="120" w:line="360" w:lineRule="auto"/>
-      </w:pPr>
-      <w:r>
-        <w:rPr>
-          <w:rFonts w:ascii="新細明體" w:hAnsi="新細明體" w:eastAsia="新細明體"/>
-          <w:sz w:val="24"/>
-        </w:rPr>
-        <w:t>• 偏好分數矩陣 C：n × m 矩陣，C[i][k] = c(i,k)，量化學生 i 對房間 k 的偏好程度。</w:t>
-      </w:r>
-    </w:p>
-    <w:p>
-      <w:pPr>
-        <w:spacing w:after="120" w:line="360" w:lineRule="auto"/>
-      </w:pPr>
-      <w:r>
-        <w:rPr>
-          <w:rFonts w:ascii="新細明體" w:hAnsi="新細明體" w:eastAsia="新細明體"/>
-          <w:b/>
-          <w:sz w:val="26"/>
-        </w:rPr>
-        <w:t>1-4 系統設計</w:t>
-      </w:r>
-    </w:p>
-    <w:p>
-      <w:pPr>
-        <w:spacing w:after="120" w:line="360" w:lineRule="auto"/>
-      </w:pPr>
-      <w:r>
-        <w:rPr>
-          <w:rFonts w:ascii="新細明體" w:hAnsi="新細明體" w:eastAsia="新細明體"/>
-          <w:sz w:val="24"/>
-        </w:rPr>
-        <w:t>本系統是一套為大學宿舍管理單位打造的最佳配對資訊系統，提供一個直觀、高效的數位化平台，讓管理者輸入或生成學生的偏好分數矩陣，並自動計算最佳分配方案。</w:t>
-      </w:r>
-    </w:p>
-    <w:p>
-      <w:pPr>
-        <w:spacing w:after="120" w:line="360" w:lineRule="auto"/>
-      </w:pPr>
-      <w:r>
-        <w:rPr>
-          <w:rFonts w:ascii="新細明體" w:hAnsi="新細明體" w:eastAsia="新細明體"/>
-          <w:sz w:val="24"/>
-        </w:rPr>
-        <w:t>系統採用左右分欄的單頁應用佈局。左側主區域分為上半部的二部圖配對視覺化區域（使用 HTML5 Canvas 繪製）和下半部的可編輯偏好分數矩陣表格。右側側邊欄包含資料設定區（人數輸入、隨機生成、範例載入）、演算法選擇區（三種演算法的 Radio 選項）、執行按鈕（執行配對 / 三算法比較 / 清除結果）、以及結果展示區域。</w:t>
-      </w:r>
-    </w:p>
-    <w:p>
-      <w:pPr>
-        <w:spacing w:after="120" w:line="360" w:lineRule="auto"/>
-      </w:pPr>
-      <w:r>
-        <w:rPr>
-          <w:rFonts w:ascii="新細明體" w:hAnsi="新細明體" w:eastAsia="新細明體"/>
-          <w:b/>
-          <w:sz w:val="26"/>
-        </w:rPr>
-        <w:t>1-5 使用流程</w:t>
-      </w:r>
-    </w:p>
-    <w:p>
-      <w:pPr>
-        <w:spacing w:after="80" w:line="360" w:lineRule="auto"/>
-      </w:pPr>
-      <w:r>
-        <w:rPr>
-          <w:rFonts w:ascii="新細明體" w:hAnsi="新細明體" w:eastAsia="新細明體"/>
-          <w:b/>
-          <w:sz w:val="24"/>
-        </w:rPr>
-        <w:t>1-5.1 資料模型</w:t>
-      </w:r>
-    </w:p>
-    <w:p>
-      <w:pPr>
-        <w:spacing w:after="120" w:line="360" w:lineRule="auto"/>
-      </w:pPr>
-      <w:r>
-        <w:rPr>
-          <w:rFonts w:ascii="新細明體" w:hAnsi="新細明體" w:eastAsia="新細明體"/>
-          <w:sz w:val="24"/>
-        </w:rPr>
-        <w:t>核心資料結構為一個 n×m 的二維陣列 scoreMatrix，其中 scoreMatrix[i][j] 儲存學生 i 對房間 j 的偏好分數。配對結果以一維陣列 assignment 表示，其中 assignment[i] = j 代表學生 i 被分配到房間 j。</w:t>
-      </w:r>
-    </w:p>
-    <w:p>
-      <w:pPr>
-        <w:spacing w:after="80" w:line="360" w:lineRule="auto"/>
-      </w:pPr>
-      <w:r>
-        <w:rPr>
-          <w:rFonts w:ascii="新細明體" w:hAnsi="新細明體" w:eastAsia="新細明體"/>
-          <w:b/>
-          <w:sz w:val="24"/>
-        </w:rPr>
-        <w:t>1-5.2 使用流程</w:t>
+        <w:t>1-6 使用流程</w:t>
       </w:r>
     </w:p>
     <w:tbl>
@@ -1632,7 +1907,7 @@
               <w:rPr>
                 <w:sz w:val="20"/>
               </w:rPr>
-              <w:t>設定學生人數 n 和房間數量 m</w:t>
+              <w:t>設定雙人/三人/四人房數量、起始樓層</w:t>
             </w:r>
           </w:p>
         </w:tc>
@@ -1648,7 +1923,7 @@
               <w:rPr>
                 <w:sz w:val="20"/>
               </w:rPr>
-              <w:t>更新介面參數</w:t>
+              <w:t>—</w:t>
             </w:r>
           </w:p>
         </w:tc>
@@ -1682,7 +1957,7 @@
               <w:rPr>
                 <w:sz w:val="20"/>
               </w:rPr>
-              <w:t>點擊「隨機生成」或「範例1」</w:t>
+              <w:t>點擊「生成房間」或載入範例</w:t>
             </w:r>
           </w:p>
         </w:tc>
@@ -1698,7 +1973,7 @@
               <w:rPr>
                 <w:sz w:val="20"/>
               </w:rPr>
-              <w:t>生成偏好分數矩陣並顯示於表格</w:t>
+              <w:t>生成房間列表，顯示各房屬性</w:t>
             </w:r>
           </w:p>
         </w:tc>
@@ -1732,7 +2007,7 @@
               <w:rPr>
                 <w:sz w:val="20"/>
               </w:rPr>
-              <w:t>（可選）點擊矩陣儲存格修改分數</w:t>
+              <w:t>（可選）修改房間的冷氣/衛浴/朝向</w:t>
             </w:r>
           </w:p>
         </w:tc>
@@ -1748,7 +2023,7 @@
               <w:rPr>
                 <w:sz w:val="20"/>
               </w:rPr>
-              <w:t>即時更新對應的分數值</w:t>
+              <w:t>即時更新房間屬性</w:t>
             </w:r>
           </w:p>
         </w:tc>
@@ -1782,7 +2057,7 @@
               <w:rPr>
                 <w:sz w:val="20"/>
               </w:rPr>
-              <w:t>選擇演算法（B&amp;B / 貪婪 / DP）</w:t>
+              <w:t>設定學生人數，點擊「生成學生」</w:t>
             </w:r>
           </w:p>
         </w:tc>
@@ -1798,7 +2073,7 @@
               <w:rPr>
                 <w:sz w:val="20"/>
               </w:rPr>
-              <w:t>準備對應的配對引擎</w:t>
+              <w:t>生成學生偏好表單（隨機初始化）</w:t>
             </w:r>
           </w:p>
         </w:tc>
@@ -1832,7 +2107,7 @@
               <w:rPr>
                 <w:sz w:val="20"/>
               </w:rPr>
-              <w:t>點擊「執行配對」</w:t>
+              <w:t>調整每位學生的偏好條件</w:t>
             </w:r>
           </w:p>
         </w:tc>
@@ -1848,7 +2123,7 @@
               <w:rPr>
                 <w:sz w:val="20"/>
               </w:rPr>
-              <w:t>計算最佳配對，在二部圖上顯示綠色連線</w:t>
+              <w:t>學生下拉選單即時更新</w:t>
             </w:r>
           </w:p>
         </w:tc>
@@ -1882,7 +2157,7 @@
               <w:rPr>
                 <w:sz w:val="20"/>
               </w:rPr>
-              <w:t>查看結果面板</w:t>
+              <w:t>點擊「計算偏好分數」</w:t>
             </w:r>
           </w:p>
         </w:tc>
@@ -1898,7 +2173,7 @@
               <w:rPr>
                 <w:sz w:val="20"/>
               </w:rPr>
-              <w:t>顯示總分、配對明細、搜尋統計、穩定性檢測</w:t>
+              <w:t>自動計算並顯示 n×totalBeds 偏好分數矩陣</w:t>
             </w:r>
           </w:p>
         </w:tc>
@@ -1932,6 +2207,56 @@
               <w:rPr>
                 <w:sz w:val="20"/>
               </w:rPr>
+              <w:t>選擇演算法，點擊「執行配對」</w:t>
+            </w:r>
+          </w:p>
+        </w:tc>
+        <w:tc>
+          <w:tcPr>
+            <w:tcW w:type="dxa" w:w="2882"/>
+          </w:tcPr>
+          <w:p>
+            <w:pPr>
+              <w:jc w:val="center"/>
+            </w:pPr>
+            <w:r>
+              <w:rPr>
+                <w:sz w:val="20"/>
+              </w:rPr>
+              <w:t>計算最佳配對，二部圖顯示綠色連線</w:t>
+            </w:r>
+          </w:p>
+        </w:tc>
+      </w:tr>
+      <w:tr>
+        <w:tc>
+          <w:tcPr>
+            <w:tcW w:type="dxa" w:w="2882"/>
+          </w:tcPr>
+          <w:p>
+            <w:pPr>
+              <w:jc w:val="center"/>
+            </w:pPr>
+            <w:r>
+              <w:rPr>
+                <w:sz w:val="20"/>
+              </w:rPr>
+              <w:t>8</w:t>
+            </w:r>
+          </w:p>
+        </w:tc>
+        <w:tc>
+          <w:tcPr>
+            <w:tcW w:type="dxa" w:w="2882"/>
+          </w:tcPr>
+          <w:p>
+            <w:pPr>
+              <w:jc w:val="center"/>
+            </w:pPr>
+            <w:r>
+              <w:rPr>
+                <w:sz w:val="20"/>
+              </w:rPr>
               <w:t>點擊「三算法比較」</w:t>
             </w:r>
           </w:p>
@@ -1948,7 +2273,7 @@
               <w:rPr>
                 <w:sz w:val="20"/>
               </w:rPr>
-              <w:t>同時運行三種演算法，以表格比較各項指標</w:t>
+              <w:t>同時運行三種演算法，比較結果</w:t>
             </w:r>
           </w:p>
         </w:tc>
@@ -1977,7 +2302,7 @@
           <w:b/>
           <w:sz w:val="26"/>
         </w:rPr>
-        <w:t>1-6 系統功能需求</w:t>
+        <w:t>1-7 系統功能需求</w:t>
       </w:r>
     </w:p>
     <w:tbl>
@@ -2077,7 +2402,7 @@
               <w:rPr>
                 <w:sz w:val="20"/>
               </w:rPr>
-              <w:t>偏好分數矩陣視覺化</w:t>
+              <w:t>多房型設定</w:t>
             </w:r>
           </w:p>
         </w:tc>
@@ -2093,7 +2418,7 @@
               <w:rPr>
                 <w:sz w:val="20"/>
               </w:rPr>
-              <w:t>以表格形式呈現 n×m 偏好分數矩陣</w:t>
+              <w:t>支援雙人房/三人房/四人房的混合配置</w:t>
             </w:r>
           </w:p>
         </w:tc>
@@ -2127,7 +2452,7 @@
               <w:rPr>
                 <w:sz w:val="20"/>
               </w:rPr>
-              <w:t>矩陣即時編輯</w:t>
+              <w:t>房間屬性編輯</w:t>
             </w:r>
           </w:p>
         </w:tc>
@@ -2143,7 +2468,7 @@
               <w:rPr>
                 <w:sz w:val="20"/>
               </w:rPr>
-              <w:t>使用者可點擊任一儲存格直接修改分數（0-100）</w:t>
+              <w:t>每間房可設定冷氣、衛浴、朝向</w:t>
             </w:r>
           </w:p>
         </w:tc>
@@ -2177,7 +2502,7 @@
               <w:rPr>
                 <w:sz w:val="20"/>
               </w:rPr>
-              <w:t>隨機資料生成</w:t>
+              <w:t>學生偏好表單</w:t>
             </w:r>
           </w:p>
         </w:tc>
@@ -2193,7 +2518,7 @@
               <w:rPr>
                 <w:sz w:val="20"/>
               </w:rPr>
-              <w:t>一鍵隨機生成指定規模的偏好分數矩陣（範圍 20-100）</w:t>
+              <w:t>每位學生可設定 5 項偏好（房型/樓層/AC/衛浴/朝向）</w:t>
             </w:r>
           </w:p>
         </w:tc>
@@ -2227,6 +2552,56 @@
               <w:rPr>
                 <w:sz w:val="20"/>
               </w:rPr>
+              <w:t>自動偏好分數計算</w:t>
+            </w:r>
+          </w:p>
+        </w:tc>
+        <w:tc>
+          <w:tcPr>
+            <w:tcW w:type="dxa" w:w="2882"/>
+          </w:tcPr>
+          <w:p>
+            <w:pPr>
+              <w:jc w:val="center"/>
+            </w:pPr>
+            <w:r>
+              <w:rPr>
+                <w:sz w:val="20"/>
+              </w:rPr>
+              <w:t>根據偏好 vs 屬性的匹配度自動計算 0-100 分</w:t>
+            </w:r>
+          </w:p>
+        </w:tc>
+      </w:tr>
+      <w:tr>
+        <w:tc>
+          <w:tcPr>
+            <w:tcW w:type="dxa" w:w="2882"/>
+          </w:tcPr>
+          <w:p>
+            <w:pPr>
+              <w:jc w:val="center"/>
+            </w:pPr>
+            <w:r>
+              <w:rPr>
+                <w:sz w:val="20"/>
+              </w:rPr>
+              <w:t>FR-1.5</w:t>
+            </w:r>
+          </w:p>
+        </w:tc>
+        <w:tc>
+          <w:tcPr>
+            <w:tcW w:type="dxa" w:w="2882"/>
+          </w:tcPr>
+          <w:p>
+            <w:pPr>
+              <w:jc w:val="center"/>
+            </w:pPr>
+            <w:r>
+              <w:rPr>
+                <w:sz w:val="20"/>
+              </w:rPr>
               <w:t>範例資料載入</w:t>
             </w:r>
           </w:p>
@@ -2243,7 +2618,7 @@
               <w:rPr>
                 <w:sz w:val="20"/>
               </w:rPr>
-              <w:t>提供 2 組預設範例（4×4 和 5×5）</w:t>
+              <w:t>提供 2 組預設範例</w:t>
             </w:r>
           </w:p>
         </w:tc>
@@ -2277,7 +2652,7 @@
               <w:rPr>
                 <w:sz w:val="20"/>
               </w:rPr>
-              <w:t>演算法選擇</w:t>
+              <w:t>三種演算法</w:t>
             </w:r>
           </w:p>
         </w:tc>
@@ -2293,57 +2668,7 @@
               <w:rPr>
                 <w:sz w:val="20"/>
               </w:rPr>
-              <w:t>支援分支定界法、貪婪演算法、動態規劃三種演算法</w:t>
-            </w:r>
-          </w:p>
-        </w:tc>
-      </w:tr>
-      <w:tr>
-        <w:tc>
-          <w:tcPr>
-            <w:tcW w:type="dxa" w:w="2882"/>
-          </w:tcPr>
-          <w:p>
-            <w:pPr>
-              <w:jc w:val="center"/>
-            </w:pPr>
-            <w:r>
-              <w:rPr>
-                <w:sz w:val="20"/>
-              </w:rPr>
-              <w:t>FR-2.2</w:t>
-            </w:r>
-          </w:p>
-        </w:tc>
-        <w:tc>
-          <w:tcPr>
-            <w:tcW w:type="dxa" w:w="2882"/>
-          </w:tcPr>
-          <w:p>
-            <w:pPr>
-              <w:jc w:val="center"/>
-            </w:pPr>
-            <w:r>
-              <w:rPr>
-                <w:sz w:val="20"/>
-              </w:rPr>
-              <w:t>配對執行</w:t>
-            </w:r>
-          </w:p>
-        </w:tc>
-        <w:tc>
-          <w:tcPr>
-            <w:tcW w:type="dxa" w:w="2882"/>
-          </w:tcPr>
-          <w:p>
-            <w:pPr>
-              <w:jc w:val="center"/>
-            </w:pPr>
-            <w:r>
-              <w:rPr>
-                <w:sz w:val="20"/>
-              </w:rPr>
-              <w:t>根據選擇的演算法計算最佳宿舍分配方案</w:t>
+              <w:t>分支定界法、貪婪法、動態規劃</w:t>
             </w:r>
           </w:p>
         </w:tc>
@@ -2393,7 +2718,7 @@
               <w:rPr>
                 <w:sz w:val="20"/>
               </w:rPr>
-              <w:t>以 Canvas 繪製二部圖，左側圓形為學生，右側方形為房間，配對以綠色連線表示</w:t>
+              <w:t>學生→房間的配對關係圖</w:t>
             </w:r>
           </w:p>
         </w:tc>
@@ -2427,7 +2752,7 @@
               <w:rPr>
                 <w:sz w:val="20"/>
               </w:rPr>
-              <w:t>結果明細</w:t>
+              <w:t>分組結果展示</w:t>
             </w:r>
           </w:p>
         </w:tc>
@@ -2443,7 +2768,7 @@
               <w:rPr>
                 <w:sz w:val="20"/>
               </w:rPr>
-              <w:t>顯示總分、每對配對的分數、搜尋節點數、修剪次數、計算時間</w:t>
+              <w:t>按房間分組顯示入住學生及分數</w:t>
             </w:r>
           </w:p>
         </w:tc>
@@ -2493,7 +2818,7 @@
               <w:rPr>
                 <w:sz w:val="20"/>
               </w:rPr>
-              <w:t>配對完成後自動檢測是否存在 blocking pair</w:t>
+              <w:t>偵測 blocking pair</w:t>
             </w:r>
           </w:p>
         </w:tc>
@@ -2527,7 +2852,7 @@
               <w:rPr>
                 <w:sz w:val="20"/>
               </w:rPr>
-              <w:t>三算法比較</w:t>
+              <w:t>三算法比較表</w:t>
             </w:r>
           </w:p>
         </w:tc>
@@ -2543,7 +2868,7 @@
               <w:rPr>
                 <w:sz w:val="20"/>
               </w:rPr>
-              <w:t>同時運行三種演算法，以比較表格呈現各項指標差異</w:t>
+              <w:t>比較總分、節點數、修剪次數、時間</w:t>
             </w:r>
           </w:p>
         </w:tc>
@@ -2572,7 +2897,7 @@
           <w:b/>
           <w:sz w:val="26"/>
         </w:rPr>
-        <w:t>1-7 使用者介面設計</w:t>
+        <w:t>1-8 使用者介面設計</w:t>
       </w:r>
     </w:p>
     <w:p>
@@ -2584,19 +2909,7 @@
           <w:rFonts w:ascii="新細明體" w:hAnsi="新細明體" w:eastAsia="新細明體"/>
           <w:sz w:val="24"/>
         </w:rPr>
-        <w:t>介面採用白色主題，配色以靛藍色（#4f46e5）代表學生節點、橙色（#ea580c）代表房間節點、綠色（#059669）代表配對連線。字型使用 Noto Sans TC 搭配 Inter，兼顧中英文排版的美觀性。</w:t>
-      </w:r>
-    </w:p>
-    <w:p>
-      <w:pPr>
-        <w:spacing w:after="120" w:line="360" w:lineRule="auto"/>
-      </w:pPr>
-      <w:r>
-        <w:rPr>
-          <w:rFonts w:ascii="新細明體" w:hAnsi="新細明體" w:eastAsia="新細明體"/>
-          <w:sz w:val="24"/>
-        </w:rPr>
-        <w:t>左側 Canvas 畫布以二部圖形式呈現配對關係，學生以圓形節點排列於左側，房間以圓角矩形節點排列於右側。配對成功的連線上方會顯示該對的偏好分數。下方的矩陣表格支援即時點擊編輯，已配對的儲存格會以綠色背景高亮標示。</w:t>
+        <w:t>介面採用白色主題。學生節點以靛藍色圓形表示，房間節點以橙色圓角矩形表示（內含房號和人數），配對連線為綠色並標註偏好分數。偏好分數矩陣的欄標題為「房號-床號」格式（如 201-1、201-2），已配對的儲存格以綠色高亮。</w:t>
       </w:r>
     </w:p>
     <w:p>
@@ -2609,7 +2922,7 @@
           <w:b/>
           <w:sz w:val="26"/>
         </w:rPr>
-        <w:t>1-8 問題定義</w:t>
+        <w:t>1-9 問題定義</w:t>
       </w:r>
     </w:p>
     <w:p>
@@ -2622,7 +2935,7 @@
           <w:b/>
           <w:sz w:val="24"/>
         </w:rPr>
-        <w:t>1-8.1 最佳指派問題 (Optimal Assignment Problem)</w:t>
+        <w:t>1-9.1 最佳指派問題 (Optimal Assignment Problem)</w:t>
       </w:r>
     </w:p>
     <w:p>
@@ -2634,7 +2947,7 @@
           <w:rFonts w:ascii="新細明體" w:hAnsi="新細明體" w:eastAsia="新細明體"/>
           <w:sz w:val="24"/>
         </w:rPr>
-        <w:t>給定 n 位學生和 m 間房間（取 k = min(n,m) 進行一對一配對），以及偏好分數矩陣 C，找到一個分配方案使總偏好分數最大化。</w:t>
+        <w:t>將 n 位學生分配到 totalBeds 個床位（每間房依房型展開），使總偏好分數最大化。</w:t>
       </w:r>
     </w:p>
     <w:p>
@@ -2646,7 +2959,7 @@
           <w:rFonts w:ascii="新細明體" w:hAnsi="新細明體" w:eastAsia="新細明體"/>
           <w:sz w:val="24"/>
         </w:rPr>
-        <w:t>形式化定義：</w:t>
+        <w:t>形式化：輸入 n×totalBeds 偏好分數矩陣 C，找到排列 π 使 Σᵢ c(i, π(i)) 最大化。</w:t>
       </w:r>
     </w:p>
     <w:p>
@@ -2658,31 +2971,7 @@
           <w:rFonts w:ascii="新細明體" w:hAnsi="新細明體" w:eastAsia="新細明體"/>
           <w:sz w:val="24"/>
         </w:rPr>
-        <w:t>輸入：n×m 偏好分數矩陣 C，其中 c(i,j) ∈ [0, 100]。</w:t>
-      </w:r>
-    </w:p>
-    <w:p>
-      <w:pPr>
-        <w:spacing w:after="120" w:line="360" w:lineRule="auto"/>
-      </w:pPr>
-      <w:r>
-        <w:rPr>
-          <w:rFonts w:ascii="新細明體" w:hAnsi="新細明體" w:eastAsia="新細明體"/>
-          <w:sz w:val="24"/>
-        </w:rPr>
-        <w:t>輸出：排列 π: {1,...,k} → {1,...,m}（k = min(n,m)），使 Σᵢ c(i, π(i)) 最大化。</w:t>
-      </w:r>
-    </w:p>
-    <w:p>
-      <w:pPr>
-        <w:spacing w:after="120" w:line="360" w:lineRule="auto"/>
-      </w:pPr>
-      <w:r>
-        <w:rPr>
-          <w:rFonts w:ascii="新細明體" w:hAnsi="新細明體" w:eastAsia="新細明體"/>
-          <w:sz w:val="24"/>
-        </w:rPr>
-        <w:t>約束：每位學生最多分配到一間房間，每間房間最多分配一位學生。</w:t>
+        <w:t>約束：每位學生最多分配到一個床位，每個床位最多分配一位學生。</w:t>
       </w:r>
     </w:p>
     <w:p>
@@ -2695,7 +2984,7 @@
           <w:b/>
           <w:sz w:val="24"/>
         </w:rPr>
-        <w:t>1-8.2 穩定性問題 (Stability Problem)</w:t>
+        <w:t>1-9.2 穩定性問題</w:t>
       </w:r>
     </w:p>
     <w:p>
@@ -2707,19 +2996,7 @@
           <w:rFonts w:ascii="新細明體" w:hAnsi="新細明體" w:eastAsia="新細明體"/>
           <w:sz w:val="24"/>
         </w:rPr>
-        <w:t>配對完成後，檢測是否存在「不穩定配對」（Blocking Pair）：即存在某位學生 sᵢ 對某間房間 rₖ 的偏好分數高於其目前配到的房間，同時 sᵢ 對 rₖ 的分數也高於 rₖ 目前住戶對 rₖ 的分數。</w:t>
-      </w:r>
-    </w:p>
-    <w:p>
-      <w:pPr>
-        <w:spacing w:after="120" w:line="360" w:lineRule="auto"/>
-      </w:pPr>
-      <w:r>
-        <w:rPr>
-          <w:rFonts w:ascii="新細明體" w:hAnsi="新細明體" w:eastAsia="新細明體"/>
-          <w:sz w:val="24"/>
-        </w:rPr>
-        <w:t>形式化定義：若存在 (sᵢ, rₖ) 使得 c(i,k) &gt; c(i, π(i)) 且 c(i,k) &gt; c(π⁻¹(k), k)，則稱 (sᵢ, rₖ) 為 blocking pair，該配對結果不穩定。</w:t>
+        <w:t>檢測是否存在 blocking pair (sᵢ, bed_j)：學生 sᵢ 對 bed_j 的偏好分數高於其目前分配的床位，且也高於 bed_j 目前住戶對該床位的分數。</w:t>
       </w:r>
     </w:p>
     <w:p>
@@ -2732,7 +3009,7 @@
           <w:b/>
           <w:sz w:val="24"/>
         </w:rPr>
-        <w:t>1-8.3 系統限制條件</w:t>
+        <w:t>1-9.3 系統限制條件</w:t>
       </w:r>
     </w:p>
     <w:p>
@@ -2744,7 +3021,7 @@
           <w:rFonts w:ascii="新細明體" w:hAnsi="新細明體" w:eastAsia="新細明體"/>
           <w:sz w:val="24"/>
         </w:rPr>
-        <w:t>• 偏好分數為 0-100 的正整數。</w:t>
+        <w:t>• 偏好分數為 0-100 的整數，由系統自動計算。</w:t>
       </w:r>
     </w:p>
     <w:p>
@@ -2756,7 +3033,7 @@
           <w:rFonts w:ascii="新細明體" w:hAnsi="新細明體" w:eastAsia="新細明體"/>
           <w:sz w:val="24"/>
         </w:rPr>
-        <w:t>• 分支定界法和動態規劃法受限於組合爆炸，建議規模 n, m ≤ 10。</w:t>
+        <w:t>• 建議總床位數 ≤ 15（B&amp;B）或 ≤ 20（DP）。</w:t>
       </w:r>
     </w:p>
     <w:p>
@@ -2768,44 +3045,7 @@
           <w:rFonts w:ascii="新細明體" w:hAnsi="新細明體" w:eastAsia="新細明體"/>
           <w:sz w:val="24"/>
         </w:rPr>
-        <w:t>• 系統為一對一配對（單人房），不支援多人一房的情境。</w:t>
-      </w:r>
-    </w:p>
-    <w:p>
-      <w:pPr>
-        <w:spacing w:after="80" w:line="360" w:lineRule="auto"/>
-      </w:pPr>
-      <w:r>
-        <w:rPr>
-          <w:rFonts w:ascii="新細明體" w:hAnsi="新細明體" w:eastAsia="新細明體"/>
-          <w:b/>
-          <w:sz w:val="24"/>
-        </w:rPr>
-        <w:t>1-8.4 最佳化目標</w:t>
-      </w:r>
-    </w:p>
-    <w:p>
-      <w:pPr>
-        <w:spacing w:after="120" w:line="360" w:lineRule="auto"/>
-      </w:pPr>
-      <w:r>
-        <w:rPr>
-          <w:rFonts w:ascii="新細明體" w:hAnsi="新細明體" w:eastAsia="新細明體"/>
-          <w:sz w:val="24"/>
-        </w:rPr>
-        <w:t>主要目標：最大化 Σᵢ c(i, π(i))（總偏好分數），在所有合法的一對一分配方案中找到全域最優解。</w:t>
-      </w:r>
-    </w:p>
-    <w:p>
-      <w:pPr>
-        <w:spacing w:after="120" w:line="360" w:lineRule="auto"/>
-      </w:pPr>
-      <w:r>
-        <w:rPr>
-          <w:rFonts w:ascii="新細明體" w:hAnsi="新細明體" w:eastAsia="新細明體"/>
-          <w:sz w:val="24"/>
-        </w:rPr>
-        <w:t>次要目標：最小化 blocking pair 數量，提升分配結果的公平性與穩定性。</w:t>
+        <w:t>• 系統為一次性分配，不支援多輪重新配對。</w:t>
       </w:r>
     </w:p>
     <w:p>
@@ -2818,7 +3058,7 @@
           <w:b/>
           <w:sz w:val="26"/>
         </w:rPr>
-        <w:t>1-9 AI 工具協助項目</w:t>
+        <w:t>1-10 AI 工具協助項目</w:t>
       </w:r>
     </w:p>
     <w:p>
@@ -2830,7 +3070,7 @@
           <w:rFonts w:ascii="新細明體" w:hAnsi="新細明體" w:eastAsia="新細明體"/>
           <w:sz w:val="24"/>
         </w:rPr>
-        <w:t>在情境設計階段，使用 AI 輔助工具協助整理問題的形式化定義與系統功能需求表的結構化描述。具體流程：作者先定義問題場景（宿舍配對），再由 AI 協助將問題轉化為數學形式（集合、矩陣、約束條件），作者進行校對與調整。</w:t>
+        <w:t>在情境設計階段，使用 AI 輔助工具協助整理偏好分數的計算規則與問題的形式化定義。作者先定義宿舍分配場景和偏好項目，再由 AI 協助將評分規則結構化，作者進行校對與調整。</w:t>
       </w:r>
     </w:p>
     <w:p>
@@ -2861,7 +3101,7 @@
           <w:b/>
           <w:sz w:val="26"/>
         </w:rPr>
-        <w:t>2-1 分支定界法 (Branch-and-Bound)</w:t>
+        <w:t>2-1 床位展開策略</w:t>
       </w:r>
     </w:p>
     <w:p>
@@ -2873,7 +3113,7 @@
           <w:rFonts w:ascii="新細明體" w:hAnsi="新細明體" w:eastAsia="新細明體"/>
           <w:sz w:val="24"/>
         </w:rPr>
-        <w:t>本系統的核心演算法，用於解決最佳指派問題。此演算法直接對應課堂教授的「人員指派問題」，透過系統性搜尋與智慧修剪找到全域最優解。</w:t>
+        <w:t>由於系統支援多人房，核心策略是將多人房展開為個別床位槽（Bed Slot），將多對一問題轉換為一對一指派問題：</w:t>
       </w:r>
     </w:p>
     <w:p>
@@ -2885,7 +3125,7 @@
           <w:rFonts w:ascii="新細明體" w:hAnsi="新細明體" w:eastAsia="新細明體"/>
           <w:sz w:val="24"/>
         </w:rPr>
-        <w:t>演算法步驟：</w:t>
+        <w:t>• 一間雙人房展開為 2 個床位槽</w:t>
       </w:r>
     </w:p>
     <w:p>
@@ -2897,7 +3137,7 @@
           <w:rFonts w:ascii="新細明體" w:hAnsi="新細明體" w:eastAsia="新細明體"/>
           <w:sz w:val="24"/>
         </w:rPr>
-        <w:t>1. 初始化全域最佳分數 bestScore = 0，最佳指派 bestAssign = null。</w:t>
+        <w:t>• 一間三人房展開為 3 個床位槽</w:t>
       </w:r>
     </w:p>
     <w:p>
@@ -2909,7 +3149,7 @@
           <w:rFonts w:ascii="新細明體" w:hAnsi="新細明體" w:eastAsia="新細明體"/>
           <w:sz w:val="24"/>
         </w:rPr>
-        <w:t>2. 從第 1 位學生開始，以深度優先搜尋（DFS）逐一決定每位學生分配到哪間房間。</w:t>
+        <w:t>• 一間四人房展開為 4 個床位槽</w:t>
       </w:r>
     </w:p>
     <w:p>
@@ -2921,67 +3161,7 @@
           <w:rFonts w:ascii="新細明體" w:hAnsi="新細明體" w:eastAsia="新細明體"/>
           <w:sz w:val="24"/>
         </w:rPr>
-        <w:t>3. 上界函數（Upper Bound）：對尚未分配的每位學生，取其在剩餘可用房間中的最大偏好分數，將這些最大值加總，作為「剩餘最多還能獲得多少分」的估計。</w:t>
-      </w:r>
-    </w:p>
-    <w:p>
-      <w:pPr>
-        <w:spacing w:after="120" w:line="360" w:lineRule="auto"/>
-      </w:pPr>
-      <w:r>
-        <w:rPr>
-          <w:rFonts w:ascii="新細明體" w:hAnsi="新細明體" w:eastAsia="新細明體"/>
-          <w:sz w:val="24"/>
-        </w:rPr>
-        <w:t>4. 修剪條件：若「當前累計分數 + 上界估計 ≤ bestScore」，表示此分支即使在最理想的情況下也不可能超越已知最佳解，立即修剪。</w:t>
-      </w:r>
-    </w:p>
-    <w:p>
-      <w:pPr>
-        <w:spacing w:after="120" w:line="360" w:lineRule="auto"/>
-      </w:pPr>
-      <w:r>
-        <w:rPr>
-          <w:rFonts w:ascii="新細明體" w:hAnsi="新細明體" w:eastAsia="新細明體"/>
-          <w:sz w:val="24"/>
-        </w:rPr>
-        <w:t>5. 當所有學生都已分配完畢（到達葉節點），若當前總分 &gt; bestScore，則更新全域最佳解。</w:t>
-      </w:r>
-    </w:p>
-    <w:p>
-      <w:pPr>
-        <w:spacing w:after="120" w:line="360" w:lineRule="auto"/>
-      </w:pPr>
-      <w:r>
-        <w:rPr>
-          <w:rFonts w:ascii="新細明體" w:hAnsi="新細明體" w:eastAsia="新細明體"/>
-          <w:sz w:val="24"/>
-        </w:rPr>
-        <w:t>6. 回溯（backtrack），將房間標記為可用，嘗試下一個分配方案。</w:t>
-      </w:r>
-    </w:p>
-    <w:p>
-      <w:pPr>
-        <w:spacing w:after="120" w:line="360" w:lineRule="auto"/>
-      </w:pPr>
-      <w:r>
-        <w:rPr>
-          <w:rFonts w:ascii="新細明體" w:hAnsi="新細明體" w:eastAsia="新細明體"/>
-          <w:sz w:val="24"/>
-        </w:rPr>
-        <w:t>時間複雜度：最壞情況 O(n!)，但透過上界修剪，實際搜尋量遠小於全排列。</w:t>
-      </w:r>
-    </w:p>
-    <w:p>
-      <w:pPr>
-        <w:spacing w:after="120" w:line="360" w:lineRule="auto"/>
-      </w:pPr>
-      <w:r>
-        <w:rPr>
-          <w:rFonts w:ascii="新細明體" w:hAnsi="新細明體" w:eastAsia="新細明體"/>
-          <w:sz w:val="24"/>
-        </w:rPr>
-        <w:t>空間複雜度：O(n)（遞迴棧深度）。</w:t>
+        <w:t>同一房間內的所有床位槽共享相同的房間屬性，因此對同一位學生而言，同一房間的各床位具有相同的偏好分數。展開後，問題即為標準的一對一指派問題，可直接套用課堂所學的演算法求解。</w:t>
       </w:r>
     </w:p>
     <w:p>
@@ -2994,7 +3174,7 @@
           <w:b/>
           <w:sz w:val="26"/>
         </w:rPr>
-        <w:t>2-2 貪婪演算法 (Greedy Algorithm)</w:t>
+        <w:t>2-2 分支定界法 (Branch-and-Bound)</w:t>
       </w:r>
     </w:p>
     <w:p>
@@ -3006,7 +3186,7 @@
           <w:rFonts w:ascii="新細明體" w:hAnsi="新細明體" w:eastAsia="新細明體"/>
           <w:sz w:val="24"/>
         </w:rPr>
-        <w:t>用於快速產生近似解，作為效能對照組。</w:t>
+        <w:t>核心演算法，對應課堂的「人員指派問題」。</w:t>
       </w:r>
     </w:p>
     <w:p>
@@ -3018,7 +3198,7 @@
           <w:rFonts w:ascii="新細明體" w:hAnsi="新細明體" w:eastAsia="新細明體"/>
           <w:sz w:val="24"/>
         </w:rPr>
-        <w:t>演算法步驟：</w:t>
+        <w:t>1. 以 DFS 逐一決定每位學生分配到哪個床位槽。</w:t>
       </w:r>
     </w:p>
     <w:p>
@@ -3030,7 +3210,7 @@
           <w:rFonts w:ascii="新細明體" w:hAnsi="新細明體" w:eastAsia="新細明體"/>
           <w:sz w:val="24"/>
         </w:rPr>
-        <w:t>1. 將所有 n×m 個 (學生, 房間) 配對的偏好分數由大到小排序。</w:t>
+        <w:t>2. 上界函數：對尚未分配的每位學生，取其在剩餘床位中的最大偏好分數之和。</w:t>
       </w:r>
     </w:p>
     <w:p>
@@ -3042,7 +3222,7 @@
           <w:rFonts w:ascii="新細明體" w:hAnsi="新細明體" w:eastAsia="新細明體"/>
           <w:sz w:val="24"/>
         </w:rPr>
-        <w:t>2. 依序取出分數最高的配對，若該學生和該房間都尚未被配對，則建立配對關係。</w:t>
+        <w:t>3. 修剪條件：當前分數 + 上界 ≤ 已知最佳解時修剪。</w:t>
       </w:r>
     </w:p>
     <w:p>
@@ -3054,31 +3234,7 @@
           <w:rFonts w:ascii="新細明體" w:hAnsi="新細明體" w:eastAsia="新細明體"/>
           <w:sz w:val="24"/>
         </w:rPr>
-        <w:t>3. 重複步驟 2，直到已配對的數量達到 min(n,m) 或所有配對都已檢查完畢。</w:t>
-      </w:r>
-    </w:p>
-    <w:p>
-      <w:pPr>
-        <w:spacing w:after="120" w:line="360" w:lineRule="auto"/>
-      </w:pPr>
-      <w:r>
-        <w:rPr>
-          <w:rFonts w:ascii="新細明體" w:hAnsi="新細明體" w:eastAsia="新細明體"/>
-          <w:sz w:val="24"/>
-        </w:rPr>
-        <w:t>時間複雜度：O(n²·log n)（排序主導）。</w:t>
-      </w:r>
-    </w:p>
-    <w:p>
-      <w:pPr>
-        <w:spacing w:after="120" w:line="360" w:lineRule="auto"/>
-      </w:pPr>
-      <w:r>
-        <w:rPr>
-          <w:rFonts w:ascii="新細明體" w:hAnsi="新細明體" w:eastAsia="新細明體"/>
-          <w:sz w:val="24"/>
-        </w:rPr>
-        <w:t>特點：不保證找到最優解，因為每一步只看眼前最大利益，可能錯過全局更優的組合。</w:t>
+        <w:t>時間複雜度：最壞 O(n!)，修剪後遠小。空間複雜度：O(n)。</w:t>
       </w:r>
     </w:p>
     <w:p>
@@ -3091,7 +3247,7 @@
           <w:b/>
           <w:sz w:val="26"/>
         </w:rPr>
-        <w:t>2-3 動態規劃法 (Dynamic Programming)</w:t>
+        <w:t>2-3 貪婪演算法 (Greedy)</w:t>
       </w:r>
     </w:p>
     <w:p>
@@ -3103,7 +3259,7 @@
           <w:rFonts w:ascii="新細明體" w:hAnsi="新細明體" w:eastAsia="新細明體"/>
           <w:sz w:val="24"/>
         </w:rPr>
-        <w:t>使用位元遮罩（Bitmask）技術的精確解法，從另一個角度求解最佳指派問題。</w:t>
+        <w:t>將所有 (學生, 床位) 的偏好分數由大到小排序，依序選取最高分且雙方都未被配對的組合。</w:t>
       </w:r>
     </w:p>
     <w:p>
@@ -3115,79 +3271,7 @@
           <w:rFonts w:ascii="新細明體" w:hAnsi="新細明體" w:eastAsia="新細明體"/>
           <w:sz w:val="24"/>
         </w:rPr>
-        <w:t>演算法步驟：</w:t>
-      </w:r>
-    </w:p>
-    <w:p>
-      <w:pPr>
-        <w:spacing w:after="120" w:line="360" w:lineRule="auto"/>
-      </w:pPr>
-      <w:r>
-        <w:rPr>
-          <w:rFonts w:ascii="新細明體" w:hAnsi="新細明體" w:eastAsia="新細明體"/>
-          <w:sz w:val="24"/>
-        </w:rPr>
-        <w:t>1. 用位元遮罩 mask 表示已被佔用的房間集合。例如 mask = 0101 表示房間 101 和房間 103 已被佔用。popcount(mask) 代表已分配的學生數。</w:t>
-      </w:r>
-    </w:p>
-    <w:p>
-      <w:pPr>
-        <w:spacing w:after="120" w:line="360" w:lineRule="auto"/>
-      </w:pPr>
-      <w:r>
-        <w:rPr>
-          <w:rFonts w:ascii="新細明體" w:hAnsi="新細明體" w:eastAsia="新細明體"/>
-          <w:sz w:val="24"/>
-        </w:rPr>
-        <w:t>2. 定義 dp[mask] = 前 popcount(mask) 位學生分配完畢、佔用房間集合為 mask 時的最大總分。初始值 dp[0] = 0。</w:t>
-      </w:r>
-    </w:p>
-    <w:p>
-      <w:pPr>
-        <w:spacing w:after="120" w:line="360" w:lineRule="auto"/>
-      </w:pPr>
-      <w:r>
-        <w:rPr>
-          <w:rFonts w:ascii="新細明體" w:hAnsi="新細明體" w:eastAsia="新細明體"/>
-          <w:sz w:val="24"/>
-        </w:rPr>
-        <w:t>3. 轉移方程：dp[mask | (1&lt;&lt;j)] = max(dp[mask] + c(person, j))，其中 person = popcount(mask)，j 為尚未在 mask 中的房間。</w:t>
-      </w:r>
-    </w:p>
-    <w:p>
-      <w:pPr>
-        <w:spacing w:after="120" w:line="360" w:lineRule="auto"/>
-      </w:pPr>
-      <w:r>
-        <w:rPr>
-          <w:rFonts w:ascii="新細明體" w:hAnsi="新細明體" w:eastAsia="新細明體"/>
-          <w:sz w:val="24"/>
-        </w:rPr>
-        <w:t>4. 最終答案為所有 popcount(mask) = k 的 dp[mask] 中的最大值。</w:t>
-      </w:r>
-    </w:p>
-    <w:p>
-      <w:pPr>
-        <w:spacing w:after="120" w:line="360" w:lineRule="auto"/>
-      </w:pPr>
-      <w:r>
-        <w:rPr>
-          <w:rFonts w:ascii="新細明體" w:hAnsi="新細明體" w:eastAsia="新細明體"/>
-          <w:sz w:val="24"/>
-        </w:rPr>
-        <w:t>5. 透過 parent 陣列回溯，重建完整的分配方案。</w:t>
-      </w:r>
-    </w:p>
-    <w:p>
-      <w:pPr>
-        <w:spacing w:after="120" w:line="360" w:lineRule="auto"/>
-      </w:pPr>
-      <w:r>
-        <w:rPr>
-          <w:rFonts w:ascii="新細明體" w:hAnsi="新細明體" w:eastAsia="新細明體"/>
-          <w:sz w:val="24"/>
-        </w:rPr>
-        <w:t>時間複雜度：O(m × 2ᵐ)。空間複雜度：O(2ᵐ)。限制：m ≤ 20。</w:t>
+        <w:t>時間複雜度：O(n²·log n)。特點：速度快但不保證最優解。</w:t>
       </w:r>
     </w:p>
     <w:p>
@@ -3200,7 +3284,7 @@
           <w:b/>
           <w:sz w:val="26"/>
         </w:rPr>
-        <w:t>2-4 演算假設</w:t>
+        <w:t>2-4 動態規劃法 (DP, Bitmask)</w:t>
       </w:r>
     </w:p>
     <w:p>
@@ -3212,7 +3296,7 @@
           <w:rFonts w:ascii="新細明體" w:hAnsi="新細明體" w:eastAsia="新細明體"/>
           <w:sz w:val="24"/>
         </w:rPr>
-        <w:t>• 偏好分數為已知的非負整數，由學生事先填寫或系統隨機生成。</w:t>
+        <w:t>用位元遮罩表示已佔用的床位集合，填表求解。</w:t>
       </w:r>
     </w:p>
     <w:p>
@@ -3224,7 +3308,7 @@
           <w:rFonts w:ascii="新細明體" w:hAnsi="新細明體" w:eastAsia="新細明體"/>
           <w:sz w:val="24"/>
         </w:rPr>
-        <w:t>• 配對為一對一，每位學生最多分配到一間房間，每間房間最多分配一位學生。</w:t>
+        <w:t>dp[mask] = 前 popcount(mask) 位學生分配完畢時的最大總分。</w:t>
       </w:r>
     </w:p>
     <w:p>
@@ -3236,7 +3320,7 @@
           <w:rFonts w:ascii="新細明體" w:hAnsi="新細明體" w:eastAsia="新細明體"/>
           <w:sz w:val="24"/>
         </w:rPr>
-        <w:t>• 所有學生對所有房間都有偏好分數（構成完全二部圖）。</w:t>
+        <w:t>時間複雜度：O(totalBeds × 2^totalBeds)。限制：totalBeds ≤ 20。</w:t>
       </w:r>
     </w:p>
     <w:p>
@@ -3249,7 +3333,7 @@
           <w:b/>
           <w:sz w:val="26"/>
         </w:rPr>
-        <w:t>2-5 設計考慮因素</w:t>
+        <w:t>2-5 演算假設</w:t>
       </w:r>
     </w:p>
     <w:p>
@@ -3261,7 +3345,7 @@
           <w:rFonts w:ascii="新細明體" w:hAnsi="新細明體" w:eastAsia="新細明體"/>
           <w:sz w:val="24"/>
         </w:rPr>
-        <w:t>• 選擇分支定界法作為主要演算法，因為它直接對應課堂教授的人員指派問題，且保證找到全域最優解。</w:t>
+        <w:t>• 偏好分數由系統根據學生偏好與房間屬性自動計算，不需人工填寫。</w:t>
       </w:r>
     </w:p>
     <w:p>
@@ -3273,19 +3357,7 @@
           <w:rFonts w:ascii="新細明體" w:hAnsi="新細明體" w:eastAsia="新細明體"/>
           <w:sz w:val="24"/>
         </w:rPr>
-        <w:t>• 上界函數的設計是影響修剪效率的關鍵。本系統採用「每個未分配學生在剩餘可用房間中的最大分數之和」作為上界。</w:t>
-      </w:r>
-    </w:p>
-    <w:p>
-      <w:pPr>
-        <w:spacing w:after="120" w:line="360" w:lineRule="auto"/>
-      </w:pPr>
-      <w:r>
-        <w:rPr>
-          <w:rFonts w:ascii="新細明體" w:hAnsi="新細明體" w:eastAsia="新細明體"/>
-          <w:sz w:val="24"/>
-        </w:rPr>
-        <w:t>• 貪婪法和 DP 分別代表「快速但可能不精確」和「精確但耗記憶體」兩種不同的設計取捨。</w:t>
+        <w:t>• 配對為一對一（學生 ↔ 床位槽），同一房間的不同床位對同一學生分數相同。</w:t>
       </w:r>
     </w:p>
     <w:p>
@@ -3382,7 +3454,7 @@
               <w:rPr>
                 <w:sz w:val="20"/>
               </w:rPr>
-              <w:t>分支定界法 (B&amp;B)</w:t>
+              <w:t>分支定界法</w:t>
               <w:br/>
               <w:t>（本系統採用）</w:t>
             </w:r>
@@ -3400,9 +3472,7 @@
               <w:rPr>
                 <w:sz w:val="20"/>
               </w:rPr>
-              <w:t>以 DFS 遍歷所有分配組合，</w:t>
-              <w:br/>
-              <w:t>利用上界函數修剪無效分支</w:t>
+              <w:t>DFS + 上界修剪</w:t>
             </w:r>
           </w:p>
         </w:tc>
@@ -3418,11 +3488,9 @@
               <w:rPr>
                 <w:sz w:val="20"/>
               </w:rPr>
-              <w:t>優點：保證最優解，修剪後效率高</w:t>
+              <w:t>保證最優解</w:t>
               <w:br/>
-              <w:t>缺點：最壞 O(n!)</w:t>
-              <w:br/>
-              <w:t>評估：適合中小規模（n ≤ 15）</w:t>
+              <w:t>適合床位數 ≤ 15</w:t>
             </w:r>
           </w:p>
         </w:tc>
@@ -3458,9 +3526,7 @@
               <w:rPr>
                 <w:sz w:val="20"/>
               </w:rPr>
-              <w:t>將所有配對按分數排序，</w:t>
-              <w:br/>
-              <w:t>每次貪心選取最高分且可用的配對</w:t>
+              <w:t>每次選最高分且可用的配對</w:t>
             </w:r>
           </w:p>
         </w:tc>
@@ -3476,11 +3542,9 @@
               <w:rPr>
                 <w:sz w:val="20"/>
               </w:rPr>
-              <w:t>優點：速度極快 O(n²log n)</w:t>
+              <w:t>速度極快</w:t>
               <w:br/>
-              <w:t>缺點：不保證最優解</w:t>
-              <w:br/>
-              <w:t>評估：適合大規模快速近似</w:t>
+              <w:t>不保證最優</w:t>
             </w:r>
           </w:p>
         </w:tc>
@@ -3516,9 +3580,7 @@
               <w:rPr>
                 <w:sz w:val="20"/>
               </w:rPr>
-              <w:t>用位元遮罩記錄已佔用的</w:t>
-              <w:br/>
-              <w:t>房間集合，填表求解</w:t>
+              <w:t>位元遮罩狀態壓縮</w:t>
             </w:r>
           </w:p>
         </w:tc>
@@ -3534,11 +3596,9 @@
               <w:rPr>
                 <w:sz w:val="20"/>
               </w:rPr>
-              <w:t>優點：保證最優，時間穩定 O(m·2ᵐ)</w:t>
+              <w:t>保證最優，時間穩定</w:t>
               <w:br/>
-              <w:t>缺點：空間 O(2ᵐ)，m&gt;20 不可行</w:t>
-              <w:br/>
-              <w:t>評估：中等規模精確解</w:t>
+              <w:t>空間 O(2^m)，m≤20</w:t>
             </w:r>
           </w:p>
         </w:tc>
@@ -3579,7 +3639,7 @@
           <w:rFonts w:ascii="新細明體" w:hAnsi="新細明體" w:eastAsia="新細明體"/>
           <w:sz w:val="24"/>
         </w:rPr>
-        <w:t>在設計演算法時，使用 AI 輔助工具協助整理各演算法的步驟描述與複雜度分析。具體流程：作者先列出課堂所學的演算法（分支定界法、貪婪法、動態規劃），再由 AI 協助將虛擬碼整理為結構化的中文步驟描述，作者進行校對與調整。</w:t>
+        <w:t>在設計演算法時，使用 AI 輔助工具協助整理床位展開策略與演算法步驟的中文描述，作者進行校對與調整。</w:t>
       </w:r>
     </w:p>
     <w:p>
@@ -3622,7 +3682,7 @@
           <w:rFonts w:ascii="新細明體" w:hAnsi="新細明體" w:eastAsia="新細明體"/>
           <w:sz w:val="24"/>
         </w:rPr>
-        <w:t>系統使用純前端技術（HTML5 + CSS + JavaScript）實作，無需後端伺服器。繪圖使用 HTML5 Canvas API 繪製二部圖，所有演算法以 JavaScript 實作於 app.js 中。使用者直接在瀏覽器開啟 index.html 即可使用，系統已部署至 GitHub Pages 供線上存取。</w:t>
+        <w:t>系統使用純前端技術（HTML5 + CSS + JavaScript）實作。房間設定、學生偏好設定、偏好分數自動計算、三種演算法、二部圖視覺化等功能全部在 app.js 中實作。使用者在瀏覽器開啟 index.html 即可使用，系統已部署至 GitHub Pages。</w:t>
       </w:r>
     </w:p>
     <w:p>
@@ -3647,7 +3707,7 @@
           <w:rFonts w:ascii="新細明體" w:hAnsi="新細明體" w:eastAsia="新細明體"/>
           <w:sz w:val="24"/>
         </w:rPr>
-        <w:t>• scoreMatrix（二維陣列）：scoreMatrix[i][j] 儲存學生 i 對房間 j 的偏好分數。</w:t>
+        <w:t>• rooms[]：房間物件陣列，每個元素包含 number, type, floor, ac, bath, orient。</w:t>
       </w:r>
     </w:p>
     <w:p>
@@ -3659,7 +3719,7 @@
           <w:rFonts w:ascii="新細明體" w:hAnsi="新細明體" w:eastAsia="新細明體"/>
           <w:sz w:val="24"/>
         </w:rPr>
-        <w:t>• assignment（一維陣列）：assignment[i] = j 表示學生 i 被分配到房間 j。</w:t>
+        <w:t>• students[]：學生物件陣列，每個元素包含 name, prefType, prefFloor, prefAC, prefBath, prefOrient。</w:t>
       </w:r>
     </w:p>
     <w:p>
@@ -3671,7 +3731,7 @@
           <w:rFonts w:ascii="新細明體" w:hAnsi="新細明體" w:eastAsia="新細明體"/>
           <w:sz w:val="24"/>
         </w:rPr>
-        <w:t>• usedJobs（Set 集合）：B&amp;B 使用，記錄目前搜尋分支中已被佔用的房間索引。</w:t>
+        <w:t>• bedSlots[]：床位槽陣列，由 rooms 展開而來。每個床位槽繼承其所屬房間的全部屬性。</w:t>
       </w:r>
     </w:p>
     <w:p>
@@ -3683,7 +3743,7 @@
           <w:rFonts w:ascii="新細明體" w:hAnsi="新細明體" w:eastAsia="新細明體"/>
           <w:sz w:val="24"/>
         </w:rPr>
-        <w:t>• dp[mask]（一維陣列）：DP 使用，索引為位元遮罩 mask，dp[mask] 記錄佔用房間集合為 mask 時的最大總分。</w:t>
+        <w:t>• scoreMatrix[][]：n×totalBeds 偏好分數矩陣，scoreMatrix[i][j] 為學生 i 對床位槽 j 的分數。</w:t>
       </w:r>
     </w:p>
     <w:p>
@@ -3695,7 +3755,7 @@
           <w:rFonts w:ascii="新細明體" w:hAnsi="新細明體" w:eastAsia="新細明體"/>
           <w:sz w:val="24"/>
         </w:rPr>
-        <w:t>• parent[mask]（一維陣列）：DP 使用，記錄每個狀態的前驅狀態，供回溯重建分配方案。</w:t>
+        <w:t>• assignment[]：配對結果，assignment[i] = j 表示學生 i 被分配到床位槽 j。</w:t>
       </w:r>
     </w:p>
     <w:p>
@@ -3720,7 +3780,7 @@
           <w:rFonts w:ascii="新細明體" w:hAnsi="新細明體" w:eastAsia="新細明體"/>
           <w:sz w:val="24"/>
         </w:rPr>
-        <w:t>分支定界法（solveBnB 函式）：</w:t>
+        <w:t>分支定界法核心函式（solveBnB）：</w:t>
       </w:r>
     </w:p>
     <w:p>
@@ -3744,7 +3804,7 @@
           <w:rFonts w:ascii="新細明體" w:hAnsi="新細明體" w:eastAsia="新細明體"/>
           <w:sz w:val="24"/>
         </w:rPr>
-        <w:t xml:space="preserve">    const sz = Math.min(n, m);</w:t>
+        <w:t xml:space="preserve">    const sz = Math.min(n, totalBeds);</w:t>
       </w:r>
     </w:p>
     <w:p>
@@ -3768,19 +3828,7 @@
           <w:rFonts w:ascii="新細明體" w:hAnsi="新細明體" w:eastAsia="新細明體"/>
           <w:sz w:val="24"/>
         </w:rPr>
-        <w:t xml:space="preserve">    let nodesExplored = 0, pruneCount = 0;</w:t>
-      </w:r>
-    </w:p>
-    <w:p>
-      <w:pPr>
-        <w:spacing w:after="120" w:line="360" w:lineRule="auto"/>
-      </w:pPr>
-      <w:r>
-        <w:rPr>
-          <w:rFonts w:ascii="新細明體" w:hAnsi="新細明體" w:eastAsia="新細明體"/>
-          <w:sz w:val="24"/>
-        </w:rPr>
-        <w:t xml:space="preserve">    function upperBound(person, usedJobs) {</w:t>
+        <w:t xml:space="preserve">    function upperBound(person, usedSlots) {</w:t>
       </w:r>
     </w:p>
     <w:p>
@@ -3828,7 +3876,7 @@
           <w:rFonts w:ascii="新細明體" w:hAnsi="新細明體" w:eastAsia="新細明體"/>
           <w:sz w:val="24"/>
         </w:rPr>
-        <w:t xml:space="preserve">            for (let j = 0; j &lt; m; j++)</w:t>
+        <w:t xml:space="preserve">            for (let j = 0; j &lt; totalBeds; j++)</w:t>
       </w:r>
     </w:p>
     <w:p>
@@ -3840,7 +3888,7 @@
           <w:rFonts w:ascii="新細明體" w:hAnsi="新細明體" w:eastAsia="新細明體"/>
           <w:sz w:val="24"/>
         </w:rPr>
-        <w:t xml:space="preserve">                if (!usedJobs.has(j)) mx = Math.max(mx, scoreMatrix[p][j]);</w:t>
+        <w:t xml:space="preserve">                if (!usedSlots.has(j)) mx = Math.max(mx, scoreMatrix[p][j]);</w:t>
       </w:r>
     </w:p>
     <w:p>
@@ -3900,7 +3948,7 @@
           <w:rFonts w:ascii="新細明體" w:hAnsi="新細明體" w:eastAsia="新細明體"/>
           <w:sz w:val="24"/>
         </w:rPr>
-        <w:t xml:space="preserve">    function search(person, currentScore, assignment, usedJobs) {</w:t>
+        <w:t xml:space="preserve">    function search(person, curScore, assignment, usedSlots) {</w:t>
       </w:r>
     </w:p>
     <w:p>
@@ -3912,7 +3960,7 @@
           <w:rFonts w:ascii="新細明體" w:hAnsi="新細明體" w:eastAsia="新細明體"/>
           <w:sz w:val="24"/>
         </w:rPr>
-        <w:t xml:space="preserve">        nodesExplored++;</w:t>
+        <w:t xml:space="preserve">        if (person === sz) { 更新最佳解; return; }</w:t>
       </w:r>
     </w:p>
     <w:p>
@@ -3924,7 +3972,7 @@
           <w:rFonts w:ascii="新細明體" w:hAnsi="新細明體" w:eastAsia="新細明體"/>
           <w:sz w:val="24"/>
         </w:rPr>
-        <w:t xml:space="preserve">        if (person === sz) {</w:t>
+        <w:t xml:space="preserve">        if (curScore + upperBound(person, usedSlots) &lt;= bestScore) { 修剪; return; }</w:t>
       </w:r>
     </w:p>
     <w:p>
@@ -3936,7 +3984,7 @@
           <w:rFonts w:ascii="新細明體" w:hAnsi="新細明體" w:eastAsia="新細明體"/>
           <w:sz w:val="24"/>
         </w:rPr>
-        <w:t xml:space="preserve">            if (currentScore &gt; bestScore)</w:t>
+        <w:t xml:space="preserve">        for (每個未佔用的床位 j) {</w:t>
       </w:r>
     </w:p>
     <w:p>
@@ -3948,7 +3996,7 @@
           <w:rFonts w:ascii="新細明體" w:hAnsi="新細明體" w:eastAsia="新細明體"/>
           <w:sz w:val="24"/>
         </w:rPr>
-        <w:t xml:space="preserve">                { bestScore = currentScore; bestAssign = [...assignment]; }</w:t>
+        <w:t xml:space="preserve">            assignment[person] = j; usedSlots.add(j);</w:t>
       </w:r>
     </w:p>
     <w:p>
@@ -3960,7 +4008,19 @@
           <w:rFonts w:ascii="新細明體" w:hAnsi="新細明體" w:eastAsia="新細明體"/>
           <w:sz w:val="24"/>
         </w:rPr>
-        <w:t xml:space="preserve">            return;</w:t>
+        <w:t xml:space="preserve">            search(person+1, curScore+scoreMatrix[person][j], ...);</w:t>
+      </w:r>
+    </w:p>
+    <w:p>
+      <w:pPr>
+        <w:spacing w:after="120" w:line="360" w:lineRule="auto"/>
+      </w:pPr>
+      <w:r>
+        <w:rPr>
+          <w:rFonts w:ascii="新細明體" w:hAnsi="新細明體" w:eastAsia="新細明體"/>
+          <w:sz w:val="24"/>
+        </w:rPr>
+        <w:t xml:space="preserve">            usedSlots.delete(j); // 回溯</w:t>
       </w:r>
     </w:p>
     <w:p>
@@ -3984,127 +4044,7 @@
           <w:rFonts w:ascii="新細明體" w:hAnsi="新細明體" w:eastAsia="新細明體"/>
           <w:sz w:val="24"/>
         </w:rPr>
-        <w:t xml:space="preserve">        if (currentScore + upperBound(person, usedJobs) &lt;= bestScore)</w:t>
-      </w:r>
-    </w:p>
-    <w:p>
-      <w:pPr>
-        <w:spacing w:after="120" w:line="360" w:lineRule="auto"/>
-      </w:pPr>
-      <w:r>
-        <w:rPr>
-          <w:rFonts w:ascii="新細明體" w:hAnsi="新細明體" w:eastAsia="新細明體"/>
-          <w:sz w:val="24"/>
-        </w:rPr>
-        <w:t xml:space="preserve">            { pruneCount++; return; }</w:t>
-      </w:r>
-    </w:p>
-    <w:p>
-      <w:pPr>
-        <w:spacing w:after="120" w:line="360" w:lineRule="auto"/>
-      </w:pPr>
-      <w:r>
-        <w:rPr>
-          <w:rFonts w:ascii="新細明體" w:hAnsi="新細明體" w:eastAsia="新細明體"/>
-          <w:sz w:val="24"/>
-        </w:rPr>
-        <w:t xml:space="preserve">        for (let j = 0; j &lt; m; j++) {</w:t>
-      </w:r>
-    </w:p>
-    <w:p>
-      <w:pPr>
-        <w:spacing w:after="120" w:line="360" w:lineRule="auto"/>
-      </w:pPr>
-      <w:r>
-        <w:rPr>
-          <w:rFonts w:ascii="新細明體" w:hAnsi="新細明體" w:eastAsia="新細明體"/>
-          <w:sz w:val="24"/>
-        </w:rPr>
-        <w:t xml:space="preserve">            if (!usedJobs.has(j)) {</w:t>
-      </w:r>
-    </w:p>
-    <w:p>
-      <w:pPr>
-        <w:spacing w:after="120" w:line="360" w:lineRule="auto"/>
-      </w:pPr>
-      <w:r>
-        <w:rPr>
-          <w:rFonts w:ascii="新細明體" w:hAnsi="新細明體" w:eastAsia="新細明體"/>
-          <w:sz w:val="24"/>
-        </w:rPr>
-        <w:t xml:space="preserve">                assignment[person] = j;  usedJobs.add(j);</w:t>
-      </w:r>
-    </w:p>
-    <w:p>
-      <w:pPr>
-        <w:spacing w:after="120" w:line="360" w:lineRule="auto"/>
-      </w:pPr>
-      <w:r>
-        <w:rPr>
-          <w:rFonts w:ascii="新細明體" w:hAnsi="新細明體" w:eastAsia="新細明體"/>
-          <w:sz w:val="24"/>
-        </w:rPr>
-        <w:t xml:space="preserve">                search(person+1, currentScore+scoreMatrix[person][j], assignment, usedJobs);</w:t>
-      </w:r>
-    </w:p>
-    <w:p>
-      <w:pPr>
-        <w:spacing w:after="120" w:line="360" w:lineRule="auto"/>
-      </w:pPr>
-      <w:r>
-        <w:rPr>
-          <w:rFonts w:ascii="新細明體" w:hAnsi="新細明體" w:eastAsia="新細明體"/>
-          <w:sz w:val="24"/>
-        </w:rPr>
-        <w:t xml:space="preserve">                usedJobs.delete(j);</w:t>
-      </w:r>
-    </w:p>
-    <w:p>
-      <w:pPr>
-        <w:spacing w:after="120" w:line="360" w:lineRule="auto"/>
-      </w:pPr>
-      <w:r>
-        <w:rPr>
-          <w:rFonts w:ascii="新細明體" w:hAnsi="新細明體" w:eastAsia="新細明體"/>
-          <w:sz w:val="24"/>
-        </w:rPr>
-        <w:t xml:space="preserve">            }</w:t>
-      </w:r>
-    </w:p>
-    <w:p>
-      <w:pPr>
-        <w:spacing w:after="120" w:line="360" w:lineRule="auto"/>
-      </w:pPr>
-      <w:r>
-        <w:rPr>
-          <w:rFonts w:ascii="新細明體" w:hAnsi="新細明體" w:eastAsia="新細明體"/>
-          <w:sz w:val="24"/>
-        </w:rPr>
-        <w:t xml:space="preserve">        }</w:t>
-      </w:r>
-    </w:p>
-    <w:p>
-      <w:pPr>
-        <w:spacing w:after="120" w:line="360" w:lineRule="auto"/>
-      </w:pPr>
-      <w:r>
-        <w:rPr>
-          <w:rFonts w:ascii="新細明體" w:hAnsi="新細明體" w:eastAsia="新細明體"/>
-          <w:sz w:val="24"/>
-        </w:rPr>
         <w:t xml:space="preserve">    }</w:t>
-      </w:r>
-    </w:p>
-    <w:p>
-      <w:pPr>
-        <w:spacing w:after="120" w:line="360" w:lineRule="auto"/>
-      </w:pPr>
-      <w:r>
-        <w:rPr>
-          <w:rFonts w:ascii="新細明體" w:hAnsi="新細明體" w:eastAsia="新細明體"/>
-          <w:sz w:val="24"/>
-        </w:rPr>
-        <w:t xml:space="preserve">    search(0, 0, new Array(sz), new Set());</w:t>
       </w:r>
     </w:p>
     <w:p>
@@ -4142,7 +4082,31 @@
           <w:b/>
           <w:sz w:val="24"/>
         </w:rPr>
-        <w:t>測試案例 1：4×4 範例</w:t>
+        <w:t>測試案例 1</w:t>
+      </w:r>
+    </w:p>
+    <w:p>
+      <w:pPr>
+        <w:spacing w:after="120" w:line="360" w:lineRule="auto"/>
+      </w:pPr>
+      <w:r>
+        <w:rPr>
+          <w:rFonts w:ascii="新細明體" w:hAnsi="新細明體" w:eastAsia="新細明體"/>
+          <w:sz w:val="24"/>
+        </w:rPr>
+        <w:t>4 間房（2×雙人 + 1×三人 + 1×四人 = 11 床位），11 位學生。</w:t>
+      </w:r>
+    </w:p>
+    <w:p>
+      <w:pPr>
+        <w:spacing w:after="120" w:line="360" w:lineRule="auto"/>
+      </w:pPr>
+      <w:r>
+        <w:rPr>
+          <w:rFonts w:ascii="新細明體" w:hAnsi="新細明體" w:eastAsia="新細明體"/>
+          <w:sz w:val="24"/>
+        </w:rPr>
+        <w:t>每位學生的偏好條件不同（偏好房型、樓層、設備需求各異），系統自動計算 11×11 的偏好分數矩陣。三種演算法的配對結果如下（實際數值依學生偏好設定而異，以系統輸出為準）：</w:t>
       </w:r>
     </w:p>
     <w:tbl>
@@ -4210,24 +4174,6 @@
                 <w:b/>
                 <w:sz w:val="20"/>
               </w:rPr>
-              <w:t>配對結果</w:t>
-            </w:r>
-          </w:p>
-        </w:tc>
-        <w:tc>
-          <w:tcPr>
-            <w:tcW w:type="dxa" w:w="1729"/>
-            <w:shd w:val="clear" w:fill="E8E0F0"/>
-          </w:tcPr>
-          <w:p>
-            <w:pPr>
-              <w:jc w:val="center"/>
-            </w:pPr>
-            <w:r>
-              <w:rPr>
-                <w:b/>
-                <w:sz w:val="20"/>
-              </w:rPr>
               <w:t>搜尋節點數</w:t>
             </w:r>
           </w:p>
@@ -4247,6 +4193,24 @@
                 <w:sz w:val="20"/>
               </w:rPr>
               <w:t>修剪次數</w:t>
+            </w:r>
+          </w:p>
+        </w:tc>
+        <w:tc>
+          <w:tcPr>
+            <w:tcW w:type="dxa" w:w="1729"/>
+            <w:shd w:val="clear" w:fill="E8E0F0"/>
+          </w:tcPr>
+          <w:p>
+            <w:pPr>
+              <w:jc w:val="center"/>
+            </w:pPr>
+            <w:r>
+              <w:rPr>
+                <w:b/>
+                <w:sz w:val="20"/>
+              </w:rPr>
+              <w:t>時間(ms)</w:t>
             </w:r>
           </w:p>
         </w:tc>
@@ -4280,7 +4244,7 @@
               <w:rPr>
                 <w:sz w:val="20"/>
               </w:rPr>
-              <w:t>340</w:t>
+              <w:t>（系統輸出）</w:t>
             </w:r>
           </w:p>
         </w:tc>
@@ -4296,7 +4260,7 @@
               <w:rPr>
                 <w:sz w:val="20"/>
               </w:rPr>
-              <w:t>A→101, B→103, C→104, D→102</w:t>
+              <w:t>-</w:t>
             </w:r>
           </w:p>
         </w:tc>
@@ -4312,7 +4276,7 @@
               <w:rPr>
                 <w:sz w:val="20"/>
               </w:rPr>
-              <w:t>15</w:t>
+              <w:t>-</w:t>
             </w:r>
           </w:p>
         </w:tc>
@@ -4328,7 +4292,7 @@
               <w:rPr>
                 <w:sz w:val="20"/>
               </w:rPr>
-              <w:t>5</w:t>
+              <w:t>-</w:t>
             </w:r>
           </w:p>
         </w:tc>
@@ -4362,7 +4326,7 @@
               <w:rPr>
                 <w:sz w:val="20"/>
               </w:rPr>
-              <w:t>330</w:t>
+              <w:t>（系統輸出）</w:t>
             </w:r>
           </w:p>
         </w:tc>
@@ -4378,23 +4342,7 @@
               <w:rPr>
                 <w:sz w:val="20"/>
               </w:rPr>
-              <w:t>A→101, B→102, C→104, D→103</w:t>
-            </w:r>
-          </w:p>
-        </w:tc>
-        <w:tc>
-          <w:tcPr>
-            <w:tcW w:type="dxa" w:w="1729"/>
-          </w:tcPr>
-          <w:p>
-            <w:pPr>
-              <w:jc w:val="center"/>
-            </w:pPr>
-            <w:r>
-              <w:rPr>
-                <w:sz w:val="20"/>
-              </w:rPr>
-              <w:t>11</w:t>
+              <w:t>-</w:t>
             </w:r>
           </w:p>
         </w:tc>
@@ -4411,6 +4359,22 @@
                 <w:sz w:val="20"/>
               </w:rPr>
               <w:t>0</w:t>
+            </w:r>
+          </w:p>
+        </w:tc>
+        <w:tc>
+          <w:tcPr>
+            <w:tcW w:type="dxa" w:w="1729"/>
+          </w:tcPr>
+          <w:p>
+            <w:pPr>
+              <w:jc w:val="center"/>
+            </w:pPr>
+            <w:r>
+              <w:rPr>
+                <w:sz w:val="20"/>
+              </w:rPr>
+              <w:t>-</w:t>
             </w:r>
           </w:p>
         </w:tc>
@@ -4444,7 +4408,7 @@
               <w:rPr>
                 <w:sz w:val="20"/>
               </w:rPr>
-              <w:t>340</w:t>
+              <w:t>（系統輸出）</w:t>
             </w:r>
           </w:p>
         </w:tc>
@@ -4460,23 +4424,7 @@
               <w:rPr>
                 <w:sz w:val="20"/>
               </w:rPr>
-              <w:t>A→101, B→103, C→104, D→102</w:t>
-            </w:r>
-          </w:p>
-        </w:tc>
-        <w:tc>
-          <w:tcPr>
-            <w:tcW w:type="dxa" w:w="1729"/>
-          </w:tcPr>
-          <w:p>
-            <w:pPr>
-              <w:jc w:val="center"/>
-            </w:pPr>
-            <w:r>
-              <w:rPr>
-                <w:sz w:val="20"/>
-              </w:rPr>
-              <w:t>32</w:t>
+              <w:t>-</w:t>
             </w:r>
           </w:p>
         </w:tc>
@@ -4496,6 +4444,22 @@
             </w:r>
           </w:p>
         </w:tc>
+        <w:tc>
+          <w:tcPr>
+            <w:tcW w:type="dxa" w:w="1729"/>
+          </w:tcPr>
+          <w:p>
+            <w:pPr>
+              <w:jc w:val="center"/>
+            </w:pPr>
+            <w:r>
+              <w:rPr>
+                <w:sz w:val="20"/>
+              </w:rPr>
+              <w:t>-</w:t>
+            </w:r>
+          </w:p>
+        </w:tc>
       </w:tr>
     </w:tbl>
     <w:p>
@@ -4513,18 +4477,6 @@
     </w:p>
     <w:p>
       <w:pPr>
-        <w:spacing w:after="120" w:line="360" w:lineRule="auto"/>
-      </w:pPr>
-      <w:r>
-        <w:rPr>
-          <w:rFonts w:ascii="新細明體" w:hAnsi="新細明體" w:eastAsia="新細明體"/>
-          <w:sz w:val="24"/>
-        </w:rPr>
-        <w:t>分析：分支定界法和動態規劃法都找到了最優解 340 分（A→101: 85, B→103: 75, C→104: 95, D→102: 85）。貪婪演算法得到 330 分，差距為 10 分（2.9%），原因是貪婪法優先選了 B→102（90 分），但這導致 D 只能選到次優的 103（60 分），整體不如 B→103 + D→102 的組合（75 + 85 = 160 &gt; 90 + 60 = 150）。</w:t>
-      </w:r>
-    </w:p>
-    <w:p>
-      <w:pPr>
         <w:spacing w:after="80" w:line="360" w:lineRule="auto"/>
       </w:pPr>
       <w:r>
@@ -4533,7 +4485,19 @@
           <w:b/>
           <w:sz w:val="24"/>
         </w:rPr>
-        <w:t>測試案例 2：5×5 範例</w:t>
+        <w:t>測試案例 2</w:t>
+      </w:r>
+    </w:p>
+    <w:p>
+      <w:pPr>
+        <w:spacing w:after="120" w:line="360" w:lineRule="auto"/>
+      </w:pPr>
+      <w:r>
+        <w:rPr>
+          <w:rFonts w:ascii="新細明體" w:hAnsi="新細明體" w:eastAsia="新細明體"/>
+          <w:sz w:val="24"/>
+        </w:rPr>
+        <w:t>3 間房（2×雙人 + 1×三人 = 7 床位），7 位學生。</w:t>
       </w:r>
     </w:p>
     <w:tbl>
@@ -4601,24 +4565,6 @@
                 <w:b/>
                 <w:sz w:val="20"/>
               </w:rPr>
-              <w:t>配對結果</w:t>
-            </w:r>
-          </w:p>
-        </w:tc>
-        <w:tc>
-          <w:tcPr>
-            <w:tcW w:type="dxa" w:w="1729"/>
-            <w:shd w:val="clear" w:fill="E8E0F0"/>
-          </w:tcPr>
-          <w:p>
-            <w:pPr>
-              <w:jc w:val="center"/>
-            </w:pPr>
-            <w:r>
-              <w:rPr>
-                <w:b/>
-                <w:sz w:val="20"/>
-              </w:rPr>
               <w:t>搜尋節點數</w:t>
             </w:r>
           </w:p>
@@ -4638,6 +4584,24 @@
                 <w:sz w:val="20"/>
               </w:rPr>
               <w:t>修剪次數</w:t>
+            </w:r>
+          </w:p>
+        </w:tc>
+        <w:tc>
+          <w:tcPr>
+            <w:tcW w:type="dxa" w:w="1729"/>
+            <w:shd w:val="clear" w:fill="E8E0F0"/>
+          </w:tcPr>
+          <w:p>
+            <w:pPr>
+              <w:jc w:val="center"/>
+            </w:pPr>
+            <w:r>
+              <w:rPr>
+                <w:b/>
+                <w:sz w:val="20"/>
+              </w:rPr>
+              <w:t>時間(ms)</w:t>
             </w:r>
           </w:p>
         </w:tc>
@@ -4671,7 +4635,7 @@
               <w:rPr>
                 <w:sz w:val="20"/>
               </w:rPr>
-              <w:t>445</w:t>
+              <w:t>（系統輸出）</w:t>
             </w:r>
           </w:p>
         </w:tc>
@@ -4687,7 +4651,7 @@
               <w:rPr>
                 <w:sz w:val="20"/>
               </w:rPr>
-              <w:t>A→101, B→102, C→103, D→104, E→105</w:t>
+              <w:t>-</w:t>
             </w:r>
           </w:p>
         </w:tc>
@@ -4753,23 +4717,7 @@
               <w:rPr>
                 <w:sz w:val="20"/>
               </w:rPr>
-              <w:t>414</w:t>
-            </w:r>
-          </w:p>
-        </w:tc>
-        <w:tc>
-          <w:tcPr>
-            <w:tcW w:type="dxa" w:w="1729"/>
-          </w:tcPr>
-          <w:p>
-            <w:pPr>
-              <w:jc w:val="center"/>
-            </w:pPr>
-            <w:r>
-              <w:rPr>
-                <w:sz w:val="20"/>
-              </w:rPr>
-              <w:t>A→101, B→104, C→103, D→102, E→105</w:t>
+              <w:t>（系統輸出）</w:t>
             </w:r>
           </w:p>
         </w:tc>
@@ -4805,6 +4753,22 @@
             </w:r>
           </w:p>
         </w:tc>
+        <w:tc>
+          <w:tcPr>
+            <w:tcW w:type="dxa" w:w="1729"/>
+          </w:tcPr>
+          <w:p>
+            <w:pPr>
+              <w:jc w:val="center"/>
+            </w:pPr>
+            <w:r>
+              <w:rPr>
+                <w:sz w:val="20"/>
+              </w:rPr>
+              <w:t>-</w:t>
+            </w:r>
+          </w:p>
+        </w:tc>
       </w:tr>
       <w:tr>
         <w:tc>
@@ -4835,23 +4799,7 @@
               <w:rPr>
                 <w:sz w:val="20"/>
               </w:rPr>
-              <w:t>445</w:t>
-            </w:r>
-          </w:p>
-        </w:tc>
-        <w:tc>
-          <w:tcPr>
-            <w:tcW w:type="dxa" w:w="1729"/>
-          </w:tcPr>
-          <w:p>
-            <w:pPr>
-              <w:jc w:val="center"/>
-            </w:pPr>
-            <w:r>
-              <w:rPr>
-                <w:sz w:val="20"/>
-              </w:rPr>
-              <w:t>A→101, B→102, C→103, D→104, E→105</w:t>
+              <w:t>（系統輸出）</w:t>
             </w:r>
           </w:p>
         </w:tc>
@@ -4887,6 +4835,22 @@
             </w:r>
           </w:p>
         </w:tc>
+        <w:tc>
+          <w:tcPr>
+            <w:tcW w:type="dxa" w:w="1729"/>
+          </w:tcPr>
+          <w:p>
+            <w:pPr>
+              <w:jc w:val="center"/>
+            </w:pPr>
+            <w:r>
+              <w:rPr>
+                <w:sz w:val="20"/>
+              </w:rPr>
+              <w:t>-</w:t>
+            </w:r>
+          </w:p>
+        </w:tc>
       </w:tr>
     </w:tbl>
     <w:p>
@@ -4900,18 +4864,6 @@
           <w:sz w:val="20"/>
         </w:rPr>
         <w:t>表 7  測試案例 2 結果</w:t>
-      </w:r>
-    </w:p>
-    <w:p>
-      <w:pPr>
-        <w:spacing w:after="120" w:line="360" w:lineRule="auto"/>
-      </w:pPr>
-      <w:r>
-        <w:rPr>
-          <w:rFonts w:ascii="新細明體" w:hAnsi="新細明體" w:eastAsia="新細明體"/>
-          <w:sz w:val="24"/>
-        </w:rPr>
-        <w:t>分析：最優解為 445 分（92+88+95+78+92）。貪婪演算法得到 414 分，差距為 31 分（7.0%）。差距擴大的原因是貪婪法先選了 D→102（90 分），佔據了 B 的最佳選擇，使 B 被迫分配到偏好分數僅 45 的房間 104，嚴重拖累了總分。</w:t>
       </w:r>
     </w:p>
     <w:p>
@@ -4936,7 +4888,7 @@
           <w:rFonts w:ascii="新細明體" w:hAnsi="新細明體" w:eastAsia="新細明體"/>
           <w:sz w:val="24"/>
         </w:rPr>
-        <w:t>以測試案例 1（4×4 範例）進行分支定界法的完整手算驗證。</w:t>
+        <w:t>以一個簡化的 3 學生 × 3 床位案例進行分支定界法手算驗證：</w:t>
       </w:r>
     </w:p>
     <w:p>
@@ -4948,7 +4900,7 @@
           <w:rFonts w:ascii="新細明體" w:hAnsi="新細明體" w:eastAsia="新細明體"/>
           <w:sz w:val="24"/>
         </w:rPr>
-        <w:t>偏好分數矩陣：A=[85,60,45,70], B=[50,90,75,55], C=[65,40,80,95], D=[70,85,60,50]</w:t>
+        <w:t>假設偏好分數矩陣為：A=[90, 60, 40], B=[50, 85, 70], C=[55, 45, 95]</w:t>
       </w:r>
     </w:p>
     <w:p>
@@ -4971,7 +4923,7 @@
           <w:rFonts w:ascii="新細明體" w:hAnsi="新細明體" w:eastAsia="新細明體"/>
           <w:sz w:val="24"/>
         </w:rPr>
-        <w:t>搜尋過程（以搜尋樹表示）：</w:t>
+        <w:t>搜尋過程：</w:t>
       </w:r>
     </w:p>
     <w:p>
@@ -4983,7 +4935,7 @@
           <w:rFonts w:ascii="新細明體" w:hAnsi="新細明體" w:eastAsia="新細明體"/>
           <w:sz w:val="24"/>
         </w:rPr>
-        <w:t>第 1 層：分配學生 A</w:t>
+        <w:t>├─ A→床位1 (90)，進入第 2 層</w:t>
       </w:r>
     </w:p>
     <w:p>
@@ -4995,7 +4947,7 @@
           <w:rFonts w:ascii="新細明體" w:hAnsi="新細明體" w:eastAsia="新細明體"/>
           <w:sz w:val="24"/>
         </w:rPr>
-        <w:t>├─ A→101 (85分)，進入第 2 層</w:t>
+        <w:t>│  ├─ B→床位2 (85)，累計 175</w:t>
       </w:r>
     </w:p>
     <w:p>
@@ -5007,7 +4959,7 @@
           <w:rFonts w:ascii="新細明體" w:hAnsi="新細明體" w:eastAsia="新細明體"/>
           <w:sz w:val="24"/>
         </w:rPr>
-        <w:t>│  ├─ B→102 (90)，累計 175</w:t>
+        <w:t>│  │  └─ C→床位3 (95)，累計 270 → bestScore=270 ✓</w:t>
       </w:r>
     </w:p>
     <w:p>
@@ -5019,7 +4971,7 @@
           <w:rFonts w:ascii="新細明體" w:hAnsi="新細明體" w:eastAsia="新細明體"/>
           <w:sz w:val="24"/>
         </w:rPr>
-        <w:t>│  │  ├─ C→103 (80)，累計 255</w:t>
+        <w:t>│  └─ B→床位3 (70)，累計 160</w:t>
       </w:r>
     </w:p>
     <w:p>
@@ -5031,7 +4983,7 @@
           <w:rFonts w:ascii="新細明體" w:hAnsi="新細明體" w:eastAsia="新細明體"/>
           <w:sz w:val="24"/>
         </w:rPr>
-        <w:t>│  │  │  └─ D→104 (50)，累計 305 → 更新 bestScore=305</w:t>
+        <w:t>│     └─ C→床位2 (45)，累計 205 &lt; 270，非最優</w:t>
       </w:r>
     </w:p>
     <w:p>
@@ -5043,7 +4995,7 @@
           <w:rFonts w:ascii="新細明體" w:hAnsi="新細明體" w:eastAsia="新細明體"/>
           <w:sz w:val="24"/>
         </w:rPr>
-        <w:t>│  │  └─ C→104 (95)，累計 270</w:t>
+        <w:t>├─ A→床位2 (60)，UB=60+70+95=225 &lt; 270 → 修剪 ✂️</w:t>
       </w:r>
     </w:p>
     <w:p>
@@ -5055,103 +5007,7 @@
           <w:rFonts w:ascii="新細明體" w:hAnsi="新細明體" w:eastAsia="新細明體"/>
           <w:sz w:val="24"/>
         </w:rPr>
-        <w:t>│  │     └─ D→103 (60)，累計 330 → 更新 bestScore=330</w:t>
-      </w:r>
-    </w:p>
-    <w:p>
-      <w:pPr>
-        <w:spacing w:after="120" w:line="360" w:lineRule="auto"/>
-      </w:pPr>
-      <w:r>
-        <w:rPr>
-          <w:rFonts w:ascii="新細明體" w:hAnsi="新細明體" w:eastAsia="新細明體"/>
-          <w:sz w:val="24"/>
-        </w:rPr>
-        <w:t>│  ├─ B→103 (75)，累計 160</w:t>
-      </w:r>
-    </w:p>
-    <w:p>
-      <w:pPr>
-        <w:spacing w:after="120" w:line="360" w:lineRule="auto"/>
-      </w:pPr>
-      <w:r>
-        <w:rPr>
-          <w:rFonts w:ascii="新細明體" w:hAnsi="新細明體" w:eastAsia="新細明體"/>
-          <w:sz w:val="24"/>
-        </w:rPr>
-        <w:t>│  │  ├─ C→102 (40)，UB=200+50=250 ≤ 330 → 修剪 ✂️</w:t>
-      </w:r>
-    </w:p>
-    <w:p>
-      <w:pPr>
-        <w:spacing w:after="120" w:line="360" w:lineRule="auto"/>
-      </w:pPr>
-      <w:r>
-        <w:rPr>
-          <w:rFonts w:ascii="新細明體" w:hAnsi="新細明體" w:eastAsia="新細明體"/>
-          <w:sz w:val="24"/>
-        </w:rPr>
-        <w:t>│  │  └─ C→104 (95)，累計 255</w:t>
-      </w:r>
-    </w:p>
-    <w:p>
-      <w:pPr>
-        <w:spacing w:after="120" w:line="360" w:lineRule="auto"/>
-      </w:pPr>
-      <w:r>
-        <w:rPr>
-          <w:rFonts w:ascii="新細明體" w:hAnsi="新細明體" w:eastAsia="新細明體"/>
-          <w:sz w:val="24"/>
-        </w:rPr>
-        <w:t>│  │     └─ D→102 (85)，累計 340 → 更新 bestScore=340 ✓</w:t>
-      </w:r>
-    </w:p>
-    <w:p>
-      <w:pPr>
-        <w:spacing w:after="120" w:line="360" w:lineRule="auto"/>
-      </w:pPr>
-      <w:r>
-        <w:rPr>
-          <w:rFonts w:ascii="新細明體" w:hAnsi="新細明體" w:eastAsia="新細明體"/>
-          <w:sz w:val="24"/>
-        </w:rPr>
-        <w:t>│  └─ B→104 (55)，UB=140+180=320 ≤ 340 → 修剪 ✂️</w:t>
-      </w:r>
-    </w:p>
-    <w:p>
-      <w:pPr>
-        <w:spacing w:after="120" w:line="360" w:lineRule="auto"/>
-      </w:pPr>
-      <w:r>
-        <w:rPr>
-          <w:rFonts w:ascii="新細明體" w:hAnsi="新細明體" w:eastAsia="新細明體"/>
-          <w:sz w:val="24"/>
-        </w:rPr>
-        <w:t>├─ A→102 (60)，UB=60+240=300 ≤ 340 → 修剪 ✂️</w:t>
-      </w:r>
-    </w:p>
-    <w:p>
-      <w:pPr>
-        <w:spacing w:after="120" w:line="360" w:lineRule="auto"/>
-      </w:pPr>
-      <w:r>
-        <w:rPr>
-          <w:rFonts w:ascii="新細明體" w:hAnsi="新細明體" w:eastAsia="新細明體"/>
-          <w:sz w:val="24"/>
-        </w:rPr>
-        <w:t>├─ A→103 (45)，UB=45+270=315 ≤ 340 → 修剪 ✂️</w:t>
-      </w:r>
-    </w:p>
-    <w:p>
-      <w:pPr>
-        <w:spacing w:after="120" w:line="360" w:lineRule="auto"/>
-      </w:pPr>
-      <w:r>
-        <w:rPr>
-          <w:rFonts w:ascii="新細明體" w:hAnsi="新細明體" w:eastAsia="新細明體"/>
-          <w:sz w:val="24"/>
-        </w:rPr>
-        <w:t>└─ A→104 (70)，UB=70+255=325 ≤ 340 → 修剪 ✂️</w:t>
+        <w:t>└─ A→床位3 (40)，UB=40+85+55=180 &lt; 270 → 修剪 ✂️</w:t>
       </w:r>
     </w:p>
     <w:p>
@@ -5174,19 +5030,7 @@
           <w:rFonts w:ascii="新細明體" w:hAnsi="新細明體" w:eastAsia="新細明體"/>
           <w:sz w:val="24"/>
         </w:rPr>
-        <w:t>搜尋結果：最佳分數 340（A→101, B→103, C→104, D→102），搜尋節點數 15，修剪次數 5。</w:t>
-      </w:r>
-    </w:p>
-    <w:p>
-      <w:pPr>
-        <w:spacing w:after="120" w:line="360" w:lineRule="auto"/>
-      </w:pPr>
-      <w:r>
-        <w:rPr>
-          <w:rFonts w:ascii="新細明體" w:hAnsi="新細明體" w:eastAsia="新細明體"/>
-          <w:sz w:val="24"/>
-        </w:rPr>
-        <w:t>全排列總數 4!=24，修剪效率：只探索了 15 個節點即找到最優解，避免了超過一半的無效搜尋。</w:t>
+        <w:t>最佳解：270（A→床位1, B→床位2, C→床位3），搜尋 5 節點，修剪 2 次。</w:t>
       </w:r>
     </w:p>
     <w:p>
@@ -5248,7 +5092,7 @@
                 <w:b/>
                 <w:sz w:val="20"/>
               </w:rPr>
-              <w:t>分支定界法 (B&amp;B)</w:t>
+              <w:t>分支定界法</w:t>
             </w:r>
           </w:p>
         </w:tc>
@@ -5284,7 +5128,7 @@
                 <w:b/>
                 <w:sz w:val="20"/>
               </w:rPr>
-              <w:t>動態規劃法 (DP)</w:t>
+              <w:t>動態規劃法</w:t>
             </w:r>
           </w:p>
         </w:tc>
@@ -5302,139 +5146,7 @@
               <w:rPr>
                 <w:sz w:val="20"/>
               </w:rPr>
-              <w:t>測試 1 總分</w:t>
-            </w:r>
-          </w:p>
-        </w:tc>
-        <w:tc>
-          <w:tcPr>
-            <w:tcW w:type="dxa" w:w="2161"/>
-          </w:tcPr>
-          <w:p>
-            <w:pPr>
-              <w:jc w:val="center"/>
-            </w:pPr>
-            <w:r>
-              <w:rPr>
-                <w:sz w:val="20"/>
-              </w:rPr>
-              <w:t>340（最優）</w:t>
-            </w:r>
-          </w:p>
-        </w:tc>
-        <w:tc>
-          <w:tcPr>
-            <w:tcW w:type="dxa" w:w="2161"/>
-          </w:tcPr>
-          <w:p>
-            <w:pPr>
-              <w:jc w:val="center"/>
-            </w:pPr>
-            <w:r>
-              <w:rPr>
-                <w:sz w:val="20"/>
-              </w:rPr>
-              <w:t>330</w:t>
-            </w:r>
-          </w:p>
-        </w:tc>
-        <w:tc>
-          <w:tcPr>
-            <w:tcW w:type="dxa" w:w="2161"/>
-          </w:tcPr>
-          <w:p>
-            <w:pPr>
-              <w:jc w:val="center"/>
-            </w:pPr>
-            <w:r>
-              <w:rPr>
-                <w:sz w:val="20"/>
-              </w:rPr>
-              <w:t>340（最優）</w:t>
-            </w:r>
-          </w:p>
-        </w:tc>
-      </w:tr>
-      <w:tr>
-        <w:tc>
-          <w:tcPr>
-            <w:tcW w:type="dxa" w:w="2161"/>
-          </w:tcPr>
-          <w:p>
-            <w:pPr>
-              <w:jc w:val="center"/>
-            </w:pPr>
-            <w:r>
-              <w:rPr>
-                <w:sz w:val="20"/>
-              </w:rPr>
-              <w:t>測試 2 總分</w:t>
-            </w:r>
-          </w:p>
-        </w:tc>
-        <w:tc>
-          <w:tcPr>
-            <w:tcW w:type="dxa" w:w="2161"/>
-          </w:tcPr>
-          <w:p>
-            <w:pPr>
-              <w:jc w:val="center"/>
-            </w:pPr>
-            <w:r>
-              <w:rPr>
-                <w:sz w:val="20"/>
-              </w:rPr>
-              <w:t>445（最優）</w:t>
-            </w:r>
-          </w:p>
-        </w:tc>
-        <w:tc>
-          <w:tcPr>
-            <w:tcW w:type="dxa" w:w="2161"/>
-          </w:tcPr>
-          <w:p>
-            <w:pPr>
-              <w:jc w:val="center"/>
-            </w:pPr>
-            <w:r>
-              <w:rPr>
-                <w:sz w:val="20"/>
-              </w:rPr>
-              <w:t>414</w:t>
-            </w:r>
-          </w:p>
-        </w:tc>
-        <w:tc>
-          <w:tcPr>
-            <w:tcW w:type="dxa" w:w="2161"/>
-          </w:tcPr>
-          <w:p>
-            <w:pPr>
-              <w:jc w:val="center"/>
-            </w:pPr>
-            <w:r>
-              <w:rPr>
-                <w:sz w:val="20"/>
-              </w:rPr>
-              <w:t>445（最優）</w:t>
-            </w:r>
-          </w:p>
-        </w:tc>
-      </w:tr>
-      <w:tr>
-        <w:tc>
-          <w:tcPr>
-            <w:tcW w:type="dxa" w:w="2161"/>
-          </w:tcPr>
-          <w:p>
-            <w:pPr>
-              <w:jc w:val="center"/>
-            </w:pPr>
-            <w:r>
-              <w:rPr>
-                <w:sz w:val="20"/>
-              </w:rPr>
-              <w:t>是否保證最優</w:t>
+              <w:t>保證最優</w:t>
             </w:r>
           </w:p>
         </w:tc>
@@ -5516,7 +5228,7 @@
               <w:rPr>
                 <w:sz w:val="20"/>
               </w:rPr>
-              <w:t>O(n!)，修剪後遠小</w:t>
+              <w:t>O(n!), 修剪後遠小</w:t>
             </w:r>
           </w:p>
         </w:tc>
@@ -5714,7 +5426,7 @@
               <w:rPr>
                 <w:sz w:val="20"/>
               </w:rPr>
-              <w:t>分支定界 + 人員指派</w:t>
+              <w:t>分支定界+人員指派</w:t>
             </w:r>
           </w:p>
         </w:tc>
@@ -5772,22 +5484,10 @@
       <w:r>
         <w:rPr>
           <w:rFonts w:ascii="新細明體" w:hAnsi="新細明體" w:eastAsia="新細明體"/>
-          <w:sz w:val="24"/>
-        </w:rPr>
-        <w:t>結果分析：分支定界法和動態規劃法在所有測試案例中都找到了相同的最優解，驗證了兩者作為精確解法的正確性。貪婪演算法在 4×4 案例中差距 2.9%，在 5×5 案例中差距擴大至 7.0%，顯示問題規模越大，貪婪法的近似誤差越明顯。</w:t>
-      </w:r>
-    </w:p>
-    <w:p>
-      <w:pPr>
-        <w:spacing w:after="120" w:line="360" w:lineRule="auto"/>
-      </w:pPr>
-      <w:r>
-        <w:rPr>
-          <w:rFonts w:ascii="新細明體" w:hAnsi="新細明體" w:eastAsia="新細明體"/>
           <w:b/>
           <w:sz w:val="26"/>
         </w:rPr>
-        <w:t>3-7 實作章節的 AI 工具協助項目</w:t>
+        <w:t>3-7 AI 工具協助項目</w:t>
       </w:r>
     </w:p>
     <w:p>
@@ -5799,7 +5499,7 @@
           <w:rFonts w:ascii="新細明體" w:hAnsi="新細明體" w:eastAsia="新細明體"/>
           <w:sz w:val="24"/>
         </w:rPr>
-        <w:t>在實作階段，使用 AI 輔助工具協助以下工作：</w:t>
+        <w:t>1. 程式碼框架生成：作者提供演算法虛擬碼和偏好分數計算規則，由 AI 協助轉為 JavaScript 實作，作者手動驗證。</w:t>
       </w:r>
     </w:p>
     <w:p>
@@ -5811,7 +5511,7 @@
           <w:rFonts w:ascii="新細明體" w:hAnsi="新細明體" w:eastAsia="新細明體"/>
           <w:sz w:val="24"/>
         </w:rPr>
-        <w:t>1. 程式碼框架生成：作者提供演算法虛擬碼和資料結構設計，由 AI 協助轉為 JavaScript 實作，作者手動驗證程式邏輯。</w:t>
+        <w:t>2. Canvas 視覺化：AI 協助實作二部圖的繪製邏輯（學生圓形→房間矩形，含容量顯示）。</w:t>
       </w:r>
     </w:p>
     <w:p>
@@ -5823,19 +5523,7 @@
           <w:rFonts w:ascii="新細明體" w:hAnsi="新細明體" w:eastAsia="新細明體"/>
           <w:sz w:val="24"/>
         </w:rPr>
-        <w:t>2. Canvas 視覺化：AI 協助實作二部圖的節點佈局計算和配對連線繪製邏輯。</w:t>
-      </w:r>
-    </w:p>
-    <w:p>
-      <w:pPr>
-        <w:spacing w:after="120" w:line="360" w:lineRule="auto"/>
-      </w:pPr>
-      <w:r>
-        <w:rPr>
-          <w:rFonts w:ascii="新細明體" w:hAnsi="新細明體" w:eastAsia="新細明體"/>
-          <w:sz w:val="24"/>
-        </w:rPr>
-        <w:t>3. 測試案例驗算：由 AI 協助進行分支定界法的搜尋樹手算驗證，作者核對結果與系統輸出一致後採用。</w:t>
+        <w:t>3. 表單互動：AI 協助實作房間屬性編輯和學生偏好下拉選單的動態生成與資料綁定。</w:t>
       </w:r>
     </w:p>
     <w:p>
@@ -5878,7 +5566,7 @@
           <w:rFonts w:ascii="新細明體" w:hAnsi="新細明體" w:eastAsia="新細明體"/>
           <w:sz w:val="24"/>
         </w:rPr>
-        <w:t>• 多演算法比較：系統同時提供三種演算法，使用者可以直觀比較各算法在效能、精確度與資源消耗上的差異。</w:t>
+        <w:t>• 貼近真實場景：支援雙人房/三人房/四人房的混合配置，學生可設定多維度偏好，比簡單的分數矩陣更接近實際宿舍分配。</w:t>
       </w:r>
     </w:p>
     <w:p>
@@ -5890,7 +5578,7 @@
           <w:rFonts w:ascii="新細明體" w:hAnsi="新細明體" w:eastAsia="新細明體"/>
           <w:sz w:val="24"/>
         </w:rPr>
-        <w:t>• 穩定性檢測：配對完成後自動偵測 blocking pair，讓管理者了解分配結果的公平性。</w:t>
+        <w:t>• 自動評分：偏好分數由系統根據規則自動計算，免去人工填寫大量數字的麻煩。</w:t>
       </w:r>
     </w:p>
     <w:p>
@@ -5902,7 +5590,7 @@
           <w:rFonts w:ascii="新細明體" w:hAnsi="新細明體" w:eastAsia="新細明體"/>
           <w:sz w:val="24"/>
         </w:rPr>
-        <w:t>• 互動式介面：偏好分數矩陣支援即時點擊編輯，方便探索不同情境的分配結果。</w:t>
+        <w:t>• 多演算法比較：三種演算法一鍵比較，直觀展示精確度與速度的取捨。</w:t>
       </w:r>
     </w:p>
     <w:p>
@@ -5914,7 +5602,19 @@
           <w:rFonts w:ascii="新細明體" w:hAnsi="新細明體" w:eastAsia="新細明體"/>
           <w:sz w:val="24"/>
         </w:rPr>
-        <w:t>• 零安裝部署：純前端應用，只需瀏覽器即可使用。</w:t>
+        <w:t>• 穩定性檢測：自動偵測 blocking pair，評估分配公平性。</w:t>
+      </w:r>
+    </w:p>
+    <w:p>
+      <w:pPr>
+        <w:spacing w:after="120" w:line="360" w:lineRule="auto"/>
+      </w:pPr>
+      <w:r>
+        <w:rPr>
+          <w:rFonts w:ascii="新細明體" w:hAnsi="新細明體" w:eastAsia="新細明體"/>
+          <w:sz w:val="24"/>
+        </w:rPr>
+        <w:t>• 零安裝：純前端應用，只需瀏覽器即可使用。</w:t>
       </w:r>
     </w:p>
     <w:p>
@@ -5939,7 +5639,7 @@
           <w:rFonts w:ascii="新細明體" w:hAnsi="新細明體" w:eastAsia="新細明體"/>
           <w:sz w:val="24"/>
         </w:rPr>
-        <w:t>• 規模限制：分支定界法在 n &gt; 15 時計算時間急劇增加，動態規劃法在 m &gt; 20 時記憶體不足。</w:t>
+        <w:t>• 規模限制：B&amp;B 在總床位 &gt; 15 時計算時間急增，DP 在 &gt; 20 時記憶體不足。</w:t>
       </w:r>
     </w:p>
     <w:p>
@@ -5951,7 +5651,7 @@
           <w:rFonts w:ascii="新細明體" w:hAnsi="新細明體" w:eastAsia="新細明體"/>
           <w:sz w:val="24"/>
         </w:rPr>
-        <w:t>• 一對一配對：系統僅支援單人房的一對一配對，未支援多人一房的情境。</w:t>
+        <w:t>• 單人一床位：系統為一對一配對，不支援學生共用同一床位。</w:t>
       </w:r>
     </w:p>
     <w:p>
@@ -5963,7 +5663,7 @@
           <w:rFonts w:ascii="新細明體" w:hAnsi="新細明體" w:eastAsia="新細明體"/>
           <w:sz w:val="24"/>
         </w:rPr>
-        <w:t>• 單輪配對：系統為一次性分配，不支援動態調整後的重新配對。</w:t>
+        <w:t>• 偏好權重固定：五個偏好項目的權重（35/25/15/15/10）為預設值，未開放使用者調整。</w:t>
       </w:r>
     </w:p>
     <w:p>
@@ -6013,7 +5713,7 @@
           <w:rFonts w:ascii="新細明體" w:hAnsi="新細明體" w:eastAsia="新細明體"/>
           <w:sz w:val="24"/>
         </w:rPr>
-        <w:t>本系統成功實作了三種課堂教授的演算法來解決學生宿舍分配問題。分支定界法在所有測試案例中都找到了全域最優解，且透過上界修剪有效縮減了搜尋空間（例如 4×4 案例中，24 種全排列只需探索 15 個節點）。貪婪演算法雖然無法保證最優，但能在極短時間內產出接近最優的近似解。動態規劃法則從另一個角度驗證了分支定界法結果的正確性。</w:t>
+        <w:t>本系統成功實作了一套支援多房型的學生宿舍最佳配對系統。透過床位展開策略，將多人房的多對一問題轉換為一對一指派問題，使課堂所學的分支定界法、貪婪法和動態規劃法可以直接套用。系統的偏好分數自動計算功能讓使用者只需設定偏好條件，無需手動填寫分數矩陣。</w:t>
       </w:r>
     </w:p>
     <w:p>
@@ -6026,7 +5726,7 @@
           <w:b/>
           <w:sz w:val="24"/>
         </w:rPr>
-        <w:t>4-3.2 未來改進的方向</w:t>
+        <w:t>4-3.2 未來改進方向</w:t>
       </w:r>
     </w:p>
     <w:p>
@@ -6038,7 +5738,7 @@
           <w:rFonts w:ascii="新細明體" w:hAnsi="新細明體" w:eastAsia="新細明體"/>
           <w:sz w:val="24"/>
         </w:rPr>
-        <w:t>• 擴展為多人一房：支援每間房間設定容納人數上限，更貼近實際宿舍分配場景。</w:t>
+        <w:t>• 偏好權重自訂：讓使用者調整五個偏好項目的權重比例。</w:t>
       </w:r>
     </w:p>
     <w:p>
@@ -6050,7 +5750,7 @@
           <w:rFonts w:ascii="新細明體" w:hAnsi="新細明體" w:eastAsia="新細明體"/>
           <w:sz w:val="24"/>
         </w:rPr>
-        <w:t>• 加入偏好排序：除了偏好分數外，加入學生的主觀排序，實作穩定婚姻演算法（Gale-Shapley）。</w:t>
+        <w:t>• 室友偏好：加入「希望和某位同學同房」的社交偏好。</w:t>
       </w:r>
     </w:p>
     <w:p>
@@ -6062,7 +5762,7 @@
           <w:rFonts w:ascii="新細明體" w:hAnsi="新細明體" w:eastAsia="新細明體"/>
           <w:sz w:val="24"/>
         </w:rPr>
-        <w:t>• 資料持久化：支援 JSON 匯出和匯入功能。</w:t>
+        <w:t>• 資料持久化：支援 JSON 匯出/匯入。</w:t>
       </w:r>
     </w:p>
     <w:p>
@@ -6074,7 +5774,7 @@
           <w:rFonts w:ascii="新細明體" w:hAnsi="新細明體" w:eastAsia="新細明體"/>
           <w:sz w:val="24"/>
         </w:rPr>
-        <w:t>• 大規模近似演算法：引入模擬退火或遺傳演算法處理大規模問題。</w:t>
+        <w:t>• 大規模演算法：引入模擬退火或遺傳演算法處理 &gt; 20 床位的問題。</w:t>
       </w:r>
     </w:p>
     <w:p>
@@ -6099,7 +5799,7 @@
           <w:rFonts w:ascii="新細明體" w:hAnsi="新細明體" w:eastAsia="新細明體"/>
           <w:sz w:val="24"/>
         </w:rPr>
-        <w:t>• 上界函數設計：初始版本使用過於寬鬆的上界，修剪效果不佳。後來改進為「每個未分配學生在剩餘房間中的最大分數之和」，顯著提升了修剪效率。</w:t>
+        <w:t>• 床位展開與還原：將多人房展開為個別床位後，演算法產出的結果需要還原回「哪些學生住哪間房」的格式。同一房間的多個床位對同一學生分數相同，需確保結果的正確分組顯示。</w:t>
       </w:r>
     </w:p>
     <w:p>
@@ -6111,7 +5811,7 @@
           <w:rFonts w:ascii="新細明體" w:hAnsi="新細明體" w:eastAsia="新細明體"/>
           <w:sz w:val="24"/>
         </w:rPr>
-        <w:t>• DP 的記憶體管理：位元遮罩 DP 的空間需求為 O(2ᵐ)，透過只使用一維 dp 陣列減少了記憶體使用量。</w:t>
+        <w:t>• 偏好分數設計：五個評分項目的權重分配需要平衡——房型偏好佔比最高（35分），因為住雙人房和四人房的體驗差異最大；朝向偏好佔比最低（10分），因為影響相對較小。</w:t>
       </w:r>
     </w:p>
     <w:p>
@@ -6123,7 +5823,7 @@
           <w:rFonts w:ascii="新細明體" w:hAnsi="新細明體" w:eastAsia="新細明體"/>
           <w:sz w:val="24"/>
         </w:rPr>
-        <w:t>• 二部圖的佈局計算：需根據學生和房間的數量動態調整節點間距，確保在不同規模下都能清晰展示。</w:t>
+        <w:t>• 上界函數：由於同一房間的多個床位分數相同，上界函數可能重複計算同一房間的分數。目前採用的上界仍為合法上界，但不夠緊緻，未來可改進。</w:t>
       </w:r>
     </w:p>
     <w:sectPr>

</xml_diff>

<commit_message>
simplify: room type only, cap bed count, editable matrix
</commit_message>
<xml_diff>
--- a/JobMatchingSystem/Program_Assignment_3_Report.docx
+++ b/JobMatchingSystem/Program_Assignment_3_Report.docx
@@ -144,7 +144,7 @@
           <w:rFonts w:ascii="新細明體" w:hAnsi="新細明體" w:eastAsia="新細明體"/>
           <w:sz w:val="24"/>
         </w:rPr>
-        <w:t>本報告設計並實作一套學生宿舍最佳配對資訊系統。系統支援多種房型（雙人房、三人房、四人房），每間房間具有樓層、冷氣、獨立衛浴、朝向等屬性。學生可設定個人偏好條件（偏好房型、樓層、設備需求等），系統自動計算每位學生對每個床位的偏好分數，再透過三種演算法——分支定界法（Branch-and-Bound）、貪婪演算法（Greedy）與動態規劃法（Dynamic Programming）——計算最佳配對方案，使全體學生的總偏好分數最大化。</w:t>
+        <w:t>本報告設計並實作一套學生宿舍最佳配對資訊系統。系統支援多種房間類型（雙人房、三人房、四人房），每位學生可選擇偏好的房間類型，系統自動計算偏好分數矩陣，並透過三種演算法——分支定界法（Branch-and-Bound）、貪婪演算法（Greedy Algorithm）與動態規劃法（Dynamic Programming）——計算最佳配對方案，使全體學生的總偏好分數最大化。</w:t>
       </w:r>
     </w:p>
     <w:p>
@@ -156,7 +156,7 @@
           <w:rFonts w:ascii="新細明體" w:hAnsi="新細明體" w:eastAsia="新細明體"/>
           <w:sz w:val="24"/>
         </w:rPr>
-        <w:t>系統將多人房拆分為個別床位，轉換為一對一指派問題後求解。提供直覺的圖形化操作介面，包含房間屬性設定、學生偏好表單、自動產生的偏好分數矩陣、二部圖配對視覺化、三種演算法一鍵比較功能，以及穩定性檢測（Blocking Pair 偵測）。</w:t>
+        <w:t>系統的核心策略是將多人房展開為個別床位槽（Bed Slot），將多對一的宿舍分配問題轉換為標準的一對一指派問題，再套用課堂所學的演算法求解。系統提供直覺的圖形化介面，包含可編輯的偏好分數矩陣、二部圖配對視覺化、三種演算法一鍵比較功能，以及穩定性檢測（Blocking Pair 偵測）。</w:t>
       </w:r>
     </w:p>
     <w:p>
@@ -199,7 +199,7 @@
           <w:rFonts w:ascii="新細明體" w:hAnsi="新細明體" w:eastAsia="新細明體"/>
           <w:sz w:val="24"/>
         </w:rPr>
-        <w:t>每學期開學前，大學宿舍管理單位需要將申請住宿的學生分配到有限的宿舍房間中。每位學生對不同房間有不同的偏好——有人偏好低樓層的雙人房、有人希望住在有獨立衛浴的高樓層。目前多數學校採用隨機抽籤的方式分配宿舍，無法考量學生的個人偏好，經常導致分配結果不理想。</w:t>
+        <w:t>每學期開學前，大學宿舍管理單位需要將申請住宿的學生分配到有限的宿舍房間中。宿舍房間有不同的類型——雙人房（2 床位）、三人房（3 床位）和四人房（4 床位）。每位學生對房間類型有不同的偏好：有人偏好雙人房的寧靜環境，有人則喜歡四人房的社交氛圍。</w:t>
       </w:r>
     </w:p>
     <w:p>
@@ -211,7 +211,7 @@
           <w:rFonts w:ascii="新細明體" w:hAnsi="新細明體" w:eastAsia="新細明體"/>
           <w:sz w:val="24"/>
         </w:rPr>
-        <w:t>本系統的目標是將宿舍分配從「隨機抽籤」升級為「最佳化配對」。系統的運營環境如下：</w:t>
+        <w:t>目前多數學校採用隨機抽籤的方式分配宿舍，無法考量學生對房間類型的偏好，經常導致分配結果不理想。本系統的目標是將宿舍分配從「隨機抽籤」升級為「最佳化配對」，透過演算法找到一個使所有學生整體滿意度最高的分配方案。</w:t>
       </w:r>
     </w:p>
     <w:p>
@@ -223,7 +223,7 @@
           <w:rFonts w:ascii="新細明體" w:hAnsi="新細明體" w:eastAsia="新細明體"/>
           <w:sz w:val="24"/>
         </w:rPr>
-        <w:t>• 房間：共有 m 間宿舍房間，每間房間有以下屬性：</w:t>
+        <w:t>系統的運營環境如下：</w:t>
       </w:r>
     </w:p>
     <w:p>
@@ -235,7 +235,7 @@
           <w:rFonts w:ascii="新細明體" w:hAnsi="新細明體" w:eastAsia="新細明體"/>
           <w:sz w:val="24"/>
         </w:rPr>
-        <w:t xml:space="preserve">　- 房型：雙人房（2床位）/ 三人房（3床位）/ 四人房（4床位）</w:t>
+        <w:t>• 房間：管理者設定各類型房間的數量（例如 2 間雙人房 + 1 間三人房），每間房間有唯一的房號。</w:t>
       </w:r>
     </w:p>
     <w:p>
@@ -247,7 +247,7 @@
           <w:rFonts w:ascii="新細明體" w:hAnsi="新細明體" w:eastAsia="新細明體"/>
           <w:sz w:val="24"/>
         </w:rPr>
-        <w:t xml:space="preserve">　- 樓層：1 樓至 6 樓以上</w:t>
+        <w:t>• 學生：共有 n 位學生申請住宿（n 等於總床位數），每位學生設定偏好的房間類型（雙人房 / 三人房 / 四人房 / 不限）。</w:t>
       </w:r>
     </w:p>
     <w:p>
@@ -259,7 +259,7 @@
           <w:rFonts w:ascii="新細明體" w:hAnsi="新細明體" w:eastAsia="新細明體"/>
           <w:sz w:val="24"/>
         </w:rPr>
-        <w:t xml:space="preserve">　- 設備：是否有冷氣、是否有獨立衛浴</w:t>
+        <w:t>• 偏好分數：系統根據學生偏好與房間類型的匹配度自動計算偏好分數（0-100），使用者也可手動微調。</w:t>
       </w:r>
     </w:p>
     <w:p>
@@ -271,91 +271,7 @@
           <w:rFonts w:ascii="新細明體" w:hAnsi="新細明體" w:eastAsia="新細明體"/>
           <w:sz w:val="24"/>
         </w:rPr>
-        <w:t xml:space="preserve">　- 朝向：南向 / 北向</w:t>
-      </w:r>
-    </w:p>
-    <w:p>
-      <w:pPr>
-        <w:spacing w:after="120" w:line="360" w:lineRule="auto"/>
-      </w:pPr>
-      <w:r>
-        <w:rPr>
-          <w:rFonts w:ascii="新細明體" w:hAnsi="新細明體" w:eastAsia="新細明體"/>
-          <w:sz w:val="24"/>
-        </w:rPr>
-        <w:t>• 學生：共有 n 位學生申請住宿，每位學生設定個人偏好條件：</w:t>
-      </w:r>
-    </w:p>
-    <w:p>
-      <w:pPr>
-        <w:spacing w:after="120" w:line="360" w:lineRule="auto"/>
-      </w:pPr>
-      <w:r>
-        <w:rPr>
-          <w:rFonts w:ascii="新細明體" w:hAnsi="新細明體" w:eastAsia="新細明體"/>
-          <w:sz w:val="24"/>
-        </w:rPr>
-        <w:t xml:space="preserve">　- 偏好房型：雙人房 / 三人房 / 四人房 / 不限</w:t>
-      </w:r>
-    </w:p>
-    <w:p>
-      <w:pPr>
-        <w:spacing w:after="120" w:line="360" w:lineRule="auto"/>
-      </w:pPr>
-      <w:r>
-        <w:rPr>
-          <w:rFonts w:ascii="新細明體" w:hAnsi="新細明體" w:eastAsia="新細明體"/>
-          <w:sz w:val="24"/>
-        </w:rPr>
-        <w:t xml:space="preserve">　- 偏好樓層：低樓層(1-2F) / 中樓層(3-4F) / 高樓層(5F+) / 不限</w:t>
-      </w:r>
-    </w:p>
-    <w:p>
-      <w:pPr>
-        <w:spacing w:after="120" w:line="360" w:lineRule="auto"/>
-      </w:pPr>
-      <w:r>
-        <w:rPr>
-          <w:rFonts w:ascii="新細明體" w:hAnsi="新細明體" w:eastAsia="新細明體"/>
-          <w:sz w:val="24"/>
-        </w:rPr>
-        <w:t xml:space="preserve">　- 冷氣需求：需要 / 不限</w:t>
-      </w:r>
-    </w:p>
-    <w:p>
-      <w:pPr>
-        <w:spacing w:after="120" w:line="360" w:lineRule="auto"/>
-      </w:pPr>
-      <w:r>
-        <w:rPr>
-          <w:rFonts w:ascii="新細明體" w:hAnsi="新細明體" w:eastAsia="新細明體"/>
-          <w:sz w:val="24"/>
-        </w:rPr>
-        <w:t xml:space="preserve">　- 衛浴需求：需要 / 不限</w:t>
-      </w:r>
-    </w:p>
-    <w:p>
-      <w:pPr>
-        <w:spacing w:after="120" w:line="360" w:lineRule="auto"/>
-      </w:pPr>
-      <w:r>
-        <w:rPr>
-          <w:rFonts w:ascii="新細明體" w:hAnsi="新細明體" w:eastAsia="新細明體"/>
-          <w:sz w:val="24"/>
-        </w:rPr>
-        <w:t xml:space="preserve">　- 朝向偏好：南向 / 北向 / 不限</w:t>
-      </w:r>
-    </w:p>
-    <w:p>
-      <w:pPr>
-        <w:spacing w:after="120" w:line="360" w:lineRule="auto"/>
-      </w:pPr>
-      <w:r>
-        <w:rPr>
-          <w:rFonts w:ascii="新細明體" w:hAnsi="新細明體" w:eastAsia="新細明體"/>
-          <w:sz w:val="24"/>
-        </w:rPr>
-        <w:t>• 配對目標：產生一個最佳分配方案，使所有學生的總偏好分數最大化。</w:t>
+        <w:t>• 配對目標：產生一個最佳的一對一分配方案（學生 ↔ 床位），使所有配對的總偏好分數最大化。</w:t>
       </w:r>
     </w:p>
     <w:p>
@@ -380,7 +296,562 @@
           <w:rFonts w:ascii="新細明體" w:hAnsi="新細明體" w:eastAsia="新細明體"/>
           <w:sz w:val="24"/>
         </w:rPr>
-        <w:t>範例 1 包含 4 間房間（2 間雙人房 + 1 間三人房 + 1 間四人房，共 11 個床位），分配 11 位學生：</w:t>
+        <w:t>範例 1：2 間雙人房（房號 101、102），共 4 個床位，4 位學生。</w:t>
+      </w:r>
+    </w:p>
+    <w:tbl>
+      <w:tblPr>
+        <w:tblStyle w:val="TableGrid"/>
+        <w:tblW w:type="auto" w:w="0"/>
+        <w:jc w:val="center"/>
+        <w:tblLook w:firstColumn="1" w:firstRow="1" w:lastColumn="0" w:lastRow="0" w:noHBand="0" w:noVBand="1" w:val="04A0"/>
+      </w:tblPr>
+      <w:tblGrid>
+        <w:gridCol w:w="1441"/>
+        <w:gridCol w:w="1441"/>
+        <w:gridCol w:w="1441"/>
+        <w:gridCol w:w="1441"/>
+        <w:gridCol w:w="1441"/>
+        <w:gridCol w:w="1441"/>
+      </w:tblGrid>
+      <w:tr>
+        <w:tc>
+          <w:tcPr>
+            <w:tcW w:type="dxa" w:w="1441"/>
+            <w:shd w:val="clear" w:fill="E8E0F0"/>
+          </w:tcPr>
+          <w:p>
+            <w:pPr>
+              <w:jc w:val="center"/>
+            </w:pPr>
+            <w:r>
+              <w:rPr>
+                <w:b/>
+                <w:sz w:val="20"/>
+              </w:rPr>
+              <w:t>學生</w:t>
+            </w:r>
+          </w:p>
+        </w:tc>
+        <w:tc>
+          <w:tcPr>
+            <w:tcW w:type="dxa" w:w="1441"/>
+            <w:shd w:val="clear" w:fill="E8E0F0"/>
+          </w:tcPr>
+          <w:p>
+            <w:pPr>
+              <w:jc w:val="center"/>
+            </w:pPr>
+            <w:r>
+              <w:rPr>
+                <w:b/>
+                <w:sz w:val="20"/>
+              </w:rPr>
+              <w:t>偏好房型</w:t>
+            </w:r>
+          </w:p>
+        </w:tc>
+        <w:tc>
+          <w:tcPr>
+            <w:tcW w:type="dxa" w:w="1441"/>
+            <w:shd w:val="clear" w:fill="E8E0F0"/>
+          </w:tcPr>
+          <w:p>
+            <w:pPr>
+              <w:jc w:val="center"/>
+            </w:pPr>
+            <w:r>
+              <w:rPr>
+                <w:b/>
+                <w:sz w:val="20"/>
+              </w:rPr>
+              <w:t>101-1</w:t>
+            </w:r>
+          </w:p>
+        </w:tc>
+        <w:tc>
+          <w:tcPr>
+            <w:tcW w:type="dxa" w:w="1441"/>
+            <w:shd w:val="clear" w:fill="E8E0F0"/>
+          </w:tcPr>
+          <w:p>
+            <w:pPr>
+              <w:jc w:val="center"/>
+            </w:pPr>
+            <w:r>
+              <w:rPr>
+                <w:b/>
+                <w:sz w:val="20"/>
+              </w:rPr>
+              <w:t>101-2</w:t>
+            </w:r>
+          </w:p>
+        </w:tc>
+        <w:tc>
+          <w:tcPr>
+            <w:tcW w:type="dxa" w:w="1441"/>
+            <w:shd w:val="clear" w:fill="E8E0F0"/>
+          </w:tcPr>
+          <w:p>
+            <w:pPr>
+              <w:jc w:val="center"/>
+            </w:pPr>
+            <w:r>
+              <w:rPr>
+                <w:b/>
+                <w:sz w:val="20"/>
+              </w:rPr>
+              <w:t>102-1</w:t>
+            </w:r>
+          </w:p>
+        </w:tc>
+        <w:tc>
+          <w:tcPr>
+            <w:tcW w:type="dxa" w:w="1441"/>
+            <w:shd w:val="clear" w:fill="E8E0F0"/>
+          </w:tcPr>
+          <w:p>
+            <w:pPr>
+              <w:jc w:val="center"/>
+            </w:pPr>
+            <w:r>
+              <w:rPr>
+                <w:b/>
+                <w:sz w:val="20"/>
+              </w:rPr>
+              <w:t>102-2</w:t>
+            </w:r>
+          </w:p>
+        </w:tc>
+      </w:tr>
+      <w:tr>
+        <w:tc>
+          <w:tcPr>
+            <w:tcW w:type="dxa" w:w="1441"/>
+          </w:tcPr>
+          <w:p>
+            <w:pPr>
+              <w:jc w:val="center"/>
+            </w:pPr>
+            <w:r>
+              <w:rPr>
+                <w:sz w:val="20"/>
+              </w:rPr>
+              <w:t>A</w:t>
+            </w:r>
+          </w:p>
+        </w:tc>
+        <w:tc>
+          <w:tcPr>
+            <w:tcW w:type="dxa" w:w="1441"/>
+          </w:tcPr>
+          <w:p>
+            <w:pPr>
+              <w:jc w:val="center"/>
+            </w:pPr>
+            <w:r>
+              <w:rPr>
+                <w:sz w:val="20"/>
+              </w:rPr>
+              <w:t>雙人房</w:t>
+            </w:r>
+          </w:p>
+        </w:tc>
+        <w:tc>
+          <w:tcPr>
+            <w:tcW w:type="dxa" w:w="1441"/>
+          </w:tcPr>
+          <w:p>
+            <w:pPr>
+              <w:jc w:val="center"/>
+            </w:pPr>
+            <w:r>
+              <w:rPr>
+                <w:sz w:val="20"/>
+              </w:rPr>
+              <w:t>77</w:t>
+            </w:r>
+          </w:p>
+        </w:tc>
+        <w:tc>
+          <w:tcPr>
+            <w:tcW w:type="dxa" w:w="1441"/>
+          </w:tcPr>
+          <w:p>
+            <w:pPr>
+              <w:jc w:val="center"/>
+            </w:pPr>
+            <w:r>
+              <w:rPr>
+                <w:sz w:val="20"/>
+              </w:rPr>
+              <w:t>77</w:t>
+            </w:r>
+          </w:p>
+        </w:tc>
+        <w:tc>
+          <w:tcPr>
+            <w:tcW w:type="dxa" w:w="1441"/>
+          </w:tcPr>
+          <w:p>
+            <w:pPr>
+              <w:jc w:val="center"/>
+            </w:pPr>
+            <w:r>
+              <w:rPr>
+                <w:sz w:val="20"/>
+              </w:rPr>
+              <w:t>72</w:t>
+            </w:r>
+          </w:p>
+        </w:tc>
+        <w:tc>
+          <w:tcPr>
+            <w:tcW w:type="dxa" w:w="1441"/>
+          </w:tcPr>
+          <w:p>
+            <w:pPr>
+              <w:jc w:val="center"/>
+            </w:pPr>
+            <w:r>
+              <w:rPr>
+                <w:sz w:val="20"/>
+              </w:rPr>
+              <w:t>72</w:t>
+            </w:r>
+          </w:p>
+        </w:tc>
+      </w:tr>
+      <w:tr>
+        <w:tc>
+          <w:tcPr>
+            <w:tcW w:type="dxa" w:w="1441"/>
+          </w:tcPr>
+          <w:p>
+            <w:pPr>
+              <w:jc w:val="center"/>
+            </w:pPr>
+            <w:r>
+              <w:rPr>
+                <w:sz w:val="20"/>
+              </w:rPr>
+              <w:t>B</w:t>
+            </w:r>
+          </w:p>
+        </w:tc>
+        <w:tc>
+          <w:tcPr>
+            <w:tcW w:type="dxa" w:w="1441"/>
+          </w:tcPr>
+          <w:p>
+            <w:pPr>
+              <w:jc w:val="center"/>
+            </w:pPr>
+            <w:r>
+              <w:rPr>
+                <w:sz w:val="20"/>
+              </w:rPr>
+              <w:t>雙人房</w:t>
+            </w:r>
+          </w:p>
+        </w:tc>
+        <w:tc>
+          <w:tcPr>
+            <w:tcW w:type="dxa" w:w="1441"/>
+          </w:tcPr>
+          <w:p>
+            <w:pPr>
+              <w:jc w:val="center"/>
+            </w:pPr>
+            <w:r>
+              <w:rPr>
+                <w:sz w:val="20"/>
+              </w:rPr>
+              <w:t>68</w:t>
+            </w:r>
+          </w:p>
+        </w:tc>
+        <w:tc>
+          <w:tcPr>
+            <w:tcW w:type="dxa" w:w="1441"/>
+          </w:tcPr>
+          <w:p>
+            <w:pPr>
+              <w:jc w:val="center"/>
+            </w:pPr>
+            <w:r>
+              <w:rPr>
+                <w:sz w:val="20"/>
+              </w:rPr>
+              <w:t>68</w:t>
+            </w:r>
+          </w:p>
+        </w:tc>
+        <w:tc>
+          <w:tcPr>
+            <w:tcW w:type="dxa" w:w="1441"/>
+          </w:tcPr>
+          <w:p>
+            <w:pPr>
+              <w:jc w:val="center"/>
+            </w:pPr>
+            <w:r>
+              <w:rPr>
+                <w:sz w:val="20"/>
+              </w:rPr>
+              <w:t>73</w:t>
+            </w:r>
+          </w:p>
+        </w:tc>
+        <w:tc>
+          <w:tcPr>
+            <w:tcW w:type="dxa" w:w="1441"/>
+          </w:tcPr>
+          <w:p>
+            <w:pPr>
+              <w:jc w:val="center"/>
+            </w:pPr>
+            <w:r>
+              <w:rPr>
+                <w:sz w:val="20"/>
+              </w:rPr>
+              <w:t>73</w:t>
+            </w:r>
+          </w:p>
+        </w:tc>
+      </w:tr>
+      <w:tr>
+        <w:tc>
+          <w:tcPr>
+            <w:tcW w:type="dxa" w:w="1441"/>
+          </w:tcPr>
+          <w:p>
+            <w:pPr>
+              <w:jc w:val="center"/>
+            </w:pPr>
+            <w:r>
+              <w:rPr>
+                <w:sz w:val="20"/>
+              </w:rPr>
+              <w:t>C</w:t>
+            </w:r>
+          </w:p>
+        </w:tc>
+        <w:tc>
+          <w:tcPr>
+            <w:tcW w:type="dxa" w:w="1441"/>
+          </w:tcPr>
+          <w:p>
+            <w:pPr>
+              <w:jc w:val="center"/>
+            </w:pPr>
+            <w:r>
+              <w:rPr>
+                <w:sz w:val="20"/>
+              </w:rPr>
+              <w:t>不限</w:t>
+            </w:r>
+          </w:p>
+        </w:tc>
+        <w:tc>
+          <w:tcPr>
+            <w:tcW w:type="dxa" w:w="1441"/>
+          </w:tcPr>
+          <w:p>
+            <w:pPr>
+              <w:jc w:val="center"/>
+            </w:pPr>
+            <w:r>
+              <w:rPr>
+                <w:sz w:val="20"/>
+              </w:rPr>
+              <w:t>59</w:t>
+            </w:r>
+          </w:p>
+        </w:tc>
+        <w:tc>
+          <w:tcPr>
+            <w:tcW w:type="dxa" w:w="1441"/>
+          </w:tcPr>
+          <w:p>
+            <w:pPr>
+              <w:jc w:val="center"/>
+            </w:pPr>
+            <w:r>
+              <w:rPr>
+                <w:sz w:val="20"/>
+              </w:rPr>
+              <w:t>59</w:t>
+            </w:r>
+          </w:p>
+        </w:tc>
+        <w:tc>
+          <w:tcPr>
+            <w:tcW w:type="dxa" w:w="1441"/>
+          </w:tcPr>
+          <w:p>
+            <w:pPr>
+              <w:jc w:val="center"/>
+            </w:pPr>
+            <w:r>
+              <w:rPr>
+                <w:sz w:val="20"/>
+              </w:rPr>
+              <w:t>54</w:t>
+            </w:r>
+          </w:p>
+        </w:tc>
+        <w:tc>
+          <w:tcPr>
+            <w:tcW w:type="dxa" w:w="1441"/>
+          </w:tcPr>
+          <w:p>
+            <w:pPr>
+              <w:jc w:val="center"/>
+            </w:pPr>
+            <w:r>
+              <w:rPr>
+                <w:sz w:val="20"/>
+              </w:rPr>
+              <w:t>54</w:t>
+            </w:r>
+          </w:p>
+        </w:tc>
+      </w:tr>
+      <w:tr>
+        <w:tc>
+          <w:tcPr>
+            <w:tcW w:type="dxa" w:w="1441"/>
+          </w:tcPr>
+          <w:p>
+            <w:pPr>
+              <w:jc w:val="center"/>
+            </w:pPr>
+            <w:r>
+              <w:rPr>
+                <w:sz w:val="20"/>
+              </w:rPr>
+              <w:t>D</w:t>
+            </w:r>
+          </w:p>
+        </w:tc>
+        <w:tc>
+          <w:tcPr>
+            <w:tcW w:type="dxa" w:w="1441"/>
+          </w:tcPr>
+          <w:p>
+            <w:pPr>
+              <w:jc w:val="center"/>
+            </w:pPr>
+            <w:r>
+              <w:rPr>
+                <w:sz w:val="20"/>
+              </w:rPr>
+              <w:t>雙人房</w:t>
+            </w:r>
+          </w:p>
+        </w:tc>
+        <w:tc>
+          <w:tcPr>
+            <w:tcW w:type="dxa" w:w="1441"/>
+          </w:tcPr>
+          <w:p>
+            <w:pPr>
+              <w:jc w:val="center"/>
+            </w:pPr>
+            <w:r>
+              <w:rPr>
+                <w:sz w:val="20"/>
+              </w:rPr>
+              <w:t>90</w:t>
+            </w:r>
+          </w:p>
+        </w:tc>
+        <w:tc>
+          <w:tcPr>
+            <w:tcW w:type="dxa" w:w="1441"/>
+          </w:tcPr>
+          <w:p>
+            <w:pPr>
+              <w:jc w:val="center"/>
+            </w:pPr>
+            <w:r>
+              <w:rPr>
+                <w:sz w:val="20"/>
+              </w:rPr>
+              <w:t>90</w:t>
+            </w:r>
+          </w:p>
+        </w:tc>
+        <w:tc>
+          <w:tcPr>
+            <w:tcW w:type="dxa" w:w="1441"/>
+          </w:tcPr>
+          <w:p>
+            <w:pPr>
+              <w:jc w:val="center"/>
+            </w:pPr>
+            <w:r>
+              <w:rPr>
+                <w:sz w:val="20"/>
+              </w:rPr>
+              <w:t>55</w:t>
+            </w:r>
+          </w:p>
+        </w:tc>
+        <w:tc>
+          <w:tcPr>
+            <w:tcW w:type="dxa" w:w="1441"/>
+          </w:tcPr>
+          <w:p>
+            <w:pPr>
+              <w:jc w:val="center"/>
+            </w:pPr>
+            <w:r>
+              <w:rPr>
+                <w:sz w:val="20"/>
+              </w:rPr>
+              <w:t>55</w:t>
+            </w:r>
+          </w:p>
+        </w:tc>
+      </w:tr>
+    </w:tbl>
+    <w:p>
+      <w:pPr>
+        <w:spacing w:after="160" w:line="360" w:lineRule="auto"/>
+        <w:jc w:val="center"/>
+      </w:pPr>
+      <w:r>
+        <w:rPr>
+          <w:rFonts w:ascii="新細明體" w:hAnsi="新細明體" w:eastAsia="新細明體"/>
+          <w:sz w:val="20"/>
+        </w:rPr>
+        <w:t>表 1  範例 1 偏好分數矩陣（4×4）</w:t>
+      </w:r>
+    </w:p>
+    <w:p>
+      <w:pPr>
+        <w:spacing w:after="120" w:line="360" w:lineRule="auto"/>
+      </w:pPr>
+      <w:r>
+        <w:rPr>
+          <w:rFonts w:ascii="新細明體" w:hAnsi="新細明體" w:eastAsia="新細明體"/>
+          <w:sz w:val="24"/>
+        </w:rPr>
+        <w:t>註：同一房間內的不同床位（如 101-1 和 101-2）對同一學生的偏好分數相同，因為兩個床位共享相同的房間屬性。</w:t>
+      </w:r>
+    </w:p>
+    <w:p>
+      <w:pPr>
+        <w:spacing w:after="120" w:line="360" w:lineRule="auto"/>
+      </w:pPr>
+      <w:r>
+        <w:rPr>
+          <w:rFonts w:ascii="新細明體" w:hAnsi="新細明體" w:eastAsia="新細明體"/>
+          <w:sz w:val="24"/>
+        </w:rPr>
+        <w:t>範例 2：1 間雙人房（201）+ 1 間三人房（202），共 5 個床位，5 位學生。</w:t>
       </w:r>
     </w:p>
     <w:tbl>
@@ -414,7 +885,7 @@
                 <w:b/>
                 <w:sz w:val="20"/>
               </w:rPr>
-              <w:t>房號</w:t>
+              <w:t>學生</w:t>
             </w:r>
           </w:p>
         </w:tc>
@@ -432,7 +903,7 @@
                 <w:b/>
                 <w:sz w:val="20"/>
               </w:rPr>
-              <w:t>房型</w:t>
+              <w:t>偏好房型</w:t>
             </w:r>
           </w:p>
         </w:tc>
@@ -450,7 +921,7 @@
                 <w:b/>
                 <w:sz w:val="20"/>
               </w:rPr>
-              <w:t>樓層</w:t>
+              <w:t>201-1</w:t>
             </w:r>
           </w:p>
         </w:tc>
@@ -468,7 +939,7 @@
                 <w:b/>
                 <w:sz w:val="20"/>
               </w:rPr>
-              <w:t>冷氣</w:t>
+              <w:t>201-2</w:t>
             </w:r>
           </w:p>
         </w:tc>
@@ -486,7 +957,7 @@
                 <w:b/>
                 <w:sz w:val="20"/>
               </w:rPr>
-              <w:t>衛浴</w:t>
+              <w:t>202-1</w:t>
             </w:r>
           </w:p>
         </w:tc>
@@ -504,7 +975,7 @@
                 <w:b/>
                 <w:sz w:val="20"/>
               </w:rPr>
-              <w:t>朝向</w:t>
+              <w:t>202-2</w:t>
             </w:r>
           </w:p>
         </w:tc>
@@ -522,7 +993,7 @@
                 <w:b/>
                 <w:sz w:val="20"/>
               </w:rPr>
-              <w:t>床位數</w:t>
+              <w:t>202-3</w:t>
             </w:r>
           </w:p>
         </w:tc>
@@ -540,7 +1011,7 @@
               <w:rPr>
                 <w:sz w:val="20"/>
               </w:rPr>
-              <w:t>201</w:t>
+              <w:t>A</w:t>
             </w:r>
           </w:p>
         </w:tc>
@@ -572,7 +1043,7 @@
               <w:rPr>
                 <w:sz w:val="20"/>
               </w:rPr>
-              <w:t>2F</w:t>
+              <w:t>77</w:t>
             </w:r>
           </w:p>
         </w:tc>
@@ -588,7 +1059,7 @@
               <w:rPr>
                 <w:sz w:val="20"/>
               </w:rPr>
-              <w:t>✓</w:t>
+              <w:t>77</w:t>
             </w:r>
           </w:p>
         </w:tc>
@@ -604,7 +1075,7 @@
               <w:rPr>
                 <w:sz w:val="20"/>
               </w:rPr>
-              <w:t>✓</w:t>
+              <w:t>37</w:t>
             </w:r>
           </w:p>
         </w:tc>
@@ -620,7 +1091,7 @@
               <w:rPr>
                 <w:sz w:val="20"/>
               </w:rPr>
-              <w:t>南向</w:t>
+              <w:t>37</w:t>
             </w:r>
           </w:p>
         </w:tc>
@@ -636,7 +1107,7 @@
               <w:rPr>
                 <w:sz w:val="20"/>
               </w:rPr>
-              <w:t>2</w:t>
+              <w:t>37</w:t>
             </w:r>
           </w:p>
         </w:tc>
@@ -654,7 +1125,121 @@
               <w:rPr>
                 <w:sz w:val="20"/>
               </w:rPr>
-              <w:t>202</w:t>
+              <w:t>B</w:t>
+            </w:r>
+          </w:p>
+        </w:tc>
+        <w:tc>
+          <w:tcPr>
+            <w:tcW w:type="dxa" w:w="1235"/>
+          </w:tcPr>
+          <w:p>
+            <w:pPr>
+              <w:jc w:val="center"/>
+            </w:pPr>
+            <w:r>
+              <w:rPr>
+                <w:sz w:val="20"/>
+              </w:rPr>
+              <w:t>三人房</w:t>
+            </w:r>
+          </w:p>
+        </w:tc>
+        <w:tc>
+          <w:tcPr>
+            <w:tcW w:type="dxa" w:w="1235"/>
+          </w:tcPr>
+          <w:p>
+            <w:pPr>
+              <w:jc w:val="center"/>
+            </w:pPr>
+            <w:r>
+              <w:rPr>
+                <w:sz w:val="20"/>
+              </w:rPr>
+              <w:t>38</w:t>
+            </w:r>
+          </w:p>
+        </w:tc>
+        <w:tc>
+          <w:tcPr>
+            <w:tcW w:type="dxa" w:w="1235"/>
+          </w:tcPr>
+          <w:p>
+            <w:pPr>
+              <w:jc w:val="center"/>
+            </w:pPr>
+            <w:r>
+              <w:rPr>
+                <w:sz w:val="20"/>
+              </w:rPr>
+              <w:t>38</w:t>
+            </w:r>
+          </w:p>
+        </w:tc>
+        <w:tc>
+          <w:tcPr>
+            <w:tcW w:type="dxa" w:w="1235"/>
+          </w:tcPr>
+          <w:p>
+            <w:pPr>
+              <w:jc w:val="center"/>
+            </w:pPr>
+            <w:r>
+              <w:rPr>
+                <w:sz w:val="20"/>
+              </w:rPr>
+              <w:t>78</w:t>
+            </w:r>
+          </w:p>
+        </w:tc>
+        <w:tc>
+          <w:tcPr>
+            <w:tcW w:type="dxa" w:w="1235"/>
+          </w:tcPr>
+          <w:p>
+            <w:pPr>
+              <w:jc w:val="center"/>
+            </w:pPr>
+            <w:r>
+              <w:rPr>
+                <w:sz w:val="20"/>
+              </w:rPr>
+              <w:t>78</w:t>
+            </w:r>
+          </w:p>
+        </w:tc>
+        <w:tc>
+          <w:tcPr>
+            <w:tcW w:type="dxa" w:w="1235"/>
+          </w:tcPr>
+          <w:p>
+            <w:pPr>
+              <w:jc w:val="center"/>
+            </w:pPr>
+            <w:r>
+              <w:rPr>
+                <w:sz w:val="20"/>
+              </w:rPr>
+              <w:t>78</w:t>
+            </w:r>
+          </w:p>
+        </w:tc>
+      </w:tr>
+      <w:tr>
+        <w:tc>
+          <w:tcPr>
+            <w:tcW w:type="dxa" w:w="1235"/>
+          </w:tcPr>
+          <w:p>
+            <w:pPr>
+              <w:jc w:val="center"/>
+            </w:pPr>
+            <w:r>
+              <w:rPr>
+                <w:sz w:val="20"/>
+              </w:rPr>
+              <w:t>C</w:t>
             </w:r>
           </w:p>
         </w:tc>
@@ -686,7 +1271,7 @@
               <w:rPr>
                 <w:sz w:val="20"/>
               </w:rPr>
-              <w:t>2F</w:t>
+              <w:t>89</w:t>
             </w:r>
           </w:p>
         </w:tc>
@@ -702,7 +1287,7 @@
               <w:rPr>
                 <w:sz w:val="20"/>
               </w:rPr>
-              <w:t>✓</w:t>
+              <w:t>89</w:t>
             </w:r>
           </w:p>
         </w:tc>
@@ -718,7 +1303,7 @@
               <w:rPr>
                 <w:sz w:val="20"/>
               </w:rPr>
-              <w:t>✗</w:t>
+              <w:t>39</w:t>
             </w:r>
           </w:p>
         </w:tc>
@@ -734,7 +1319,7 @@
               <w:rPr>
                 <w:sz w:val="20"/>
               </w:rPr>
-              <w:t>北向</w:t>
+              <w:t>39</w:t>
             </w:r>
           </w:p>
         </w:tc>
@@ -750,7 +1335,7 @@
               <w:rPr>
                 <w:sz w:val="20"/>
               </w:rPr>
-              <w:t>2</w:t>
+              <w:t>39</w:t>
             </w:r>
           </w:p>
         </w:tc>
@@ -768,7 +1353,121 @@
               <w:rPr>
                 <w:sz w:val="20"/>
               </w:rPr>
-              <w:t>301</w:t>
+              <w:t>D</w:t>
+            </w:r>
+          </w:p>
+        </w:tc>
+        <w:tc>
+          <w:tcPr>
+            <w:tcW w:type="dxa" w:w="1235"/>
+          </w:tcPr>
+          <w:p>
+            <w:pPr>
+              <w:jc w:val="center"/>
+            </w:pPr>
+            <w:r>
+              <w:rPr>
+                <w:sz w:val="20"/>
+              </w:rPr>
+              <w:t>不限</w:t>
+            </w:r>
+          </w:p>
+        </w:tc>
+        <w:tc>
+          <w:tcPr>
+            <w:tcW w:type="dxa" w:w="1235"/>
+          </w:tcPr>
+          <w:p>
+            <w:pPr>
+              <w:jc w:val="center"/>
+            </w:pPr>
+            <w:r>
+              <w:rPr>
+                <w:sz w:val="20"/>
+              </w:rPr>
+              <w:t>50</w:t>
+            </w:r>
+          </w:p>
+        </w:tc>
+        <w:tc>
+          <w:tcPr>
+            <w:tcW w:type="dxa" w:w="1235"/>
+          </w:tcPr>
+          <w:p>
+            <w:pPr>
+              <w:jc w:val="center"/>
+            </w:pPr>
+            <w:r>
+              <w:rPr>
+                <w:sz w:val="20"/>
+              </w:rPr>
+              <w:t>50</w:t>
+            </w:r>
+          </w:p>
+        </w:tc>
+        <w:tc>
+          <w:tcPr>
+            <w:tcW w:type="dxa" w:w="1235"/>
+          </w:tcPr>
+          <w:p>
+            <w:pPr>
+              <w:jc w:val="center"/>
+            </w:pPr>
+            <w:r>
+              <w:rPr>
+                <w:sz w:val="20"/>
+              </w:rPr>
+              <w:t>60</w:t>
+            </w:r>
+          </w:p>
+        </w:tc>
+        <w:tc>
+          <w:tcPr>
+            <w:tcW w:type="dxa" w:w="1235"/>
+          </w:tcPr>
+          <w:p>
+            <w:pPr>
+              <w:jc w:val="center"/>
+            </w:pPr>
+            <w:r>
+              <w:rPr>
+                <w:sz w:val="20"/>
+              </w:rPr>
+              <w:t>60</w:t>
+            </w:r>
+          </w:p>
+        </w:tc>
+        <w:tc>
+          <w:tcPr>
+            <w:tcW w:type="dxa" w:w="1235"/>
+          </w:tcPr>
+          <w:p>
+            <w:pPr>
+              <w:jc w:val="center"/>
+            </w:pPr>
+            <w:r>
+              <w:rPr>
+                <w:sz w:val="20"/>
+              </w:rPr>
+              <w:t>60</w:t>
+            </w:r>
+          </w:p>
+        </w:tc>
+      </w:tr>
+      <w:tr>
+        <w:tc>
+          <w:tcPr>
+            <w:tcW w:type="dxa" w:w="1235"/>
+          </w:tcPr>
+          <w:p>
+            <w:pPr>
+              <w:jc w:val="center"/>
+            </w:pPr>
+            <w:r>
+              <w:rPr>
+                <w:sz w:val="20"/>
+              </w:rPr>
+              <w:t>E</w:t>
             </w:r>
           </w:p>
         </w:tc>
@@ -800,7 +1499,7 @@
               <w:rPr>
                 <w:sz w:val="20"/>
               </w:rPr>
-              <w:t>3F</w:t>
+              <w:t>41</w:t>
             </w:r>
           </w:p>
         </w:tc>
@@ -816,7 +1515,7 @@
               <w:rPr>
                 <w:sz w:val="20"/>
               </w:rPr>
-              <w:t>✗</w:t>
+              <w:t>41</w:t>
             </w:r>
           </w:p>
         </w:tc>
@@ -832,7 +1531,7 @@
               <w:rPr>
                 <w:sz w:val="20"/>
               </w:rPr>
-              <w:t>✓</w:t>
+              <w:t>71</w:t>
             </w:r>
           </w:p>
         </w:tc>
@@ -848,7 +1547,7 @@
               <w:rPr>
                 <w:sz w:val="20"/>
               </w:rPr>
-              <w:t>南向</w:t>
+              <w:t>71</w:t>
             </w:r>
           </w:p>
         </w:tc>
@@ -864,121 +1563,7 @@
               <w:rPr>
                 <w:sz w:val="20"/>
               </w:rPr>
-              <w:t>3</w:t>
-            </w:r>
-          </w:p>
-        </w:tc>
-      </w:tr>
-      <w:tr>
-        <w:tc>
-          <w:tcPr>
-            <w:tcW w:type="dxa" w:w="1235"/>
-          </w:tcPr>
-          <w:p>
-            <w:pPr>
-              <w:jc w:val="center"/>
-            </w:pPr>
-            <w:r>
-              <w:rPr>
-                <w:sz w:val="20"/>
-              </w:rPr>
-              <w:t>401</w:t>
-            </w:r>
-          </w:p>
-        </w:tc>
-        <w:tc>
-          <w:tcPr>
-            <w:tcW w:type="dxa" w:w="1235"/>
-          </w:tcPr>
-          <w:p>
-            <w:pPr>
-              <w:jc w:val="center"/>
-            </w:pPr>
-            <w:r>
-              <w:rPr>
-                <w:sz w:val="20"/>
-              </w:rPr>
-              <w:t>四人房</w:t>
-            </w:r>
-          </w:p>
-        </w:tc>
-        <w:tc>
-          <w:tcPr>
-            <w:tcW w:type="dxa" w:w="1235"/>
-          </w:tcPr>
-          <w:p>
-            <w:pPr>
-              <w:jc w:val="center"/>
-            </w:pPr>
-            <w:r>
-              <w:rPr>
-                <w:sz w:val="20"/>
-              </w:rPr>
-              <w:t>4F</w:t>
-            </w:r>
-          </w:p>
-        </w:tc>
-        <w:tc>
-          <w:tcPr>
-            <w:tcW w:type="dxa" w:w="1235"/>
-          </w:tcPr>
-          <w:p>
-            <w:pPr>
-              <w:jc w:val="center"/>
-            </w:pPr>
-            <w:r>
-              <w:rPr>
-                <w:sz w:val="20"/>
-              </w:rPr>
-              <w:t>✓</w:t>
-            </w:r>
-          </w:p>
-        </w:tc>
-        <w:tc>
-          <w:tcPr>
-            <w:tcW w:type="dxa" w:w="1235"/>
-          </w:tcPr>
-          <w:p>
-            <w:pPr>
-              <w:jc w:val="center"/>
-            </w:pPr>
-            <w:r>
-              <w:rPr>
-                <w:sz w:val="20"/>
-              </w:rPr>
-              <w:t>✓</w:t>
-            </w:r>
-          </w:p>
-        </w:tc>
-        <w:tc>
-          <w:tcPr>
-            <w:tcW w:type="dxa" w:w="1235"/>
-          </w:tcPr>
-          <w:p>
-            <w:pPr>
-              <w:jc w:val="center"/>
-            </w:pPr>
-            <w:r>
-              <w:rPr>
-                <w:sz w:val="20"/>
-              </w:rPr>
-              <w:t>北向</w:t>
-            </w:r>
-          </w:p>
-        </w:tc>
-        <w:tc>
-          <w:tcPr>
-            <w:tcW w:type="dxa" w:w="1235"/>
-          </w:tcPr>
-          <w:p>
-            <w:pPr>
-              <w:jc w:val="center"/>
-            </w:pPr>
-            <w:r>
-              <w:rPr>
-                <w:sz w:val="20"/>
-              </w:rPr>
-              <w:t>4</w:t>
+              <w:t>71</w:t>
             </w:r>
           </w:p>
         </w:tc>
@@ -994,7 +1579,7 @@
           <w:rFonts w:ascii="新細明體" w:hAnsi="新細明體" w:eastAsia="新細明體"/>
           <w:sz w:val="20"/>
         </w:rPr>
-        <w:t>表 1  範例 1 房間屬性</w:t>
+        <w:t>表 2  範例 2 偏好分數矩陣（5×5）</w:t>
       </w:r>
     </w:p>
     <w:p>
@@ -1019,7 +1604,7 @@
           <w:rFonts w:ascii="新細明體" w:hAnsi="新細明體" w:eastAsia="新細明體"/>
           <w:sz w:val="24"/>
         </w:rPr>
-        <w:t>系統的核心資料模型：</w:t>
+        <w:t>系統的資料模型可以用二部圖 G = (S ∪ B, E) 表示：</w:t>
       </w:r>
     </w:p>
     <w:p>
@@ -1031,7 +1616,7 @@
           <w:rFonts w:ascii="新細明體" w:hAnsi="新細明體" w:eastAsia="新細明體"/>
           <w:sz w:val="24"/>
         </w:rPr>
-        <w:t>• 房間物件 Room = {number, type, floor, ac, bath, orient}，其中 type ∈ {2, 3, 4}。</w:t>
+        <w:t>• S（學生集合）：S = {s₁, s₂, ..., sₙ}，每個 sᵢ 代表一位學生，具有偏好房型屬性。</w:t>
       </w:r>
     </w:p>
     <w:p>
@@ -1043,7 +1628,7 @@
           <w:rFonts w:ascii="新細明體" w:hAnsi="新細明體" w:eastAsia="新細明體"/>
           <w:sz w:val="24"/>
         </w:rPr>
-        <w:t>• 床位展開：每間房間依其 type 展開為 type 個床位槽（Bed Slot）。例如一間三人房展開為 3 個床位槽，每個床位槽繼承該房間的所有屬性。</w:t>
+        <w:t>• B（床位槽集合）：由房間展開而來。例如一間雙人房展開為 2 個床位槽，三人房展開為 3 個。</w:t>
       </w:r>
     </w:p>
     <w:p>
@@ -1055,7 +1640,7 @@
           <w:rFonts w:ascii="新細明體" w:hAnsi="新細明體" w:eastAsia="新細明體"/>
           <w:sz w:val="24"/>
         </w:rPr>
-        <w:t>• 學生物件 Student = {name, prefType, prefFloor, prefAC, prefBath, prefOrient}。</w:t>
+        <w:t>• E（邊集合）：每條邊 (sᵢ, bⱼ) 的權重為偏好分數 c(i,j) ∈ [0, 100]。</w:t>
       </w:r>
     </w:p>
     <w:p>
@@ -1067,19 +1652,7 @@
           <w:rFonts w:ascii="新細明體" w:hAnsi="新細明體" w:eastAsia="新細明體"/>
           <w:sz w:val="24"/>
         </w:rPr>
-        <w:t>• 偏好分數矩陣 C：n × totalBeds 矩陣，C[i][j] 為學生 i 對床位槽 j 的偏好分數（0-100），由系統根據學生偏好與床位屬性自動計算。</w:t>
-      </w:r>
-    </w:p>
-    <w:p>
-      <w:pPr>
-        <w:spacing w:after="120" w:line="360" w:lineRule="auto"/>
-      </w:pPr>
-      <w:r>
-        <w:rPr>
-          <w:rFonts w:ascii="新細明體" w:hAnsi="新細明體" w:eastAsia="新細明體"/>
-          <w:sz w:val="24"/>
-        </w:rPr>
-        <w:t>• 配對結果 assignment：一維陣列，assignment[i] = j 表示學生 i 被分配到床位槽 j。</w:t>
+        <w:t>• 偏好分數矩陣 C：n × totalBeds 矩陣，由系統根據偏好匹配度自動計算。</w:t>
       </w:r>
     </w:p>
     <w:p>
@@ -1092,7 +1665,7 @@
           <w:b/>
           <w:sz w:val="26"/>
         </w:rPr>
-        <w:t>1-4 系統設計</w:t>
+        <w:t>1-4 偏好分數計算規則</w:t>
       </w:r>
     </w:p>
     <w:p>
@@ -1104,7 +1677,7 @@
           <w:rFonts w:ascii="新細明體" w:hAnsi="新細明體" w:eastAsia="新細明體"/>
           <w:sz w:val="24"/>
         </w:rPr>
-        <w:t>本系統是一套為大學宿舍管理單位打造的最佳配對資訊系統。系統採用左右分欄的單頁應用佈局：</w:t>
+        <w:t>偏好分數 c(i,j) 由兩部分加總而成，合計 0-100 分：</w:t>
       </w:r>
     </w:p>
     <w:p>
@@ -1116,7 +1689,7 @@
           <w:rFonts w:ascii="新細明體" w:hAnsi="新細明體" w:eastAsia="新細明體"/>
           <w:sz w:val="24"/>
         </w:rPr>
-        <w:t>左側主區域：上方為二部圖配對視覺化（Canvas），左側為學生節點、右側為房間節點（含房型與容量資訊），配對以綠色連線表示。下方為系統自動計算的偏好分數矩陣（唯讀），以高亮顯示已配對的儲存格。</w:t>
+        <w:t>(1) 基礎分數（20-50 分）：根據學生與床位的編號組合產生的固定差異值，模擬不同學生對不同房間的個人偏好差異（例如地理位置、室友關係等無法量化的因素）。</w:t>
       </w:r>
     </w:p>
     <w:p>
@@ -1128,32 +1701,7 @@
           <w:rFonts w:ascii="新細明體" w:hAnsi="新細明體" w:eastAsia="新細明體"/>
           <w:sz w:val="24"/>
         </w:rPr>
-        <w:t>右側側邊欄由上而下包含：(1) 房間設定區——可設定雙人房/三人房/四人房的數量、起始樓層和房號，系統自動生成房間並隨機分配設備屬性，也可手動修改每間房的冷氣、衛浴和朝向。(2) 學生偏好設定區——可設定學生人數，每位學生透過下拉選單設定偏好房型、偏好樓層、冷氣需求、衛浴需求和朝向偏好。(3) 演算法選擇與執行區——支援三種演算法及一鍵比較。(4) 結果展示區——包含分數、配對明細、穩定性檢測和比較表格。</w:t>
-      </w:r>
-    </w:p>
-    <w:p>
-      <w:pPr>
-        <w:spacing w:after="120" w:line="360" w:lineRule="auto"/>
-      </w:pPr>
-      <w:r>
-        <w:rPr>
-          <w:rFonts w:ascii="新細明體" w:hAnsi="新細明體" w:eastAsia="新細明體"/>
-          <w:b/>
-          <w:sz w:val="26"/>
-        </w:rPr>
-        <w:t>1-5 偏好分數計算規則</w:t>
-      </w:r>
-    </w:p>
-    <w:p>
-      <w:pPr>
-        <w:spacing w:after="120" w:line="360" w:lineRule="auto"/>
-      </w:pPr>
-      <w:r>
-        <w:rPr>
-          <w:rFonts w:ascii="新細明體" w:hAnsi="新細明體" w:eastAsia="新細明體"/>
-          <w:sz w:val="24"/>
-        </w:rPr>
-        <w:t>偏好分數 c(i,j) 的計算規則如下，滿分 100 分：</w:t>
+        <w:t>(2) 房型匹配加分（0-50 分）：</w:t>
       </w:r>
     </w:p>
     <w:tbl>
@@ -1164,17 +1712,13 @@
         <w:tblLook w:firstColumn="1" w:firstRow="1" w:lastColumn="0" w:lastRow="0" w:noHBand="0" w:noVBand="1" w:val="04A0"/>
       </w:tblPr>
       <w:tblGrid>
-        <w:gridCol w:w="1441"/>
-        <w:gridCol w:w="1441"/>
-        <w:gridCol w:w="1441"/>
-        <w:gridCol w:w="1441"/>
-        <w:gridCol w:w="1441"/>
-        <w:gridCol w:w="1441"/>
+        <w:gridCol w:w="4323"/>
+        <w:gridCol w:w="4323"/>
       </w:tblGrid>
       <w:tr>
         <w:tc>
           <w:tcPr>
-            <w:tcW w:type="dxa" w:w="1441"/>
+            <w:tcW w:type="dxa" w:w="4323"/>
             <w:shd w:val="clear" w:fill="E8E0F0"/>
           </w:tcPr>
           <w:p>
@@ -1186,13 +1730,13 @@
                 <w:b/>
                 <w:sz w:val="20"/>
               </w:rPr>
-              <w:t>評分項目</w:t>
+              <w:t>匹配情況</w:t>
             </w:r>
           </w:p>
         </w:tc>
         <w:tc>
           <w:tcPr>
-            <w:tcW w:type="dxa" w:w="1441"/>
+            <w:tcW w:type="dxa" w:w="4323"/>
             <w:shd w:val="clear" w:fill="E8E0F0"/>
           </w:tcPr>
           <w:p>
@@ -1204,79 +1748,7 @@
                 <w:b/>
                 <w:sz w:val="20"/>
               </w:rPr>
-              <w:t>滿分</w:t>
-            </w:r>
-          </w:p>
-        </w:tc>
-        <w:tc>
-          <w:tcPr>
-            <w:tcW w:type="dxa" w:w="1441"/>
-            <w:shd w:val="clear" w:fill="E8E0F0"/>
-          </w:tcPr>
-          <w:p>
-            <w:pPr>
-              <w:jc w:val="center"/>
-            </w:pPr>
-            <w:r>
-              <w:rPr>
-                <w:b/>
-                <w:sz w:val="20"/>
-              </w:rPr>
-              <w:t>完全符合</w:t>
-            </w:r>
-          </w:p>
-        </w:tc>
-        <w:tc>
-          <w:tcPr>
-            <w:tcW w:type="dxa" w:w="1441"/>
-            <w:shd w:val="clear" w:fill="E8E0F0"/>
-          </w:tcPr>
-          <w:p>
-            <w:pPr>
-              <w:jc w:val="center"/>
-            </w:pPr>
-            <w:r>
-              <w:rPr>
-                <w:b/>
-                <w:sz w:val="20"/>
-              </w:rPr>
-              <w:t>部分符合</w:t>
-            </w:r>
-          </w:p>
-        </w:tc>
-        <w:tc>
-          <w:tcPr>
-            <w:tcW w:type="dxa" w:w="1441"/>
-            <w:shd w:val="clear" w:fill="E8E0F0"/>
-          </w:tcPr>
-          <w:p>
-            <w:pPr>
-              <w:jc w:val="center"/>
-            </w:pPr>
-            <w:r>
-              <w:rPr>
-                <w:b/>
-                <w:sz w:val="20"/>
-              </w:rPr>
-              <w:t>不限</w:t>
-            </w:r>
-          </w:p>
-        </w:tc>
-        <w:tc>
-          <w:tcPr>
-            <w:tcW w:type="dxa" w:w="1441"/>
-            <w:shd w:val="clear" w:fill="E8E0F0"/>
-          </w:tcPr>
-          <w:p>
-            <w:pPr>
-              <w:jc w:val="center"/>
-            </w:pPr>
-            <w:r>
-              <w:rPr>
-                <w:b/>
-                <w:sz w:val="20"/>
-              </w:rPr>
-              <w:t>不符合</w:t>
+              <w:t>加分</w:t>
             </w:r>
           </w:p>
         </w:tc>
@@ -1284,7 +1756,7 @@
       <w:tr>
         <w:tc>
           <w:tcPr>
-            <w:tcW w:type="dxa" w:w="1441"/>
+            <w:tcW w:type="dxa" w:w="4323"/>
           </w:tcPr>
           <w:p>
             <w:pPr>
@@ -1294,13 +1766,13 @@
               <w:rPr>
                 <w:sz w:val="20"/>
               </w:rPr>
-              <w:t>房型偏好</w:t>
+              <w:t>完全符合（偏好房型 = 房間類型）</w:t>
             </w:r>
           </w:p>
         </w:tc>
         <w:tc>
           <w:tcPr>
-            <w:tcW w:type="dxa" w:w="1441"/>
+            <w:tcW w:type="dxa" w:w="4323"/>
           </w:tcPr>
           <w:p>
             <w:pPr>
@@ -1310,13 +1782,15 @@
               <w:rPr>
                 <w:sz w:val="20"/>
               </w:rPr>
-              <w:t>35</w:t>
+              <w:t>+50</w:t>
             </w:r>
           </w:p>
         </w:tc>
+      </w:tr>
+      <w:tr>
         <w:tc>
           <w:tcPr>
-            <w:tcW w:type="dxa" w:w="1441"/>
+            <w:tcW w:type="dxa" w:w="4323"/>
           </w:tcPr>
           <w:p>
             <w:pPr>
@@ -1326,13 +1800,13 @@
               <w:rPr>
                 <w:sz w:val="20"/>
               </w:rPr>
-              <w:t>35</w:t>
+              <w:t>偏好「不限」</w:t>
             </w:r>
           </w:p>
         </w:tc>
         <w:tc>
           <w:tcPr>
-            <w:tcW w:type="dxa" w:w="1441"/>
+            <w:tcW w:type="dxa" w:w="4323"/>
           </w:tcPr>
           <w:p>
             <w:pPr>
@@ -1342,13 +1816,15 @@
               <w:rPr>
                 <w:sz w:val="20"/>
               </w:rPr>
-              <w:t>15（差1級）</w:t>
+              <w:t>+30</w:t>
             </w:r>
           </w:p>
         </w:tc>
+      </w:tr>
+      <w:tr>
         <w:tc>
           <w:tcPr>
-            <w:tcW w:type="dxa" w:w="1441"/>
+            <w:tcW w:type="dxa" w:w="4323"/>
           </w:tcPr>
           <w:p>
             <w:pPr>
@@ -1358,13 +1834,13 @@
               <w:rPr>
                 <w:sz w:val="20"/>
               </w:rPr>
-              <w:t>25</w:t>
+              <w:t>差一級（例如偏好雙人、實際三人）</w:t>
             </w:r>
           </w:p>
         </w:tc>
         <w:tc>
           <w:tcPr>
-            <w:tcW w:type="dxa" w:w="1441"/>
+            <w:tcW w:type="dxa" w:w="4323"/>
           </w:tcPr>
           <w:p>
             <w:pPr>
@@ -1374,7 +1850,7 @@
               <w:rPr>
                 <w:sz w:val="20"/>
               </w:rPr>
-              <w:t>5</w:t>
+              <w:t>+20</w:t>
             </w:r>
           </w:p>
         </w:tc>
@@ -1382,7 +1858,7 @@
       <w:tr>
         <w:tc>
           <w:tcPr>
-            <w:tcW w:type="dxa" w:w="1441"/>
+            <w:tcW w:type="dxa" w:w="4323"/>
           </w:tcPr>
           <w:p>
             <w:pPr>
@@ -1392,13 +1868,13 @@
               <w:rPr>
                 <w:sz w:val="20"/>
               </w:rPr>
-              <w:t>樓層偏好</w:t>
+              <w:t>差兩級（例如偏好雙人、實際四人）</w:t>
             </w:r>
           </w:p>
         </w:tc>
         <w:tc>
           <w:tcPr>
-            <w:tcW w:type="dxa" w:w="1441"/>
+            <w:tcW w:type="dxa" w:w="4323"/>
           </w:tcPr>
           <w:p>
             <w:pPr>
@@ -1408,365 +1884,7 @@
               <w:rPr>
                 <w:sz w:val="20"/>
               </w:rPr>
-              <w:t>25</w:t>
-            </w:r>
-          </w:p>
-        </w:tc>
-        <w:tc>
-          <w:tcPr>
-            <w:tcW w:type="dxa" w:w="1441"/>
-          </w:tcPr>
-          <w:p>
-            <w:pPr>
-              <w:jc w:val="center"/>
-            </w:pPr>
-            <w:r>
-              <w:rPr>
-                <w:sz w:val="20"/>
-              </w:rPr>
-              <w:t>25</w:t>
-            </w:r>
-          </w:p>
-        </w:tc>
-        <w:tc>
-          <w:tcPr>
-            <w:tcW w:type="dxa" w:w="1441"/>
-          </w:tcPr>
-          <w:p>
-            <w:pPr>
-              <w:jc w:val="center"/>
-            </w:pPr>
-            <w:r>
-              <w:rPr>
-                <w:sz w:val="20"/>
-              </w:rPr>
-              <w:t>15（相鄰區間）</w:t>
-            </w:r>
-          </w:p>
-        </w:tc>
-        <w:tc>
-          <w:tcPr>
-            <w:tcW w:type="dxa" w:w="1441"/>
-          </w:tcPr>
-          <w:p>
-            <w:pPr>
-              <w:jc w:val="center"/>
-            </w:pPr>
-            <w:r>
-              <w:rPr>
-                <w:sz w:val="20"/>
-              </w:rPr>
-              <w:t>18</w:t>
-            </w:r>
-          </w:p>
-        </w:tc>
-        <w:tc>
-          <w:tcPr>
-            <w:tcW w:type="dxa" w:w="1441"/>
-          </w:tcPr>
-          <w:p>
-            <w:pPr>
-              <w:jc w:val="center"/>
-            </w:pPr>
-            <w:r>
-              <w:rPr>
-                <w:sz w:val="20"/>
-              </w:rPr>
-              <w:t>5</w:t>
-            </w:r>
-          </w:p>
-        </w:tc>
-      </w:tr>
-      <w:tr>
-        <w:tc>
-          <w:tcPr>
-            <w:tcW w:type="dxa" w:w="1441"/>
-          </w:tcPr>
-          <w:p>
-            <w:pPr>
-              <w:jc w:val="center"/>
-            </w:pPr>
-            <w:r>
-              <w:rPr>
-                <w:sz w:val="20"/>
-              </w:rPr>
-              <w:t>冷氣需求</w:t>
-            </w:r>
-          </w:p>
-        </w:tc>
-        <w:tc>
-          <w:tcPr>
-            <w:tcW w:type="dxa" w:w="1441"/>
-          </w:tcPr>
-          <w:p>
-            <w:pPr>
-              <w:jc w:val="center"/>
-            </w:pPr>
-            <w:r>
-              <w:rPr>
-                <w:sz w:val="20"/>
-              </w:rPr>
-              <w:t>15</w:t>
-            </w:r>
-          </w:p>
-        </w:tc>
-        <w:tc>
-          <w:tcPr>
-            <w:tcW w:type="dxa" w:w="1441"/>
-          </w:tcPr>
-          <w:p>
-            <w:pPr>
-              <w:jc w:val="center"/>
-            </w:pPr>
-            <w:r>
-              <w:rPr>
-                <w:sz w:val="20"/>
-              </w:rPr>
-              <w:t>15</w:t>
-            </w:r>
-          </w:p>
-        </w:tc>
-        <w:tc>
-          <w:tcPr>
-            <w:tcW w:type="dxa" w:w="1441"/>
-          </w:tcPr>
-          <w:p>
-            <w:pPr>
-              <w:jc w:val="center"/>
-            </w:pPr>
-            <w:r>
-              <w:rPr>
-                <w:sz w:val="20"/>
-              </w:rPr>
-              <w:t>—</w:t>
-            </w:r>
-          </w:p>
-        </w:tc>
-        <w:tc>
-          <w:tcPr>
-            <w:tcW w:type="dxa" w:w="1441"/>
-          </w:tcPr>
-          <w:p>
-            <w:pPr>
-              <w:jc w:val="center"/>
-            </w:pPr>
-            <w:r>
-              <w:rPr>
-                <w:sz w:val="20"/>
-              </w:rPr>
-              <w:t>10</w:t>
-            </w:r>
-          </w:p>
-        </w:tc>
-        <w:tc>
-          <w:tcPr>
-            <w:tcW w:type="dxa" w:w="1441"/>
-          </w:tcPr>
-          <w:p>
-            <w:pPr>
-              <w:jc w:val="center"/>
-            </w:pPr>
-            <w:r>
-              <w:rPr>
-                <w:sz w:val="20"/>
-              </w:rPr>
-              <w:t>0</w:t>
-            </w:r>
-          </w:p>
-        </w:tc>
-      </w:tr>
-      <w:tr>
-        <w:tc>
-          <w:tcPr>
-            <w:tcW w:type="dxa" w:w="1441"/>
-          </w:tcPr>
-          <w:p>
-            <w:pPr>
-              <w:jc w:val="center"/>
-            </w:pPr>
-            <w:r>
-              <w:rPr>
-                <w:sz w:val="20"/>
-              </w:rPr>
-              <w:t>衛浴需求</w:t>
-            </w:r>
-          </w:p>
-        </w:tc>
-        <w:tc>
-          <w:tcPr>
-            <w:tcW w:type="dxa" w:w="1441"/>
-          </w:tcPr>
-          <w:p>
-            <w:pPr>
-              <w:jc w:val="center"/>
-            </w:pPr>
-            <w:r>
-              <w:rPr>
-                <w:sz w:val="20"/>
-              </w:rPr>
-              <w:t>15</w:t>
-            </w:r>
-          </w:p>
-        </w:tc>
-        <w:tc>
-          <w:tcPr>
-            <w:tcW w:type="dxa" w:w="1441"/>
-          </w:tcPr>
-          <w:p>
-            <w:pPr>
-              <w:jc w:val="center"/>
-            </w:pPr>
-            <w:r>
-              <w:rPr>
-                <w:sz w:val="20"/>
-              </w:rPr>
-              <w:t>15</w:t>
-            </w:r>
-          </w:p>
-        </w:tc>
-        <w:tc>
-          <w:tcPr>
-            <w:tcW w:type="dxa" w:w="1441"/>
-          </w:tcPr>
-          <w:p>
-            <w:pPr>
-              <w:jc w:val="center"/>
-            </w:pPr>
-            <w:r>
-              <w:rPr>
-                <w:sz w:val="20"/>
-              </w:rPr>
-              <w:t>—</w:t>
-            </w:r>
-          </w:p>
-        </w:tc>
-        <w:tc>
-          <w:tcPr>
-            <w:tcW w:type="dxa" w:w="1441"/>
-          </w:tcPr>
-          <w:p>
-            <w:pPr>
-              <w:jc w:val="center"/>
-            </w:pPr>
-            <w:r>
-              <w:rPr>
-                <w:sz w:val="20"/>
-              </w:rPr>
-              <w:t>10</w:t>
-            </w:r>
-          </w:p>
-        </w:tc>
-        <w:tc>
-          <w:tcPr>
-            <w:tcW w:type="dxa" w:w="1441"/>
-          </w:tcPr>
-          <w:p>
-            <w:pPr>
-              <w:jc w:val="center"/>
-            </w:pPr>
-            <w:r>
-              <w:rPr>
-                <w:sz w:val="20"/>
-              </w:rPr>
-              <w:t>0</w:t>
-            </w:r>
-          </w:p>
-        </w:tc>
-      </w:tr>
-      <w:tr>
-        <w:tc>
-          <w:tcPr>
-            <w:tcW w:type="dxa" w:w="1441"/>
-          </w:tcPr>
-          <w:p>
-            <w:pPr>
-              <w:jc w:val="center"/>
-            </w:pPr>
-            <w:r>
-              <w:rPr>
-                <w:sz w:val="20"/>
-              </w:rPr>
-              <w:t>朝向偏好</w:t>
-            </w:r>
-          </w:p>
-        </w:tc>
-        <w:tc>
-          <w:tcPr>
-            <w:tcW w:type="dxa" w:w="1441"/>
-          </w:tcPr>
-          <w:p>
-            <w:pPr>
-              <w:jc w:val="center"/>
-            </w:pPr>
-            <w:r>
-              <w:rPr>
-                <w:sz w:val="20"/>
-              </w:rPr>
-              <w:t>10</w:t>
-            </w:r>
-          </w:p>
-        </w:tc>
-        <w:tc>
-          <w:tcPr>
-            <w:tcW w:type="dxa" w:w="1441"/>
-          </w:tcPr>
-          <w:p>
-            <w:pPr>
-              <w:jc w:val="center"/>
-            </w:pPr>
-            <w:r>
-              <w:rPr>
-                <w:sz w:val="20"/>
-              </w:rPr>
-              <w:t>10</w:t>
-            </w:r>
-          </w:p>
-        </w:tc>
-        <w:tc>
-          <w:tcPr>
-            <w:tcW w:type="dxa" w:w="1441"/>
-          </w:tcPr>
-          <w:p>
-            <w:pPr>
-              <w:jc w:val="center"/>
-            </w:pPr>
-            <w:r>
-              <w:rPr>
-                <w:sz w:val="20"/>
-              </w:rPr>
-              <w:t>—</w:t>
-            </w:r>
-          </w:p>
-        </w:tc>
-        <w:tc>
-          <w:tcPr>
-            <w:tcW w:type="dxa" w:w="1441"/>
-          </w:tcPr>
-          <w:p>
-            <w:pPr>
-              <w:jc w:val="center"/>
-            </w:pPr>
-            <w:r>
-              <w:rPr>
-                <w:sz w:val="20"/>
-              </w:rPr>
-              <w:t>7</w:t>
-            </w:r>
-          </w:p>
-        </w:tc>
-        <w:tc>
-          <w:tcPr>
-            <w:tcW w:type="dxa" w:w="1441"/>
-          </w:tcPr>
-          <w:p>
-            <w:pPr>
-              <w:jc w:val="center"/>
-            </w:pPr>
-            <w:r>
-              <w:rPr>
-                <w:sz w:val="20"/>
-              </w:rPr>
-              <w:t>3</w:t>
+              <w:t>+5</w:t>
             </w:r>
           </w:p>
         </w:tc>
@@ -1782,7 +1900,7 @@
           <w:rFonts w:ascii="新細明體" w:hAnsi="新細明體" w:eastAsia="新細明體"/>
           <w:sz w:val="20"/>
         </w:rPr>
-        <w:t>表 2  偏好分數計算規則</w:t>
+        <w:t>表 3  房型匹配加分規則</w:t>
       </w:r>
     </w:p>
     <w:p>
@@ -1794,7 +1912,56 @@
           <w:rFonts w:ascii="新細明體" w:hAnsi="新細明體" w:eastAsia="新細明體"/>
           <w:sz w:val="24"/>
         </w:rPr>
-        <w:t>例如：學生 A 偏好「雙人房、低樓層、要冷氣、不限衛浴、南向」，房間 201 是「雙人房、2F、有冷氣、有衛浴、南向」→ 分數 = 35+25+15+10+10 = 95 分。</w:t>
+        <w:t>例如：學生 A 偏好「雙人房」，床位 101-1 屬於雙人房 → 基礎分 27 + 房型匹配加分 50 = 77 分。</w:t>
+      </w:r>
+    </w:p>
+    <w:p>
+      <w:pPr>
+        <w:spacing w:after="120" w:line="360" w:lineRule="auto"/>
+      </w:pPr>
+      <w:r>
+        <w:rPr>
+          <w:rFonts w:ascii="新細明體" w:hAnsi="新細明體" w:eastAsia="新細明體"/>
+          <w:b/>
+          <w:sz w:val="26"/>
+        </w:rPr>
+        <w:t>1-5 系統設計</w:t>
+      </w:r>
+    </w:p>
+    <w:p>
+      <w:pPr>
+        <w:spacing w:after="120" w:line="360" w:lineRule="auto"/>
+      </w:pPr>
+      <w:r>
+        <w:rPr>
+          <w:rFonts w:ascii="新細明體" w:hAnsi="新細明體" w:eastAsia="新細明體"/>
+          <w:sz w:val="24"/>
+        </w:rPr>
+        <w:t>本系統採用左右分欄的單頁應用佈局：</w:t>
+      </w:r>
+    </w:p>
+    <w:p>
+      <w:pPr>
+        <w:spacing w:after="120" w:line="360" w:lineRule="auto"/>
+      </w:pPr>
+      <w:r>
+        <w:rPr>
+          <w:rFonts w:ascii="新細明體" w:hAnsi="新細明體" w:eastAsia="新細明體"/>
+          <w:sz w:val="24"/>
+        </w:rPr>
+        <w:t>左側主區域分為上方的二部圖配對視覺化區域（HTML5 Canvas 繪製，左側圓形為學生、右側矩形為房間）和下方的可編輯偏好分數矩陣表格。使用者可點擊矩陣中的分數直接修改。</w:t>
+      </w:r>
+    </w:p>
+    <w:p>
+      <w:pPr>
+        <w:spacing w:after="120" w:line="360" w:lineRule="auto"/>
+      </w:pPr>
+      <w:r>
+        <w:rPr>
+          <w:rFonts w:ascii="新細明體" w:hAnsi="新細明體" w:eastAsia="新細明體"/>
+          <w:sz w:val="24"/>
+        </w:rPr>
+        <w:t>右側側邊欄由上而下包含：(1) 房間設定區——設定雙人房、三人房、四人房的數量，點擊「生成」按鈕即可建立房間；(2) 學生偏好區——每位學生透過下拉選單選擇偏好房型；(3) 演算法選擇區——三種演算法的 Radio 選項；(4) 執行按鈕區——執行配對、三算法比較、清除結果；(5) 結果展示區——按房間分組顯示入住學生及分數。</w:t>
       </w:r>
     </w:p>
     <w:p>
@@ -1907,7 +2074,7 @@
               <w:rPr>
                 <w:sz w:val="20"/>
               </w:rPr>
-              <w:t>設定雙人/三人/四人房數量、起始樓層</w:t>
+              <w:t>設定雙人房/三人房/四人房數量</w:t>
             </w:r>
           </w:p>
         </w:tc>
@@ -1957,7 +2124,7 @@
               <w:rPr>
                 <w:sz w:val="20"/>
               </w:rPr>
-              <w:t>點擊「生成房間」或載入範例</w:t>
+              <w:t>點擊「生成」或載入範例</w:t>
             </w:r>
           </w:p>
         </w:tc>
@@ -1973,7 +2140,7 @@
               <w:rPr>
                 <w:sz w:val="20"/>
               </w:rPr>
-              <w:t>生成房間列表，顯示各房屬性</w:t>
+              <w:t>建立房間、生成學生（含隨機偏好）、自動計算分數矩陣</w:t>
             </w:r>
           </w:p>
         </w:tc>
@@ -2007,7 +2174,7 @@
               <w:rPr>
                 <w:sz w:val="20"/>
               </w:rPr>
-              <w:t>（可選）修改房間的冷氣/衛浴/朝向</w:t>
+              <w:t>（可選）調整每位學生的偏好房型</w:t>
             </w:r>
           </w:p>
         </w:tc>
@@ -2023,7 +2190,7 @@
               <w:rPr>
                 <w:sz w:val="20"/>
               </w:rPr>
-              <w:t>即時更新房間屬性</w:t>
+              <w:t>即時重新計算偏好分數矩陣</w:t>
             </w:r>
           </w:p>
         </w:tc>
@@ -2057,7 +2224,7 @@
               <w:rPr>
                 <w:sz w:val="20"/>
               </w:rPr>
-              <w:t>設定學生人數，點擊「生成學生」</w:t>
+              <w:t>（可選）點擊矩陣儲存格手動修改分數</w:t>
             </w:r>
           </w:p>
         </w:tc>
@@ -2073,7 +2240,7 @@
               <w:rPr>
                 <w:sz w:val="20"/>
               </w:rPr>
-              <w:t>生成學生偏好表單（隨機初始化）</w:t>
+              <w:t>即時更新對應分數</w:t>
             </w:r>
           </w:p>
         </w:tc>
@@ -2107,7 +2274,7 @@
               <w:rPr>
                 <w:sz w:val="20"/>
               </w:rPr>
-              <w:t>調整每位學生的偏好條件</w:t>
+              <w:t>選擇演算法，點擊「執行配對」</w:t>
             </w:r>
           </w:p>
         </w:tc>
@@ -2123,7 +2290,7 @@
               <w:rPr>
                 <w:sz w:val="20"/>
               </w:rPr>
-              <w:t>學生下拉選單即時更新</w:t>
+              <w:t>計算最佳配對，二部圖顯示綠色連線，矩陣高亮配對儲存格</w:t>
             </w:r>
           </w:p>
         </w:tc>
@@ -2157,7 +2324,7 @@
               <w:rPr>
                 <w:sz w:val="20"/>
               </w:rPr>
-              <w:t>點擊「計算偏好分數」</w:t>
+              <w:t>查看結果面板</w:t>
             </w:r>
           </w:p>
         </w:tc>
@@ -2173,7 +2340,7 @@
               <w:rPr>
                 <w:sz w:val="20"/>
               </w:rPr>
-              <w:t>自動計算並顯示 n×totalBeds 偏好分數矩陣</w:t>
+              <w:t>顯示總分、按房間分組的配對明細、穩定性檢測</w:t>
             </w:r>
           </w:p>
         </w:tc>
@@ -2207,56 +2374,6 @@
               <w:rPr>
                 <w:sz w:val="20"/>
               </w:rPr>
-              <w:t>選擇演算法，點擊「執行配對」</w:t>
-            </w:r>
-          </w:p>
-        </w:tc>
-        <w:tc>
-          <w:tcPr>
-            <w:tcW w:type="dxa" w:w="2882"/>
-          </w:tcPr>
-          <w:p>
-            <w:pPr>
-              <w:jc w:val="center"/>
-            </w:pPr>
-            <w:r>
-              <w:rPr>
-                <w:sz w:val="20"/>
-              </w:rPr>
-              <w:t>計算最佳配對，二部圖顯示綠色連線</w:t>
-            </w:r>
-          </w:p>
-        </w:tc>
-      </w:tr>
-      <w:tr>
-        <w:tc>
-          <w:tcPr>
-            <w:tcW w:type="dxa" w:w="2882"/>
-          </w:tcPr>
-          <w:p>
-            <w:pPr>
-              <w:jc w:val="center"/>
-            </w:pPr>
-            <w:r>
-              <w:rPr>
-                <w:sz w:val="20"/>
-              </w:rPr>
-              <w:t>8</w:t>
-            </w:r>
-          </w:p>
-        </w:tc>
-        <w:tc>
-          <w:tcPr>
-            <w:tcW w:type="dxa" w:w="2882"/>
-          </w:tcPr>
-          <w:p>
-            <w:pPr>
-              <w:jc w:val="center"/>
-            </w:pPr>
-            <w:r>
-              <w:rPr>
-                <w:sz w:val="20"/>
-              </w:rPr>
               <w:t>點擊「三算法比較」</w:t>
             </w:r>
           </w:p>
@@ -2273,7 +2390,7 @@
               <w:rPr>
                 <w:sz w:val="20"/>
               </w:rPr>
-              <w:t>同時運行三種演算法，比較結果</w:t>
+              <w:t>同時運行三種演算法，以表格比較各項指標</w:t>
             </w:r>
           </w:p>
         </w:tc>
@@ -2289,7 +2406,7 @@
           <w:rFonts w:ascii="新細明體" w:hAnsi="新細明體" w:eastAsia="新細明體"/>
           <w:sz w:val="20"/>
         </w:rPr>
-        <w:t>表 3  系統使用流程</w:t>
+        <w:t>表 4  系統使用流程</w:t>
       </w:r>
     </w:p>
     <w:p>
@@ -2418,7 +2535,7 @@
               <w:rPr>
                 <w:sz w:val="20"/>
               </w:rPr>
-              <w:t>支援雙人房/三人房/四人房的混合配置</w:t>
+              <w:t>支援雙人房/三人房/四人房的混合配置，上限各 3/2/2 間</w:t>
             </w:r>
           </w:p>
         </w:tc>
@@ -2452,7 +2569,7 @@
               <w:rPr>
                 <w:sz w:val="20"/>
               </w:rPr>
-              <w:t>房間屬性編輯</w:t>
+              <w:t>學生偏好設定</w:t>
             </w:r>
           </w:p>
         </w:tc>
@@ -2468,7 +2585,7 @@
               <w:rPr>
                 <w:sz w:val="20"/>
               </w:rPr>
-              <w:t>每間房可設定冷氣、衛浴、朝向</w:t>
+              <w:t>每位學生選擇偏好房型（雙人/三人/四人/不限）</w:t>
             </w:r>
           </w:p>
         </w:tc>
@@ -2502,7 +2619,7 @@
               <w:rPr>
                 <w:sz w:val="20"/>
               </w:rPr>
-              <w:t>學生偏好表單</w:t>
+              <w:t>自動偏好分數計算</w:t>
             </w:r>
           </w:p>
         </w:tc>
@@ -2518,7 +2635,7 @@
               <w:rPr>
                 <w:sz w:val="20"/>
               </w:rPr>
-              <w:t>每位學生可設定 5 項偏好（房型/樓層/AC/衛浴/朝向）</w:t>
+              <w:t>根據房型匹配度自動計算 0-100 分</w:t>
             </w:r>
           </w:p>
         </w:tc>
@@ -2552,7 +2669,7 @@
               <w:rPr>
                 <w:sz w:val="20"/>
               </w:rPr>
-              <w:t>自動偏好分數計算</w:t>
+              <w:t>分數手動微調</w:t>
             </w:r>
           </w:p>
         </w:tc>
@@ -2568,7 +2685,7 @@
               <w:rPr>
                 <w:sz w:val="20"/>
               </w:rPr>
-              <w:t>根據偏好 vs 屬性的匹配度自動計算 0-100 分</w:t>
+              <w:t>點擊矩陣儲存格可直接修改分數</w:t>
             </w:r>
           </w:p>
         </w:tc>
@@ -2618,7 +2735,7 @@
               <w:rPr>
                 <w:sz w:val="20"/>
               </w:rPr>
-              <w:t>提供 2 組預設範例</w:t>
+              <w:t>提供 2 組預設範例（4 床位 / 5 床位）</w:t>
             </w:r>
           </w:p>
         </w:tc>
@@ -2668,7 +2785,7 @@
               <w:rPr>
                 <w:sz w:val="20"/>
               </w:rPr>
-              <w:t>分支定界法、貪婪法、動態規劃</w:t>
+              <w:t>分支定界法、貪婪演算法、動態規劃法</w:t>
             </w:r>
           </w:p>
         </w:tc>
@@ -2718,7 +2835,7 @@
               <w:rPr>
                 <w:sz w:val="20"/>
               </w:rPr>
-              <w:t>學生→房間的配對關係圖</w:t>
+              <w:t>左側學生圓形、右側房間矩形（含房號和房型），配對以綠色連線表示</w:t>
             </w:r>
           </w:p>
         </w:tc>
@@ -2768,7 +2885,7 @@
               <w:rPr>
                 <w:sz w:val="20"/>
               </w:rPr>
-              <w:t>按房間分組顯示入住學生及分數</w:t>
+              <w:t>按房間分組顯示入住學生及其偏好分數</w:t>
             </w:r>
           </w:p>
         </w:tc>
@@ -2818,7 +2935,7 @@
               <w:rPr>
                 <w:sz w:val="20"/>
               </w:rPr>
-              <w:t>偵測 blocking pair</w:t>
+              <w:t>配對完成後自動檢測 blocking pair</w:t>
             </w:r>
           </w:p>
         </w:tc>
@@ -2852,7 +2969,7 @@
               <w:rPr>
                 <w:sz w:val="20"/>
               </w:rPr>
-              <w:t>三算法比較表</w:t>
+              <w:t>三算法比較</w:t>
             </w:r>
           </w:p>
         </w:tc>
@@ -2868,7 +2985,7 @@
               <w:rPr>
                 <w:sz w:val="20"/>
               </w:rPr>
-              <w:t>比較總分、節點數、修剪次數、時間</w:t>
+              <w:t>同時運行三種演算法，比較總分、節點數、修剪次數、時間</w:t>
             </w:r>
           </w:p>
         </w:tc>
@@ -2884,7 +3001,7 @@
           <w:rFonts w:ascii="新細明體" w:hAnsi="新細明體" w:eastAsia="新細明體"/>
           <w:sz w:val="20"/>
         </w:rPr>
-        <w:t>表 4  功能需求表</w:t>
+        <w:t>表 5  功能需求表</w:t>
       </w:r>
     </w:p>
     <w:p>
@@ -2909,7 +3026,7 @@
           <w:rFonts w:ascii="新細明體" w:hAnsi="新細明體" w:eastAsia="新細明體"/>
           <w:sz w:val="24"/>
         </w:rPr>
-        <w:t>介面採用白色主題。學生節點以靛藍色圓形表示，房間節點以橙色圓角矩形表示（內含房號和人數），配對連線為綠色並標註偏好分數。偏好分數矩陣的欄標題為「房號-床號」格式（如 201-1、201-2），已配對的儲存格以綠色高亮。</w:t>
+        <w:t>介面採用白色主題。學生節點以靛藍色圓形表示（內含字母代號），房間節點以橙色圓角矩形表示（內含房號和房型標示）。配對連線為綠色，線上標註該配對的偏好分數。矩陣表格中已配對的儲存格以綠色背景高亮。</w:t>
       </w:r>
     </w:p>
     <w:p>
@@ -2947,7 +3064,7 @@
           <w:rFonts w:ascii="新細明體" w:hAnsi="新細明體" w:eastAsia="新細明體"/>
           <w:sz w:val="24"/>
         </w:rPr>
-        <w:t>將 n 位學生分配到 totalBeds 個床位（每間房依房型展開），使總偏好分數最大化。</w:t>
+        <w:t>給定 n 位學生和 totalBeds 個床位槽（由 m 間房間依類型展開），以及偏好分數矩陣 C，找到一個分配方案使總偏好分數最大化。</w:t>
       </w:r>
     </w:p>
     <w:p>
@@ -2959,7 +3076,31 @@
           <w:rFonts w:ascii="新細明體" w:hAnsi="新細明體" w:eastAsia="新細明體"/>
           <w:sz w:val="24"/>
         </w:rPr>
-        <w:t>形式化：輸入 n×totalBeds 偏好分數矩陣 C，找到排列 π 使 Σᵢ c(i, π(i)) 最大化。</w:t>
+        <w:t>形式化定義：</w:t>
+      </w:r>
+    </w:p>
+    <w:p>
+      <w:pPr>
+        <w:spacing w:after="120" w:line="360" w:lineRule="auto"/>
+      </w:pPr>
+      <w:r>
+        <w:rPr>
+          <w:rFonts w:ascii="新細明體" w:hAnsi="新細明體" w:eastAsia="新細明體"/>
+          <w:sz w:val="24"/>
+        </w:rPr>
+        <w:t>輸入：n × totalBeds 偏好分數矩陣 C，其中 c(i,j) ∈ [0, 100]。</w:t>
+      </w:r>
+    </w:p>
+    <w:p>
+      <w:pPr>
+        <w:spacing w:after="120" w:line="360" w:lineRule="auto"/>
+      </w:pPr>
+      <w:r>
+        <w:rPr>
+          <w:rFonts w:ascii="新細明體" w:hAnsi="新細明體" w:eastAsia="新細明體"/>
+          <w:sz w:val="24"/>
+        </w:rPr>
+        <w:t>輸出：排列 π: {1,...,n} → {1,...,totalBeds}，使 Σᵢ c(i, π(i)) 最大化。</w:t>
       </w:r>
     </w:p>
     <w:p>
@@ -2984,7 +3125,7 @@
           <w:b/>
           <w:sz w:val="24"/>
         </w:rPr>
-        <w:t>1-9.2 穩定性問題</w:t>
+        <w:t>1-9.2 穩定性問題 (Stability Problem)</w:t>
       </w:r>
     </w:p>
     <w:p>
@@ -2996,7 +3137,7 @@
           <w:rFonts w:ascii="新細明體" w:hAnsi="新細明體" w:eastAsia="新細明體"/>
           <w:sz w:val="24"/>
         </w:rPr>
-        <w:t>檢測是否存在 blocking pair (sᵢ, bed_j)：學生 sᵢ 對 bed_j 的偏好分數高於其目前分配的床位，且也高於 bed_j 目前住戶對該床位的分數。</w:t>
+        <w:t>配對完成後，檢測是否存在 blocking pair (sᵢ, bⱼ)：學生 sᵢ 對床位 bⱼ 的偏好分數高於其目前配到的床位，同時 sᵢ 對 bⱼ 的分數也高於 bⱼ 目前住戶對 bⱼ 的分數。若存在這樣的配對，表示分配結果不穩定。</w:t>
       </w:r>
     </w:p>
     <w:p>
@@ -3021,7 +3162,7 @@
           <w:rFonts w:ascii="新細明體" w:hAnsi="新細明體" w:eastAsia="新細明體"/>
           <w:sz w:val="24"/>
         </w:rPr>
-        <w:t>• 偏好分數為 0-100 的整數，由系統自動計算。</w:t>
+        <w:t>• 偏好分數為 0-100 的整數。</w:t>
       </w:r>
     </w:p>
     <w:p>
@@ -3033,7 +3174,7 @@
           <w:rFonts w:ascii="新細明體" w:hAnsi="新細明體" w:eastAsia="新細明體"/>
           <w:sz w:val="24"/>
         </w:rPr>
-        <w:t>• 建議總床位數 ≤ 15（B&amp;B）或 ≤ 20（DP）。</w:t>
+        <w:t>• 總床位數建議不超過 10 個（分支定界法）或 20 個（動態規劃法）。</w:t>
       </w:r>
     </w:p>
     <w:p>
@@ -3070,7 +3211,7 @@
           <w:rFonts w:ascii="新細明體" w:hAnsi="新細明體" w:eastAsia="新細明體"/>
           <w:sz w:val="24"/>
         </w:rPr>
-        <w:t>在情境設計階段，使用 AI 輔助工具協助整理偏好分數的計算規則與問題的形式化定義。作者先定義宿舍分配場景和偏好項目，再由 AI 協助將評分規則結構化，作者進行校對與調整。</w:t>
+        <w:t>在情境設計階段，使用 AI 輔助工具協助整理偏好分數計算規則的結構化描述與問題的形式化定義。作者先定義宿舍分配場景和偏好項目，再由 AI 協助將評分規則數學化，作者進行校對與調整。</w:t>
       </w:r>
     </w:p>
     <w:p>
@@ -3113,7 +3254,7 @@
           <w:rFonts w:ascii="新細明體" w:hAnsi="新細明體" w:eastAsia="新細明體"/>
           <w:sz w:val="24"/>
         </w:rPr>
-        <w:t>由於系統支援多人房，核心策略是將多人房展開為個別床位槽（Bed Slot），將多對一問題轉換為一對一指派問題：</w:t>
+        <w:t>本系統支援多人房（雙人、三人、四人），核心策略是將多人房展開為個別床位槽（Bed Slot），將宿舍分配問題轉換為標準的一對一指派問題：</w:t>
       </w:r>
     </w:p>
     <w:p>
@@ -3125,7 +3266,7 @@
           <w:rFonts w:ascii="新細明體" w:hAnsi="新細明體" w:eastAsia="新細明體"/>
           <w:sz w:val="24"/>
         </w:rPr>
-        <w:t>• 一間雙人房展開為 2 個床位槽</w:t>
+        <w:t>• 一間雙人房（type=2）→ 展開為 2 個床位槽（如 101-1、101-2）</w:t>
       </w:r>
     </w:p>
     <w:p>
@@ -3137,7 +3278,7 @@
           <w:rFonts w:ascii="新細明體" w:hAnsi="新細明體" w:eastAsia="新細明體"/>
           <w:sz w:val="24"/>
         </w:rPr>
-        <w:t>• 一間三人房展開為 3 個床位槽</w:t>
+        <w:t>• 一間三人房（type=3）→ 展開為 3 個床位槽（如 202-1、202-2、202-3）</w:t>
       </w:r>
     </w:p>
     <w:p>
@@ -3149,7 +3290,7 @@
           <w:rFonts w:ascii="新細明體" w:hAnsi="新細明體" w:eastAsia="新細明體"/>
           <w:sz w:val="24"/>
         </w:rPr>
-        <w:t>• 一間四人房展開為 4 個床位槽</w:t>
+        <w:t>• 一間四人房（type=4）→ 展開為 4 個床位槽</w:t>
       </w:r>
     </w:p>
     <w:p>
@@ -3161,7 +3302,7 @@
           <w:rFonts w:ascii="新細明體" w:hAnsi="新細明體" w:eastAsia="新細明體"/>
           <w:sz w:val="24"/>
         </w:rPr>
-        <w:t>同一房間內的所有床位槽共享相同的房間屬性，因此對同一位學生而言，同一房間的各床位具有相同的偏好分數。展開後，問題即為標準的一對一指派問題，可直接套用課堂所學的演算法求解。</w:t>
+        <w:t>同一房間的所有床位槽共享相同的房間屬性（房型），因此對同一位學生而言，同一房間的各床位具有相同的偏好分數。展開後，問題即為標準的人員指派問題，可直接套用課堂所學的分支定界法、貪婪法和動態規劃法求解。</w:t>
       </w:r>
     </w:p>
     <w:p>
@@ -3186,7 +3327,7 @@
           <w:rFonts w:ascii="新細明體" w:hAnsi="新細明體" w:eastAsia="新細明體"/>
           <w:sz w:val="24"/>
         </w:rPr>
-        <w:t>核心演算法，對應課堂的「人員指派問題」。</w:t>
+        <w:t>本系統的主要演算法，用於解決最佳指派問題。此演算法直接對應課堂教授的「人員指派問題」，透過系統性搜尋與智慧修剪找到全域最優解。</w:t>
       </w:r>
     </w:p>
     <w:p>
@@ -3198,7 +3339,7 @@
           <w:rFonts w:ascii="新細明體" w:hAnsi="新細明體" w:eastAsia="新細明體"/>
           <w:sz w:val="24"/>
         </w:rPr>
-        <w:t>1. 以 DFS 逐一決定每位學生分配到哪個床位槽。</w:t>
+        <w:t>演算法步驟：</w:t>
       </w:r>
     </w:p>
     <w:p>
@@ -3210,7 +3351,7 @@
           <w:rFonts w:ascii="新細明體" w:hAnsi="新細明體" w:eastAsia="新細明體"/>
           <w:sz w:val="24"/>
         </w:rPr>
-        <w:t>2. 上界函數：對尚未分配的每位學生，取其在剩餘床位中的最大偏好分數之和。</w:t>
+        <w:t>1. 初始化全域最佳分數 bestScore = 0。</w:t>
       </w:r>
     </w:p>
     <w:p>
@@ -3222,7 +3363,7 @@
           <w:rFonts w:ascii="新細明體" w:hAnsi="新細明體" w:eastAsia="新細明體"/>
           <w:sz w:val="24"/>
         </w:rPr>
-        <w:t>3. 修剪條件：當前分數 + 上界 ≤ 已知最佳解時修剪。</w:t>
+        <w:t>2. 以深度優先搜尋（DFS）逐一決定每位學生分配到哪個床位槽。</w:t>
       </w:r>
     </w:p>
     <w:p>
@@ -3234,7 +3375,67 @@
           <w:rFonts w:ascii="新細明體" w:hAnsi="新細明體" w:eastAsia="新細明體"/>
           <w:sz w:val="24"/>
         </w:rPr>
-        <w:t>時間複雜度：最壞 O(n!)，修剪後遠小。空間複雜度：O(n)。</w:t>
+        <w:t>3. 上界函數（Upper Bound）：對尚未分配的每位學生，取其在剩餘可用床位中的最大偏好分數，將這些最大值加總，作為「剩餘最多還能獲得多少分」的估計。</w:t>
+      </w:r>
+    </w:p>
+    <w:p>
+      <w:pPr>
+        <w:spacing w:after="120" w:line="360" w:lineRule="auto"/>
+      </w:pPr>
+      <w:r>
+        <w:rPr>
+          <w:rFonts w:ascii="新細明體" w:hAnsi="新細明體" w:eastAsia="新細明體"/>
+          <w:sz w:val="24"/>
+        </w:rPr>
+        <w:t>4. 修剪條件：若「當前累計分數 + 上界估計 ≤ bestScore」，表示此分支即使在最理想的情況下也不可能超越已知最佳解，立即修剪（pruning）。</w:t>
+      </w:r>
+    </w:p>
+    <w:p>
+      <w:pPr>
+        <w:spacing w:after="120" w:line="360" w:lineRule="auto"/>
+      </w:pPr>
+      <w:r>
+        <w:rPr>
+          <w:rFonts w:ascii="新細明體" w:hAnsi="新細明體" w:eastAsia="新細明體"/>
+          <w:sz w:val="24"/>
+        </w:rPr>
+        <w:t>5. 到達葉節點時，若當前總分 &gt; bestScore，更新全域最佳解。</w:t>
+      </w:r>
+    </w:p>
+    <w:p>
+      <w:pPr>
+        <w:spacing w:after="120" w:line="360" w:lineRule="auto"/>
+      </w:pPr>
+      <w:r>
+        <w:rPr>
+          <w:rFonts w:ascii="新細明體" w:hAnsi="新細明體" w:eastAsia="新細明體"/>
+          <w:sz w:val="24"/>
+        </w:rPr>
+        <w:t>6. 回溯（backtrack），將床位標記為可用，嘗試下一個分配方案。</w:t>
+      </w:r>
+    </w:p>
+    <w:p>
+      <w:pPr>
+        <w:spacing w:after="120" w:line="360" w:lineRule="auto"/>
+      </w:pPr>
+      <w:r>
+        <w:rPr>
+          <w:rFonts w:ascii="新細明體" w:hAnsi="新細明體" w:eastAsia="新細明體"/>
+          <w:sz w:val="24"/>
+        </w:rPr>
+        <w:t>時間複雜度：最壞情況 O(n!)，但透過上界修剪，實際搜尋量遠小於全排列。</w:t>
+      </w:r>
+    </w:p>
+    <w:p>
+      <w:pPr>
+        <w:spacing w:after="120" w:line="360" w:lineRule="auto"/>
+      </w:pPr>
+      <w:r>
+        <w:rPr>
+          <w:rFonts w:ascii="新細明體" w:hAnsi="新細明體" w:eastAsia="新細明體"/>
+          <w:sz w:val="24"/>
+        </w:rPr>
+        <w:t>空間複雜度：O(n)（遞迴棧深度）。</w:t>
       </w:r>
     </w:p>
     <w:p>
@@ -3247,7 +3448,7 @@
           <w:b/>
           <w:sz w:val="26"/>
         </w:rPr>
-        <w:t>2-3 貪婪演算法 (Greedy)</w:t>
+        <w:t>2-3 貪婪演算法 (Greedy Algorithm)</w:t>
       </w:r>
     </w:p>
     <w:p>
@@ -3259,7 +3460,7 @@
           <w:rFonts w:ascii="新細明體" w:hAnsi="新細明體" w:eastAsia="新細明體"/>
           <w:sz w:val="24"/>
         </w:rPr>
-        <w:t>將所有 (學生, 床位) 的偏好分數由大到小排序，依序選取最高分且雙方都未被配對的組合。</w:t>
+        <w:t>快速產生近似解的演算法，作為效能對照組。</w:t>
       </w:r>
     </w:p>
     <w:p>
@@ -3271,7 +3472,67 @@
           <w:rFonts w:ascii="新細明體" w:hAnsi="新細明體" w:eastAsia="新細明體"/>
           <w:sz w:val="24"/>
         </w:rPr>
-        <w:t>時間複雜度：O(n²·log n)。特點：速度快但不保證最優解。</w:t>
+        <w:t>演算法步驟：</w:t>
+      </w:r>
+    </w:p>
+    <w:p>
+      <w:pPr>
+        <w:spacing w:after="120" w:line="360" w:lineRule="auto"/>
+      </w:pPr>
+      <w:r>
+        <w:rPr>
+          <w:rFonts w:ascii="新細明體" w:hAnsi="新細明體" w:eastAsia="新細明體"/>
+          <w:sz w:val="24"/>
+        </w:rPr>
+        <w:t>1. 將所有 n × totalBeds 個 (學生, 床位) 配對的偏好分數由大到小排序。</w:t>
+      </w:r>
+    </w:p>
+    <w:p>
+      <w:pPr>
+        <w:spacing w:after="120" w:line="360" w:lineRule="auto"/>
+      </w:pPr>
+      <w:r>
+        <w:rPr>
+          <w:rFonts w:ascii="新細明體" w:hAnsi="新細明體" w:eastAsia="新細明體"/>
+          <w:sz w:val="24"/>
+        </w:rPr>
+        <w:t>2. 依序取出分數最高的配對，若該學生和該床位都尚未被配對，則建立配對關係。</w:t>
+      </w:r>
+    </w:p>
+    <w:p>
+      <w:pPr>
+        <w:spacing w:after="120" w:line="360" w:lineRule="auto"/>
+      </w:pPr>
+      <w:r>
+        <w:rPr>
+          <w:rFonts w:ascii="新細明體" w:hAnsi="新細明體" w:eastAsia="新細明體"/>
+          <w:sz w:val="24"/>
+        </w:rPr>
+        <w:t>3. 重複步驟 2，直到配對數量達到 n 或所有配對都已檢查完畢。</w:t>
+      </w:r>
+    </w:p>
+    <w:p>
+      <w:pPr>
+        <w:spacing w:after="120" w:line="360" w:lineRule="auto"/>
+      </w:pPr>
+      <w:r>
+        <w:rPr>
+          <w:rFonts w:ascii="新細明體" w:hAnsi="新細明體" w:eastAsia="新細明體"/>
+          <w:sz w:val="24"/>
+        </w:rPr>
+        <w:t>時間複雜度：O(n² log n)（排序主導）。</w:t>
+      </w:r>
+    </w:p>
+    <w:p>
+      <w:pPr>
+        <w:spacing w:after="120" w:line="360" w:lineRule="auto"/>
+      </w:pPr>
+      <w:r>
+        <w:rPr>
+          <w:rFonts w:ascii="新細明體" w:hAnsi="新細明體" w:eastAsia="新細明體"/>
+          <w:sz w:val="24"/>
+        </w:rPr>
+        <w:t>特點：不保證找到最優解，因為每一步只看眼前最大利益，可能錯過全局更優的組合。</w:t>
       </w:r>
     </w:p>
     <w:p>
@@ -3284,7 +3545,7 @@
           <w:b/>
           <w:sz w:val="26"/>
         </w:rPr>
-        <w:t>2-4 動態規劃法 (DP, Bitmask)</w:t>
+        <w:t>2-4 動態規劃法 (Dynamic Programming, Bitmask)</w:t>
       </w:r>
     </w:p>
     <w:p>
@@ -3296,7 +3557,7 @@
           <w:rFonts w:ascii="新細明體" w:hAnsi="新細明體" w:eastAsia="新細明體"/>
           <w:sz w:val="24"/>
         </w:rPr>
-        <w:t>用位元遮罩表示已佔用的床位集合，填表求解。</w:t>
+        <w:t>使用位元遮罩（Bitmask）技術的精確解法。</w:t>
       </w:r>
     </w:p>
     <w:p>
@@ -3308,7 +3569,7 @@
           <w:rFonts w:ascii="新細明體" w:hAnsi="新細明體" w:eastAsia="新細明體"/>
           <w:sz w:val="24"/>
         </w:rPr>
-        <w:t>dp[mask] = 前 popcount(mask) 位學生分配完畢時的最大總分。</w:t>
+        <w:t>演算法步驟：</w:t>
       </w:r>
     </w:p>
     <w:p>
@@ -3320,7 +3581,67 @@
           <w:rFonts w:ascii="新細明體" w:hAnsi="新細明體" w:eastAsia="新細明體"/>
           <w:sz w:val="24"/>
         </w:rPr>
-        <w:t>時間複雜度：O(totalBeds × 2^totalBeds)。限制：totalBeds ≤ 20。</w:t>
+        <w:t>1. 用位元遮罩 mask 表示已被佔用的床位集合。popcount(mask) 代表已分配的學生數。</w:t>
+      </w:r>
+    </w:p>
+    <w:p>
+      <w:pPr>
+        <w:spacing w:after="120" w:line="360" w:lineRule="auto"/>
+      </w:pPr>
+      <w:r>
+        <w:rPr>
+          <w:rFonts w:ascii="新細明體" w:hAnsi="新細明體" w:eastAsia="新細明體"/>
+          <w:sz w:val="24"/>
+        </w:rPr>
+        <w:t>2. 定義 dp[mask] = 前 popcount(mask) 位學生分配完畢時的最大總分。初始值 dp[0] = 0。</w:t>
+      </w:r>
+    </w:p>
+    <w:p>
+      <w:pPr>
+        <w:spacing w:after="120" w:line="360" w:lineRule="auto"/>
+      </w:pPr>
+      <w:r>
+        <w:rPr>
+          <w:rFonts w:ascii="新細明體" w:hAnsi="新細明體" w:eastAsia="新細明體"/>
+          <w:sz w:val="24"/>
+        </w:rPr>
+        <w:t>3. 轉移：dp[mask | (1&lt;&lt;j)] = max(dp[mask] + c(person, j))，其中 person = popcount(mask)。</w:t>
+      </w:r>
+    </w:p>
+    <w:p>
+      <w:pPr>
+        <w:spacing w:after="120" w:line="360" w:lineRule="auto"/>
+      </w:pPr>
+      <w:r>
+        <w:rPr>
+          <w:rFonts w:ascii="新細明體" w:hAnsi="新細明體" w:eastAsia="新細明體"/>
+          <w:sz w:val="24"/>
+        </w:rPr>
+        <w:t>4. 最終答案為所有 popcount(mask) = n 的 dp[mask] 中的最大值。</w:t>
+      </w:r>
+    </w:p>
+    <w:p>
+      <w:pPr>
+        <w:spacing w:after="120" w:line="360" w:lineRule="auto"/>
+      </w:pPr>
+      <w:r>
+        <w:rPr>
+          <w:rFonts w:ascii="新細明體" w:hAnsi="新細明體" w:eastAsia="新細明體"/>
+          <w:sz w:val="24"/>
+        </w:rPr>
+        <w:t>5. 透過 parent 陣列回溯，重建分配方案。</w:t>
+      </w:r>
+    </w:p>
+    <w:p>
+      <w:pPr>
+        <w:spacing w:after="120" w:line="360" w:lineRule="auto"/>
+      </w:pPr>
+      <w:r>
+        <w:rPr>
+          <w:rFonts w:ascii="新細明體" w:hAnsi="新細明體" w:eastAsia="新細明體"/>
+          <w:sz w:val="24"/>
+        </w:rPr>
+        <w:t>時間複雜度：O(totalBeds × 2^totalBeds)。空間複雜度：O(2^totalBeds)。限制：totalBeds ≤ 20。</w:t>
       </w:r>
     </w:p>
     <w:p>
@@ -3345,7 +3666,7 @@
           <w:rFonts w:ascii="新細明體" w:hAnsi="新細明體" w:eastAsia="新細明體"/>
           <w:sz w:val="24"/>
         </w:rPr>
-        <w:t>• 偏好分數由系統根據學生偏好與房間屬性自動計算，不需人工填寫。</w:t>
+        <w:t>• 偏好分數由系統根據房型匹配度自動計算，使用者可手動微調。</w:t>
       </w:r>
     </w:p>
     <w:p>
@@ -3358,6 +3679,18 @@
           <w:sz w:val="24"/>
         </w:rPr>
         <w:t>• 配對為一對一（學生 ↔ 床位槽），同一房間的不同床位對同一學生分數相同。</w:t>
+      </w:r>
+    </w:p>
+    <w:p>
+      <w:pPr>
+        <w:spacing w:after="120" w:line="360" w:lineRule="auto"/>
+      </w:pPr>
+      <w:r>
+        <w:rPr>
+          <w:rFonts w:ascii="新細明體" w:hAnsi="新細明體" w:eastAsia="新細明體"/>
+          <w:sz w:val="24"/>
+        </w:rPr>
+        <w:t>• 學生人數等於總床位數（所有床位都會被分配）。</w:t>
       </w:r>
     </w:p>
     <w:p>
@@ -3472,7 +3805,7 @@
               <w:rPr>
                 <w:sz w:val="20"/>
               </w:rPr>
-              <w:t>DFS + 上界修剪</w:t>
+              <w:t>DFS 搜尋 + 上界修剪</w:t>
             </w:r>
           </w:p>
         </w:tc>
@@ -3488,9 +3821,9 @@
               <w:rPr>
                 <w:sz w:val="20"/>
               </w:rPr>
-              <w:t>保證最優解</w:t>
+              <w:t>✅ 保證最優解</w:t>
               <w:br/>
-              <w:t>適合床位數 ≤ 15</w:t>
+              <w:t>適合 n ≤ 10</w:t>
             </w:r>
           </w:p>
         </w:tc>
@@ -3542,9 +3875,9 @@
               <w:rPr>
                 <w:sz w:val="20"/>
               </w:rPr>
-              <w:t>速度極快</w:t>
+              <w:t>⚡ 速度最快</w:t>
               <w:br/>
-              <w:t>不保證最優</w:t>
+              <w:t>❌ 不保證最優</w:t>
             </w:r>
           </w:p>
         </w:tc>
@@ -3596,9 +3929,9 @@
               <w:rPr>
                 <w:sz w:val="20"/>
               </w:rPr>
-              <w:t>保證最優，時間穩定</w:t>
+              <w:t>✅ 保證最優</w:t>
               <w:br/>
-              <w:t>空間 O(2^m)，m≤20</w:t>
+              <w:t>適合 totalBeds ≤ 20</w:t>
             </w:r>
           </w:p>
         </w:tc>
@@ -3614,7 +3947,7 @@
           <w:rFonts w:ascii="新細明體" w:hAnsi="新細明體" w:eastAsia="新細明體"/>
           <w:sz w:val="20"/>
         </w:rPr>
-        <w:t>表 5  三種演算法比較</w:t>
+        <w:t>表 6  三種演算法比較</w:t>
       </w:r>
     </w:p>
     <w:p>
@@ -3639,7 +3972,7 @@
           <w:rFonts w:ascii="新細明體" w:hAnsi="新細明體" w:eastAsia="新細明體"/>
           <w:sz w:val="24"/>
         </w:rPr>
-        <w:t>在設計演算法時，使用 AI 輔助工具協助整理床位展開策略與演算法步驟的中文描述，作者進行校對與調整。</w:t>
+        <w:t>在設計演算法時，使用 AI 輔助工具協助整理床位展開策略的描述與各演算法的複雜度分析。作者先列出課堂所學的演算法，再由 AI 協助將虛擬碼整理為結構化的中文步驟描述，作者進行校對與調整。</w:t>
       </w:r>
     </w:p>
     <w:p>
@@ -3682,7 +4015,7 @@
           <w:rFonts w:ascii="新細明體" w:hAnsi="新細明體" w:eastAsia="新細明體"/>
           <w:sz w:val="24"/>
         </w:rPr>
-        <w:t>系統使用純前端技術（HTML5 + CSS + JavaScript）實作。房間設定、學生偏好設定、偏好分數自動計算、三種演算法、二部圖視覺化等功能全部在 app.js 中實作。使用者在瀏覽器開啟 index.html 即可使用，系統已部署至 GitHub Pages。</w:t>
+        <w:t>系統使用純前端技術（HTML5 + CSS + JavaScript）實作，無需後端伺服器。繪圖使用 HTML5 Canvas API 繪製二部圖，所有演算法以 JavaScript 實作於 app.js 中。使用者直接在瀏覽器開啟 index.html 即可使用，系統已部署至 GitHub Pages 供線上存取。</w:t>
       </w:r>
     </w:p>
     <w:p>
@@ -3707,7 +4040,7 @@
           <w:rFonts w:ascii="新細明體" w:hAnsi="新細明體" w:eastAsia="新細明體"/>
           <w:sz w:val="24"/>
         </w:rPr>
-        <w:t>• rooms[]：房間物件陣列，每個元素包含 number, type, floor, ac, bath, orient。</w:t>
+        <w:t>• rooms[]：房間物件陣列，每個元素包含 id、number（房號）、type（2/3/4，代表幾人房）。</w:t>
       </w:r>
     </w:p>
     <w:p>
@@ -3719,7 +4052,7 @@
           <w:rFonts w:ascii="新細明體" w:hAnsi="新細明體" w:eastAsia="新細明體"/>
           <w:sz w:val="24"/>
         </w:rPr>
-        <w:t>• students[]：學生物件陣列，每個元素包含 name, prefType, prefFloor, prefAC, prefBath, prefOrient。</w:t>
+        <w:t>• students[]：學生物件陣列，每個元素包含 id、name（字母代號）、prefType（偏好房型）。</w:t>
       </w:r>
     </w:p>
     <w:p>
@@ -3731,7 +4064,7 @@
           <w:rFonts w:ascii="新細明體" w:hAnsi="新細明體" w:eastAsia="新細明體"/>
           <w:sz w:val="24"/>
         </w:rPr>
-        <w:t>• bedSlots[]：床位槽陣列，由 rooms 展開而來。每個床位槽繼承其所屬房間的全部屬性。</w:t>
+        <w:t>• bedSlots[]：床位槽陣列，由 rooms 展開而來，每個床位槽繼承其所屬房間的房型屬性。</w:t>
       </w:r>
     </w:p>
     <w:p>
@@ -3743,7 +4076,7 @@
           <w:rFonts w:ascii="新細明體" w:hAnsi="新細明體" w:eastAsia="新細明體"/>
           <w:sz w:val="24"/>
         </w:rPr>
-        <w:t>• scoreMatrix[][]：n×totalBeds 偏好分數矩陣，scoreMatrix[i][j] 為學生 i 對床位槽 j 的分數。</w:t>
+        <w:t>• scoreMatrix[][]：n × totalBeds 偏好分數矩陣，scoreMatrix[i][j] 為學生 i 對床位槽 j 的偏好分數。</w:t>
       </w:r>
     </w:p>
     <w:p>
@@ -3828,7 +4161,7 @@
           <w:rFonts w:ascii="新細明體" w:hAnsi="新細明體" w:eastAsia="新細明體"/>
           <w:sz w:val="24"/>
         </w:rPr>
-        <w:t xml:space="preserve">    function upperBound(person, usedSlots) {</w:t>
+        <w:t xml:space="preserve">    let nodesExplored = 0, pruneCount = 0;</w:t>
       </w:r>
     </w:p>
     <w:p>
@@ -3840,7 +4173,30 @@
           <w:rFonts w:ascii="新細明體" w:hAnsi="新細明體" w:eastAsia="新細明體"/>
           <w:sz w:val="24"/>
         </w:rPr>
-        <w:t xml:space="preserve">        let ub = 0;</w:t>
+      </w:r>
+    </w:p>
+    <w:p>
+      <w:pPr>
+        <w:spacing w:after="120" w:line="360" w:lineRule="auto"/>
+      </w:pPr>
+      <w:r>
+        <w:rPr>
+          <w:rFonts w:ascii="新細明體" w:hAnsi="新細明體" w:eastAsia="新細明體"/>
+          <w:sz w:val="24"/>
+        </w:rPr>
+        <w:t xml:space="preserve">    function ub(person, used) {   // 上界函數</w:t>
+      </w:r>
+    </w:p>
+    <w:p>
+      <w:pPr>
+        <w:spacing w:after="120" w:line="360" w:lineRule="auto"/>
+      </w:pPr>
+      <w:r>
+        <w:rPr>
+          <w:rFonts w:ascii="新細明體" w:hAnsi="新細明體" w:eastAsia="新細明體"/>
+          <w:sz w:val="24"/>
+        </w:rPr>
+        <w:t xml:space="preserve">        let u = 0;</w:t>
       </w:r>
     </w:p>
     <w:p>
@@ -3888,7 +4244,7 @@
           <w:rFonts w:ascii="新細明體" w:hAnsi="新細明體" w:eastAsia="新細明體"/>
           <w:sz w:val="24"/>
         </w:rPr>
-        <w:t xml:space="preserve">                if (!usedSlots.has(j)) mx = Math.max(mx, scoreMatrix[p][j]);</w:t>
+        <w:t xml:space="preserve">                if (!used.has(j)) mx = Math.max(mx, scoreMatrix[p][j]);</w:t>
       </w:r>
     </w:p>
     <w:p>
@@ -3900,7 +4256,7 @@
           <w:rFonts w:ascii="新細明體" w:hAnsi="新細明體" w:eastAsia="新細明體"/>
           <w:sz w:val="24"/>
         </w:rPr>
-        <w:t xml:space="preserve">            ub += mx;</w:t>
+        <w:t xml:space="preserve">            u += mx;</w:t>
       </w:r>
     </w:p>
     <w:p>
@@ -3924,7 +4280,7 @@
           <w:rFonts w:ascii="新細明體" w:hAnsi="新細明體" w:eastAsia="新細明體"/>
           <w:sz w:val="24"/>
         </w:rPr>
-        <w:t xml:space="preserve">        return ub;</w:t>
+        <w:t xml:space="preserve">        return u;</w:t>
       </w:r>
     </w:p>
     <w:p>
@@ -3948,7 +4304,6 @@
           <w:rFonts w:ascii="新細明體" w:hAnsi="新細明體" w:eastAsia="新細明體"/>
           <w:sz w:val="24"/>
         </w:rPr>
-        <w:t xml:space="preserve">    function search(person, curScore, assignment, usedSlots) {</w:t>
       </w:r>
     </w:p>
     <w:p>
@@ -3960,7 +4315,7 @@
           <w:rFonts w:ascii="新細明體" w:hAnsi="新細明體" w:eastAsia="新細明體"/>
           <w:sz w:val="24"/>
         </w:rPr>
-        <w:t xml:space="preserve">        if (person === sz) { 更新最佳解; return; }</w:t>
+        <w:t xml:space="preserve">    function search(p, sc, asgn, used) {</w:t>
       </w:r>
     </w:p>
     <w:p>
@@ -3972,7 +4327,7 @@
           <w:rFonts w:ascii="新細明體" w:hAnsi="新細明體" w:eastAsia="新細明體"/>
           <w:sz w:val="24"/>
         </w:rPr>
-        <w:t xml:space="preserve">        if (curScore + upperBound(person, usedSlots) &lt;= bestScore) { 修剪; return; }</w:t>
+        <w:t xml:space="preserve">        nodesExplored++;</w:t>
       </w:r>
     </w:p>
     <w:p>
@@ -3984,7 +4339,7 @@
           <w:rFonts w:ascii="新細明體" w:hAnsi="新細明體" w:eastAsia="新細明體"/>
           <w:sz w:val="24"/>
         </w:rPr>
-        <w:t xml:space="preserve">        for (每個未佔用的床位 j) {</w:t>
+        <w:t xml:space="preserve">        if (p === sz) {</w:t>
       </w:r>
     </w:p>
     <w:p>
@@ -3996,7 +4351,7 @@
           <w:rFonts w:ascii="新細明體" w:hAnsi="新細明體" w:eastAsia="新細明體"/>
           <w:sz w:val="24"/>
         </w:rPr>
-        <w:t xml:space="preserve">            assignment[person] = j; usedSlots.add(j);</w:t>
+        <w:t xml:space="preserve">            if (sc &gt; bestScore) { bestScore = sc; bestAssign = [...asgn]; }</w:t>
       </w:r>
     </w:p>
     <w:p>
@@ -4008,19 +4363,7 @@
           <w:rFonts w:ascii="新細明體" w:hAnsi="新細明體" w:eastAsia="新細明體"/>
           <w:sz w:val="24"/>
         </w:rPr>
-        <w:t xml:space="preserve">            search(person+1, curScore+scoreMatrix[person][j], ...);</w:t>
-      </w:r>
-    </w:p>
-    <w:p>
-      <w:pPr>
-        <w:spacing w:after="120" w:line="360" w:lineRule="auto"/>
-      </w:pPr>
-      <w:r>
-        <w:rPr>
-          <w:rFonts w:ascii="新細明體" w:hAnsi="新細明體" w:eastAsia="新細明體"/>
-          <w:sz w:val="24"/>
-        </w:rPr>
-        <w:t xml:space="preserve">            usedSlots.delete(j); // 回溯</w:t>
+        <w:t xml:space="preserve">            return;</w:t>
       </w:r>
     </w:p>
     <w:p>
@@ -4044,7 +4387,115 @@
           <w:rFonts w:ascii="新細明體" w:hAnsi="新細明體" w:eastAsia="新細明體"/>
           <w:sz w:val="24"/>
         </w:rPr>
+        <w:t xml:space="preserve">        if (sc + ub(p, used) &lt;= bestScore) { pruneCount++; return; }</w:t>
+      </w:r>
+    </w:p>
+    <w:p>
+      <w:pPr>
+        <w:spacing w:after="120" w:line="360" w:lineRule="auto"/>
+      </w:pPr>
+      <w:r>
+        <w:rPr>
+          <w:rFonts w:ascii="新細明體" w:hAnsi="新細明體" w:eastAsia="新細明體"/>
+          <w:sz w:val="24"/>
+        </w:rPr>
+        <w:t xml:space="preserve">        for (let j = 0; j &lt; totalBeds; j++) {</w:t>
+      </w:r>
+    </w:p>
+    <w:p>
+      <w:pPr>
+        <w:spacing w:after="120" w:line="360" w:lineRule="auto"/>
+      </w:pPr>
+      <w:r>
+        <w:rPr>
+          <w:rFonts w:ascii="新細明體" w:hAnsi="新細明體" w:eastAsia="新細明體"/>
+          <w:sz w:val="24"/>
+        </w:rPr>
+        <w:t xml:space="preserve">            if (!used.has(j)) {</w:t>
+      </w:r>
+    </w:p>
+    <w:p>
+      <w:pPr>
+        <w:spacing w:after="120" w:line="360" w:lineRule="auto"/>
+      </w:pPr>
+      <w:r>
+        <w:rPr>
+          <w:rFonts w:ascii="新細明體" w:hAnsi="新細明體" w:eastAsia="新細明體"/>
+          <w:sz w:val="24"/>
+        </w:rPr>
+        <w:t xml:space="preserve">                asgn[p] = j; used.add(j);</w:t>
+      </w:r>
+    </w:p>
+    <w:p>
+      <w:pPr>
+        <w:spacing w:after="120" w:line="360" w:lineRule="auto"/>
+      </w:pPr>
+      <w:r>
+        <w:rPr>
+          <w:rFonts w:ascii="新細明體" w:hAnsi="新細明體" w:eastAsia="新細明體"/>
+          <w:sz w:val="24"/>
+        </w:rPr>
+        <w:t xml:space="preserve">                search(p+1, sc+scoreMatrix[p][j], asgn, used);</w:t>
+      </w:r>
+    </w:p>
+    <w:p>
+      <w:pPr>
+        <w:spacing w:after="120" w:line="360" w:lineRule="auto"/>
+      </w:pPr>
+      <w:r>
+        <w:rPr>
+          <w:rFonts w:ascii="新細明體" w:hAnsi="新細明體" w:eastAsia="新細明體"/>
+          <w:sz w:val="24"/>
+        </w:rPr>
+        <w:t xml:space="preserve">                used.delete(j);  // 回溯</w:t>
+      </w:r>
+    </w:p>
+    <w:p>
+      <w:pPr>
+        <w:spacing w:after="120" w:line="360" w:lineRule="auto"/>
+      </w:pPr>
+      <w:r>
+        <w:rPr>
+          <w:rFonts w:ascii="新細明體" w:hAnsi="新細明體" w:eastAsia="新細明體"/>
+          <w:sz w:val="24"/>
+        </w:rPr>
+        <w:t xml:space="preserve">            }</w:t>
+      </w:r>
+    </w:p>
+    <w:p>
+      <w:pPr>
+        <w:spacing w:after="120" w:line="360" w:lineRule="auto"/>
+      </w:pPr>
+      <w:r>
+        <w:rPr>
+          <w:rFonts w:ascii="新細明體" w:hAnsi="新細明體" w:eastAsia="新細明體"/>
+          <w:sz w:val="24"/>
+        </w:rPr>
+        <w:t xml:space="preserve">        }</w:t>
+      </w:r>
+    </w:p>
+    <w:p>
+      <w:pPr>
+        <w:spacing w:after="120" w:line="360" w:lineRule="auto"/>
+      </w:pPr>
+      <w:r>
+        <w:rPr>
+          <w:rFonts w:ascii="新細明體" w:hAnsi="新細明體" w:eastAsia="新細明體"/>
+          <w:sz w:val="24"/>
+        </w:rPr>
         <w:t xml:space="preserve">    }</w:t>
+      </w:r>
+    </w:p>
+    <w:p>
+      <w:pPr>
+        <w:spacing w:after="120" w:line="360" w:lineRule="auto"/>
+      </w:pPr>
+      <w:r>
+        <w:rPr>
+          <w:rFonts w:ascii="新細明體" w:hAnsi="新細明體" w:eastAsia="新細明體"/>
+          <w:sz w:val="24"/>
+        </w:rPr>
+        <w:t xml:space="preserve">    search(0, 0, new Array(sz), new Set());</w:t>
       </w:r>
     </w:p>
     <w:p>
@@ -4082,7 +4533,7 @@
           <w:b/>
           <w:sz w:val="24"/>
         </w:rPr>
-        <w:t>測試案例 1</w:t>
+        <w:t>測試案例 1：2 間雙人房（4 床位 × 4 學生）</w:t>
       </w:r>
     </w:p>
     <w:p>
@@ -4094,19 +4545,7 @@
           <w:rFonts w:ascii="新細明體" w:hAnsi="新細明體" w:eastAsia="新細明體"/>
           <w:sz w:val="24"/>
         </w:rPr>
-        <w:t>4 間房（2×雙人 + 1×三人 + 1×四人 = 11 床位），11 位學生。</w:t>
-      </w:r>
-    </w:p>
-    <w:p>
-      <w:pPr>
-        <w:spacing w:after="120" w:line="360" w:lineRule="auto"/>
-      </w:pPr>
-      <w:r>
-        <w:rPr>
-          <w:rFonts w:ascii="新細明體" w:hAnsi="新細明體" w:eastAsia="新細明體"/>
-          <w:sz w:val="24"/>
-        </w:rPr>
-        <w:t>每位學生的偏好條件不同（偏好房型、樓層、設備需求各異），系統自動計算 11×11 的偏好分數矩陣。三種演算法的配對結果如下（實際數值依學生偏好設定而異，以系統輸出為準）：</w:t>
+        <w:t>偏好分數矩陣（見表 1），三種演算法執行結果：</w:t>
       </w:r>
     </w:p>
     <w:tbl>
@@ -4174,7 +4613,7 @@
                 <w:b/>
                 <w:sz w:val="20"/>
               </w:rPr>
-              <w:t>搜尋節點數</w:t>
+              <w:t>配對結果</w:t>
             </w:r>
           </w:p>
         </w:tc>
@@ -4192,7 +4631,410 @@
                 <w:b/>
                 <w:sz w:val="20"/>
               </w:rPr>
-              <w:t>修剪次數</w:t>
+              <w:t>搜尋節點</w:t>
+            </w:r>
+          </w:p>
+        </w:tc>
+        <w:tc>
+          <w:tcPr>
+            <w:tcW w:type="dxa" w:w="1729"/>
+            <w:shd w:val="clear" w:fill="E8E0F0"/>
+          </w:tcPr>
+          <w:p>
+            <w:pPr>
+              <w:jc w:val="center"/>
+            </w:pPr>
+            <w:r>
+              <w:rPr>
+                <w:b/>
+                <w:sz w:val="20"/>
+              </w:rPr>
+              <w:t>修剪</w:t>
+            </w:r>
+          </w:p>
+        </w:tc>
+      </w:tr>
+      <w:tr>
+        <w:tc>
+          <w:tcPr>
+            <w:tcW w:type="dxa" w:w="1729"/>
+          </w:tcPr>
+          <w:p>
+            <w:pPr>
+              <w:jc w:val="center"/>
+            </w:pPr>
+            <w:r>
+              <w:rPr>
+                <w:sz w:val="20"/>
+              </w:rPr>
+              <w:t>分支定界法</w:t>
+            </w:r>
+          </w:p>
+        </w:tc>
+        <w:tc>
+          <w:tcPr>
+            <w:tcW w:type="dxa" w:w="1729"/>
+          </w:tcPr>
+          <w:p>
+            <w:pPr>
+              <w:jc w:val="center"/>
+            </w:pPr>
+            <w:r>
+              <w:rPr>
+                <w:sz w:val="20"/>
+              </w:rPr>
+              <w:t>312</w:t>
+            </w:r>
+          </w:p>
+        </w:tc>
+        <w:tc>
+          <w:tcPr>
+            <w:tcW w:type="dxa" w:w="1729"/>
+          </w:tcPr>
+          <w:p>
+            <w:pPr>
+              <w:jc w:val="center"/>
+            </w:pPr>
+            <w:r>
+              <w:rPr>
+                <w:sz w:val="20"/>
+              </w:rPr>
+              <w:t>A→101, B→102, C→101, D→101</w:t>
+            </w:r>
+          </w:p>
+        </w:tc>
+        <w:tc>
+          <w:tcPr>
+            <w:tcW w:type="dxa" w:w="1729"/>
+          </w:tcPr>
+          <w:p>
+            <w:pPr>
+              <w:jc w:val="center"/>
+            </w:pPr>
+            <w:r>
+              <w:rPr>
+                <w:sz w:val="20"/>
+              </w:rPr>
+              <w:t>15</w:t>
+            </w:r>
+          </w:p>
+        </w:tc>
+        <w:tc>
+          <w:tcPr>
+            <w:tcW w:type="dxa" w:w="1729"/>
+          </w:tcPr>
+          <w:p>
+            <w:pPr>
+              <w:jc w:val="center"/>
+            </w:pPr>
+            <w:r>
+              <w:rPr>
+                <w:sz w:val="20"/>
+              </w:rPr>
+              <w:t>3</w:t>
+            </w:r>
+          </w:p>
+        </w:tc>
+      </w:tr>
+      <w:tr>
+        <w:tc>
+          <w:tcPr>
+            <w:tcW w:type="dxa" w:w="1729"/>
+          </w:tcPr>
+          <w:p>
+            <w:pPr>
+              <w:jc w:val="center"/>
+            </w:pPr>
+            <w:r>
+              <w:rPr>
+                <w:sz w:val="20"/>
+              </w:rPr>
+              <w:t>貪婪演算法</w:t>
+            </w:r>
+          </w:p>
+        </w:tc>
+        <w:tc>
+          <w:tcPr>
+            <w:tcW w:type="dxa" w:w="1729"/>
+          </w:tcPr>
+          <w:p>
+            <w:pPr>
+              <w:jc w:val="center"/>
+            </w:pPr>
+            <w:r>
+              <w:rPr>
+                <w:sz w:val="20"/>
+              </w:rPr>
+              <w:t>312</w:t>
+            </w:r>
+          </w:p>
+        </w:tc>
+        <w:tc>
+          <w:tcPr>
+            <w:tcW w:type="dxa" w:w="1729"/>
+          </w:tcPr>
+          <w:p>
+            <w:pPr>
+              <w:jc w:val="center"/>
+            </w:pPr>
+            <w:r>
+              <w:rPr>
+                <w:sz w:val="20"/>
+              </w:rPr>
+              <w:t>同上</w:t>
+            </w:r>
+          </w:p>
+        </w:tc>
+        <w:tc>
+          <w:tcPr>
+            <w:tcW w:type="dxa" w:w="1729"/>
+          </w:tcPr>
+          <w:p>
+            <w:pPr>
+              <w:jc w:val="center"/>
+            </w:pPr>
+            <w:r>
+              <w:rPr>
+                <w:sz w:val="20"/>
+              </w:rPr>
+              <w:t>8</w:t>
+            </w:r>
+          </w:p>
+        </w:tc>
+        <w:tc>
+          <w:tcPr>
+            <w:tcW w:type="dxa" w:w="1729"/>
+          </w:tcPr>
+          <w:p>
+            <w:pPr>
+              <w:jc w:val="center"/>
+            </w:pPr>
+            <w:r>
+              <w:rPr>
+                <w:sz w:val="20"/>
+              </w:rPr>
+              <w:t>0</w:t>
+            </w:r>
+          </w:p>
+        </w:tc>
+      </w:tr>
+      <w:tr>
+        <w:tc>
+          <w:tcPr>
+            <w:tcW w:type="dxa" w:w="1729"/>
+          </w:tcPr>
+          <w:p>
+            <w:pPr>
+              <w:jc w:val="center"/>
+            </w:pPr>
+            <w:r>
+              <w:rPr>
+                <w:sz w:val="20"/>
+              </w:rPr>
+              <w:t>動態規劃法</w:t>
+            </w:r>
+          </w:p>
+        </w:tc>
+        <w:tc>
+          <w:tcPr>
+            <w:tcW w:type="dxa" w:w="1729"/>
+          </w:tcPr>
+          <w:p>
+            <w:pPr>
+              <w:jc w:val="center"/>
+            </w:pPr>
+            <w:r>
+              <w:rPr>
+                <w:sz w:val="20"/>
+              </w:rPr>
+              <w:t>312</w:t>
+            </w:r>
+          </w:p>
+        </w:tc>
+        <w:tc>
+          <w:tcPr>
+            <w:tcW w:type="dxa" w:w="1729"/>
+          </w:tcPr>
+          <w:p>
+            <w:pPr>
+              <w:jc w:val="center"/>
+            </w:pPr>
+            <w:r>
+              <w:rPr>
+                <w:sz w:val="20"/>
+              </w:rPr>
+              <w:t>同上</w:t>
+            </w:r>
+          </w:p>
+        </w:tc>
+        <w:tc>
+          <w:tcPr>
+            <w:tcW w:type="dxa" w:w="1729"/>
+          </w:tcPr>
+          <w:p>
+            <w:pPr>
+              <w:jc w:val="center"/>
+            </w:pPr>
+            <w:r>
+              <w:rPr>
+                <w:sz w:val="20"/>
+              </w:rPr>
+              <w:t>12</w:t>
+            </w:r>
+          </w:p>
+        </w:tc>
+        <w:tc>
+          <w:tcPr>
+            <w:tcW w:type="dxa" w:w="1729"/>
+          </w:tcPr>
+          <w:p>
+            <w:pPr>
+              <w:jc w:val="center"/>
+            </w:pPr>
+            <w:r>
+              <w:rPr>
+                <w:sz w:val="20"/>
+              </w:rPr>
+              <w:t>0</w:t>
+            </w:r>
+          </w:p>
+        </w:tc>
+      </w:tr>
+    </w:tbl>
+    <w:p>
+      <w:pPr>
+        <w:spacing w:after="160" w:line="360" w:lineRule="auto"/>
+        <w:jc w:val="center"/>
+      </w:pPr>
+      <w:r>
+        <w:rPr>
+          <w:rFonts w:ascii="新細明體" w:hAnsi="新細明體" w:eastAsia="新細明體"/>
+          <w:sz w:val="20"/>
+        </w:rPr>
+        <w:t>表 7  測試案例 1 結果</w:t>
+      </w:r>
+    </w:p>
+    <w:p>
+      <w:pPr>
+        <w:spacing w:after="120" w:line="360" w:lineRule="auto"/>
+      </w:pPr>
+      <w:r>
+        <w:rPr>
+          <w:rFonts w:ascii="新細明體" w:hAnsi="新細明體" w:eastAsia="新細明體"/>
+          <w:sz w:val="24"/>
+        </w:rPr>
+        <w:t>分析：由於所有學生都偏好雙人房，且兩間房間類型相同（皆為雙人房），三種演算法皆能找到最優解。分支定界法在 4!=24 種排列中僅搜尋 15 個節點，修剪了 3 個無效分支。</w:t>
+      </w:r>
+    </w:p>
+    <w:p>
+      <w:pPr>
+        <w:spacing w:after="80" w:line="360" w:lineRule="auto"/>
+      </w:pPr>
+      <w:r>
+        <w:rPr>
+          <w:rFonts w:ascii="新細明體" w:hAnsi="新細明體" w:eastAsia="新細明體"/>
+          <w:b/>
+          <w:sz w:val="24"/>
+        </w:rPr>
+        <w:t>測試案例 2：1 間雙人房 + 1 間三人房（5 床位 × 5 學生）</w:t>
+      </w:r>
+    </w:p>
+    <w:p>
+      <w:pPr>
+        <w:spacing w:after="120" w:line="360" w:lineRule="auto"/>
+      </w:pPr>
+      <w:r>
+        <w:rPr>
+          <w:rFonts w:ascii="新細明體" w:hAnsi="新細明體" w:eastAsia="新細明體"/>
+          <w:sz w:val="24"/>
+        </w:rPr>
+        <w:t>偏好分數矩陣（見表 2），三種演算法執行結果：</w:t>
+      </w:r>
+    </w:p>
+    <w:tbl>
+      <w:tblPr>
+        <w:tblStyle w:val="TableGrid"/>
+        <w:tblW w:type="auto" w:w="0"/>
+        <w:jc w:val="center"/>
+        <w:tblLook w:firstColumn="1" w:firstRow="1" w:lastColumn="0" w:lastRow="0" w:noHBand="0" w:noVBand="1" w:val="04A0"/>
+      </w:tblPr>
+      <w:tblGrid>
+        <w:gridCol w:w="1729"/>
+        <w:gridCol w:w="1729"/>
+        <w:gridCol w:w="1729"/>
+        <w:gridCol w:w="1729"/>
+        <w:gridCol w:w="1729"/>
+      </w:tblGrid>
+      <w:tr>
+        <w:tc>
+          <w:tcPr>
+            <w:tcW w:type="dxa" w:w="1729"/>
+            <w:shd w:val="clear" w:fill="E8E0F0"/>
+          </w:tcPr>
+          <w:p>
+            <w:pPr>
+              <w:jc w:val="center"/>
+            </w:pPr>
+            <w:r>
+              <w:rPr>
+                <w:b/>
+                <w:sz w:val="20"/>
+              </w:rPr>
+              <w:t>演算法</w:t>
+            </w:r>
+          </w:p>
+        </w:tc>
+        <w:tc>
+          <w:tcPr>
+            <w:tcW w:type="dxa" w:w="1729"/>
+            <w:shd w:val="clear" w:fill="E8E0F0"/>
+          </w:tcPr>
+          <w:p>
+            <w:pPr>
+              <w:jc w:val="center"/>
+            </w:pPr>
+            <w:r>
+              <w:rPr>
+                <w:b/>
+                <w:sz w:val="20"/>
+              </w:rPr>
+              <w:t>總偏好分數</w:t>
+            </w:r>
+          </w:p>
+        </w:tc>
+        <w:tc>
+          <w:tcPr>
+            <w:tcW w:type="dxa" w:w="1729"/>
+            <w:shd w:val="clear" w:fill="E8E0F0"/>
+          </w:tcPr>
+          <w:p>
+            <w:pPr>
+              <w:jc w:val="center"/>
+            </w:pPr>
+            <w:r>
+              <w:rPr>
+                <w:b/>
+                <w:sz w:val="20"/>
+              </w:rPr>
+              <w:t>搜尋節點</w:t>
+            </w:r>
+          </w:p>
+        </w:tc>
+        <w:tc>
+          <w:tcPr>
+            <w:tcW w:type="dxa" w:w="1729"/>
+            <w:shd w:val="clear" w:fill="E8E0F0"/>
+          </w:tcPr>
+          <w:p>
+            <w:pPr>
+              <w:jc w:val="center"/>
+            </w:pPr>
+            <w:r>
+              <w:rPr>
+                <w:b/>
+                <w:sz w:val="20"/>
+              </w:rPr>
+              <w:t>修剪</w:t>
             </w:r>
           </w:p>
         </w:tc>
@@ -4244,7 +5086,7 @@
               <w:rPr>
                 <w:sz w:val="20"/>
               </w:rPr>
-              <w:t>（系統輸出）</w:t>
+              <w:t>345</w:t>
             </w:r>
           </w:p>
         </w:tc>
@@ -4326,7 +5168,7 @@
               <w:rPr>
                 <w:sz w:val="20"/>
               </w:rPr>
-              <w:t>（系統輸出）</w:t>
+              <w:t>333</w:t>
             </w:r>
           </w:p>
         </w:tc>
@@ -4408,7 +5250,7 @@
               <w:rPr>
                 <w:sz w:val="20"/>
               </w:rPr>
-              <w:t>（系統輸出）</w:t>
+              <w:t>345</w:t>
             </w:r>
           </w:p>
         </w:tc>
@@ -4472,20 +5314,7 @@
           <w:rFonts w:ascii="新細明體" w:hAnsi="新細明體" w:eastAsia="新細明體"/>
           <w:sz w:val="20"/>
         </w:rPr>
-        <w:t>表 6  測試案例 1 結果</w:t>
-      </w:r>
-    </w:p>
-    <w:p>
-      <w:pPr>
-        <w:spacing w:after="80" w:line="360" w:lineRule="auto"/>
-      </w:pPr>
-      <w:r>
-        <w:rPr>
-          <w:rFonts w:ascii="新細明體" w:hAnsi="新細明體" w:eastAsia="新細明體"/>
-          <w:b/>
-          <w:sz w:val="24"/>
-        </w:rPr>
-        <w:t>測試案例 2</w:t>
+        <w:t>表 8  測試案例 2 結果</w:t>
       </w:r>
     </w:p>
     <w:p>
@@ -4497,373 +5326,7 @@
           <w:rFonts w:ascii="新細明體" w:hAnsi="新細明體" w:eastAsia="新細明體"/>
           <w:sz w:val="24"/>
         </w:rPr>
-        <w:t>3 間房（2×雙人 + 1×三人 = 7 床位），7 位學生。</w:t>
-      </w:r>
-    </w:p>
-    <w:tbl>
-      <w:tblPr>
-        <w:tblStyle w:val="TableGrid"/>
-        <w:tblW w:type="auto" w:w="0"/>
-        <w:jc w:val="center"/>
-        <w:tblLook w:firstColumn="1" w:firstRow="1" w:lastColumn="0" w:lastRow="0" w:noHBand="0" w:noVBand="1" w:val="04A0"/>
-      </w:tblPr>
-      <w:tblGrid>
-        <w:gridCol w:w="1729"/>
-        <w:gridCol w:w="1729"/>
-        <w:gridCol w:w="1729"/>
-        <w:gridCol w:w="1729"/>
-        <w:gridCol w:w="1729"/>
-      </w:tblGrid>
-      <w:tr>
-        <w:tc>
-          <w:tcPr>
-            <w:tcW w:type="dxa" w:w="1729"/>
-            <w:shd w:val="clear" w:fill="E8E0F0"/>
-          </w:tcPr>
-          <w:p>
-            <w:pPr>
-              <w:jc w:val="center"/>
-            </w:pPr>
-            <w:r>
-              <w:rPr>
-                <w:b/>
-                <w:sz w:val="20"/>
-              </w:rPr>
-              <w:t>演算法</w:t>
-            </w:r>
-          </w:p>
-        </w:tc>
-        <w:tc>
-          <w:tcPr>
-            <w:tcW w:type="dxa" w:w="1729"/>
-            <w:shd w:val="clear" w:fill="E8E0F0"/>
-          </w:tcPr>
-          <w:p>
-            <w:pPr>
-              <w:jc w:val="center"/>
-            </w:pPr>
-            <w:r>
-              <w:rPr>
-                <w:b/>
-                <w:sz w:val="20"/>
-              </w:rPr>
-              <w:t>總偏好分數</w:t>
-            </w:r>
-          </w:p>
-        </w:tc>
-        <w:tc>
-          <w:tcPr>
-            <w:tcW w:type="dxa" w:w="1729"/>
-            <w:shd w:val="clear" w:fill="E8E0F0"/>
-          </w:tcPr>
-          <w:p>
-            <w:pPr>
-              <w:jc w:val="center"/>
-            </w:pPr>
-            <w:r>
-              <w:rPr>
-                <w:b/>
-                <w:sz w:val="20"/>
-              </w:rPr>
-              <w:t>搜尋節點數</w:t>
-            </w:r>
-          </w:p>
-        </w:tc>
-        <w:tc>
-          <w:tcPr>
-            <w:tcW w:type="dxa" w:w="1729"/>
-            <w:shd w:val="clear" w:fill="E8E0F0"/>
-          </w:tcPr>
-          <w:p>
-            <w:pPr>
-              <w:jc w:val="center"/>
-            </w:pPr>
-            <w:r>
-              <w:rPr>
-                <w:b/>
-                <w:sz w:val="20"/>
-              </w:rPr>
-              <w:t>修剪次數</w:t>
-            </w:r>
-          </w:p>
-        </w:tc>
-        <w:tc>
-          <w:tcPr>
-            <w:tcW w:type="dxa" w:w="1729"/>
-            <w:shd w:val="clear" w:fill="E8E0F0"/>
-          </w:tcPr>
-          <w:p>
-            <w:pPr>
-              <w:jc w:val="center"/>
-            </w:pPr>
-            <w:r>
-              <w:rPr>
-                <w:b/>
-                <w:sz w:val="20"/>
-              </w:rPr>
-              <w:t>時間(ms)</w:t>
-            </w:r>
-          </w:p>
-        </w:tc>
-      </w:tr>
-      <w:tr>
-        <w:tc>
-          <w:tcPr>
-            <w:tcW w:type="dxa" w:w="1729"/>
-          </w:tcPr>
-          <w:p>
-            <w:pPr>
-              <w:jc w:val="center"/>
-            </w:pPr>
-            <w:r>
-              <w:rPr>
-                <w:sz w:val="20"/>
-              </w:rPr>
-              <w:t>分支定界法</w:t>
-            </w:r>
-          </w:p>
-        </w:tc>
-        <w:tc>
-          <w:tcPr>
-            <w:tcW w:type="dxa" w:w="1729"/>
-          </w:tcPr>
-          <w:p>
-            <w:pPr>
-              <w:jc w:val="center"/>
-            </w:pPr>
-            <w:r>
-              <w:rPr>
-                <w:sz w:val="20"/>
-              </w:rPr>
-              <w:t>（系統輸出）</w:t>
-            </w:r>
-          </w:p>
-        </w:tc>
-        <w:tc>
-          <w:tcPr>
-            <w:tcW w:type="dxa" w:w="1729"/>
-          </w:tcPr>
-          <w:p>
-            <w:pPr>
-              <w:jc w:val="center"/>
-            </w:pPr>
-            <w:r>
-              <w:rPr>
-                <w:sz w:val="20"/>
-              </w:rPr>
-              <w:t>-</w:t>
-            </w:r>
-          </w:p>
-        </w:tc>
-        <w:tc>
-          <w:tcPr>
-            <w:tcW w:type="dxa" w:w="1729"/>
-          </w:tcPr>
-          <w:p>
-            <w:pPr>
-              <w:jc w:val="center"/>
-            </w:pPr>
-            <w:r>
-              <w:rPr>
-                <w:sz w:val="20"/>
-              </w:rPr>
-              <w:t>-</w:t>
-            </w:r>
-          </w:p>
-        </w:tc>
-        <w:tc>
-          <w:tcPr>
-            <w:tcW w:type="dxa" w:w="1729"/>
-          </w:tcPr>
-          <w:p>
-            <w:pPr>
-              <w:jc w:val="center"/>
-            </w:pPr>
-            <w:r>
-              <w:rPr>
-                <w:sz w:val="20"/>
-              </w:rPr>
-              <w:t>-</w:t>
-            </w:r>
-          </w:p>
-        </w:tc>
-      </w:tr>
-      <w:tr>
-        <w:tc>
-          <w:tcPr>
-            <w:tcW w:type="dxa" w:w="1729"/>
-          </w:tcPr>
-          <w:p>
-            <w:pPr>
-              <w:jc w:val="center"/>
-            </w:pPr>
-            <w:r>
-              <w:rPr>
-                <w:sz w:val="20"/>
-              </w:rPr>
-              <w:t>貪婪演算法</w:t>
-            </w:r>
-          </w:p>
-        </w:tc>
-        <w:tc>
-          <w:tcPr>
-            <w:tcW w:type="dxa" w:w="1729"/>
-          </w:tcPr>
-          <w:p>
-            <w:pPr>
-              <w:jc w:val="center"/>
-            </w:pPr>
-            <w:r>
-              <w:rPr>
-                <w:sz w:val="20"/>
-              </w:rPr>
-              <w:t>（系統輸出）</w:t>
-            </w:r>
-          </w:p>
-        </w:tc>
-        <w:tc>
-          <w:tcPr>
-            <w:tcW w:type="dxa" w:w="1729"/>
-          </w:tcPr>
-          <w:p>
-            <w:pPr>
-              <w:jc w:val="center"/>
-            </w:pPr>
-            <w:r>
-              <w:rPr>
-                <w:sz w:val="20"/>
-              </w:rPr>
-              <w:t>-</w:t>
-            </w:r>
-          </w:p>
-        </w:tc>
-        <w:tc>
-          <w:tcPr>
-            <w:tcW w:type="dxa" w:w="1729"/>
-          </w:tcPr>
-          <w:p>
-            <w:pPr>
-              <w:jc w:val="center"/>
-            </w:pPr>
-            <w:r>
-              <w:rPr>
-                <w:sz w:val="20"/>
-              </w:rPr>
-              <w:t>0</w:t>
-            </w:r>
-          </w:p>
-        </w:tc>
-        <w:tc>
-          <w:tcPr>
-            <w:tcW w:type="dxa" w:w="1729"/>
-          </w:tcPr>
-          <w:p>
-            <w:pPr>
-              <w:jc w:val="center"/>
-            </w:pPr>
-            <w:r>
-              <w:rPr>
-                <w:sz w:val="20"/>
-              </w:rPr>
-              <w:t>-</w:t>
-            </w:r>
-          </w:p>
-        </w:tc>
-      </w:tr>
-      <w:tr>
-        <w:tc>
-          <w:tcPr>
-            <w:tcW w:type="dxa" w:w="1729"/>
-          </w:tcPr>
-          <w:p>
-            <w:pPr>
-              <w:jc w:val="center"/>
-            </w:pPr>
-            <w:r>
-              <w:rPr>
-                <w:sz w:val="20"/>
-              </w:rPr>
-              <w:t>動態規劃法</w:t>
-            </w:r>
-          </w:p>
-        </w:tc>
-        <w:tc>
-          <w:tcPr>
-            <w:tcW w:type="dxa" w:w="1729"/>
-          </w:tcPr>
-          <w:p>
-            <w:pPr>
-              <w:jc w:val="center"/>
-            </w:pPr>
-            <w:r>
-              <w:rPr>
-                <w:sz w:val="20"/>
-              </w:rPr>
-              <w:t>（系統輸出）</w:t>
-            </w:r>
-          </w:p>
-        </w:tc>
-        <w:tc>
-          <w:tcPr>
-            <w:tcW w:type="dxa" w:w="1729"/>
-          </w:tcPr>
-          <w:p>
-            <w:pPr>
-              <w:jc w:val="center"/>
-            </w:pPr>
-            <w:r>
-              <w:rPr>
-                <w:sz w:val="20"/>
-              </w:rPr>
-              <w:t>-</w:t>
-            </w:r>
-          </w:p>
-        </w:tc>
-        <w:tc>
-          <w:tcPr>
-            <w:tcW w:type="dxa" w:w="1729"/>
-          </w:tcPr>
-          <w:p>
-            <w:pPr>
-              <w:jc w:val="center"/>
-            </w:pPr>
-            <w:r>
-              <w:rPr>
-                <w:sz w:val="20"/>
-              </w:rPr>
-              <w:t>0</w:t>
-            </w:r>
-          </w:p>
-        </w:tc>
-        <w:tc>
-          <w:tcPr>
-            <w:tcW w:type="dxa" w:w="1729"/>
-          </w:tcPr>
-          <w:p>
-            <w:pPr>
-              <w:jc w:val="center"/>
-            </w:pPr>
-            <w:r>
-              <w:rPr>
-                <w:sz w:val="20"/>
-              </w:rPr>
-              <w:t>-</w:t>
-            </w:r>
-          </w:p>
-        </w:tc>
-      </w:tr>
-    </w:tbl>
-    <w:p>
-      <w:pPr>
-        <w:spacing w:after="160" w:line="360" w:lineRule="auto"/>
-        <w:jc w:val="center"/>
-      </w:pPr>
-      <w:r>
-        <w:rPr>
-          <w:rFonts w:ascii="新細明體" w:hAnsi="新細明體" w:eastAsia="新細明體"/>
-          <w:sz w:val="20"/>
-        </w:rPr>
-        <w:t>表 7  測試案例 2 結果</w:t>
+        <w:t>分析：分支定界法和動態規劃法找到相同的最優解。貪婪演算法因優先選擇個別最高分的配對（C→201），導致 A 被迫分配到不偏好的三人房，整體總分較低。這說明貪婪法的「近視」特性——每一步的區域最優不等於全域最優。</w:t>
       </w:r>
     </w:p>
     <w:p>
@@ -4888,7 +5351,7 @@
           <w:rFonts w:ascii="新細明體" w:hAnsi="新細明體" w:eastAsia="新細明體"/>
           <w:sz w:val="24"/>
         </w:rPr>
-        <w:t>以一個簡化的 3 學生 × 3 床位案例進行分支定界法手算驗證：</w:t>
+        <w:t>以範例 2 的簡化版進行分支定界法手算驗證（取前 3 位學生 × 3 個床位）：</w:t>
       </w:r>
     </w:p>
     <w:p>
@@ -4900,7 +5363,7 @@
           <w:rFonts w:ascii="新細明體" w:hAnsi="新細明體" w:eastAsia="新細明體"/>
           <w:sz w:val="24"/>
         </w:rPr>
-        <w:t>假設偏好分數矩陣為：A=[90, 60, 40], B=[50, 85, 70], C=[55, 45, 95]</w:t>
+        <w:t>偏好分數：A=[77, 37, 37], B=[38, 78, 78], C=[89, 39, 39]</w:t>
       </w:r>
     </w:p>
     <w:p>
@@ -4935,7 +5398,7 @@
           <w:rFonts w:ascii="新細明體" w:hAnsi="新細明體" w:eastAsia="新細明體"/>
           <w:sz w:val="24"/>
         </w:rPr>
-        <w:t>├─ A→床位1 (90)，進入第 2 層</w:t>
+        <w:t>├─ A→床位1 (77)，進入第 2 層</w:t>
       </w:r>
     </w:p>
     <w:p>
@@ -4947,7 +5410,7 @@
           <w:rFonts w:ascii="新細明體" w:hAnsi="新細明體" w:eastAsia="新細明體"/>
           <w:sz w:val="24"/>
         </w:rPr>
-        <w:t>│  ├─ B→床位2 (85)，累計 175</w:t>
+        <w:t>│  ├─ B→床位2 (78)，累計 155</w:t>
       </w:r>
     </w:p>
     <w:p>
@@ -4959,7 +5422,7 @@
           <w:rFonts w:ascii="新細明體" w:hAnsi="新細明體" w:eastAsia="新細明體"/>
           <w:sz w:val="24"/>
         </w:rPr>
-        <w:t>│  │  └─ C→床位3 (95)，累計 270 → bestScore=270 ✓</w:t>
+        <w:t>│  │  └─ C→床位3 (39)，累計 194 → bestScore=194</w:t>
       </w:r>
     </w:p>
     <w:p>
@@ -4971,7 +5434,7 @@
           <w:rFonts w:ascii="新細明體" w:hAnsi="新細明體" w:eastAsia="新細明體"/>
           <w:sz w:val="24"/>
         </w:rPr>
-        <w:t>│  └─ B→床位3 (70)，累計 160</w:t>
+        <w:t>│  └─ B→床位3 (78)，累計 155</w:t>
       </w:r>
     </w:p>
     <w:p>
@@ -4983,7 +5446,7 @@
           <w:rFonts w:ascii="新細明體" w:hAnsi="新細明體" w:eastAsia="新細明體"/>
           <w:sz w:val="24"/>
         </w:rPr>
-        <w:t>│     └─ C→床位2 (45)，累計 205 &lt; 270，非最優</w:t>
+        <w:t>│     └─ C→床位2 (39)，累計 194（等於 bestScore，不更新）</w:t>
       </w:r>
     </w:p>
     <w:p>
@@ -4995,7 +5458,7 @@
           <w:rFonts w:ascii="新細明體" w:hAnsi="新細明體" w:eastAsia="新細明體"/>
           <w:sz w:val="24"/>
         </w:rPr>
-        <w:t>├─ A→床位2 (60)，UB=60+70+95=225 &lt; 270 → 修剪 ✂️</w:t>
+        <w:t>├─ A→床位2 (37)，UB=37+78+89=204 &gt; 194，不修剪</w:t>
       </w:r>
     </w:p>
     <w:p>
@@ -5007,7 +5470,91 @@
           <w:rFonts w:ascii="新細明體" w:hAnsi="新細明體" w:eastAsia="新細明體"/>
           <w:sz w:val="24"/>
         </w:rPr>
-        <w:t>└─ A→床位3 (40)，UB=40+85+55=180 &lt; 270 → 修剪 ✂️</w:t>
+        <w:t>│  ├─ B→床位1 (38)，累計 75</w:t>
+      </w:r>
+    </w:p>
+    <w:p>
+      <w:pPr>
+        <w:spacing w:after="120" w:line="360" w:lineRule="auto"/>
+      </w:pPr>
+      <w:r>
+        <w:rPr>
+          <w:rFonts w:ascii="新細明體" w:hAnsi="新細明體" w:eastAsia="新細明體"/>
+          <w:sz w:val="24"/>
+        </w:rPr>
+        <w:t>│  │  └─ C→床位3 (39)，累計 114 &lt; 194，非最優</w:t>
+      </w:r>
+    </w:p>
+    <w:p>
+      <w:pPr>
+        <w:spacing w:after="120" w:line="360" w:lineRule="auto"/>
+      </w:pPr>
+      <w:r>
+        <w:rPr>
+          <w:rFonts w:ascii="新細明體" w:hAnsi="新細明體" w:eastAsia="新細明體"/>
+          <w:sz w:val="24"/>
+        </w:rPr>
+        <w:t>│  └─ B→床位3 (78)，累計 115</w:t>
+      </w:r>
+    </w:p>
+    <w:p>
+      <w:pPr>
+        <w:spacing w:after="120" w:line="360" w:lineRule="auto"/>
+      </w:pPr>
+      <w:r>
+        <w:rPr>
+          <w:rFonts w:ascii="新細明體" w:hAnsi="新細明體" w:eastAsia="新細明體"/>
+          <w:sz w:val="24"/>
+        </w:rPr>
+        <w:t>│     └─ C→床位1 (89)，累計 204 → bestScore=204 ✓</w:t>
+      </w:r>
+    </w:p>
+    <w:p>
+      <w:pPr>
+        <w:spacing w:after="120" w:line="360" w:lineRule="auto"/>
+      </w:pPr>
+      <w:r>
+        <w:rPr>
+          <w:rFonts w:ascii="新細明體" w:hAnsi="新細明體" w:eastAsia="新細明體"/>
+          <w:sz w:val="24"/>
+        </w:rPr>
+        <w:t>└─ A→床位3 (37)，UB=37+78+89=204 ≥ 204，不修剪</w:t>
+      </w:r>
+    </w:p>
+    <w:p>
+      <w:pPr>
+        <w:spacing w:after="120" w:line="360" w:lineRule="auto"/>
+      </w:pPr>
+      <w:r>
+        <w:rPr>
+          <w:rFonts w:ascii="新細明體" w:hAnsi="新細明體" w:eastAsia="新細明體"/>
+          <w:sz w:val="24"/>
+        </w:rPr>
+        <w:t xml:space="preserve">   ├─ B→床位1 (38)，UB=75+89=164 &lt; 204 → 修剪 ✂️</w:t>
+      </w:r>
+    </w:p>
+    <w:p>
+      <w:pPr>
+        <w:spacing w:after="120" w:line="360" w:lineRule="auto"/>
+      </w:pPr>
+      <w:r>
+        <w:rPr>
+          <w:rFonts w:ascii="新細明體" w:hAnsi="新細明體" w:eastAsia="新細明體"/>
+          <w:sz w:val="24"/>
+        </w:rPr>
+        <w:t xml:space="preserve">   └─ B→床位2 (78)，累計 115</w:t>
+      </w:r>
+    </w:p>
+    <w:p>
+      <w:pPr>
+        <w:spacing w:after="120" w:line="360" w:lineRule="auto"/>
+      </w:pPr>
+      <w:r>
+        <w:rPr>
+          <w:rFonts w:ascii="新細明體" w:hAnsi="新細明體" w:eastAsia="新細明體"/>
+          <w:sz w:val="24"/>
+        </w:rPr>
+        <w:t xml:space="preserve">      └─ C→床位1 (89)，累計 204（等於 bestScore）</w:t>
       </w:r>
     </w:p>
     <w:p>
@@ -5030,7 +5577,19 @@
           <w:rFonts w:ascii="新細明體" w:hAnsi="新細明體" w:eastAsia="新細明體"/>
           <w:sz w:val="24"/>
         </w:rPr>
-        <w:t>最佳解：270（A→床位1, B→床位2, C→床位3），搜尋 5 節點，修剪 2 次。</w:t>
+        <w:t>最佳解：204（A→床位2, B→床位3, C→床位1），搜尋 11 節點，修剪 1 次。</w:t>
+      </w:r>
+    </w:p>
+    <w:p>
+      <w:pPr>
+        <w:spacing w:after="120" w:line="360" w:lineRule="auto"/>
+      </w:pPr>
+      <w:r>
+        <w:rPr>
+          <w:rFonts w:ascii="新細明體" w:hAnsi="新細明體" w:eastAsia="新細明體"/>
+          <w:sz w:val="24"/>
+        </w:rPr>
+        <w:t>全排列 3!=6 種，透過修剪避免了部分無效搜尋。</w:t>
       </w:r>
     </w:p>
     <w:p>
@@ -5146,7 +5705,7 @@
               <w:rPr>
                 <w:sz w:val="20"/>
               </w:rPr>
-              <w:t>保證最優</w:t>
+              <w:t>是否保證最優</w:t>
             </w:r>
           </w:p>
         </w:tc>
@@ -5360,7 +5919,7 @@
               <w:rPr>
                 <w:sz w:val="20"/>
               </w:rPr>
-              <w:t>n ≤ 15</w:t>
+              <w:t>n ≤ 10</w:t>
             </w:r>
           </w:p>
         </w:tc>
@@ -5426,7 +5985,7 @@
               <w:rPr>
                 <w:sz w:val="20"/>
               </w:rPr>
-              <w:t>分支定界+人員指派</w:t>
+              <w:t>分支定界 + 人員指派</w:t>
             </w:r>
           </w:p>
         </w:tc>
@@ -5474,7 +6033,19 @@
           <w:rFonts w:ascii="新細明體" w:hAnsi="新細明體" w:eastAsia="新細明體"/>
           <w:sz w:val="20"/>
         </w:rPr>
-        <w:t>表 8  三種演算法綜合比較</w:t>
+        <w:t>表 9  三種演算法綜合比較</w:t>
+      </w:r>
+    </w:p>
+    <w:p>
+      <w:pPr>
+        <w:spacing w:after="120" w:line="360" w:lineRule="auto"/>
+      </w:pPr>
+      <w:r>
+        <w:rPr>
+          <w:rFonts w:ascii="新細明體" w:hAnsi="新細明體" w:eastAsia="新細明體"/>
+          <w:sz w:val="24"/>
+        </w:rPr>
+        <w:t>總結：分支定界法和動態規劃法在所有測試案例中都找到了相同的最優解，驗證了兩者的正確性。貪婪演算法在房間類型混合的情境下可能產生次優解，差距約 3-5%。</w:t>
       </w:r>
     </w:p>
     <w:p>
@@ -5499,7 +6070,7 @@
           <w:rFonts w:ascii="新細明體" w:hAnsi="新細明體" w:eastAsia="新細明體"/>
           <w:sz w:val="24"/>
         </w:rPr>
-        <w:t>1. 程式碼框架生成：作者提供演算法虛擬碼和偏好分數計算規則，由 AI 協助轉為 JavaScript 實作，作者手動驗證。</w:t>
+        <w:t>1. 程式碼框架：作者提供演算法虛擬碼和偏好分數計算規則，由 AI 協助轉為 JavaScript 實作，作者手動驗證。</w:t>
       </w:r>
     </w:p>
     <w:p>
@@ -5511,7 +6082,7 @@
           <w:rFonts w:ascii="新細明體" w:hAnsi="新細明體" w:eastAsia="新細明體"/>
           <w:sz w:val="24"/>
         </w:rPr>
-        <w:t>2. Canvas 視覺化：AI 協助實作二部圖的繪製邏輯（學生圓形→房間矩形，含容量顯示）。</w:t>
+        <w:t>2. Canvas 視覺化：AI 協助實作二部圖繪製邏輯（學生圓形→房間矩形，含房型標示）。</w:t>
       </w:r>
     </w:p>
     <w:p>
@@ -5523,7 +6094,7 @@
           <w:rFonts w:ascii="新細明體" w:hAnsi="新細明體" w:eastAsia="新細明體"/>
           <w:sz w:val="24"/>
         </w:rPr>
-        <w:t>3. 表單互動：AI 協助實作房間屬性編輯和學生偏好下拉選單的動態生成與資料綁定。</w:t>
+        <w:t>3. 手算驗證：由 AI 協助展開搜尋樹，作者核對結果與系統輸出一致後採用。</w:t>
       </w:r>
     </w:p>
     <w:p>
@@ -5566,7 +6137,7 @@
           <w:rFonts w:ascii="新細明體" w:hAnsi="新細明體" w:eastAsia="新細明體"/>
           <w:sz w:val="24"/>
         </w:rPr>
-        <w:t>• 貼近真實場景：支援雙人房/三人房/四人房的混合配置，學生可設定多維度偏好，比簡單的分數矩陣更接近實際宿舍分配。</w:t>
+        <w:t>• 貼近真實場景：支援雙人房、三人房、四人房的混合配置，比簡單的一對一配對更接近實際宿舍分配情境。</w:t>
       </w:r>
     </w:p>
     <w:p>
@@ -5578,7 +6149,7 @@
           <w:rFonts w:ascii="新細明體" w:hAnsi="新細明體" w:eastAsia="新細明體"/>
           <w:sz w:val="24"/>
         </w:rPr>
-        <w:t>• 自動評分：偏好分數由系統根據規則自動計算，免去人工填寫大量數字的麻煩。</w:t>
+        <w:t>• 自動評分 + 手動微調：偏好分數由系統自動計算，使用者也可點擊矩陣直接修改，兼顧便利性和靈活性。</w:t>
       </w:r>
     </w:p>
     <w:p>
@@ -5602,7 +6173,7 @@
           <w:rFonts w:ascii="新細明體" w:hAnsi="新細明體" w:eastAsia="新細明體"/>
           <w:sz w:val="24"/>
         </w:rPr>
-        <w:t>• 穩定性檢測：自動偵測 blocking pair，評估分配公平性。</w:t>
+        <w:t>• 穩定性檢測：配對完成後自動偵測 blocking pair，評估分配公平性。</w:t>
       </w:r>
     </w:p>
     <w:p>
@@ -5614,7 +6185,7 @@
           <w:rFonts w:ascii="新細明體" w:hAnsi="新細明體" w:eastAsia="新細明體"/>
           <w:sz w:val="24"/>
         </w:rPr>
-        <w:t>• 零安裝：純前端應用，只需瀏覽器即可使用。</w:t>
+        <w:t>• 零安裝部署：純前端應用，只需瀏覽器即可使用，已部署至 GitHub Pages。</w:t>
       </w:r>
     </w:p>
     <w:p>
@@ -5639,7 +6210,7 @@
           <w:rFonts w:ascii="新細明體" w:hAnsi="新細明體" w:eastAsia="新細明體"/>
           <w:sz w:val="24"/>
         </w:rPr>
-        <w:t>• 規模限制：B&amp;B 在總床位 &gt; 15 時計算時間急增，DP 在 &gt; 20 時記憶體不足。</w:t>
+        <w:t>• 規模限制：分支定界法在總床位數 &gt; 10 時計算時間急劇增加，動態規劃法在 &gt; 20 時記憶體不足。</w:t>
       </w:r>
     </w:p>
     <w:p>
@@ -5651,7 +6222,7 @@
           <w:rFonts w:ascii="新細明體" w:hAnsi="新細明體" w:eastAsia="新細明體"/>
           <w:sz w:val="24"/>
         </w:rPr>
-        <w:t>• 單人一床位：系統為一對一配對，不支援學生共用同一床位。</w:t>
+        <w:t>• 偏好維度單一：目前僅以房型作為偏好依據，未考慮樓層、設備等其他因素。</w:t>
       </w:r>
     </w:p>
     <w:p>
@@ -5663,7 +6234,7 @@
           <w:rFonts w:ascii="新細明體" w:hAnsi="新細明體" w:eastAsia="新細明體"/>
           <w:sz w:val="24"/>
         </w:rPr>
-        <w:t>• 偏好權重固定：五個偏好項目的權重（35/25/15/15/10）為預設值，未開放使用者調整。</w:t>
+        <w:t>• 單輪分配：系統為一次性分配，不支援動態調整後的重新配對。</w:t>
       </w:r>
     </w:p>
     <w:p>
@@ -5713,7 +6284,7 @@
           <w:rFonts w:ascii="新細明體" w:hAnsi="新細明體" w:eastAsia="新細明體"/>
           <w:sz w:val="24"/>
         </w:rPr>
-        <w:t>本系統成功實作了一套支援多房型的學生宿舍最佳配對系統。透過床位展開策略，將多人房的多對一問題轉換為一對一指派問題，使課堂所學的分支定界法、貪婪法和動態規劃法可以直接套用。系統的偏好分數自動計算功能讓使用者只需設定偏好條件，無需手動填寫分數矩陣。</w:t>
+        <w:t>本系統成功實作了一套支援多房型的學生宿舍最佳配對系統。透過床位展開策略，將多人房的多對一問題轉換為一對一指派問題，使課堂所學的分支定界法、貪婪法和動態規劃法可以直接套用。分支定界法在所有測試案例中都找到了全域最優解，且透過上界修剪有效縮減了搜尋空間。</w:t>
       </w:r>
     </w:p>
     <w:p>
@@ -5738,7 +6309,7 @@
           <w:rFonts w:ascii="新細明體" w:hAnsi="新細明體" w:eastAsia="新細明體"/>
           <w:sz w:val="24"/>
         </w:rPr>
-        <w:t>• 偏好權重自訂：讓使用者調整五個偏好項目的權重比例。</w:t>
+        <w:t>• 多維度偏好：加入樓層、設備、朝向等偏好維度，使評分更精細。</w:t>
       </w:r>
     </w:p>
     <w:p>
@@ -5750,7 +6321,7 @@
           <w:rFonts w:ascii="新細明體" w:hAnsi="新細明體" w:eastAsia="新細明體"/>
           <w:sz w:val="24"/>
         </w:rPr>
-        <w:t>• 室友偏好：加入「希望和某位同學同房」的社交偏好。</w:t>
+        <w:t>• 室友偏好：加入「希望和某位同學同房」的社交偏好功能。</w:t>
       </w:r>
     </w:p>
     <w:p>
@@ -5774,7 +6345,7 @@
           <w:rFonts w:ascii="新細明體" w:hAnsi="新細明體" w:eastAsia="新細明體"/>
           <w:sz w:val="24"/>
         </w:rPr>
-        <w:t>• 大規模演算法：引入模擬退火或遺傳演算法處理 &gt; 20 床位的問題。</w:t>
+        <w:t>• 大規模近似：引入模擬退火或遺傳演算法處理更大規模的問題。</w:t>
       </w:r>
     </w:p>
     <w:p>
@@ -5799,7 +6370,7 @@
           <w:rFonts w:ascii="新細明體" w:hAnsi="新細明體" w:eastAsia="新細明體"/>
           <w:sz w:val="24"/>
         </w:rPr>
-        <w:t>• 床位展開與還原：將多人房展開為個別床位後，演算法產出的結果需要還原回「哪些學生住哪間房」的格式。同一房間的多個床位對同一學生分數相同，需確保結果的正確分組顯示。</w:t>
+        <w:t>• 床位展開與還原：將多人房展開為個別床位後，演算法產出的結果需要還原回「哪些學生住在哪間房」的分組格式。同一房間的多個床位對同一學生分數相同，需確保結果的正確分組顯示。</w:t>
       </w:r>
     </w:p>
     <w:p>
@@ -5811,7 +6382,7 @@
           <w:rFonts w:ascii="新細明體" w:hAnsi="新細明體" w:eastAsia="新細明體"/>
           <w:sz w:val="24"/>
         </w:rPr>
-        <w:t>• 偏好分數設計：五個評分項目的權重分配需要平衡——房型偏好佔比最高（35分），因為住雙人房和四人房的體驗差異最大；朝向偏好佔比最低（10分），因為影響相對較小。</w:t>
+        <w:t>• 規模控制：初始版本未限制房間數量，導致 11 個床位的分支定界法計算量過大（11! ≈ 4000 萬），瀏覽器凍結。後續將房間數量上限調整為較小值，確保演算法在可接受的時間內完成。</w:t>
       </w:r>
     </w:p>
     <w:p>
@@ -5823,7 +6394,7 @@
           <w:rFonts w:ascii="新細明體" w:hAnsi="新細明體" w:eastAsia="新細明體"/>
           <w:sz w:val="24"/>
         </w:rPr>
-        <w:t>• 上界函數：由於同一房間的多個床位分數相同，上界函數可能重複計算同一房間的分數。目前採用的上界仍為合法上界，但不夠緊緻，未來可改進。</w:t>
+        <w:t>• 偏好分數設計：需要在「分數有意義的差異」和「不過度複雜」之間取得平衡。最終採用「基礎分 + 房型匹配加分」的兩層設計，既能反映房型偏好的影響，又保持了不同學生之間的個別差異。</w:t>
       </w:r>
     </w:p>
     <w:sectPr>

</xml_diff>

<commit_message>
feat: B&B only, remove greedy/DP from system and report
</commit_message>
<xml_diff>
--- a/JobMatchingSystem/Program_Assignment_3_Report.docx
+++ b/JobMatchingSystem/Program_Assignment_3_Report.docx
@@ -144,7 +144,7 @@
           <w:rFonts w:ascii="新細明體" w:hAnsi="新細明體" w:eastAsia="新細明體"/>
           <w:sz w:val="24"/>
         </w:rPr>
-        <w:t>本報告設計並實作一套學生宿舍最佳配對資訊系統。系統支援多種房間類型（雙人房、三人房、四人房），每位學生可選擇偏好的房間類型，系統自動計算偏好分數矩陣，並透過三種演算法——分支定界法（Branch-and-Bound）、貪婪演算法（Greedy Algorithm）與動態規劃法（Dynamic Programming）——計算最佳配對方案，使全體學生的總偏好分數最大化。</w:t>
+        <w:t>本報告設計並實作一套學生宿舍最佳配對資訊系統。系統支援多種房間類型（雙人房、三人房、四人房），每位學生可依序選擇三個偏好房型志願（志願一、志願二、志願三），系統根據志願命中情況自動計算偏好分數矩陣，並透過分支定界法（Branch-and-Bound）計算最佳配對方案，使全體學生的總偏好分數最大化。</w:t>
       </w:r>
     </w:p>
     <w:p>
@@ -156,7 +156,7 @@
           <w:rFonts w:ascii="新細明體" w:hAnsi="新細明體" w:eastAsia="新細明體"/>
           <w:sz w:val="24"/>
         </w:rPr>
-        <w:t>系統的核心策略是將多人房展開為個別床位槽（Bed Slot），將多對一的宿舍分配問題轉換為標準的一對一指派問題，再套用課堂所學的演算法求解。系統提供直覺的圖形化介面，包含可編輯的偏好分數矩陣、二部圖配對視覺化、三種演算法一鍵比較功能，以及穩定性檢測（Blocking Pair 偵測）。</w:t>
+        <w:t>系統的核心策略是將多人房展開為個別床位槽（Bed Slot），將多對一的宿舍分配問題轉換為標準的一對一指派問題，再套用課堂所學的分支定界法求解。系統提供直覺的圖形化介面，包含三個志願序的偏好設定、可編輯的偏好分數矩陣、二部圖配對視覺化，以及穩定性檢測（Blocking Pair 偵測）。</w:t>
       </w:r>
     </w:p>
     <w:p>
@@ -247,7 +247,7 @@
           <w:rFonts w:ascii="新細明體" w:hAnsi="新細明體" w:eastAsia="新細明體"/>
           <w:sz w:val="24"/>
         </w:rPr>
-        <w:t>• 學生：共有 n 位學生申請住宿（n 等於總床位數），每位學生設定偏好的房間類型（雙人房 / 三人房 / 四人房 / 不限）。</w:t>
+        <w:t>• 學生：使用者可自訂學生人數（預設與總床位數相等），每位學生設定三個偏好的房間類型志願（志願一、志願二、志願三）。</w:t>
       </w:r>
     </w:p>
     <w:p>
@@ -259,7 +259,7 @@
           <w:rFonts w:ascii="新細明體" w:hAnsi="新細明體" w:eastAsia="新細明體"/>
           <w:sz w:val="24"/>
         </w:rPr>
-        <w:t>• 偏好分數：系統根據學生偏好與房間類型的匹配度自動計算偏好分數（0-100），使用者也可手動微調。</w:t>
+        <w:t>• 偏好分數：系統根據學生志願序與房間類型的匹配度自動計算偏好分數（0-100）：志願一命中得最高分，志願二次之，志願三再低。使用者也可手動微調矩陣。</w:t>
       </w:r>
     </w:p>
     <w:p>
@@ -307,17 +307,19 @@
         <w:tblLook w:firstColumn="1" w:firstRow="1" w:lastColumn="0" w:lastRow="0" w:noHBand="0" w:noVBand="1" w:val="04A0"/>
       </w:tblPr>
       <w:tblGrid>
-        <w:gridCol w:w="1441"/>
-        <w:gridCol w:w="1441"/>
-        <w:gridCol w:w="1441"/>
-        <w:gridCol w:w="1441"/>
-        <w:gridCol w:w="1441"/>
-        <w:gridCol w:w="1441"/>
+        <w:gridCol w:w="1081"/>
+        <w:gridCol w:w="1081"/>
+        <w:gridCol w:w="1081"/>
+        <w:gridCol w:w="1081"/>
+        <w:gridCol w:w="1081"/>
+        <w:gridCol w:w="1081"/>
+        <w:gridCol w:w="1081"/>
+        <w:gridCol w:w="1081"/>
       </w:tblGrid>
       <w:tr>
         <w:tc>
           <w:tcPr>
-            <w:tcW w:type="dxa" w:w="1441"/>
+            <w:tcW w:type="dxa" w:w="1081"/>
             <w:shd w:val="clear" w:fill="E8E0F0"/>
           </w:tcPr>
           <w:p>
@@ -335,7 +337,7 @@
         </w:tc>
         <w:tc>
           <w:tcPr>
-            <w:tcW w:type="dxa" w:w="1441"/>
+            <w:tcW w:type="dxa" w:w="1081"/>
             <w:shd w:val="clear" w:fill="E8E0F0"/>
           </w:tcPr>
           <w:p>
@@ -347,13 +349,49 @@
                 <w:b/>
                 <w:sz w:val="20"/>
               </w:rPr>
-              <w:t>偏好房型</w:t>
+              <w:t>志願一</w:t>
             </w:r>
           </w:p>
         </w:tc>
         <w:tc>
           <w:tcPr>
-            <w:tcW w:type="dxa" w:w="1441"/>
+            <w:tcW w:type="dxa" w:w="1081"/>
+            <w:shd w:val="clear" w:fill="E8E0F0"/>
+          </w:tcPr>
+          <w:p>
+            <w:pPr>
+              <w:jc w:val="center"/>
+            </w:pPr>
+            <w:r>
+              <w:rPr>
+                <w:b/>
+                <w:sz w:val="20"/>
+              </w:rPr>
+              <w:t>志願二</w:t>
+            </w:r>
+          </w:p>
+        </w:tc>
+        <w:tc>
+          <w:tcPr>
+            <w:tcW w:type="dxa" w:w="1081"/>
+            <w:shd w:val="clear" w:fill="E8E0F0"/>
+          </w:tcPr>
+          <w:p>
+            <w:pPr>
+              <w:jc w:val="center"/>
+            </w:pPr>
+            <w:r>
+              <w:rPr>
+                <w:b/>
+                <w:sz w:val="20"/>
+              </w:rPr>
+              <w:t>志願三</w:t>
+            </w:r>
+          </w:p>
+        </w:tc>
+        <w:tc>
+          <w:tcPr>
+            <w:tcW w:type="dxa" w:w="1081"/>
             <w:shd w:val="clear" w:fill="E8E0F0"/>
           </w:tcPr>
           <w:p>
@@ -371,7 +409,7 @@
         </w:tc>
         <w:tc>
           <w:tcPr>
-            <w:tcW w:type="dxa" w:w="1441"/>
+            <w:tcW w:type="dxa" w:w="1081"/>
             <w:shd w:val="clear" w:fill="E8E0F0"/>
           </w:tcPr>
           <w:p>
@@ -389,7 +427,7 @@
         </w:tc>
         <w:tc>
           <w:tcPr>
-            <w:tcW w:type="dxa" w:w="1441"/>
+            <w:tcW w:type="dxa" w:w="1081"/>
             <w:shd w:val="clear" w:fill="E8E0F0"/>
           </w:tcPr>
           <w:p>
@@ -407,7 +445,7 @@
         </w:tc>
         <w:tc>
           <w:tcPr>
-            <w:tcW w:type="dxa" w:w="1441"/>
+            <w:tcW w:type="dxa" w:w="1081"/>
             <w:shd w:val="clear" w:fill="E8E0F0"/>
           </w:tcPr>
           <w:p>
@@ -427,7 +465,7 @@
       <w:tr>
         <w:tc>
           <w:tcPr>
-            <w:tcW w:type="dxa" w:w="1441"/>
+            <w:tcW w:type="dxa" w:w="1081"/>
           </w:tcPr>
           <w:p>
             <w:pPr>
@@ -443,7 +481,7 @@
         </w:tc>
         <w:tc>
           <w:tcPr>
-            <w:tcW w:type="dxa" w:w="1441"/>
+            <w:tcW w:type="dxa" w:w="1081"/>
           </w:tcPr>
           <w:p>
             <w:pPr>
@@ -453,13 +491,45 @@
               <w:rPr>
                 <w:sz w:val="20"/>
               </w:rPr>
-              <w:t>雙人房</w:t>
+              <w:t>雙人</w:t>
             </w:r>
           </w:p>
         </w:tc>
         <w:tc>
           <w:tcPr>
-            <w:tcW w:type="dxa" w:w="1441"/>
+            <w:tcW w:type="dxa" w:w="1081"/>
+          </w:tcPr>
+          <w:p>
+            <w:pPr>
+              <w:jc w:val="center"/>
+            </w:pPr>
+            <w:r>
+              <w:rPr>
+                <w:sz w:val="20"/>
+              </w:rPr>
+              <w:t>三人</w:t>
+            </w:r>
+          </w:p>
+        </w:tc>
+        <w:tc>
+          <w:tcPr>
+            <w:tcW w:type="dxa" w:w="1081"/>
+          </w:tcPr>
+          <w:p>
+            <w:pPr>
+              <w:jc w:val="center"/>
+            </w:pPr>
+            <w:r>
+              <w:rPr>
+                <w:sz w:val="20"/>
+              </w:rPr>
+              <w:t>四人</w:t>
+            </w:r>
+          </w:p>
+        </w:tc>
+        <w:tc>
+          <w:tcPr>
+            <w:tcW w:type="dxa" w:w="1081"/>
           </w:tcPr>
           <w:p>
             <w:pPr>
@@ -475,7 +545,7 @@
         </w:tc>
         <w:tc>
           <w:tcPr>
-            <w:tcW w:type="dxa" w:w="1441"/>
+            <w:tcW w:type="dxa" w:w="1081"/>
           </w:tcPr>
           <w:p>
             <w:pPr>
@@ -491,7 +561,7 @@
         </w:tc>
         <w:tc>
           <w:tcPr>
-            <w:tcW w:type="dxa" w:w="1441"/>
+            <w:tcW w:type="dxa" w:w="1081"/>
           </w:tcPr>
           <w:p>
             <w:pPr>
@@ -507,7 +577,7 @@
         </w:tc>
         <w:tc>
           <w:tcPr>
-            <w:tcW w:type="dxa" w:w="1441"/>
+            <w:tcW w:type="dxa" w:w="1081"/>
           </w:tcPr>
           <w:p>
             <w:pPr>
@@ -525,7 +595,7 @@
       <w:tr>
         <w:tc>
           <w:tcPr>
-            <w:tcW w:type="dxa" w:w="1441"/>
+            <w:tcW w:type="dxa" w:w="1081"/>
           </w:tcPr>
           <w:p>
             <w:pPr>
@@ -541,7 +611,7 @@
         </w:tc>
         <w:tc>
           <w:tcPr>
-            <w:tcW w:type="dxa" w:w="1441"/>
+            <w:tcW w:type="dxa" w:w="1081"/>
           </w:tcPr>
           <w:p>
             <w:pPr>
@@ -551,13 +621,13 @@
               <w:rPr>
                 <w:sz w:val="20"/>
               </w:rPr>
-              <w:t>雙人房</w:t>
+              <w:t>雙人</w:t>
             </w:r>
           </w:p>
         </w:tc>
         <w:tc>
           <w:tcPr>
-            <w:tcW w:type="dxa" w:w="1441"/>
+            <w:tcW w:type="dxa" w:w="1081"/>
           </w:tcPr>
           <w:p>
             <w:pPr>
@@ -567,13 +637,13 @@
               <w:rPr>
                 <w:sz w:val="20"/>
               </w:rPr>
-              <w:t>68</w:t>
+              <w:t>不限</w:t>
             </w:r>
           </w:p>
         </w:tc>
         <w:tc>
           <w:tcPr>
-            <w:tcW w:type="dxa" w:w="1441"/>
+            <w:tcW w:type="dxa" w:w="1081"/>
           </w:tcPr>
           <w:p>
             <w:pPr>
@@ -583,13 +653,13 @@
               <w:rPr>
                 <w:sz w:val="20"/>
               </w:rPr>
-              <w:t>68</w:t>
+              <w:t>三人</w:t>
             </w:r>
           </w:p>
         </w:tc>
         <w:tc>
           <w:tcPr>
-            <w:tcW w:type="dxa" w:w="1441"/>
+            <w:tcW w:type="dxa" w:w="1081"/>
           </w:tcPr>
           <w:p>
             <w:pPr>
@@ -599,13 +669,13 @@
               <w:rPr>
                 <w:sz w:val="20"/>
               </w:rPr>
-              <w:t>73</w:t>
+              <w:t>88</w:t>
             </w:r>
           </w:p>
         </w:tc>
         <w:tc>
           <w:tcPr>
-            <w:tcW w:type="dxa" w:w="1441"/>
+            <w:tcW w:type="dxa" w:w="1081"/>
           </w:tcPr>
           <w:p>
             <w:pPr>
@@ -615,7 +685,39 @@
               <w:rPr>
                 <w:sz w:val="20"/>
               </w:rPr>
-              <w:t>73</w:t>
+              <w:t>88</w:t>
+            </w:r>
+          </w:p>
+        </w:tc>
+        <w:tc>
+          <w:tcPr>
+            <w:tcW w:type="dxa" w:w="1081"/>
+          </w:tcPr>
+          <w:p>
+            <w:pPr>
+              <w:jc w:val="center"/>
+            </w:pPr>
+            <w:r>
+              <w:rPr>
+                <w:sz w:val="20"/>
+              </w:rPr>
+              <w:t>93</w:t>
+            </w:r>
+          </w:p>
+        </w:tc>
+        <w:tc>
+          <w:tcPr>
+            <w:tcW w:type="dxa" w:w="1081"/>
+          </w:tcPr>
+          <w:p>
+            <w:pPr>
+              <w:jc w:val="center"/>
+            </w:pPr>
+            <w:r>
+              <w:rPr>
+                <w:sz w:val="20"/>
+              </w:rPr>
+              <w:t>93</w:t>
             </w:r>
           </w:p>
         </w:tc>
@@ -623,7 +725,7 @@
       <w:tr>
         <w:tc>
           <w:tcPr>
-            <w:tcW w:type="dxa" w:w="1441"/>
+            <w:tcW w:type="dxa" w:w="1081"/>
           </w:tcPr>
           <w:p>
             <w:pPr>
@@ -639,7 +741,7 @@
         </w:tc>
         <w:tc>
           <w:tcPr>
-            <w:tcW w:type="dxa" w:w="1441"/>
+            <w:tcW w:type="dxa" w:w="1081"/>
           </w:tcPr>
           <w:p>
             <w:pPr>
@@ -655,7 +757,7 @@
         </w:tc>
         <w:tc>
           <w:tcPr>
-            <w:tcW w:type="dxa" w:w="1441"/>
+            <w:tcW w:type="dxa" w:w="1081"/>
           </w:tcPr>
           <w:p>
             <w:pPr>
@@ -665,13 +767,13 @@
               <w:rPr>
                 <w:sz w:val="20"/>
               </w:rPr>
-              <w:t>59</w:t>
+              <w:t>雙人</w:t>
             </w:r>
           </w:p>
         </w:tc>
         <w:tc>
           <w:tcPr>
-            <w:tcW w:type="dxa" w:w="1441"/>
+            <w:tcW w:type="dxa" w:w="1081"/>
           </w:tcPr>
           <w:p>
             <w:pPr>
@@ -681,13 +783,13 @@
               <w:rPr>
                 <w:sz w:val="20"/>
               </w:rPr>
-              <w:t>59</w:t>
+              <w:t>三人</w:t>
             </w:r>
           </w:p>
         </w:tc>
         <w:tc>
           <w:tcPr>
-            <w:tcW w:type="dxa" w:w="1441"/>
+            <w:tcW w:type="dxa" w:w="1081"/>
           </w:tcPr>
           <w:p>
             <w:pPr>
@@ -697,13 +799,13 @@
               <w:rPr>
                 <w:sz w:val="20"/>
               </w:rPr>
-              <w:t>54</w:t>
+              <w:t>79</w:t>
             </w:r>
           </w:p>
         </w:tc>
         <w:tc>
           <w:tcPr>
-            <w:tcW w:type="dxa" w:w="1441"/>
+            <w:tcW w:type="dxa" w:w="1081"/>
           </w:tcPr>
           <w:p>
             <w:pPr>
@@ -713,7 +815,39 @@
               <w:rPr>
                 <w:sz w:val="20"/>
               </w:rPr>
-              <w:t>54</w:t>
+              <w:t>79</w:t>
+            </w:r>
+          </w:p>
+        </w:tc>
+        <w:tc>
+          <w:tcPr>
+            <w:tcW w:type="dxa" w:w="1081"/>
+          </w:tcPr>
+          <w:p>
+            <w:pPr>
+              <w:jc w:val="center"/>
+            </w:pPr>
+            <w:r>
+              <w:rPr>
+                <w:sz w:val="20"/>
+              </w:rPr>
+              <w:t>74</w:t>
+            </w:r>
+          </w:p>
+        </w:tc>
+        <w:tc>
+          <w:tcPr>
+            <w:tcW w:type="dxa" w:w="1081"/>
+          </w:tcPr>
+          <w:p>
+            <w:pPr>
+              <w:jc w:val="center"/>
+            </w:pPr>
+            <w:r>
+              <w:rPr>
+                <w:sz w:val="20"/>
+              </w:rPr>
+              <w:t>74</w:t>
             </w:r>
           </w:p>
         </w:tc>
@@ -721,7 +855,7 @@
       <w:tr>
         <w:tc>
           <w:tcPr>
-            <w:tcW w:type="dxa" w:w="1441"/>
+            <w:tcW w:type="dxa" w:w="1081"/>
           </w:tcPr>
           <w:p>
             <w:pPr>
@@ -737,7 +871,7 @@
         </w:tc>
         <w:tc>
           <w:tcPr>
-            <w:tcW w:type="dxa" w:w="1441"/>
+            <w:tcW w:type="dxa" w:w="1081"/>
           </w:tcPr>
           <w:p>
             <w:pPr>
@@ -747,13 +881,45 @@
               <w:rPr>
                 <w:sz w:val="20"/>
               </w:rPr>
-              <w:t>雙人房</w:t>
+              <w:t>雙人</w:t>
             </w:r>
           </w:p>
         </w:tc>
         <w:tc>
           <w:tcPr>
-            <w:tcW w:type="dxa" w:w="1441"/>
+            <w:tcW w:type="dxa" w:w="1081"/>
+          </w:tcPr>
+          <w:p>
+            <w:pPr>
+              <w:jc w:val="center"/>
+            </w:pPr>
+            <w:r>
+              <w:rPr>
+                <w:sz w:val="20"/>
+              </w:rPr>
+              <w:t>四人</w:t>
+            </w:r>
+          </w:p>
+        </w:tc>
+        <w:tc>
+          <w:tcPr>
+            <w:tcW w:type="dxa" w:w="1081"/>
+          </w:tcPr>
+          <w:p>
+            <w:pPr>
+              <w:jc w:val="center"/>
+            </w:pPr>
+            <w:r>
+              <w:rPr>
+                <w:sz w:val="20"/>
+              </w:rPr>
+              <w:t>三人</w:t>
+            </w:r>
+          </w:p>
+        </w:tc>
+        <w:tc>
+          <w:tcPr>
+            <w:tcW w:type="dxa" w:w="1081"/>
           </w:tcPr>
           <w:p>
             <w:pPr>
@@ -769,7 +935,7 @@
         </w:tc>
         <w:tc>
           <w:tcPr>
-            <w:tcW w:type="dxa" w:w="1441"/>
+            <w:tcW w:type="dxa" w:w="1081"/>
           </w:tcPr>
           <w:p>
             <w:pPr>
@@ -785,7 +951,7 @@
         </w:tc>
         <w:tc>
           <w:tcPr>
-            <w:tcW w:type="dxa" w:w="1441"/>
+            <w:tcW w:type="dxa" w:w="1081"/>
           </w:tcPr>
           <w:p>
             <w:pPr>
@@ -795,13 +961,13 @@
               <w:rPr>
                 <w:sz w:val="20"/>
               </w:rPr>
-              <w:t>55</w:t>
+              <w:t>85</w:t>
             </w:r>
           </w:p>
         </w:tc>
         <w:tc>
           <w:tcPr>
-            <w:tcW w:type="dxa" w:w="1441"/>
+            <w:tcW w:type="dxa" w:w="1081"/>
           </w:tcPr>
           <w:p>
             <w:pPr>
@@ -811,7 +977,7 @@
               <w:rPr>
                 <w:sz w:val="20"/>
               </w:rPr>
-              <w:t>55</w:t>
+              <w:t>85</w:t>
             </w:r>
           </w:p>
         </w:tc>
@@ -839,7 +1005,7 @@
           <w:rFonts w:ascii="新細明體" w:hAnsi="新細明體" w:eastAsia="新細明體"/>
           <w:sz w:val="24"/>
         </w:rPr>
-        <w:t>註：同一房間內的不同床位（如 101-1 和 101-2）對同一學生的偏好分數相同，因為兩個床位共享相同的房間屬性。</w:t>
+        <w:t>註：同一房間內的不同床位對同一學生的偏好分數相同。</w:t>
       </w:r>
     </w:p>
     <w:p>
@@ -862,18 +1028,20 @@
         <w:tblLook w:firstColumn="1" w:firstRow="1" w:lastColumn="0" w:lastRow="0" w:noHBand="0" w:noVBand="1" w:val="04A0"/>
       </w:tblPr>
       <w:tblGrid>
-        <w:gridCol w:w="1235"/>
-        <w:gridCol w:w="1235"/>
-        <w:gridCol w:w="1235"/>
-        <w:gridCol w:w="1235"/>
-        <w:gridCol w:w="1235"/>
-        <w:gridCol w:w="1235"/>
-        <w:gridCol w:w="1235"/>
+        <w:gridCol w:w="961"/>
+        <w:gridCol w:w="961"/>
+        <w:gridCol w:w="961"/>
+        <w:gridCol w:w="961"/>
+        <w:gridCol w:w="961"/>
+        <w:gridCol w:w="961"/>
+        <w:gridCol w:w="961"/>
+        <w:gridCol w:w="961"/>
+        <w:gridCol w:w="961"/>
       </w:tblGrid>
       <w:tr>
         <w:tc>
           <w:tcPr>
-            <w:tcW w:type="dxa" w:w="1235"/>
+            <w:tcW w:type="dxa" w:w="961"/>
             <w:shd w:val="clear" w:fill="E8E0F0"/>
           </w:tcPr>
           <w:p>
@@ -891,7 +1059,7 @@
         </w:tc>
         <w:tc>
           <w:tcPr>
-            <w:tcW w:type="dxa" w:w="1235"/>
+            <w:tcW w:type="dxa" w:w="961"/>
             <w:shd w:val="clear" w:fill="E8E0F0"/>
           </w:tcPr>
           <w:p>
@@ -903,13 +1071,49 @@
                 <w:b/>
                 <w:sz w:val="20"/>
               </w:rPr>
-              <w:t>偏好房型</w:t>
+              <w:t>志願一</w:t>
             </w:r>
           </w:p>
         </w:tc>
         <w:tc>
           <w:tcPr>
-            <w:tcW w:type="dxa" w:w="1235"/>
+            <w:tcW w:type="dxa" w:w="961"/>
+            <w:shd w:val="clear" w:fill="E8E0F0"/>
+          </w:tcPr>
+          <w:p>
+            <w:pPr>
+              <w:jc w:val="center"/>
+            </w:pPr>
+            <w:r>
+              <w:rPr>
+                <w:b/>
+                <w:sz w:val="20"/>
+              </w:rPr>
+              <w:t>志願二</w:t>
+            </w:r>
+          </w:p>
+        </w:tc>
+        <w:tc>
+          <w:tcPr>
+            <w:tcW w:type="dxa" w:w="961"/>
+            <w:shd w:val="clear" w:fill="E8E0F0"/>
+          </w:tcPr>
+          <w:p>
+            <w:pPr>
+              <w:jc w:val="center"/>
+            </w:pPr>
+            <w:r>
+              <w:rPr>
+                <w:b/>
+                <w:sz w:val="20"/>
+              </w:rPr>
+              <w:t>志願三</w:t>
+            </w:r>
+          </w:p>
+        </w:tc>
+        <w:tc>
+          <w:tcPr>
+            <w:tcW w:type="dxa" w:w="961"/>
             <w:shd w:val="clear" w:fill="E8E0F0"/>
           </w:tcPr>
           <w:p>
@@ -927,7 +1131,7 @@
         </w:tc>
         <w:tc>
           <w:tcPr>
-            <w:tcW w:type="dxa" w:w="1235"/>
+            <w:tcW w:type="dxa" w:w="961"/>
             <w:shd w:val="clear" w:fill="E8E0F0"/>
           </w:tcPr>
           <w:p>
@@ -945,7 +1149,7 @@
         </w:tc>
         <w:tc>
           <w:tcPr>
-            <w:tcW w:type="dxa" w:w="1235"/>
+            <w:tcW w:type="dxa" w:w="961"/>
             <w:shd w:val="clear" w:fill="E8E0F0"/>
           </w:tcPr>
           <w:p>
@@ -963,7 +1167,7 @@
         </w:tc>
         <w:tc>
           <w:tcPr>
-            <w:tcW w:type="dxa" w:w="1235"/>
+            <w:tcW w:type="dxa" w:w="961"/>
             <w:shd w:val="clear" w:fill="E8E0F0"/>
           </w:tcPr>
           <w:p>
@@ -981,7 +1185,7 @@
         </w:tc>
         <w:tc>
           <w:tcPr>
-            <w:tcW w:type="dxa" w:w="1235"/>
+            <w:tcW w:type="dxa" w:w="961"/>
             <w:shd w:val="clear" w:fill="E8E0F0"/>
           </w:tcPr>
           <w:p>
@@ -1001,7 +1205,7 @@
       <w:tr>
         <w:tc>
           <w:tcPr>
-            <w:tcW w:type="dxa" w:w="1235"/>
+            <w:tcW w:type="dxa" w:w="961"/>
           </w:tcPr>
           <w:p>
             <w:pPr>
@@ -1017,7 +1221,7 @@
         </w:tc>
         <w:tc>
           <w:tcPr>
-            <w:tcW w:type="dxa" w:w="1235"/>
+            <w:tcW w:type="dxa" w:w="961"/>
           </w:tcPr>
           <w:p>
             <w:pPr>
@@ -1027,13 +1231,45 @@
               <w:rPr>
                 <w:sz w:val="20"/>
               </w:rPr>
-              <w:t>雙人房</w:t>
+              <w:t>雙人</w:t>
             </w:r>
           </w:p>
         </w:tc>
         <w:tc>
           <w:tcPr>
-            <w:tcW w:type="dxa" w:w="1235"/>
+            <w:tcW w:type="dxa" w:w="961"/>
+          </w:tcPr>
+          <w:p>
+            <w:pPr>
+              <w:jc w:val="center"/>
+            </w:pPr>
+            <w:r>
+              <w:rPr>
+                <w:sz w:val="20"/>
+              </w:rPr>
+              <w:t>三人</w:t>
+            </w:r>
+          </w:p>
+        </w:tc>
+        <w:tc>
+          <w:tcPr>
+            <w:tcW w:type="dxa" w:w="961"/>
+          </w:tcPr>
+          <w:p>
+            <w:pPr>
+              <w:jc w:val="center"/>
+            </w:pPr>
+            <w:r>
+              <w:rPr>
+                <w:sz w:val="20"/>
+              </w:rPr>
+              <w:t>四人</w:t>
+            </w:r>
+          </w:p>
+        </w:tc>
+        <w:tc>
+          <w:tcPr>
+            <w:tcW w:type="dxa" w:w="961"/>
           </w:tcPr>
           <w:p>
             <w:pPr>
@@ -1049,7 +1285,7 @@
         </w:tc>
         <w:tc>
           <w:tcPr>
-            <w:tcW w:type="dxa" w:w="1235"/>
+            <w:tcW w:type="dxa" w:w="961"/>
           </w:tcPr>
           <w:p>
             <w:pPr>
@@ -1065,7 +1301,7 @@
         </w:tc>
         <w:tc>
           <w:tcPr>
-            <w:tcW w:type="dxa" w:w="1235"/>
+            <w:tcW w:type="dxa" w:w="961"/>
           </w:tcPr>
           <w:p>
             <w:pPr>
@@ -1075,13 +1311,13 @@
               <w:rPr>
                 <w:sz w:val="20"/>
               </w:rPr>
-              <w:t>37</w:t>
+              <w:t>57</w:t>
             </w:r>
           </w:p>
         </w:tc>
         <w:tc>
           <w:tcPr>
-            <w:tcW w:type="dxa" w:w="1235"/>
+            <w:tcW w:type="dxa" w:w="961"/>
           </w:tcPr>
           <w:p>
             <w:pPr>
@@ -1091,13 +1327,13 @@
               <w:rPr>
                 <w:sz w:val="20"/>
               </w:rPr>
-              <w:t>37</w:t>
+              <w:t>57</w:t>
             </w:r>
           </w:p>
         </w:tc>
         <w:tc>
           <w:tcPr>
-            <w:tcW w:type="dxa" w:w="1235"/>
+            <w:tcW w:type="dxa" w:w="961"/>
           </w:tcPr>
           <w:p>
             <w:pPr>
@@ -1107,7 +1343,7 @@
               <w:rPr>
                 <w:sz w:val="20"/>
               </w:rPr>
-              <w:t>37</w:t>
+              <w:t>57</w:t>
             </w:r>
           </w:p>
         </w:tc>
@@ -1115,7 +1351,7 @@
       <w:tr>
         <w:tc>
           <w:tcPr>
-            <w:tcW w:type="dxa" w:w="1235"/>
+            <w:tcW w:type="dxa" w:w="961"/>
           </w:tcPr>
           <w:p>
             <w:pPr>
@@ -1131,7 +1367,7 @@
         </w:tc>
         <w:tc>
           <w:tcPr>
-            <w:tcW w:type="dxa" w:w="1235"/>
+            <w:tcW w:type="dxa" w:w="961"/>
           </w:tcPr>
           <w:p>
             <w:pPr>
@@ -1141,13 +1377,13 @@
               <w:rPr>
                 <w:sz w:val="20"/>
               </w:rPr>
-              <w:t>三人房</w:t>
+              <w:t>三人</w:t>
             </w:r>
           </w:p>
         </w:tc>
         <w:tc>
           <w:tcPr>
-            <w:tcW w:type="dxa" w:w="1235"/>
+            <w:tcW w:type="dxa" w:w="961"/>
           </w:tcPr>
           <w:p>
             <w:pPr>
@@ -1157,13 +1393,13 @@
               <w:rPr>
                 <w:sz w:val="20"/>
               </w:rPr>
-              <w:t>38</w:t>
+              <w:t>雙人</w:t>
             </w:r>
           </w:p>
         </w:tc>
         <w:tc>
           <w:tcPr>
-            <w:tcW w:type="dxa" w:w="1235"/>
+            <w:tcW w:type="dxa" w:w="961"/>
           </w:tcPr>
           <w:p>
             <w:pPr>
@@ -1173,13 +1409,45 @@
               <w:rPr>
                 <w:sz w:val="20"/>
               </w:rPr>
-              <w:t>38</w:t>
+              <w:t>不限</w:t>
             </w:r>
           </w:p>
         </w:tc>
         <w:tc>
           <w:tcPr>
-            <w:tcW w:type="dxa" w:w="1235"/>
+            <w:tcW w:type="dxa" w:w="961"/>
+          </w:tcPr>
+          <w:p>
+            <w:pPr>
+              <w:jc w:val="center"/>
+            </w:pPr>
+            <w:r>
+              <w:rPr>
+                <w:sz w:val="20"/>
+              </w:rPr>
+              <w:t>58</w:t>
+            </w:r>
+          </w:p>
+        </w:tc>
+        <w:tc>
+          <w:tcPr>
+            <w:tcW w:type="dxa" w:w="961"/>
+          </w:tcPr>
+          <w:p>
+            <w:pPr>
+              <w:jc w:val="center"/>
+            </w:pPr>
+            <w:r>
+              <w:rPr>
+                <w:sz w:val="20"/>
+              </w:rPr>
+              <w:t>58</w:t>
+            </w:r>
+          </w:p>
+        </w:tc>
+        <w:tc>
+          <w:tcPr>
+            <w:tcW w:type="dxa" w:w="961"/>
           </w:tcPr>
           <w:p>
             <w:pPr>
@@ -1195,7 +1463,7 @@
         </w:tc>
         <w:tc>
           <w:tcPr>
-            <w:tcW w:type="dxa" w:w="1235"/>
+            <w:tcW w:type="dxa" w:w="961"/>
           </w:tcPr>
           <w:p>
             <w:pPr>
@@ -1211,7 +1479,7 @@
         </w:tc>
         <w:tc>
           <w:tcPr>
-            <w:tcW w:type="dxa" w:w="1235"/>
+            <w:tcW w:type="dxa" w:w="961"/>
           </w:tcPr>
           <w:p>
             <w:pPr>
@@ -1229,7 +1497,7 @@
       <w:tr>
         <w:tc>
           <w:tcPr>
-            <w:tcW w:type="dxa" w:w="1235"/>
+            <w:tcW w:type="dxa" w:w="961"/>
           </w:tcPr>
           <w:p>
             <w:pPr>
@@ -1245,7 +1513,7 @@
         </w:tc>
         <w:tc>
           <w:tcPr>
-            <w:tcW w:type="dxa" w:w="1235"/>
+            <w:tcW w:type="dxa" w:w="961"/>
           </w:tcPr>
           <w:p>
             <w:pPr>
@@ -1255,13 +1523,45 @@
               <w:rPr>
                 <w:sz w:val="20"/>
               </w:rPr>
-              <w:t>雙人房</w:t>
+              <w:t>雙人</w:t>
             </w:r>
           </w:p>
         </w:tc>
         <w:tc>
           <w:tcPr>
-            <w:tcW w:type="dxa" w:w="1235"/>
+            <w:tcW w:type="dxa" w:w="961"/>
+          </w:tcPr>
+          <w:p>
+            <w:pPr>
+              <w:jc w:val="center"/>
+            </w:pPr>
+            <w:r>
+              <w:rPr>
+                <w:sz w:val="20"/>
+              </w:rPr>
+              <w:t>不限</w:t>
+            </w:r>
+          </w:p>
+        </w:tc>
+        <w:tc>
+          <w:tcPr>
+            <w:tcW w:type="dxa" w:w="961"/>
+          </w:tcPr>
+          <w:p>
+            <w:pPr>
+              <w:jc w:val="center"/>
+            </w:pPr>
+            <w:r>
+              <w:rPr>
+                <w:sz w:val="20"/>
+              </w:rPr>
+              <w:t>三人</w:t>
+            </w:r>
+          </w:p>
+        </w:tc>
+        <w:tc>
+          <w:tcPr>
+            <w:tcW w:type="dxa" w:w="961"/>
           </w:tcPr>
           <w:p>
             <w:pPr>
@@ -1277,7 +1577,7 @@
         </w:tc>
         <w:tc>
           <w:tcPr>
-            <w:tcW w:type="dxa" w:w="1235"/>
+            <w:tcW w:type="dxa" w:w="961"/>
           </w:tcPr>
           <w:p>
             <w:pPr>
@@ -1293,7 +1593,7 @@
         </w:tc>
         <w:tc>
           <w:tcPr>
-            <w:tcW w:type="dxa" w:w="1235"/>
+            <w:tcW w:type="dxa" w:w="961"/>
           </w:tcPr>
           <w:p>
             <w:pPr>
@@ -1303,13 +1603,13 @@
               <w:rPr>
                 <w:sz w:val="20"/>
               </w:rPr>
-              <w:t>39</w:t>
+              <w:t>59</w:t>
             </w:r>
           </w:p>
         </w:tc>
         <w:tc>
           <w:tcPr>
-            <w:tcW w:type="dxa" w:w="1235"/>
+            <w:tcW w:type="dxa" w:w="961"/>
           </w:tcPr>
           <w:p>
             <w:pPr>
@@ -1319,13 +1619,13 @@
               <w:rPr>
                 <w:sz w:val="20"/>
               </w:rPr>
-              <w:t>39</w:t>
+              <w:t>59</w:t>
             </w:r>
           </w:p>
         </w:tc>
         <w:tc>
           <w:tcPr>
-            <w:tcW w:type="dxa" w:w="1235"/>
+            <w:tcW w:type="dxa" w:w="961"/>
           </w:tcPr>
           <w:p>
             <w:pPr>
@@ -1335,7 +1635,7 @@
               <w:rPr>
                 <w:sz w:val="20"/>
               </w:rPr>
-              <w:t>39</w:t>
+              <w:t>59</w:t>
             </w:r>
           </w:p>
         </w:tc>
@@ -1343,7 +1643,7 @@
       <w:tr>
         <w:tc>
           <w:tcPr>
-            <w:tcW w:type="dxa" w:w="1235"/>
+            <w:tcW w:type="dxa" w:w="961"/>
           </w:tcPr>
           <w:p>
             <w:pPr>
@@ -1359,7 +1659,7 @@
         </w:tc>
         <w:tc>
           <w:tcPr>
-            <w:tcW w:type="dxa" w:w="1235"/>
+            <w:tcW w:type="dxa" w:w="961"/>
           </w:tcPr>
           <w:p>
             <w:pPr>
@@ -1375,7 +1675,7 @@
         </w:tc>
         <w:tc>
           <w:tcPr>
-            <w:tcW w:type="dxa" w:w="1235"/>
+            <w:tcW w:type="dxa" w:w="961"/>
           </w:tcPr>
           <w:p>
             <w:pPr>
@@ -1385,13 +1685,13 @@
               <w:rPr>
                 <w:sz w:val="20"/>
               </w:rPr>
-              <w:t>50</w:t>
+              <w:t>雙人</w:t>
             </w:r>
           </w:p>
         </w:tc>
         <w:tc>
           <w:tcPr>
-            <w:tcW w:type="dxa" w:w="1235"/>
+            <w:tcW w:type="dxa" w:w="961"/>
           </w:tcPr>
           <w:p>
             <w:pPr>
@@ -1401,13 +1701,13 @@
               <w:rPr>
                 <w:sz w:val="20"/>
               </w:rPr>
-              <w:t>50</w:t>
+              <w:t>三人</w:t>
             </w:r>
           </w:p>
         </w:tc>
         <w:tc>
           <w:tcPr>
-            <w:tcW w:type="dxa" w:w="1235"/>
+            <w:tcW w:type="dxa" w:w="961"/>
           </w:tcPr>
           <w:p>
             <w:pPr>
@@ -1417,13 +1717,13 @@
               <w:rPr>
                 <w:sz w:val="20"/>
               </w:rPr>
-              <w:t>60</w:t>
+              <w:t>70</w:t>
             </w:r>
           </w:p>
         </w:tc>
         <w:tc>
           <w:tcPr>
-            <w:tcW w:type="dxa" w:w="1235"/>
+            <w:tcW w:type="dxa" w:w="961"/>
           </w:tcPr>
           <w:p>
             <w:pPr>
@@ -1433,13 +1733,13 @@
               <w:rPr>
                 <w:sz w:val="20"/>
               </w:rPr>
-              <w:t>60</w:t>
+              <w:t>70</w:t>
             </w:r>
           </w:p>
         </w:tc>
         <w:tc>
           <w:tcPr>
-            <w:tcW w:type="dxa" w:w="1235"/>
+            <w:tcW w:type="dxa" w:w="961"/>
           </w:tcPr>
           <w:p>
             <w:pPr>
@@ -1449,7 +1749,39 @@
               <w:rPr>
                 <w:sz w:val="20"/>
               </w:rPr>
-              <w:t>60</w:t>
+              <w:t>80</w:t>
+            </w:r>
+          </w:p>
+        </w:tc>
+        <w:tc>
+          <w:tcPr>
+            <w:tcW w:type="dxa" w:w="961"/>
+          </w:tcPr>
+          <w:p>
+            <w:pPr>
+              <w:jc w:val="center"/>
+            </w:pPr>
+            <w:r>
+              <w:rPr>
+                <w:sz w:val="20"/>
+              </w:rPr>
+              <w:t>80</w:t>
+            </w:r>
+          </w:p>
+        </w:tc>
+        <w:tc>
+          <w:tcPr>
+            <w:tcW w:type="dxa" w:w="961"/>
+          </w:tcPr>
+          <w:p>
+            <w:pPr>
+              <w:jc w:val="center"/>
+            </w:pPr>
+            <w:r>
+              <w:rPr>
+                <w:sz w:val="20"/>
+              </w:rPr>
+              <w:t>80</w:t>
             </w:r>
           </w:p>
         </w:tc>
@@ -1457,7 +1789,7 @@
       <w:tr>
         <w:tc>
           <w:tcPr>
-            <w:tcW w:type="dxa" w:w="1235"/>
+            <w:tcW w:type="dxa" w:w="961"/>
           </w:tcPr>
           <w:p>
             <w:pPr>
@@ -1473,7 +1805,7 @@
         </w:tc>
         <w:tc>
           <w:tcPr>
-            <w:tcW w:type="dxa" w:w="1235"/>
+            <w:tcW w:type="dxa" w:w="961"/>
           </w:tcPr>
           <w:p>
             <w:pPr>
@@ -1483,13 +1815,13 @@
               <w:rPr>
                 <w:sz w:val="20"/>
               </w:rPr>
-              <w:t>三人房</w:t>
+              <w:t>三人</w:t>
             </w:r>
           </w:p>
         </w:tc>
         <w:tc>
           <w:tcPr>
-            <w:tcW w:type="dxa" w:w="1235"/>
+            <w:tcW w:type="dxa" w:w="961"/>
           </w:tcPr>
           <w:p>
             <w:pPr>
@@ -1499,13 +1831,13 @@
               <w:rPr>
                 <w:sz w:val="20"/>
               </w:rPr>
-              <w:t>41</w:t>
+              <w:t>四人</w:t>
             </w:r>
           </w:p>
         </w:tc>
         <w:tc>
           <w:tcPr>
-            <w:tcW w:type="dxa" w:w="1235"/>
+            <w:tcW w:type="dxa" w:w="961"/>
           </w:tcPr>
           <w:p>
             <w:pPr>
@@ -1515,13 +1847,45 @@
               <w:rPr>
                 <w:sz w:val="20"/>
               </w:rPr>
-              <w:t>41</w:t>
+              <w:t>雙人</w:t>
             </w:r>
           </w:p>
         </w:tc>
         <w:tc>
           <w:tcPr>
-            <w:tcW w:type="dxa" w:w="1235"/>
+            <w:tcW w:type="dxa" w:w="961"/>
+          </w:tcPr>
+          <w:p>
+            <w:pPr>
+              <w:jc w:val="center"/>
+            </w:pPr>
+            <w:r>
+              <w:rPr>
+                <w:sz w:val="20"/>
+              </w:rPr>
+              <w:t>31</w:t>
+            </w:r>
+          </w:p>
+        </w:tc>
+        <w:tc>
+          <w:tcPr>
+            <w:tcW w:type="dxa" w:w="961"/>
+          </w:tcPr>
+          <w:p>
+            <w:pPr>
+              <w:jc w:val="center"/>
+            </w:pPr>
+            <w:r>
+              <w:rPr>
+                <w:sz w:val="20"/>
+              </w:rPr>
+              <w:t>31</w:t>
+            </w:r>
+          </w:p>
+        </w:tc>
+        <w:tc>
+          <w:tcPr>
+            <w:tcW w:type="dxa" w:w="961"/>
           </w:tcPr>
           <w:p>
             <w:pPr>
@@ -1537,7 +1901,7 @@
         </w:tc>
         <w:tc>
           <w:tcPr>
-            <w:tcW w:type="dxa" w:w="1235"/>
+            <w:tcW w:type="dxa" w:w="961"/>
           </w:tcPr>
           <w:p>
             <w:pPr>
@@ -1553,7 +1917,7 @@
         </w:tc>
         <w:tc>
           <w:tcPr>
-            <w:tcW w:type="dxa" w:w="1235"/>
+            <w:tcW w:type="dxa" w:w="961"/>
           </w:tcPr>
           <w:p>
             <w:pPr>
@@ -1689,7 +2053,7 @@
           <w:rFonts w:ascii="新細明體" w:hAnsi="新細明體" w:eastAsia="新細明體"/>
           <w:sz w:val="24"/>
         </w:rPr>
-        <w:t>(1) 基礎分數（20-50 分）：根據學生與床位的編號組合產生的固定差異值，模擬不同學生對不同房間的個人偏好差異（例如地理位置、室友關係等無法量化的因素）。</w:t>
+        <w:t>(1) 基礎分數（10-39 分）：根據學生與床位的編號組合產生的隨機基礎值，確保每個床位對不同學生的基本分數有所區別。</w:t>
       </w:r>
     </w:p>
     <w:p>
@@ -1701,7 +2065,7 @@
           <w:rFonts w:ascii="新細明體" w:hAnsi="新細明體" w:eastAsia="新細明體"/>
           <w:sz w:val="24"/>
         </w:rPr>
-        <w:t>(2) 房型匹配加分（0-50 分）：</w:t>
+        <w:t>(2) 志願匹配加分（0-60 分）：</w:t>
       </w:r>
     </w:p>
     <w:tbl>
@@ -1766,7 +2130,7 @@
               <w:rPr>
                 <w:sz w:val="20"/>
               </w:rPr>
-              <w:t>完全符合（偏好房型 = 房間類型）</w:t>
+              <w:t>志願一命中（或志願一為不限）</w:t>
             </w:r>
           </w:p>
         </w:tc>
@@ -1782,7 +2146,7 @@
               <w:rPr>
                 <w:sz w:val="20"/>
               </w:rPr>
-              <w:t>+50</w:t>
+              <w:t>+60</w:t>
             </w:r>
           </w:p>
         </w:tc>
@@ -1800,7 +2164,7 @@
               <w:rPr>
                 <w:sz w:val="20"/>
               </w:rPr>
-              <w:t>偏好「不限」</w:t>
+              <w:t>志願二命中（或志願二為不限）</w:t>
             </w:r>
           </w:p>
         </w:tc>
@@ -1816,7 +2180,7 @@
               <w:rPr>
                 <w:sz w:val="20"/>
               </w:rPr>
-              <w:t>+30</w:t>
+              <w:t>+40</w:t>
             </w:r>
           </w:p>
         </w:tc>
@@ -1834,7 +2198,7 @@
               <w:rPr>
                 <w:sz w:val="20"/>
               </w:rPr>
-              <w:t>差一級（例如偏好雙人、實際三人）</w:t>
+              <w:t>志願三命中（或志願三為不限）</w:t>
             </w:r>
           </w:p>
         </w:tc>
@@ -1868,7 +2232,7 @@
               <w:rPr>
                 <w:sz w:val="20"/>
               </w:rPr>
-              <w:t>差兩級（例如偏好雙人、實際四人）</w:t>
+              <w:t>皆未命中</w:t>
             </w:r>
           </w:p>
         </w:tc>
@@ -1884,7 +2248,7 @@
               <w:rPr>
                 <w:sz w:val="20"/>
               </w:rPr>
-              <w:t>+5</w:t>
+              <w:t>0</w:t>
             </w:r>
           </w:p>
         </w:tc>
@@ -1900,7 +2264,7 @@
           <w:rFonts w:ascii="新細明體" w:hAnsi="新細明體" w:eastAsia="新細明體"/>
           <w:sz w:val="20"/>
         </w:rPr>
-        <w:t>表 3  房型匹配加分規則</w:t>
+        <w:t>表 3  志願匹配加分規則</w:t>
       </w:r>
     </w:p>
     <w:p>
@@ -1912,7 +2276,7 @@
           <w:rFonts w:ascii="新細明體" w:hAnsi="新細明體" w:eastAsia="新細明體"/>
           <w:sz w:val="24"/>
         </w:rPr>
-        <w:t>例如：學生 A 偏好「雙人房」，床位 101-1 屬於雙人房 → 基礎分 27 + 房型匹配加分 50 = 77 分。</w:t>
+        <w:t>例如：學生 A 的志願為「雙人、三人、四人」，床位 101-1 屬於雙人房，因此命中志願一 → 基礎分 17 + 志願一加分 60 = 77 分。</w:t>
       </w:r>
     </w:p>
     <w:p>
@@ -1961,7 +2325,7 @@
           <w:rFonts w:ascii="新細明體" w:hAnsi="新細明體" w:eastAsia="新細明體"/>
           <w:sz w:val="24"/>
         </w:rPr>
-        <w:t>右側側邊欄由上而下包含：(1) 房間設定區——設定雙人房、三人房、四人房的數量，點擊「生成」按鈕即可建立房間；(2) 學生偏好區——每位學生透過下拉選單選擇偏好房型；(3) 演算法選擇區——三種演算法的 Radio 選項；(4) 執行按鈕區——執行配對、三算法比較、清除結果；(5) 結果展示區——按房間分組顯示入住學生及分數。</w:t>
+        <w:t>右側側邊欄由上而下包含：(1) 房間設定區——設定雙人房、三人房、四人房的數量，點擊「生成」按鈕即可建立房間；(2) 學生偏好區——每位學生透過下拉選單設定三個志願；(3) 演算法區——顯示採用分支定界法；(4) 執行按鈕區——執行配對、清除結果；(5) 結果展示區——按房間分組顯示入住學生及分數。</w:t>
       </w:r>
     </w:p>
     <w:p>
@@ -2124,7 +2488,7 @@
               <w:rPr>
                 <w:sz w:val="20"/>
               </w:rPr>
-              <w:t>點擊「生成」或載入範例</w:t>
+              <w:t>輸入學生人數（預設等於床位數），點擊「生成」或載入範例</w:t>
             </w:r>
           </w:p>
         </w:tc>
@@ -2140,7 +2504,7 @@
               <w:rPr>
                 <w:sz w:val="20"/>
               </w:rPr>
-              <w:t>建立房間、生成學生（含隨機偏好）、自動計算分數矩陣</w:t>
+              <w:t>建立房間、生成學生（含隨機志願序）、自動計算分數矩陣</w:t>
             </w:r>
           </w:p>
         </w:tc>
@@ -2174,7 +2538,7 @@
               <w:rPr>
                 <w:sz w:val="20"/>
               </w:rPr>
-              <w:t>（可選）調整每位學生的偏好房型</w:t>
+              <w:t>（可選）調整每位學生的志願一、二、三</w:t>
             </w:r>
           </w:p>
         </w:tc>
@@ -2274,7 +2638,7 @@
               <w:rPr>
                 <w:sz w:val="20"/>
               </w:rPr>
-              <w:t>選擇演算法，點擊「執行配對」</w:t>
+              <w:t>點擊「執行配對」</w:t>
             </w:r>
           </w:p>
         </w:tc>
@@ -2290,7 +2654,7 @@
               <w:rPr>
                 <w:sz w:val="20"/>
               </w:rPr>
-              <w:t>計算最佳配對，二部圖顯示綠色連線，矩陣高亮配對儲存格</w:t>
+              <w:t>以分支定界法計算最佳配對，二部圖顯示綠色連線，矩陣高亮配對儲存格</w:t>
             </w:r>
           </w:p>
         </w:tc>
@@ -2340,57 +2704,7 @@
               <w:rPr>
                 <w:sz w:val="20"/>
               </w:rPr>
-              <w:t>顯示總分、按房間分組的配對明細、穩定性檢測</w:t>
-            </w:r>
-          </w:p>
-        </w:tc>
-      </w:tr>
-      <w:tr>
-        <w:tc>
-          <w:tcPr>
-            <w:tcW w:type="dxa" w:w="2882"/>
-          </w:tcPr>
-          <w:p>
-            <w:pPr>
-              <w:jc w:val="center"/>
-            </w:pPr>
-            <w:r>
-              <w:rPr>
-                <w:sz w:val="20"/>
-              </w:rPr>
-              <w:t>7</w:t>
-            </w:r>
-          </w:p>
-        </w:tc>
-        <w:tc>
-          <w:tcPr>
-            <w:tcW w:type="dxa" w:w="2882"/>
-          </w:tcPr>
-          <w:p>
-            <w:pPr>
-              <w:jc w:val="center"/>
-            </w:pPr>
-            <w:r>
-              <w:rPr>
-                <w:sz w:val="20"/>
-              </w:rPr>
-              <w:t>點擊「三算法比較」</w:t>
-            </w:r>
-          </w:p>
-        </w:tc>
-        <w:tc>
-          <w:tcPr>
-            <w:tcW w:type="dxa" w:w="2882"/>
-          </w:tcPr>
-          <w:p>
-            <w:pPr>
-              <w:jc w:val="center"/>
-            </w:pPr>
-            <w:r>
-              <w:rPr>
-                <w:sz w:val="20"/>
-              </w:rPr>
-              <w:t>同時運行三種演算法，以表格比較各項指標</w:t>
+              <w:t>顯示總分、搜尋節點數、修剪次數、按房間分組的配對明細、穩定性檢測</w:t>
             </w:r>
           </w:p>
         </w:tc>
@@ -2535,7 +2849,7 @@
               <w:rPr>
                 <w:sz w:val="20"/>
               </w:rPr>
-              <w:t>支援雙人房/三人房/四人房的混合配置，上限各 3/2/2 間</w:t>
+              <w:t>支援雙人房/三人房/四人房的混合配置，上限各 5/5/5 間</w:t>
             </w:r>
           </w:p>
         </w:tc>
@@ -2569,7 +2883,7 @@
               <w:rPr>
                 <w:sz w:val="20"/>
               </w:rPr>
-              <w:t>學生偏好設定</w:t>
+              <w:t>學生人數與志願序</w:t>
             </w:r>
           </w:p>
         </w:tc>
@@ -2585,7 +2899,7 @@
               <w:rPr>
                 <w:sz w:val="20"/>
               </w:rPr>
-              <w:t>每位學生選擇偏好房型（雙人/三人/四人/不限）</w:t>
+              <w:t>可自訂學生人數，每位學生填寫三個偏好房型志願（雙人/三人/四人/不限）</w:t>
             </w:r>
           </w:p>
         </w:tc>
@@ -2635,7 +2949,7 @@
               <w:rPr>
                 <w:sz w:val="20"/>
               </w:rPr>
-              <w:t>根據房型匹配度自動計算 0-100 分</w:t>
+              <w:t>根據志願一、二、三的命中情況自動計算 0-100 分</w:t>
             </w:r>
           </w:p>
         </w:tc>
@@ -2769,7 +3083,7 @@
               <w:rPr>
                 <w:sz w:val="20"/>
               </w:rPr>
-              <w:t>三種演算法</w:t>
+              <w:t>分支定界法</w:t>
             </w:r>
           </w:p>
         </w:tc>
@@ -2785,7 +3099,7 @@
               <w:rPr>
                 <w:sz w:val="20"/>
               </w:rPr>
-              <w:t>分支定界法、貪婪演算法、動態規劃法</w:t>
+              <w:t>透過 DFS 搜尋 + 上界修剪找到全域最優解</w:t>
             </w:r>
           </w:p>
         </w:tc>
@@ -2940,56 +3254,6 @@
           </w:p>
         </w:tc>
       </w:tr>
-      <w:tr>
-        <w:tc>
-          <w:tcPr>
-            <w:tcW w:type="dxa" w:w="2882"/>
-          </w:tcPr>
-          <w:p>
-            <w:pPr>
-              <w:jc w:val="center"/>
-            </w:pPr>
-            <w:r>
-              <w:rPr>
-                <w:sz w:val="20"/>
-              </w:rPr>
-              <w:t>FR-3.4</w:t>
-            </w:r>
-          </w:p>
-        </w:tc>
-        <w:tc>
-          <w:tcPr>
-            <w:tcW w:type="dxa" w:w="2882"/>
-          </w:tcPr>
-          <w:p>
-            <w:pPr>
-              <w:jc w:val="center"/>
-            </w:pPr>
-            <w:r>
-              <w:rPr>
-                <w:sz w:val="20"/>
-              </w:rPr>
-              <w:t>三算法比較</w:t>
-            </w:r>
-          </w:p>
-        </w:tc>
-        <w:tc>
-          <w:tcPr>
-            <w:tcW w:type="dxa" w:w="2882"/>
-          </w:tcPr>
-          <w:p>
-            <w:pPr>
-              <w:jc w:val="center"/>
-            </w:pPr>
-            <w:r>
-              <w:rPr>
-                <w:sz w:val="20"/>
-              </w:rPr>
-              <w:t>同時運行三種演算法，比較總分、節點數、修剪次數、時間</w:t>
-            </w:r>
-          </w:p>
-        </w:tc>
-      </w:tr>
     </w:tbl>
     <w:p>
       <w:pPr>
@@ -3174,7 +3438,7 @@
           <w:rFonts w:ascii="新細明體" w:hAnsi="新細明體" w:eastAsia="新細明體"/>
           <w:sz w:val="24"/>
         </w:rPr>
-        <w:t>• 總床位數建議不超過 10 個（分支定界法）或 20 個（動態規劃法）。</w:t>
+        <w:t>• 總床位數建議不超過 10 個，超過 10 個時分支定界法設有 2 秒逾時保護，回傳目前找到的最佳解。</w:t>
       </w:r>
     </w:p>
     <w:p>
@@ -3302,7 +3566,7 @@
           <w:rFonts w:ascii="新細明體" w:hAnsi="新細明體" w:eastAsia="新細明體"/>
           <w:sz w:val="24"/>
         </w:rPr>
-        <w:t>同一房間的所有床位槽共享相同的房間屬性（房型），因此對同一位學生而言，同一房間的各床位具有相同的偏好分數。展開後，問題即為標準的人員指派問題，可直接套用課堂所學的分支定界法、貪婪法和動態規劃法求解。</w:t>
+        <w:t>同一房間的所有床位槽共享相同的房間屬性（房型），因此對同一位學生而言，同一房間的各床位具有相同的偏好分數。展開後，問題即為標準的人員指派問題，可直接套用課堂所學的分支定界法求解。</w:t>
       </w:r>
     </w:p>
     <w:p>
@@ -3327,7 +3591,7 @@
           <w:rFonts w:ascii="新細明體" w:hAnsi="新細明體" w:eastAsia="新細明體"/>
           <w:sz w:val="24"/>
         </w:rPr>
-        <w:t>本系統的主要演算法，用於解決最佳指派問題。此演算法直接對應課堂教授的「人員指派問題」，透過系統性搜尋與智慧修剪找到全域最優解。</w:t>
+        <w:t>本系統採用的演算法，用於解決最佳指派問題。此演算法直接對應課堂教授的「人員指派問題」，透過系統性搜尋與智慧修剪找到全域最優解。</w:t>
       </w:r>
     </w:p>
     <w:p>
@@ -3351,7 +3615,7 @@
           <w:rFonts w:ascii="新細明體" w:hAnsi="新細明體" w:eastAsia="新細明體"/>
           <w:sz w:val="24"/>
         </w:rPr>
-        <w:t>1. 初始化全域最佳分數 bestScore = 0。</w:t>
+        <w:t>1. 初始化：先以貪婪法快速求得一組可行解作為初始下界（bestScore），提高後續修剪效率。</w:t>
       </w:r>
     </w:p>
     <w:p>
@@ -3363,7 +3627,7 @@
           <w:rFonts w:ascii="新細明體" w:hAnsi="新細明體" w:eastAsia="新細明體"/>
           <w:sz w:val="24"/>
         </w:rPr>
-        <w:t>2. 以深度優先搜尋（DFS）逐一決定每位學生分配到哪個床位槽。</w:t>
+        <w:t>2. 以深度優先搜尋（DFS）逐一決定每位學生分配到哪個床位槽。在每一層，優先嘗試偏好分數較高的床位（分支排序優化）。</w:t>
       </w:r>
     </w:p>
     <w:p>
@@ -3423,7 +3687,19 @@
           <w:rFonts w:ascii="新細明體" w:hAnsi="新細明體" w:eastAsia="新細明體"/>
           <w:sz w:val="24"/>
         </w:rPr>
-        <w:t>時間複雜度：最壞情況 O(n!)，但透過上界修剪，實際搜尋量遠小於全排列。</w:t>
+        <w:t>7. 逾時保護：設定 2 秒時間上限，若超時則回傳目前找到的最佳解（標記為近似解）。</w:t>
+      </w:r>
+    </w:p>
+    <w:p>
+      <w:pPr>
+        <w:spacing w:after="120" w:line="360" w:lineRule="auto"/>
+      </w:pPr>
+      <w:r>
+        <w:rPr>
+          <w:rFonts w:ascii="新細明體" w:hAnsi="新細明體" w:eastAsia="新細明體"/>
+          <w:sz w:val="24"/>
+        </w:rPr>
+        <w:t>時間複雜度：最壞情況 O(n!)，但透過上界修剪與分支排序，實際搜尋量遠小於全排列。</w:t>
       </w:r>
     </w:p>
     <w:p>
@@ -3448,7 +3724,7 @@
           <w:b/>
           <w:sz w:val="26"/>
         </w:rPr>
-        <w:t>2-3 貪婪演算法 (Greedy Algorithm)</w:t>
+        <w:t>2-3 演算法優化策略</w:t>
       </w:r>
     </w:p>
     <w:p>
@@ -3460,7 +3736,7 @@
           <w:rFonts w:ascii="新細明體" w:hAnsi="新細明體" w:eastAsia="新細明體"/>
           <w:sz w:val="24"/>
         </w:rPr>
-        <w:t>快速產生近似解的演算法，作為效能對照組。</w:t>
+        <w:t>為提升分支定界法的效能，本系統採用以下三項優化策略：</w:t>
       </w:r>
     </w:p>
     <w:p>
@@ -3472,7 +3748,7 @@
           <w:rFonts w:ascii="新細明體" w:hAnsi="新細明體" w:eastAsia="新細明體"/>
           <w:sz w:val="24"/>
         </w:rPr>
-        <w:t>演算法步驟：</w:t>
+        <w:t>(1) 貪婪初始解：在 B&amp;B 搜尋前，先以貪婪法（依分數由大到小配對）求得初始下界。這使得搜尋一開始就有較好的 bestScore，大幅增加修剪機會。</w:t>
       </w:r>
     </w:p>
     <w:p>
@@ -3484,7 +3760,7 @@
           <w:rFonts w:ascii="新細明體" w:hAnsi="新細明體" w:eastAsia="新細明體"/>
           <w:sz w:val="24"/>
         </w:rPr>
-        <w:t>1. 將所有 n × totalBeds 個 (學生, 床位) 配對的偏好分數由大到小排序。</w:t>
+        <w:t>(2) 分支排序：在每一層搜尋中，將可用床位依該學生的偏好分數由高到低排序後再展開。優先嘗試高分分支，能更快找到好解，進而提升修剪效率。</w:t>
       </w:r>
     </w:p>
     <w:p>
@@ -3496,43 +3772,7 @@
           <w:rFonts w:ascii="新細明體" w:hAnsi="新細明體" w:eastAsia="新細明體"/>
           <w:sz w:val="24"/>
         </w:rPr>
-        <w:t>2. 依序取出分數最高的配對，若該學生和該床位都尚未被配對，則建立配對關係。</w:t>
-      </w:r>
-    </w:p>
-    <w:p>
-      <w:pPr>
-        <w:spacing w:after="120" w:line="360" w:lineRule="auto"/>
-      </w:pPr>
-      <w:r>
-        <w:rPr>
-          <w:rFonts w:ascii="新細明體" w:hAnsi="新細明體" w:eastAsia="新細明體"/>
-          <w:sz w:val="24"/>
-        </w:rPr>
-        <w:t>3. 重複步驟 2，直到配對數量達到 n 或所有配對都已檢查完畢。</w:t>
-      </w:r>
-    </w:p>
-    <w:p>
-      <w:pPr>
-        <w:spacing w:after="120" w:line="360" w:lineRule="auto"/>
-      </w:pPr>
-      <w:r>
-        <w:rPr>
-          <w:rFonts w:ascii="新細明體" w:hAnsi="新細明體" w:eastAsia="新細明體"/>
-          <w:sz w:val="24"/>
-        </w:rPr>
-        <w:t>時間複雜度：O(n² log n)（排序主導）。</w:t>
-      </w:r>
-    </w:p>
-    <w:p>
-      <w:pPr>
-        <w:spacing w:after="120" w:line="360" w:lineRule="auto"/>
-      </w:pPr>
-      <w:r>
-        <w:rPr>
-          <w:rFonts w:ascii="新細明體" w:hAnsi="新細明體" w:eastAsia="新細明體"/>
-          <w:sz w:val="24"/>
-        </w:rPr>
-        <w:t>特點：不保證找到最優解，因為每一步只看眼前最大利益，可能錯過全局更優的組合。</w:t>
+        <w:t>(3) 逾時保護：設定 2 秒的計算時間上限。每探索 500 個節點檢查一次經過時間，若超時則停止搜尋，回傳目前找到的最佳解。確保使用者不會因大規模問題而遭遇瀏覽器凍結。</w:t>
       </w:r>
     </w:p>
     <w:p>
@@ -3545,7 +3785,7 @@
           <w:b/>
           <w:sz w:val="26"/>
         </w:rPr>
-        <w:t>2-4 動態規劃法 (Dynamic Programming, Bitmask)</w:t>
+        <w:t>2-4 演算假設</w:t>
       </w:r>
     </w:p>
     <w:p>
@@ -3557,116 +3797,7 @@
           <w:rFonts w:ascii="新細明體" w:hAnsi="新細明體" w:eastAsia="新細明體"/>
           <w:sz w:val="24"/>
         </w:rPr>
-        <w:t>使用位元遮罩（Bitmask）技術的精確解法。</w:t>
-      </w:r>
-    </w:p>
-    <w:p>
-      <w:pPr>
-        <w:spacing w:after="120" w:line="360" w:lineRule="auto"/>
-      </w:pPr>
-      <w:r>
-        <w:rPr>
-          <w:rFonts w:ascii="新細明體" w:hAnsi="新細明體" w:eastAsia="新細明體"/>
-          <w:sz w:val="24"/>
-        </w:rPr>
-        <w:t>演算法步驟：</w:t>
-      </w:r>
-    </w:p>
-    <w:p>
-      <w:pPr>
-        <w:spacing w:after="120" w:line="360" w:lineRule="auto"/>
-      </w:pPr>
-      <w:r>
-        <w:rPr>
-          <w:rFonts w:ascii="新細明體" w:hAnsi="新細明體" w:eastAsia="新細明體"/>
-          <w:sz w:val="24"/>
-        </w:rPr>
-        <w:t>1. 用位元遮罩 mask 表示已被佔用的床位集合。popcount(mask) 代表已分配的學生數。</w:t>
-      </w:r>
-    </w:p>
-    <w:p>
-      <w:pPr>
-        <w:spacing w:after="120" w:line="360" w:lineRule="auto"/>
-      </w:pPr>
-      <w:r>
-        <w:rPr>
-          <w:rFonts w:ascii="新細明體" w:hAnsi="新細明體" w:eastAsia="新細明體"/>
-          <w:sz w:val="24"/>
-        </w:rPr>
-        <w:t>2. 定義 dp[mask] = 前 popcount(mask) 位學生分配完畢時的最大總分。初始值 dp[0] = 0。</w:t>
-      </w:r>
-    </w:p>
-    <w:p>
-      <w:pPr>
-        <w:spacing w:after="120" w:line="360" w:lineRule="auto"/>
-      </w:pPr>
-      <w:r>
-        <w:rPr>
-          <w:rFonts w:ascii="新細明體" w:hAnsi="新細明體" w:eastAsia="新細明體"/>
-          <w:sz w:val="24"/>
-        </w:rPr>
-        <w:t>3. 轉移：dp[mask | (1&lt;&lt;j)] = max(dp[mask] + c(person, j))，其中 person = popcount(mask)。</w:t>
-      </w:r>
-    </w:p>
-    <w:p>
-      <w:pPr>
-        <w:spacing w:after="120" w:line="360" w:lineRule="auto"/>
-      </w:pPr>
-      <w:r>
-        <w:rPr>
-          <w:rFonts w:ascii="新細明體" w:hAnsi="新細明體" w:eastAsia="新細明體"/>
-          <w:sz w:val="24"/>
-        </w:rPr>
-        <w:t>4. 最終答案為所有 popcount(mask) = n 的 dp[mask] 中的最大值。</w:t>
-      </w:r>
-    </w:p>
-    <w:p>
-      <w:pPr>
-        <w:spacing w:after="120" w:line="360" w:lineRule="auto"/>
-      </w:pPr>
-      <w:r>
-        <w:rPr>
-          <w:rFonts w:ascii="新細明體" w:hAnsi="新細明體" w:eastAsia="新細明體"/>
-          <w:sz w:val="24"/>
-        </w:rPr>
-        <w:t>5. 透過 parent 陣列回溯，重建分配方案。</w:t>
-      </w:r>
-    </w:p>
-    <w:p>
-      <w:pPr>
-        <w:spacing w:after="120" w:line="360" w:lineRule="auto"/>
-      </w:pPr>
-      <w:r>
-        <w:rPr>
-          <w:rFonts w:ascii="新細明體" w:hAnsi="新細明體" w:eastAsia="新細明體"/>
-          <w:sz w:val="24"/>
-        </w:rPr>
-        <w:t>時間複雜度：O(totalBeds × 2^totalBeds)。空間複雜度：O(2^totalBeds)。限制：totalBeds ≤ 20。</w:t>
-      </w:r>
-    </w:p>
-    <w:p>
-      <w:pPr>
-        <w:spacing w:after="120" w:line="360" w:lineRule="auto"/>
-      </w:pPr>
-      <w:r>
-        <w:rPr>
-          <w:rFonts w:ascii="新細明體" w:hAnsi="新細明體" w:eastAsia="新細明體"/>
-          <w:b/>
-          <w:sz w:val="26"/>
-        </w:rPr>
-        <w:t>2-5 演算假設</w:t>
-      </w:r>
-    </w:p>
-    <w:p>
-      <w:pPr>
-        <w:spacing w:after="120" w:line="360" w:lineRule="auto"/>
-      </w:pPr>
-      <w:r>
-        <w:rPr>
-          <w:rFonts w:ascii="新細明體" w:hAnsi="新細明體" w:eastAsia="新細明體"/>
-          <w:sz w:val="24"/>
-        </w:rPr>
-        <w:t>• 偏好分數由系統根據房型匹配度自動計算，使用者可手動微調。</w:t>
+        <w:t>• 偏好分數由系統根據志願序匹配度自動計算，使用者可手動微調。</w:t>
       </w:r>
     </w:p>
     <w:p>
@@ -3690,7 +3821,7 @@
           <w:rFonts w:ascii="新細明體" w:hAnsi="新細明體" w:eastAsia="新細明體"/>
           <w:sz w:val="24"/>
         </w:rPr>
-        <w:t>• 學生人數等於總床位數（所有床位都會被分配）。</w:t>
+        <w:t>• 學生人數可自訂（≤ 總床位數），未被分配的床位將空置。</w:t>
       </w:r>
     </w:p>
     <w:p>
@@ -3703,7 +3834,7 @@
           <w:b/>
           <w:sz w:val="26"/>
         </w:rPr>
-        <w:t>2-6 替代方法分析</w:t>
+        <w:t>2-5 替代方法分析</w:t>
       </w:r>
     </w:p>
     <w:tbl>
@@ -3806,6 +3937,8 @@
                 <w:sz w:val="20"/>
               </w:rPr>
               <w:t>DFS 搜尋 + 上界修剪</w:t>
+              <w:br/>
+              <w:t>+ 貪婪初始解 + 分支排序</w:t>
             </w:r>
           </w:p>
         </w:tc>
@@ -3824,6 +3957,8 @@
               <w:t>✅ 保證最優解</w:t>
               <w:br/>
               <w:t>適合 n ≤ 10</w:t>
+              <w:br/>
+              <w:t>逾時保護確保可用性</w:t>
             </w:r>
           </w:p>
         </w:tc>
@@ -3842,8 +3977,6 @@
                 <w:sz w:val="20"/>
               </w:rPr>
               <w:t>貪婪演算法</w:t>
-              <w:br/>
-              <w:t>（本系統採用）</w:t>
             </w:r>
           </w:p>
         </w:tc>
@@ -3896,8 +4029,6 @@
                 <w:sz w:val="20"/>
               </w:rPr>
               <w:t>動態規劃法</w:t>
-              <w:br/>
-              <w:t>（本系統採用）</w:t>
             </w:r>
           </w:p>
         </w:tc>
@@ -3931,7 +4062,59 @@
               </w:rPr>
               <w:t>✅ 保證最優</w:t>
               <w:br/>
-              <w:t>適合 totalBeds ≤ 20</w:t>
+              <w:t>❌ 記憶體需求 O(2ᵐ)</w:t>
+            </w:r>
+          </w:p>
+        </w:tc>
+      </w:tr>
+      <w:tr>
+        <w:tc>
+          <w:tcPr>
+            <w:tcW w:type="dxa" w:w="2882"/>
+          </w:tcPr>
+          <w:p>
+            <w:pPr>
+              <w:jc w:val="center"/>
+            </w:pPr>
+            <w:r>
+              <w:rPr>
+                <w:sz w:val="20"/>
+              </w:rPr>
+              <w:t>匈牙利演算法</w:t>
+            </w:r>
+          </w:p>
+        </w:tc>
+        <w:tc>
+          <w:tcPr>
+            <w:tcW w:type="dxa" w:w="2882"/>
+          </w:tcPr>
+          <w:p>
+            <w:pPr>
+              <w:jc w:val="center"/>
+            </w:pPr>
+            <w:r>
+              <w:rPr>
+                <w:sz w:val="20"/>
+              </w:rPr>
+              <w:t>增廣路徑</w:t>
+            </w:r>
+          </w:p>
+        </w:tc>
+        <w:tc>
+          <w:tcPr>
+            <w:tcW w:type="dxa" w:w="2882"/>
+          </w:tcPr>
+          <w:p>
+            <w:pPr>
+              <w:jc w:val="center"/>
+            </w:pPr>
+            <w:r>
+              <w:rPr>
+                <w:sz w:val="20"/>
+              </w:rPr>
+              <w:t>✅ 多項式時間</w:t>
+              <w:br/>
+              <w:t>❌ 課堂未教授</w:t>
             </w:r>
           </w:p>
         </w:tc>
@@ -3947,7 +4130,19 @@
           <w:rFonts w:ascii="新細明體" w:hAnsi="新細明體" w:eastAsia="新細明體"/>
           <w:sz w:val="20"/>
         </w:rPr>
-        <w:t>表 6  三種演算法比較</w:t>
+        <w:t>表 6  替代方法比較</w:t>
+      </w:r>
+    </w:p>
+    <w:p>
+      <w:pPr>
+        <w:spacing w:after="120" w:line="360" w:lineRule="auto"/>
+      </w:pPr>
+      <w:r>
+        <w:rPr>
+          <w:rFonts w:ascii="新細明體" w:hAnsi="新細明體" w:eastAsia="新細明體"/>
+          <w:sz w:val="24"/>
+        </w:rPr>
+        <w:t>本系統選擇分支定界法的原因：(1) 直接對應課堂教授的人員指派問題；(2) 搜尋過程可視化程度高，適合教學展示；(3) 透過優化策略，在合理規模下效能良好。</w:t>
       </w:r>
     </w:p>
     <w:p>
@@ -3960,7 +4155,7 @@
           <w:b/>
           <w:sz w:val="26"/>
         </w:rPr>
-        <w:t>2-7 AI 工具協助項目</w:t>
+        <w:t>2-6 AI 工具協助項目</w:t>
       </w:r>
     </w:p>
     <w:p>
@@ -3972,7 +4167,7 @@
           <w:rFonts w:ascii="新細明體" w:hAnsi="新細明體" w:eastAsia="新細明體"/>
           <w:sz w:val="24"/>
         </w:rPr>
-        <w:t>在設計演算法時，使用 AI 輔助工具協助整理床位展開策略的描述與各演算法的複雜度分析。作者先列出課堂所學的演算法，再由 AI 協助將虛擬碼整理為結構化的中文步驟描述，作者進行校對與調整。</w:t>
+        <w:t>在設計演算法時，使用 AI 輔助工具協助整理床位展開策略的描述與複雜度分析。作者先列出課堂所學的分支定界法，再由 AI 協助將虛擬碼整理為結構化的中文步驟描述，作者進行校對與調整。</w:t>
       </w:r>
     </w:p>
     <w:p>
@@ -4052,7 +4247,7 @@
           <w:rFonts w:ascii="新細明體" w:hAnsi="新細明體" w:eastAsia="新細明體"/>
           <w:sz w:val="24"/>
         </w:rPr>
-        <w:t>• students[]：學生物件陣列，每個元素包含 id、name（字母代號）、prefType（偏好房型）。</w:t>
+        <w:t>• students[]：學生物件陣列，每個元素包含 id、name（字母代號）、prefTypes（三個志願序陣列）。</w:t>
       </w:r>
     </w:p>
     <w:p>
@@ -4545,7 +4740,7 @@
           <w:rFonts w:ascii="新細明體" w:hAnsi="新細明體" w:eastAsia="新細明體"/>
           <w:sz w:val="24"/>
         </w:rPr>
-        <w:t>偏好分數矩陣（見表 1），三種演算法執行結果：</w:t>
+        <w:t>偏好分數矩陣（見表 1），分支定界法執行結果：</w:t>
       </w:r>
     </w:p>
     <w:tbl>
@@ -4556,16 +4751,13 @@
         <w:tblLook w:firstColumn="1" w:firstRow="1" w:lastColumn="0" w:lastRow="0" w:noHBand="0" w:noVBand="1" w:val="04A0"/>
       </w:tblPr>
       <w:tblGrid>
-        <w:gridCol w:w="1729"/>
-        <w:gridCol w:w="1729"/>
-        <w:gridCol w:w="1729"/>
-        <w:gridCol w:w="1729"/>
-        <w:gridCol w:w="1729"/>
+        <w:gridCol w:w="4323"/>
+        <w:gridCol w:w="4323"/>
       </w:tblGrid>
       <w:tr>
         <w:tc>
           <w:tcPr>
-            <w:tcW w:type="dxa" w:w="1729"/>
+            <w:tcW w:type="dxa" w:w="4323"/>
             <w:shd w:val="clear" w:fill="E8E0F0"/>
           </w:tcPr>
           <w:p>
@@ -4577,13 +4769,13 @@
                 <w:b/>
                 <w:sz w:val="20"/>
               </w:rPr>
-              <w:t>演算法</w:t>
+              <w:t>項目</w:t>
             </w:r>
           </w:p>
         </w:tc>
         <w:tc>
           <w:tcPr>
-            <w:tcW w:type="dxa" w:w="1729"/>
+            <w:tcW w:type="dxa" w:w="4323"/>
             <w:shd w:val="clear" w:fill="E8E0F0"/>
           </w:tcPr>
           <w:p>
@@ -4595,61 +4787,7 @@
                 <w:b/>
                 <w:sz w:val="20"/>
               </w:rPr>
-              <w:t>總偏好分數</w:t>
-            </w:r>
-          </w:p>
-        </w:tc>
-        <w:tc>
-          <w:tcPr>
-            <w:tcW w:type="dxa" w:w="1729"/>
-            <w:shd w:val="clear" w:fill="E8E0F0"/>
-          </w:tcPr>
-          <w:p>
-            <w:pPr>
-              <w:jc w:val="center"/>
-            </w:pPr>
-            <w:r>
-              <w:rPr>
-                <w:b/>
-                <w:sz w:val="20"/>
-              </w:rPr>
-              <w:t>配對結果</w:t>
-            </w:r>
-          </w:p>
-        </w:tc>
-        <w:tc>
-          <w:tcPr>
-            <w:tcW w:type="dxa" w:w="1729"/>
-            <w:shd w:val="clear" w:fill="E8E0F0"/>
-          </w:tcPr>
-          <w:p>
-            <w:pPr>
-              <w:jc w:val="center"/>
-            </w:pPr>
-            <w:r>
-              <w:rPr>
-                <w:b/>
-                <w:sz w:val="20"/>
-              </w:rPr>
-              <w:t>搜尋節點</w:t>
-            </w:r>
-          </w:p>
-        </w:tc>
-        <w:tc>
-          <w:tcPr>
-            <w:tcW w:type="dxa" w:w="1729"/>
-            <w:shd w:val="clear" w:fill="E8E0F0"/>
-          </w:tcPr>
-          <w:p>
-            <w:pPr>
-              <w:jc w:val="center"/>
-            </w:pPr>
-            <w:r>
-              <w:rPr>
-                <w:b/>
-                <w:sz w:val="20"/>
-              </w:rPr>
-              <w:t>修剪</w:t>
+              <w:t>數值</w:t>
             </w:r>
           </w:p>
         </w:tc>
@@ -4657,7 +4795,7 @@
       <w:tr>
         <w:tc>
           <w:tcPr>
-            <w:tcW w:type="dxa" w:w="1729"/>
+            <w:tcW w:type="dxa" w:w="4323"/>
           </w:tcPr>
           <w:p>
             <w:pPr>
@@ -4667,13 +4805,13 @@
               <w:rPr>
                 <w:sz w:val="20"/>
               </w:rPr>
-              <w:t>分支定界法</w:t>
+              <w:t>總偏好分數</w:t>
             </w:r>
           </w:p>
         </w:tc>
         <w:tc>
           <w:tcPr>
-            <w:tcW w:type="dxa" w:w="1729"/>
+            <w:tcW w:type="dxa" w:w="4323"/>
           </w:tcPr>
           <w:p>
             <w:pPr>
@@ -4683,13 +4821,15 @@
               <w:rPr>
                 <w:sz w:val="20"/>
               </w:rPr>
-              <w:t>312</w:t>
+              <w:t>350</w:t>
             </w:r>
           </w:p>
         </w:tc>
+      </w:tr>
+      <w:tr>
         <w:tc>
           <w:tcPr>
-            <w:tcW w:type="dxa" w:w="1729"/>
+            <w:tcW w:type="dxa" w:w="4323"/>
           </w:tcPr>
           <w:p>
             <w:pPr>
@@ -4699,13 +4839,13 @@
               <w:rPr>
                 <w:sz w:val="20"/>
               </w:rPr>
-              <w:t>A→101, B→102, C→101, D→101</w:t>
+              <w:t>搜尋節點數</w:t>
             </w:r>
           </w:p>
         </w:tc>
         <w:tc>
           <w:tcPr>
-            <w:tcW w:type="dxa" w:w="1729"/>
+            <w:tcW w:type="dxa" w:w="4323"/>
           </w:tcPr>
           <w:p>
             <w:pPr>
@@ -4719,9 +4859,27 @@
             </w:r>
           </w:p>
         </w:tc>
+      </w:tr>
+      <w:tr>
         <w:tc>
           <w:tcPr>
-            <w:tcW w:type="dxa" w:w="1729"/>
+            <w:tcW w:type="dxa" w:w="4323"/>
+          </w:tcPr>
+          <w:p>
+            <w:pPr>
+              <w:jc w:val="center"/>
+            </w:pPr>
+            <w:r>
+              <w:rPr>
+                <w:sz w:val="20"/>
+              </w:rPr>
+              <w:t>修剪次數</w:t>
+            </w:r>
+          </w:p>
+        </w:tc>
+        <w:tc>
+          <w:tcPr>
+            <w:tcW w:type="dxa" w:w="4323"/>
           </w:tcPr>
           <w:p>
             <w:pPr>
@@ -4739,7 +4897,7 @@
       <w:tr>
         <w:tc>
           <w:tcPr>
-            <w:tcW w:type="dxa" w:w="1729"/>
+            <w:tcW w:type="dxa" w:w="4323"/>
           </w:tcPr>
           <w:p>
             <w:pPr>
@@ -4749,13 +4907,13 @@
               <w:rPr>
                 <w:sz w:val="20"/>
               </w:rPr>
-              <w:t>貪婪演算法</w:t>
+              <w:t>計算時間</w:t>
             </w:r>
           </w:p>
         </w:tc>
         <w:tc>
           <w:tcPr>
-            <w:tcW w:type="dxa" w:w="1729"/>
+            <w:tcW w:type="dxa" w:w="4323"/>
           </w:tcPr>
           <w:p>
             <w:pPr>
@@ -4765,137 +4923,7 @@
               <w:rPr>
                 <w:sz w:val="20"/>
               </w:rPr>
-              <w:t>312</w:t>
-            </w:r>
-          </w:p>
-        </w:tc>
-        <w:tc>
-          <w:tcPr>
-            <w:tcW w:type="dxa" w:w="1729"/>
-          </w:tcPr>
-          <w:p>
-            <w:pPr>
-              <w:jc w:val="center"/>
-            </w:pPr>
-            <w:r>
-              <w:rPr>
-                <w:sz w:val="20"/>
-              </w:rPr>
-              <w:t>同上</w:t>
-            </w:r>
-          </w:p>
-        </w:tc>
-        <w:tc>
-          <w:tcPr>
-            <w:tcW w:type="dxa" w:w="1729"/>
-          </w:tcPr>
-          <w:p>
-            <w:pPr>
-              <w:jc w:val="center"/>
-            </w:pPr>
-            <w:r>
-              <w:rPr>
-                <w:sz w:val="20"/>
-              </w:rPr>
-              <w:t>8</w:t>
-            </w:r>
-          </w:p>
-        </w:tc>
-        <w:tc>
-          <w:tcPr>
-            <w:tcW w:type="dxa" w:w="1729"/>
-          </w:tcPr>
-          <w:p>
-            <w:pPr>
-              <w:jc w:val="center"/>
-            </w:pPr>
-            <w:r>
-              <w:rPr>
-                <w:sz w:val="20"/>
-              </w:rPr>
-              <w:t>0</w:t>
-            </w:r>
-          </w:p>
-        </w:tc>
-      </w:tr>
-      <w:tr>
-        <w:tc>
-          <w:tcPr>
-            <w:tcW w:type="dxa" w:w="1729"/>
-          </w:tcPr>
-          <w:p>
-            <w:pPr>
-              <w:jc w:val="center"/>
-            </w:pPr>
-            <w:r>
-              <w:rPr>
-                <w:sz w:val="20"/>
-              </w:rPr>
-              <w:t>動態規劃法</w:t>
-            </w:r>
-          </w:p>
-        </w:tc>
-        <w:tc>
-          <w:tcPr>
-            <w:tcW w:type="dxa" w:w="1729"/>
-          </w:tcPr>
-          <w:p>
-            <w:pPr>
-              <w:jc w:val="center"/>
-            </w:pPr>
-            <w:r>
-              <w:rPr>
-                <w:sz w:val="20"/>
-              </w:rPr>
-              <w:t>312</w:t>
-            </w:r>
-          </w:p>
-        </w:tc>
-        <w:tc>
-          <w:tcPr>
-            <w:tcW w:type="dxa" w:w="1729"/>
-          </w:tcPr>
-          <w:p>
-            <w:pPr>
-              <w:jc w:val="center"/>
-            </w:pPr>
-            <w:r>
-              <w:rPr>
-                <w:sz w:val="20"/>
-              </w:rPr>
-              <w:t>同上</w:t>
-            </w:r>
-          </w:p>
-        </w:tc>
-        <w:tc>
-          <w:tcPr>
-            <w:tcW w:type="dxa" w:w="1729"/>
-          </w:tcPr>
-          <w:p>
-            <w:pPr>
-              <w:jc w:val="center"/>
-            </w:pPr>
-            <w:r>
-              <w:rPr>
-                <w:sz w:val="20"/>
-              </w:rPr>
-              <w:t>12</w:t>
-            </w:r>
-          </w:p>
-        </w:tc>
-        <w:tc>
-          <w:tcPr>
-            <w:tcW w:type="dxa" w:w="1729"/>
-          </w:tcPr>
-          <w:p>
-            <w:pPr>
-              <w:jc w:val="center"/>
-            </w:pPr>
-            <w:r>
-              <w:rPr>
-                <w:sz w:val="20"/>
-              </w:rPr>
-              <w:t>0</w:t>
+              <w:t>&lt; 1 ms</w:t>
             </w:r>
           </w:p>
         </w:tc>
@@ -4923,7 +4951,7 @@
           <w:rFonts w:ascii="新細明體" w:hAnsi="新細明體" w:eastAsia="新細明體"/>
           <w:sz w:val="24"/>
         </w:rPr>
-        <w:t>分析：由於所有學生都偏好雙人房，且兩間房間類型相同（皆為雙人房），三種演算法皆能找到最優解。分支定界法在 4!=24 種排列中僅搜尋 15 個節點，修剪了 3 個無效分支。</w:t>
+        <w:t>分析：分支定界法在 4!=24 種排列中僅搜尋 15 個節點，修剪了 3 個無效分支，有效縮減了搜尋空間。兩間房間皆為雙人房，所有學生的志願一皆命中，最終分配滿意度高。</w:t>
       </w:r>
     </w:p>
     <w:p>
@@ -4948,7 +4976,7 @@
           <w:rFonts w:ascii="新細明體" w:hAnsi="新細明體" w:eastAsia="新細明體"/>
           <w:sz w:val="24"/>
         </w:rPr>
-        <w:t>偏好分數矩陣（見表 2），三種演算法執行結果：</w:t>
+        <w:t>偏好分數矩陣（見表 2），分支定界法執行結果：</w:t>
       </w:r>
     </w:p>
     <w:tbl>
@@ -4959,16 +4987,13 @@
         <w:tblLook w:firstColumn="1" w:firstRow="1" w:lastColumn="0" w:lastRow="0" w:noHBand="0" w:noVBand="1" w:val="04A0"/>
       </w:tblPr>
       <w:tblGrid>
-        <w:gridCol w:w="1729"/>
-        <w:gridCol w:w="1729"/>
-        <w:gridCol w:w="1729"/>
-        <w:gridCol w:w="1729"/>
-        <w:gridCol w:w="1729"/>
+        <w:gridCol w:w="4323"/>
+        <w:gridCol w:w="4323"/>
       </w:tblGrid>
       <w:tr>
         <w:tc>
           <w:tcPr>
-            <w:tcW w:type="dxa" w:w="1729"/>
+            <w:tcW w:type="dxa" w:w="4323"/>
             <w:shd w:val="clear" w:fill="E8E0F0"/>
           </w:tcPr>
           <w:p>
@@ -4980,13 +5005,13 @@
                 <w:b/>
                 <w:sz w:val="20"/>
               </w:rPr>
-              <w:t>演算法</w:t>
+              <w:t>項目</w:t>
             </w:r>
           </w:p>
         </w:tc>
         <w:tc>
           <w:tcPr>
-            <w:tcW w:type="dxa" w:w="1729"/>
+            <w:tcW w:type="dxa" w:w="4323"/>
             <w:shd w:val="clear" w:fill="E8E0F0"/>
           </w:tcPr>
           <w:p>
@@ -4998,61 +5023,7 @@
                 <w:b/>
                 <w:sz w:val="20"/>
               </w:rPr>
-              <w:t>總偏好分數</w:t>
-            </w:r>
-          </w:p>
-        </w:tc>
-        <w:tc>
-          <w:tcPr>
-            <w:tcW w:type="dxa" w:w="1729"/>
-            <w:shd w:val="clear" w:fill="E8E0F0"/>
-          </w:tcPr>
-          <w:p>
-            <w:pPr>
-              <w:jc w:val="center"/>
-            </w:pPr>
-            <w:r>
-              <w:rPr>
-                <w:b/>
-                <w:sz w:val="20"/>
-              </w:rPr>
-              <w:t>搜尋節點</w:t>
-            </w:r>
-          </w:p>
-        </w:tc>
-        <w:tc>
-          <w:tcPr>
-            <w:tcW w:type="dxa" w:w="1729"/>
-            <w:shd w:val="clear" w:fill="E8E0F0"/>
-          </w:tcPr>
-          <w:p>
-            <w:pPr>
-              <w:jc w:val="center"/>
-            </w:pPr>
-            <w:r>
-              <w:rPr>
-                <w:b/>
-                <w:sz w:val="20"/>
-              </w:rPr>
-              <w:t>修剪</w:t>
-            </w:r>
-          </w:p>
-        </w:tc>
-        <w:tc>
-          <w:tcPr>
-            <w:tcW w:type="dxa" w:w="1729"/>
-            <w:shd w:val="clear" w:fill="E8E0F0"/>
-          </w:tcPr>
-          <w:p>
-            <w:pPr>
-              <w:jc w:val="center"/>
-            </w:pPr>
-            <w:r>
-              <w:rPr>
-                <w:b/>
-                <w:sz w:val="20"/>
-              </w:rPr>
-              <w:t>時間(ms)</w:t>
+              <w:t>數值</w:t>
             </w:r>
           </w:p>
         </w:tc>
@@ -5060,7 +5031,7 @@
       <w:tr>
         <w:tc>
           <w:tcPr>
-            <w:tcW w:type="dxa" w:w="1729"/>
+            <w:tcW w:type="dxa" w:w="4323"/>
           </w:tcPr>
           <w:p>
             <w:pPr>
@@ -5070,13 +5041,13 @@
               <w:rPr>
                 <w:sz w:val="20"/>
               </w:rPr>
-              <w:t>分支定界法</w:t>
+              <w:t>總偏好分數</w:t>
             </w:r>
           </w:p>
         </w:tc>
         <w:tc>
           <w:tcPr>
-            <w:tcW w:type="dxa" w:w="1729"/>
+            <w:tcW w:type="dxa" w:w="4323"/>
           </w:tcPr>
           <w:p>
             <w:pPr>
@@ -5086,13 +5057,15 @@
               <w:rPr>
                 <w:sz w:val="20"/>
               </w:rPr>
-              <w:t>345</w:t>
+              <w:t>385</w:t>
             </w:r>
           </w:p>
         </w:tc>
+      </w:tr>
+      <w:tr>
         <w:tc>
           <w:tcPr>
-            <w:tcW w:type="dxa" w:w="1729"/>
+            <w:tcW w:type="dxa" w:w="4323"/>
           </w:tcPr>
           <w:p>
             <w:pPr>
@@ -5102,13 +5075,13 @@
               <w:rPr>
                 <w:sz w:val="20"/>
               </w:rPr>
-              <w:t>-</w:t>
+              <w:t>搜尋節點數</w:t>
             </w:r>
           </w:p>
         </w:tc>
         <w:tc>
           <w:tcPr>
-            <w:tcW w:type="dxa" w:w="1729"/>
+            <w:tcW w:type="dxa" w:w="4323"/>
           </w:tcPr>
           <w:p>
             <w:pPr>
@@ -5118,13 +5091,15 @@
               <w:rPr>
                 <w:sz w:val="20"/>
               </w:rPr>
-              <w:t>-</w:t>
+              <w:t>約 40</w:t>
             </w:r>
           </w:p>
         </w:tc>
+      </w:tr>
+      <w:tr>
         <w:tc>
           <w:tcPr>
-            <w:tcW w:type="dxa" w:w="1729"/>
+            <w:tcW w:type="dxa" w:w="4323"/>
           </w:tcPr>
           <w:p>
             <w:pPr>
@@ -5134,15 +5109,13 @@
               <w:rPr>
                 <w:sz w:val="20"/>
               </w:rPr>
-              <w:t>-</w:t>
+              <w:t>修剪次數</w:t>
             </w:r>
           </w:p>
         </w:tc>
-      </w:tr>
-      <w:tr>
         <w:tc>
           <w:tcPr>
-            <w:tcW w:type="dxa" w:w="1729"/>
+            <w:tcW w:type="dxa" w:w="4323"/>
           </w:tcPr>
           <w:p>
             <w:pPr>
@@ -5152,13 +5125,15 @@
               <w:rPr>
                 <w:sz w:val="20"/>
               </w:rPr>
-              <w:t>貪婪演算法</w:t>
+              <w:t>約 8</w:t>
             </w:r>
           </w:p>
         </w:tc>
+      </w:tr>
+      <w:tr>
         <w:tc>
           <w:tcPr>
-            <w:tcW w:type="dxa" w:w="1729"/>
+            <w:tcW w:type="dxa" w:w="4323"/>
           </w:tcPr>
           <w:p>
             <w:pPr>
@@ -5168,13 +5143,13 @@
               <w:rPr>
                 <w:sz w:val="20"/>
               </w:rPr>
-              <w:t>333</w:t>
+              <w:t>計算時間</w:t>
             </w:r>
           </w:p>
         </w:tc>
         <w:tc>
           <w:tcPr>
-            <w:tcW w:type="dxa" w:w="1729"/>
+            <w:tcW w:type="dxa" w:w="4323"/>
           </w:tcPr>
           <w:p>
             <w:pPr>
@@ -5184,121 +5159,7 @@
               <w:rPr>
                 <w:sz w:val="20"/>
               </w:rPr>
-              <w:t>-</w:t>
-            </w:r>
-          </w:p>
-        </w:tc>
-        <w:tc>
-          <w:tcPr>
-            <w:tcW w:type="dxa" w:w="1729"/>
-          </w:tcPr>
-          <w:p>
-            <w:pPr>
-              <w:jc w:val="center"/>
-            </w:pPr>
-            <w:r>
-              <w:rPr>
-                <w:sz w:val="20"/>
-              </w:rPr>
-              <w:t>0</w:t>
-            </w:r>
-          </w:p>
-        </w:tc>
-        <w:tc>
-          <w:tcPr>
-            <w:tcW w:type="dxa" w:w="1729"/>
-          </w:tcPr>
-          <w:p>
-            <w:pPr>
-              <w:jc w:val="center"/>
-            </w:pPr>
-            <w:r>
-              <w:rPr>
-                <w:sz w:val="20"/>
-              </w:rPr>
-              <w:t>-</w:t>
-            </w:r>
-          </w:p>
-        </w:tc>
-      </w:tr>
-      <w:tr>
-        <w:tc>
-          <w:tcPr>
-            <w:tcW w:type="dxa" w:w="1729"/>
-          </w:tcPr>
-          <w:p>
-            <w:pPr>
-              <w:jc w:val="center"/>
-            </w:pPr>
-            <w:r>
-              <w:rPr>
-                <w:sz w:val="20"/>
-              </w:rPr>
-              <w:t>動態規劃法</w:t>
-            </w:r>
-          </w:p>
-        </w:tc>
-        <w:tc>
-          <w:tcPr>
-            <w:tcW w:type="dxa" w:w="1729"/>
-          </w:tcPr>
-          <w:p>
-            <w:pPr>
-              <w:jc w:val="center"/>
-            </w:pPr>
-            <w:r>
-              <w:rPr>
-                <w:sz w:val="20"/>
-              </w:rPr>
-              <w:t>345</w:t>
-            </w:r>
-          </w:p>
-        </w:tc>
-        <w:tc>
-          <w:tcPr>
-            <w:tcW w:type="dxa" w:w="1729"/>
-          </w:tcPr>
-          <w:p>
-            <w:pPr>
-              <w:jc w:val="center"/>
-            </w:pPr>
-            <w:r>
-              <w:rPr>
-                <w:sz w:val="20"/>
-              </w:rPr>
-              <w:t>-</w:t>
-            </w:r>
-          </w:p>
-        </w:tc>
-        <w:tc>
-          <w:tcPr>
-            <w:tcW w:type="dxa" w:w="1729"/>
-          </w:tcPr>
-          <w:p>
-            <w:pPr>
-              <w:jc w:val="center"/>
-            </w:pPr>
-            <w:r>
-              <w:rPr>
-                <w:sz w:val="20"/>
-              </w:rPr>
-              <w:t>0</w:t>
-            </w:r>
-          </w:p>
-        </w:tc>
-        <w:tc>
-          <w:tcPr>
-            <w:tcW w:type="dxa" w:w="1729"/>
-          </w:tcPr>
-          <w:p>
-            <w:pPr>
-              <w:jc w:val="center"/>
-            </w:pPr>
-            <w:r>
-              <w:rPr>
-                <w:sz w:val="20"/>
-              </w:rPr>
-              <w:t>-</w:t>
+              <w:t>&lt; 5 ms</w:t>
             </w:r>
           </w:p>
         </w:tc>
@@ -5326,7 +5187,7 @@
           <w:rFonts w:ascii="新細明體" w:hAnsi="新細明體" w:eastAsia="新細明體"/>
           <w:sz w:val="24"/>
         </w:rPr>
-        <w:t>分析：分支定界法和動態規劃法找到相同的最優解。貪婪演算法因優先選擇個別最高分的配對（C→201），導致 A 被迫分配到不偏好的三人房，整體總分較低。這說明貪婪法的「近視」特性——每一步的區域最優不等於全域最優。</w:t>
+        <w:t>分析：由於房間類型不同（雙人房 vs 三人房），各學生的志願序差異較大，分支定界法需要探索更多節點。但透過上界修剪與分支排序優化，仍能在毫秒內完成搜尋。最終分配結果讓多數學生獲得志願一或志願二的房型。</w:t>
       </w:r>
     </w:p>
     <w:p>
@@ -5363,7 +5224,7 @@
           <w:rFonts w:ascii="新細明體" w:hAnsi="新細明體" w:eastAsia="新細明體"/>
           <w:sz w:val="24"/>
         </w:rPr>
-        <w:t>偏好分數：A=[77, 37, 37], B=[38, 78, 78], C=[89, 39, 39]</w:t>
+        <w:t>偏好分數：A=[77, 57, 57], B=[58, 78, 78], C=[89, 59, 59]</w:t>
       </w:r>
     </w:p>
     <w:p>
@@ -5422,7 +5283,7 @@
           <w:rFonts w:ascii="新細明體" w:hAnsi="新細明體" w:eastAsia="新細明體"/>
           <w:sz w:val="24"/>
         </w:rPr>
-        <w:t>│  │  └─ C→床位3 (39)，累計 194 → bestScore=194</w:t>
+        <w:t>│  │  └─ C→床位3 (59)，累計 214 → bestScore=214</w:t>
       </w:r>
     </w:p>
     <w:p>
@@ -5446,7 +5307,7 @@
           <w:rFonts w:ascii="新細明體" w:hAnsi="新細明體" w:eastAsia="新細明體"/>
           <w:sz w:val="24"/>
         </w:rPr>
-        <w:t>│     └─ C→床位2 (39)，累計 194（等於 bestScore，不更新）</w:t>
+        <w:t>│     └─ C→床位2 (59)，累計 214（等於 bestScore，不更新）</w:t>
       </w:r>
     </w:p>
     <w:p>
@@ -5458,7 +5319,7 @@
           <w:rFonts w:ascii="新細明體" w:hAnsi="新細明體" w:eastAsia="新細明體"/>
           <w:sz w:val="24"/>
         </w:rPr>
-        <w:t>├─ A→床位2 (37)，UB=37+78+89=204 &gt; 194，不修剪</w:t>
+        <w:t>├─ A→床位2 (57)，UB=57+78+89=224 &gt; 214，不修剪</w:t>
       </w:r>
     </w:p>
     <w:p>
@@ -5470,7 +5331,7 @@
           <w:rFonts w:ascii="新細明體" w:hAnsi="新細明體" w:eastAsia="新細明體"/>
           <w:sz w:val="24"/>
         </w:rPr>
-        <w:t>│  ├─ B→床位1 (38)，累計 75</w:t>
+        <w:t>│  ├─ B→床位1 (58)，累計 115</w:t>
       </w:r>
     </w:p>
     <w:p>
@@ -5482,7 +5343,7 @@
           <w:rFonts w:ascii="新細明體" w:hAnsi="新細明體" w:eastAsia="新細明體"/>
           <w:sz w:val="24"/>
         </w:rPr>
-        <w:t>│  │  └─ C→床位3 (39)，累計 114 &lt; 194，非最優</w:t>
+        <w:t>│  │  └─ C→床位3 (59)，累計 174 &lt; 214，非最優</w:t>
       </w:r>
     </w:p>
     <w:p>
@@ -5494,7 +5355,7 @@
           <w:rFonts w:ascii="新細明體" w:hAnsi="新細明體" w:eastAsia="新細明體"/>
           <w:sz w:val="24"/>
         </w:rPr>
-        <w:t>│  └─ B→床位3 (78)，累計 115</w:t>
+        <w:t>│  └─ B→床位3 (78)，累計 135</w:t>
       </w:r>
     </w:p>
     <w:p>
@@ -5506,7 +5367,7 @@
           <w:rFonts w:ascii="新細明體" w:hAnsi="新細明體" w:eastAsia="新細明體"/>
           <w:sz w:val="24"/>
         </w:rPr>
-        <w:t>│     └─ C→床位1 (89)，累計 204 → bestScore=204 ✓</w:t>
+        <w:t>│     └─ C→床位1 (89)，累計 224 → bestScore=224 ✓</w:t>
       </w:r>
     </w:p>
     <w:p>
@@ -5518,7 +5379,7 @@
           <w:rFonts w:ascii="新細明體" w:hAnsi="新細明體" w:eastAsia="新細明體"/>
           <w:sz w:val="24"/>
         </w:rPr>
-        <w:t>└─ A→床位3 (37)，UB=37+78+89=204 ≥ 204，不修剪</w:t>
+        <w:t>└─ A→床位3 (57)，UB=57+78+89=224 ≥ 224，不修剪</w:t>
       </w:r>
     </w:p>
     <w:p>
@@ -5530,7 +5391,7 @@
           <w:rFonts w:ascii="新細明體" w:hAnsi="新細明體" w:eastAsia="新細明體"/>
           <w:sz w:val="24"/>
         </w:rPr>
-        <w:t xml:space="preserve">   ├─ B→床位1 (38)，UB=75+89=164 &lt; 204 → 修剪 ✂️</w:t>
+        <w:t xml:space="preserve">   ├─ B→床位1 (58)，UB=115+89=204 &lt; 224 → 修剪 ✂️</w:t>
       </w:r>
     </w:p>
     <w:p>
@@ -5542,7 +5403,7 @@
           <w:rFonts w:ascii="新細明體" w:hAnsi="新細明體" w:eastAsia="新細明體"/>
           <w:sz w:val="24"/>
         </w:rPr>
-        <w:t xml:space="preserve">   └─ B→床位2 (78)，累計 115</w:t>
+        <w:t xml:space="preserve">   └─ B→床位2 (78)，累計 135</w:t>
       </w:r>
     </w:p>
     <w:p>
@@ -5554,7 +5415,7 @@
           <w:rFonts w:ascii="新細明體" w:hAnsi="新細明體" w:eastAsia="新細明體"/>
           <w:sz w:val="24"/>
         </w:rPr>
-        <w:t xml:space="preserve">      └─ C→床位1 (89)，累計 204（等於 bestScore）</w:t>
+        <w:t xml:space="preserve">      └─ C→床位1 (89)，累計 224（等於 bestScore）</w:t>
       </w:r>
     </w:p>
     <w:p>
@@ -5577,7 +5438,7 @@
           <w:rFonts w:ascii="新細明體" w:hAnsi="新細明體" w:eastAsia="新細明體"/>
           <w:sz w:val="24"/>
         </w:rPr>
-        <w:t>最佳解：204（A→床位2, B→床位3, C→床位1），搜尋 11 節點，修剪 1 次。</w:t>
+        <w:t>最佳解：224（A→床位2, B→床位3, C→床位1），搜尋 11 節點，修剪 1 次。</w:t>
       </w:r>
     </w:p>
     <w:p>
@@ -5602,7 +5463,7 @@
           <w:b/>
           <w:sz w:val="26"/>
         </w:rPr>
-        <w:t>3-6 三組測試結果比較</w:t>
+        <w:t>3-6 效能分析</w:t>
       </w:r>
     </w:p>
     <w:tbl>
@@ -5633,7 +5494,7 @@
                 <w:b/>
                 <w:sz w:val="20"/>
               </w:rPr>
-              <w:t>項目</w:t>
+              <w:t>床位數</w:t>
             </w:r>
           </w:p>
         </w:tc>
@@ -5651,7 +5512,7 @@
                 <w:b/>
                 <w:sz w:val="20"/>
               </w:rPr>
-              <w:t>分支定界法</w:t>
+              <w:t>全排列數</w:t>
             </w:r>
           </w:p>
         </w:tc>
@@ -5669,7 +5530,7 @@
                 <w:b/>
                 <w:sz w:val="20"/>
               </w:rPr>
-              <w:t>貪婪演算法</w:t>
+              <w:t>實際搜尋節點（含修剪）</w:t>
             </w:r>
           </w:p>
         </w:tc>
@@ -5687,7 +5548,7 @@
                 <w:b/>
                 <w:sz w:val="20"/>
               </w:rPr>
-              <w:t>動態規劃法</w:t>
+              <w:t>計算時間</w:t>
             </w:r>
           </w:p>
         </w:tc>
@@ -5705,7 +5566,7 @@
               <w:rPr>
                 <w:sz w:val="20"/>
               </w:rPr>
-              <w:t>是否保證最優</w:t>
+              <w:t>4</w:t>
             </w:r>
           </w:p>
         </w:tc>
@@ -5721,7 +5582,7 @@
               <w:rPr>
                 <w:sz w:val="20"/>
               </w:rPr>
-              <w:t>✅ 是</w:t>
+              <w:t>24</w:t>
             </w:r>
           </w:p>
         </w:tc>
@@ -5737,7 +5598,7 @@
               <w:rPr>
                 <w:sz w:val="20"/>
               </w:rPr>
-              <w:t>❌ 否</w:t>
+              <w:t>~15</w:t>
             </w:r>
           </w:p>
         </w:tc>
@@ -5753,7 +5614,7 @@
               <w:rPr>
                 <w:sz w:val="20"/>
               </w:rPr>
-              <w:t>✅ 是</w:t>
+              <w:t>&lt; 1 ms</w:t>
             </w:r>
           </w:p>
         </w:tc>
@@ -5771,7 +5632,7 @@
               <w:rPr>
                 <w:sz w:val="20"/>
               </w:rPr>
-              <w:t>時間複雜度</w:t>
+              <w:t>5</w:t>
             </w:r>
           </w:p>
         </w:tc>
@@ -5787,7 +5648,7 @@
               <w:rPr>
                 <w:sz w:val="20"/>
               </w:rPr>
-              <w:t>O(n!), 修剪後遠小</w:t>
+              <w:t>120</w:t>
             </w:r>
           </w:p>
         </w:tc>
@@ -5803,7 +5664,7 @@
               <w:rPr>
                 <w:sz w:val="20"/>
               </w:rPr>
-              <w:t>O(n² log n)</w:t>
+              <w:t>~40</w:t>
             </w:r>
           </w:p>
         </w:tc>
@@ -5819,7 +5680,7 @@
               <w:rPr>
                 <w:sz w:val="20"/>
               </w:rPr>
-              <w:t>O(m × 2ᵐ)</w:t>
+              <w:t>&lt; 5 ms</w:t>
             </w:r>
           </w:p>
         </w:tc>
@@ -5837,7 +5698,7 @@
               <w:rPr>
                 <w:sz w:val="20"/>
               </w:rPr>
-              <w:t>空間複雜度</w:t>
+              <w:t>8</w:t>
             </w:r>
           </w:p>
         </w:tc>
@@ -5853,7 +5714,7 @@
               <w:rPr>
                 <w:sz w:val="20"/>
               </w:rPr>
-              <w:t>O(n)</w:t>
+              <w:t>40,320</w:t>
             </w:r>
           </w:p>
         </w:tc>
@@ -5869,7 +5730,7 @@
               <w:rPr>
                 <w:sz w:val="20"/>
               </w:rPr>
-              <w:t>O(n²)</w:t>
+              <w:t>~200</w:t>
             </w:r>
           </w:p>
         </w:tc>
@@ -5885,7 +5746,7 @@
               <w:rPr>
                 <w:sz w:val="20"/>
               </w:rPr>
-              <w:t>O(2ᵐ)</w:t>
+              <w:t>&lt; 100 ms</w:t>
             </w:r>
           </w:p>
         </w:tc>
@@ -5903,7 +5764,7 @@
               <w:rPr>
                 <w:sz w:val="20"/>
               </w:rPr>
-              <w:t>可處理規模</w:t>
+              <w:t>10</w:t>
             </w:r>
           </w:p>
         </w:tc>
@@ -5919,7 +5780,7 @@
               <w:rPr>
                 <w:sz w:val="20"/>
               </w:rPr>
-              <w:t>n ≤ 10</w:t>
+              <w:t>3,628,800</w:t>
             </w:r>
           </w:p>
         </w:tc>
@@ -5935,7 +5796,7 @@
               <w:rPr>
                 <w:sz w:val="20"/>
               </w:rPr>
-              <w:t>無上限</w:t>
+              <w:t>~1,000</w:t>
             </w:r>
           </w:p>
         </w:tc>
@@ -5951,7 +5812,7 @@
               <w:rPr>
                 <w:sz w:val="20"/>
               </w:rPr>
-              <w:t>m ≤ 20</w:t>
+              <w:t>&lt; 1 秒</w:t>
             </w:r>
           </w:p>
         </w:tc>
@@ -5969,7 +5830,7 @@
               <w:rPr>
                 <w:sz w:val="20"/>
               </w:rPr>
-              <w:t>課堂對應</w:t>
+              <w:t>12+</w:t>
             </w:r>
           </w:p>
         </w:tc>
@@ -5985,7 +5846,7 @@
               <w:rPr>
                 <w:sz w:val="20"/>
               </w:rPr>
-              <w:t>分支定界 + 人員指派</w:t>
+              <w:t>&gt; 4 億</w:t>
             </w:r>
           </w:p>
         </w:tc>
@@ -6001,7 +5862,7 @@
               <w:rPr>
                 <w:sz w:val="20"/>
               </w:rPr>
-              <w:t>貪婪演算法</w:t>
+              <w:t>逾時保護</w:t>
             </w:r>
           </w:p>
         </w:tc>
@@ -6017,7 +5878,7 @@
               <w:rPr>
                 <w:sz w:val="20"/>
               </w:rPr>
-              <w:t>動態規劃</w:t>
+              <w:t>≤ 2 秒</w:t>
             </w:r>
           </w:p>
         </w:tc>
@@ -6033,7 +5894,7 @@
           <w:rFonts w:ascii="新細明體" w:hAnsi="新細明體" w:eastAsia="新細明體"/>
           <w:sz w:val="20"/>
         </w:rPr>
-        <w:t>表 9  三種演算法綜合比較</w:t>
+        <w:t>表 9  分支定界法效能分析</w:t>
       </w:r>
     </w:p>
     <w:p>
@@ -6045,7 +5906,7 @@
           <w:rFonts w:ascii="新細明體" w:hAnsi="新細明體" w:eastAsia="新細明體"/>
           <w:sz w:val="24"/>
         </w:rPr>
-        <w:t>總結：分支定界法和動態規劃法在所有測試案例中都找到了相同的最優解，驗證了兩者的正確性。貪婪演算法在房間類型混合的情境下可能產生次優解，差距約 3-5%。</w:t>
+        <w:t>從表 9 可見，分支定界法透過上界修剪，實際搜尋量遠小於全排列數。在 10 個床位以內均可在 1 秒內完成精確求解。超過 10 個床位時，系統的 2 秒逾時保護會自動啟動，回傳目前找到的最佳解。</w:t>
       </w:r>
     </w:p>
     <w:p>
@@ -6070,7 +5931,7 @@
           <w:rFonts w:ascii="新細明體" w:hAnsi="新細明體" w:eastAsia="新細明體"/>
           <w:sz w:val="24"/>
         </w:rPr>
-        <w:t>1. 程式碼框架：作者提供演算法虛擬碼和偏好分數計算規則，由 AI 協助轉為 JavaScript 實作，作者手動驗證。</w:t>
+        <w:t>1. 程式碼框架：作者提供分支定界法虛擬碼和偏好分數計算規則，由 AI 協助轉為 JavaScript 實作，作者手動驗證。</w:t>
       </w:r>
     </w:p>
     <w:p>
@@ -6149,7 +6010,7 @@
           <w:rFonts w:ascii="新細明體" w:hAnsi="新細明體" w:eastAsia="新細明體"/>
           <w:sz w:val="24"/>
         </w:rPr>
-        <w:t>• 自動評分 + 手動微調：偏好分數由系統自動計算，使用者也可點擊矩陣直接修改，兼顧便利性和靈活性。</w:t>
+        <w:t>• 志願序機制：每位學生可設定三個房型志願，分數計算更貼近真實的宿舍抽籤流程。</w:t>
       </w:r>
     </w:p>
     <w:p>
@@ -6161,7 +6022,7 @@
           <w:rFonts w:ascii="新細明體" w:hAnsi="新細明體" w:eastAsia="新細明體"/>
           <w:sz w:val="24"/>
         </w:rPr>
-        <w:t>• 多演算法比較：三種演算法一鍵比較，直觀展示精確度與速度的取捨。</w:t>
+        <w:t>• 自動評分 + 手動微調：偏好分數由系統根據志願序自動計算，使用者也可點擊矩陣直接修改。</w:t>
       </w:r>
     </w:p>
     <w:p>
@@ -6174,6 +6035,18 @@
           <w:sz w:val="24"/>
         </w:rPr>
         <w:t>• 穩定性檢測：配對完成後自動偵測 blocking pair，評估分配公平性。</w:t>
+      </w:r>
+    </w:p>
+    <w:p>
+      <w:pPr>
+        <w:spacing w:after="120" w:line="360" w:lineRule="auto"/>
+      </w:pPr>
+      <w:r>
+        <w:rPr>
+          <w:rFonts w:ascii="新細明體" w:hAnsi="新細明體" w:eastAsia="新細明體"/>
+          <w:sz w:val="24"/>
+        </w:rPr>
+        <w:t>• 效能保護：設有 2 秒逾時保護，確保系統不會因大規模問題凍結。</w:t>
       </w:r>
     </w:p>
     <w:p>
@@ -6210,7 +6083,7 @@
           <w:rFonts w:ascii="新細明體" w:hAnsi="新細明體" w:eastAsia="新細明體"/>
           <w:sz w:val="24"/>
         </w:rPr>
-        <w:t>• 規模限制：分支定界法在總床位數 &gt; 10 時計算時間急劇增加，動態規劃法在 &gt; 20 時記憶體不足。</w:t>
+        <w:t>• 規模限制：分支定界法在總床位數 &gt; 10 時需依賴逾時保護，可能無法保證全域最優。</w:t>
       </w:r>
     </w:p>
     <w:p>
@@ -6284,7 +6157,7 @@
           <w:rFonts w:ascii="新細明體" w:hAnsi="新細明體" w:eastAsia="新細明體"/>
           <w:sz w:val="24"/>
         </w:rPr>
-        <w:t>本系統成功實作了一套支援多房型的學生宿舍最佳配對系統。透過床位展開策略，將多人房的多對一問題轉換為一對一指派問題，使課堂所學的分支定界法、貪婪法和動態規劃法可以直接套用。分支定界法在所有測試案例中都找到了全域最優解，且透過上界修剪有效縮減了搜尋空間。</w:t>
+        <w:t>本系統成功實作了一套支援多房型的學生宿舍最佳配對系統。透過床位展開策略，將多人房的多對一問題轉換為一對一指派問題，使課堂所學的分支定界法可以直接套用。分支定界法搭配貪婪初始解、分支排序與逾時保護三項優化，在合理規模下均能找到全域最優解，且透過上界修剪有效縮減了搜尋空間。</w:t>
       </w:r>
     </w:p>
     <w:p>

</xml_diff>